<commit_message>
Decreto 51/2025 Google Docs version v2: editable cover text and rounded shapes
Co-Authored-By: Claude Opus 5.5 <noreply@anthropic.com>
Claude-Session: https://claude.ai/code/session_01T98mbmRs8KdzUGJ1QXPFqC
</commit_message>
<xml_diff>
--- a/virginia-jurado/decreto-51-2025-muestra-google-docs.docx
+++ b/virginia-jurado/decreto-51-2025-muestra-google-docs.docx
@@ -4,13 +4,56 @@
   <w:body>
     <w:p>
       <w:pPr>
-        <w:spacing w:after="0" w:before="0"/>
+        <w:spacing w:after="0" w:before="0" w:line="374" w:lineRule="exact"/>
+      </w:pPr>
+      <w:r>
+        <w:rPr>
+          <w:sz w:val="2"/>
+          <w:szCs w:val="2"/>
+        </w:rPr>
+        <w:t xml:space="preserve"/>
+      </w:r>
+    </w:p>
+    <w:p>
+      <w:pPr>
+        <w:spacing w:after="0" w:before="0" w:line="216" w:lineRule="auto"/>
+        <w:jc w:val="center"/>
+      </w:pPr>
+      <w:r>
+        <w:rPr>
+          <w:rFonts w:ascii="Poppins" w:cs="Poppins" w:eastAsia="Poppins" w:hAnsi="Poppins"/>
+          <w:b/>
+          <w:bCs/>
+          <w:color w:val="143548"/>
+          <w:sz w:val="63"/>
+          <w:szCs w:val="63"/>
+        </w:rPr>
+        <w:t xml:space="preserve">DECRETO 51/2025,</w:t>
+      </w:r>
+      <w:r>
+        <w:br/>
+      </w:r>
+      <w:r>
+        <w:rPr>
+          <w:rFonts w:ascii="Poppins" w:cs="Poppins" w:eastAsia="Poppins" w:hAnsi="Poppins"/>
+          <w:b/>
+          <w:bCs/>
+          <w:color w:val="143548"/>
+          <w:sz w:val="63"/>
+          <w:szCs w:val="63"/>
+        </w:rPr>
+        <w:t xml:space="preserve">DE 24 DE FEBRERO</w:t>
+      </w:r>
+    </w:p>
+    <w:p>
+      <w:pPr>
+        <w:spacing w:after="115" w:before="29"/>
         <w:jc w:val="center"/>
       </w:pPr>
       <w:r>
         <w:drawing>
           <wp:inline distT="0" distB="0" distL="0" distR="0">
-            <wp:extent cx="7524750" cy="10639425"/>
+            <wp:extent cx="2230578" cy="219401"/>
             <wp:effectExtent t="0" r="0" b="0" l="0"/>
             <wp:docPr id="1" name="" descr="" title=""/>
             <wp:cNvGraphicFramePr>
@@ -26,7 +69,7 @@
                     </pic:cNvPicPr>
                   </pic:nvPicPr>
                   <pic:blipFill>
-                    <a:blip r:embed="rId9" cstate="none"/>
+                    <a:blip r:embed="rId13" cstate="none"/>
                     <a:srcRect/>
                     <a:stretch>
                       <a:fillRect/>
@@ -35,7 +78,457 @@
                   <pic:spPr bwMode="auto">
                     <a:xfrm>
                       <a:off x="0" y="0"/>
-                      <a:ext cx="7524750" cy="10639425"/>
+                      <a:ext cx="2230578" cy="219401"/>
+                    </a:xfrm>
+                    <a:prstGeom prst="rect">
+                      <a:avLst/>
+                    </a:prstGeom>
+                  </pic:spPr>
+                </pic:pic>
+              </a:graphicData>
+            </a:graphic>
+          </wp:inline>
+        </w:drawing>
+      </w:r>
+    </w:p>
+    <w:p>
+      <w:pPr>
+        <w:spacing w:after="230" w:before="0" w:line="250" w:lineRule="auto"/>
+        <w:ind w:left="1627" w:right="1627"/>
+        <w:jc w:val="center"/>
+      </w:pPr>
+      <w:r>
+        <w:rPr>
+          <w:rFonts w:ascii="Poppins" w:cs="Poppins" w:eastAsia="Poppins" w:hAnsi="Poppins"/>
+          <w:color w:val="3A4A55"/>
+          <w:sz w:val="21"/>
+          <w:szCs w:val="21"/>
+        </w:rPr>
+        <w:t xml:space="preserve">Por el que se regula la planificación y ordenación del empleo público, y el ingreso, promoción interna y provisión de puestos de trabajo del personal de la Administración General de la Junta de Andalucía.</w:t>
+      </w:r>
+    </w:p>
+    <w:p>
+      <w:pPr>
+        <w:spacing w:after="0" w:before="0"/>
+        <w:jc w:val="center"/>
+      </w:pPr>
+      <w:r>
+        <w:drawing>
+          <wp:inline distT="0" distB="0" distL="0" distR="0">
+            <wp:extent cx="999221" cy="265118"/>
+            <wp:effectExtent l="0" t="0" r="0" b="0"/>
+            <wp:docPr id="5001" name="Forma 5001"/>
+            <wp:cNvGraphicFramePr/>
+            <a:graphic xmlns:a="http://schemas.openxmlformats.org/drawingml/2006/main">
+              <a:graphicData uri="http://schemas.microsoft.com/office/word/2010/wordprocessingShape">
+                <wps:wsp>
+                  <wps:cNvSpPr/>
+                  <wps:spPr>
+                    <a:xfrm>
+                      <a:off x="0" y="0"/>
+                      <a:ext cx="999221" cy="265118"/>
+                    </a:xfrm>
+                    <a:prstGeom prst="roundRect">
+                      <a:avLst>
+                        <a:gd name="adj" fmla="val 50000"/>
+                      </a:avLst>
+                    </a:prstGeom>
+                    <a:solidFill>
+                      <a:srgbClr val="FFFFFF"/>
+                    </a:solidFill>
+                    <a:ln w="9525">
+                      <a:solidFill>
+                        <a:srgbClr val="8A8F94"/>
+                      </a:solidFill>
+                    </a:ln>
+                  </wps:spPr>
+                  <wps:txbx>
+                    <w:txbxContent>
+                      <w:p>
+                        <w:pPr>
+                          <w:spacing w:before="0" w:after="0" w:line="240" w:lineRule="auto"/>
+                          <w:jc w:val="center"/>
+                        </w:pPr>
+                        <w:r>
+                          <w:rPr>
+                            <w:rFonts w:ascii="Poppins" w:hAnsi="Poppins" w:cs="Poppins"/>
+                            <w:color w:val="4B4F53"/>
+                            <w:sz w:val="17"/>
+                            <w:szCs w:val="17"/>
+                          </w:rPr>
+                          <w:t xml:space="preserve">Planificación</w:t>
+                        </w:r>
+                      </w:p>
+                    </w:txbxContent>
+                  </wps:txbx>
+                  <wps:bodyPr rot="0" vert="horz" wrap="square" lIns="36568" tIns="0" rIns="36568" bIns="0" anchor="ctr" anchorCtr="0">
+                    <a:noAutofit/>
+                  </wps:bodyPr>
+                </wps:wsp>
+              </a:graphicData>
+            </a:graphic>
+          </wp:inline>
+        </w:drawing>
+      </w:r>
+      <w:r>
+        <w:rPr>
+          <w:sz w:val="12"/>
+          <w:szCs w:val="12"/>
+        </w:rPr>
+        <w:t xml:space="preserve">  </w:t>
+      </w:r>
+      <w:r>
+        <w:drawing>
+          <wp:inline distT="0" distB="0" distL="0" distR="0">
+            <wp:extent cx="1502031" cy="265118"/>
+            <wp:effectExtent l="0" t="0" r="0" b="0"/>
+            <wp:docPr id="5002" name="Forma 5002"/>
+            <wp:cNvGraphicFramePr/>
+            <a:graphic xmlns:a="http://schemas.openxmlformats.org/drawingml/2006/main">
+              <a:graphicData uri="http://schemas.microsoft.com/office/word/2010/wordprocessingShape">
+                <wps:wsp>
+                  <wps:cNvSpPr/>
+                  <wps:spPr>
+                    <a:xfrm>
+                      <a:off x="0" y="0"/>
+                      <a:ext cx="1502031" cy="265118"/>
+                    </a:xfrm>
+                    <a:prstGeom prst="roundRect">
+                      <a:avLst>
+                        <a:gd name="adj" fmla="val 50000"/>
+                      </a:avLst>
+                    </a:prstGeom>
+                    <a:solidFill>
+                      <a:srgbClr val="FFFFFF"/>
+                    </a:solidFill>
+                    <a:ln w="9525">
+                      <a:solidFill>
+                        <a:srgbClr val="8A8F94"/>
+                      </a:solidFill>
+                    </a:ln>
+                  </wps:spPr>
+                  <wps:txbx>
+                    <w:txbxContent>
+                      <w:p>
+                        <w:pPr>
+                          <w:spacing w:before="0" w:after="0" w:line="240" w:lineRule="auto"/>
+                          <w:jc w:val="center"/>
+                        </w:pPr>
+                        <w:r>
+                          <w:rPr>
+                            <w:rFonts w:ascii="Poppins" w:hAnsi="Poppins" w:cs="Poppins"/>
+                            <w:color w:val="4B4F53"/>
+                            <w:sz w:val="17"/>
+                            <w:szCs w:val="17"/>
+                          </w:rPr>
+                          <w:t xml:space="preserve">Selección de personal</w:t>
+                        </w:r>
+                      </w:p>
+                    </w:txbxContent>
+                  </wps:txbx>
+                  <wps:bodyPr rot="0" vert="horz" wrap="square" lIns="36568" tIns="0" rIns="36568" bIns="0" anchor="ctr" anchorCtr="0">
+                    <a:noAutofit/>
+                  </wps:bodyPr>
+                </wps:wsp>
+              </a:graphicData>
+            </a:graphic>
+          </wp:inline>
+        </w:drawing>
+      </w:r>
+      <w:r>
+        <w:rPr>
+          <w:sz w:val="12"/>
+          <w:szCs w:val="12"/>
+        </w:rPr>
+        <w:t xml:space="preserve">  </w:t>
+      </w:r>
+      <w:r>
+        <w:drawing>
+          <wp:inline distT="0" distB="0" distL="0" distR="0">
+            <wp:extent cx="1306392" cy="265118"/>
+            <wp:effectExtent l="0" t="0" r="0" b="0"/>
+            <wp:docPr id="5003" name="Forma 5003"/>
+            <wp:cNvGraphicFramePr/>
+            <a:graphic xmlns:a="http://schemas.openxmlformats.org/drawingml/2006/main">
+              <a:graphicData uri="http://schemas.microsoft.com/office/word/2010/wordprocessingShape">
+                <wps:wsp>
+                  <wps:cNvSpPr/>
+                  <wps:spPr>
+                    <a:xfrm>
+                      <a:off x="0" y="0"/>
+                      <a:ext cx="1306392" cy="265118"/>
+                    </a:xfrm>
+                    <a:prstGeom prst="roundRect">
+                      <a:avLst>
+                        <a:gd name="adj" fmla="val 50000"/>
+                      </a:avLst>
+                    </a:prstGeom>
+                    <a:solidFill>
+                      <a:srgbClr val="FFFFFF"/>
+                    </a:solidFill>
+                    <a:ln w="9525">
+                      <a:solidFill>
+                        <a:srgbClr val="8A8F94"/>
+                      </a:solidFill>
+                    </a:ln>
+                  </wps:spPr>
+                  <wps:txbx>
+                    <w:txbxContent>
+                      <w:p>
+                        <w:pPr>
+                          <w:spacing w:before="0" w:after="0" w:line="240" w:lineRule="auto"/>
+                          <w:jc w:val="center"/>
+                        </w:pPr>
+                        <w:r>
+                          <w:rPr>
+                            <w:rFonts w:ascii="Poppins" w:hAnsi="Poppins" w:cs="Poppins"/>
+                            <w:color w:val="4B4F53"/>
+                            <w:sz w:val="17"/>
+                            <w:szCs w:val="17"/>
+                          </w:rPr>
+                          <w:t xml:space="preserve">Promoción interna</w:t>
+                        </w:r>
+                      </w:p>
+                    </w:txbxContent>
+                  </wps:txbx>
+                  <wps:bodyPr rot="0" vert="horz" wrap="square" lIns="36568" tIns="0" rIns="36568" bIns="0" anchor="ctr" anchorCtr="0">
+                    <a:noAutofit/>
+                  </wps:bodyPr>
+                </wps:wsp>
+              </a:graphicData>
+            </a:graphic>
+          </wp:inline>
+        </w:drawing>
+      </w:r>
+    </w:p>
+    <w:p>
+      <w:pPr>
+        <w:spacing w:after="0" w:before="86"/>
+        <w:jc w:val="center"/>
+      </w:pPr>
+      <w:r>
+        <w:drawing>
+          <wp:inline distT="0" distB="0" distL="0" distR="0">
+            <wp:extent cx="2010326" cy="265118"/>
+            <wp:effectExtent l="0" t="0" r="0" b="0"/>
+            <wp:docPr id="5004" name="Forma 5004"/>
+            <wp:cNvGraphicFramePr/>
+            <a:graphic xmlns:a="http://schemas.openxmlformats.org/drawingml/2006/main">
+              <a:graphicData uri="http://schemas.microsoft.com/office/word/2010/wordprocessingShape">
+                <wps:wsp>
+                  <wps:cNvSpPr/>
+                  <wps:spPr>
+                    <a:xfrm>
+                      <a:off x="0" y="0"/>
+                      <a:ext cx="2010326" cy="265118"/>
+                    </a:xfrm>
+                    <a:prstGeom prst="roundRect">
+                      <a:avLst>
+                        <a:gd name="adj" fmla="val 50000"/>
+                      </a:avLst>
+                    </a:prstGeom>
+                    <a:solidFill>
+                      <a:srgbClr val="FFFFFF"/>
+                    </a:solidFill>
+                    <a:ln w="9525">
+                      <a:solidFill>
+                        <a:srgbClr val="8A8F94"/>
+                      </a:solidFill>
+                    </a:ln>
+                  </wps:spPr>
+                  <wps:txbx>
+                    <w:txbxContent>
+                      <w:p>
+                        <w:pPr>
+                          <w:spacing w:before="0" w:after="0" w:line="240" w:lineRule="auto"/>
+                          <w:jc w:val="center"/>
+                        </w:pPr>
+                        <w:r>
+                          <w:rPr>
+                            <w:rFonts w:ascii="Poppins" w:hAnsi="Poppins" w:cs="Poppins"/>
+                            <w:color w:val="4B4F53"/>
+                            <w:sz w:val="17"/>
+                            <w:szCs w:val="17"/>
+                          </w:rPr>
+                          <w:t xml:space="preserve">Provisión de puestos de trabajo</w:t>
+                        </w:r>
+                      </w:p>
+                    </w:txbxContent>
+                  </wps:txbx>
+                  <wps:bodyPr rot="0" vert="horz" wrap="square" lIns="36568" tIns="0" rIns="36568" bIns="0" anchor="ctr" anchorCtr="0">
+                    <a:noAutofit/>
+                  </wps:bodyPr>
+                </wps:wsp>
+              </a:graphicData>
+            </a:graphic>
+          </wp:inline>
+        </w:drawing>
+      </w:r>
+      <w:r>
+        <w:rPr>
+          <w:sz w:val="12"/>
+          <w:szCs w:val="12"/>
+        </w:rPr>
+        <w:t xml:space="preserve">  </w:t>
+      </w:r>
+      <w:r>
+        <w:drawing>
+          <wp:inline distT="0" distB="0" distL="0" distR="0">
+            <wp:extent cx="831922" cy="265118"/>
+            <wp:effectExtent l="0" t="0" r="0" b="0"/>
+            <wp:docPr id="5005" name="Forma 5005"/>
+            <wp:cNvGraphicFramePr/>
+            <a:graphic xmlns:a="http://schemas.openxmlformats.org/drawingml/2006/main">
+              <a:graphicData uri="http://schemas.microsoft.com/office/word/2010/wordprocessingShape">
+                <wps:wsp>
+                  <wps:cNvSpPr/>
+                  <wps:spPr>
+                    <a:xfrm>
+                      <a:off x="0" y="0"/>
+                      <a:ext cx="831922" cy="265118"/>
+                    </a:xfrm>
+                    <a:prstGeom prst="roundRect">
+                      <a:avLst>
+                        <a:gd name="adj" fmla="val 50000"/>
+                      </a:avLst>
+                    </a:prstGeom>
+                    <a:solidFill>
+                      <a:srgbClr val="FFFFFF"/>
+                    </a:solidFill>
+                    <a:ln w="9525">
+                      <a:solidFill>
+                        <a:srgbClr val="8A8F94"/>
+                      </a:solidFill>
+                    </a:ln>
+                  </wps:spPr>
+                  <wps:txbx>
+                    <w:txbxContent>
+                      <w:p>
+                        <w:pPr>
+                          <w:spacing w:before="0" w:after="0" w:line="240" w:lineRule="auto"/>
+                          <w:jc w:val="center"/>
+                        </w:pPr>
+                        <w:r>
+                          <w:rPr>
+                            <w:rFonts w:ascii="Poppins" w:hAnsi="Poppins" w:cs="Poppins"/>
+                            <w:color w:val="4B4F53"/>
+                            <w:sz w:val="17"/>
+                            <w:szCs w:val="17"/>
+                          </w:rPr>
+                          <w:t xml:space="preserve">Movilidad</w:t>
+                        </w:r>
+                      </w:p>
+                    </w:txbxContent>
+                  </wps:txbx>
+                  <wps:bodyPr rot="0" vert="horz" wrap="square" lIns="36568" tIns="0" rIns="36568" bIns="0" anchor="ctr" anchorCtr="0">
+                    <a:noAutofit/>
+                  </wps:bodyPr>
+                </wps:wsp>
+              </a:graphicData>
+            </a:graphic>
+          </wp:inline>
+        </w:drawing>
+      </w:r>
+      <w:r>
+        <w:rPr>
+          <w:sz w:val="12"/>
+          <w:szCs w:val="12"/>
+        </w:rPr>
+        <w:t xml:space="preserve">  </w:t>
+      </w:r>
+      <w:r>
+        <w:drawing>
+          <wp:inline distT="0" distB="0" distL="0" distR="0">
+            <wp:extent cx="2855047" cy="265118"/>
+            <wp:effectExtent l="0" t="0" r="0" b="0"/>
+            <wp:docPr id="5006" name="Forma 5006"/>
+            <wp:cNvGraphicFramePr/>
+            <a:graphic xmlns:a="http://schemas.openxmlformats.org/drawingml/2006/main">
+              <a:graphicData uri="http://schemas.microsoft.com/office/word/2010/wordprocessingShape">
+                <wps:wsp>
+                  <wps:cNvSpPr/>
+                  <wps:spPr>
+                    <a:xfrm>
+                      <a:off x="0" y="0"/>
+                      <a:ext cx="2855047" cy="265118"/>
+                    </a:xfrm>
+                    <a:prstGeom prst="roundRect">
+                      <a:avLst>
+                        <a:gd name="adj" fmla="val 50000"/>
+                      </a:avLst>
+                    </a:prstGeom>
+                    <a:solidFill>
+                      <a:srgbClr val="FFFFFF"/>
+                    </a:solidFill>
+                    <a:ln w="9525">
+                      <a:solidFill>
+                        <a:srgbClr val="8A8F94"/>
+                      </a:solidFill>
+                    </a:ln>
+                  </wps:spPr>
+                  <wps:txbx>
+                    <w:txbxContent>
+                      <w:p>
+                        <w:pPr>
+                          <w:spacing w:before="0" w:after="0" w:line="240" w:lineRule="auto"/>
+                          <w:jc w:val="center"/>
+                        </w:pPr>
+                        <w:r>
+                          <w:rPr>
+                            <w:rFonts w:ascii="Poppins" w:hAnsi="Poppins" w:cs="Poppins"/>
+                            <w:color w:val="4B4F53"/>
+                            <w:sz w:val="17"/>
+                            <w:szCs w:val="17"/>
+                          </w:rPr>
+                          <w:t xml:space="preserve">Adquisición y pérdida de la relación de servicio</w:t>
+                        </w:r>
+                      </w:p>
+                    </w:txbxContent>
+                  </wps:txbx>
+                  <wps:bodyPr rot="0" vert="horz" wrap="square" lIns="36568" tIns="0" rIns="36568" bIns="0" anchor="ctr" anchorCtr="0">
+                    <a:noAutofit/>
+                  </wps:bodyPr>
+                </wps:wsp>
+              </a:graphicData>
+            </a:graphic>
+          </wp:inline>
+        </w:drawing>
+      </w:r>
+    </w:p>
+    <w:p>
+      <w:pPr>
+        <w:spacing w:after="0" w:before="230"/>
+        <w:jc w:val="center"/>
+      </w:pPr>
+      <w:r>
+        <w:drawing>
+          <wp:inline distT="0" distB="0" distL="0" distR="0">
+            <wp:extent cx="639920" cy="603353"/>
+            <wp:effectExtent t="0" r="0" b="0" l="0"/>
+            <wp:docPr id="1" name="" descr="" title=""/>
+            <wp:cNvGraphicFramePr>
+              <a:graphicFrameLocks xmlns:a="http://schemas.openxmlformats.org/drawingml/2006/main" noChangeAspect="1"/>
+            </wp:cNvGraphicFramePr>
+            <a:graphic xmlns:a="http://schemas.openxmlformats.org/drawingml/2006/main">
+              <a:graphicData uri="http://schemas.openxmlformats.org/drawingml/2006/picture">
+                <pic:pic xmlns:pic="http://schemas.openxmlformats.org/drawingml/2006/picture">
+                  <pic:nvPicPr>
+                    <pic:cNvPr id="0" name="" descr=""/>
+                    <pic:cNvPicPr>
+                      <a:picLocks noChangeAspect="1" noChangeArrowheads="1"/>
+                    </pic:cNvPicPr>
+                  </pic:nvPicPr>
+                  <pic:blipFill>
+                    <a:blip r:embed="rId14" cstate="none"/>
+                    <a:srcRect/>
+                    <a:stretch>
+                      <a:fillRect/>
+                    </a:stretch>
+                  </pic:blipFill>
+                  <pic:spPr bwMode="auto">
+                    <a:xfrm>
+                      <a:off x="0" y="0"/>
+                      <a:ext cx="639920" cy="603353"/>
                     </a:xfrm>
                     <a:prstGeom prst="rect">
                       <a:avLst/>
@@ -51,115 +544,129 @@
     <w:p>
       <w:pPr>
         <w:sectPr>
-          <w:footerReference w:type="default" r:id="rId7"/>
+          <w:headerReference w:type="default" r:id="rId7"/>
+          <w:headerReference w:type="first" r:id="rId8"/>
+          <w:footerReference w:type="default" r:id="rId9"/>
+          <w:footerReference w:type="first" r:id="rId10"/>
           <w:pgSz w:w="11906" w:h="16838" w:orient="portrait"/>
-          <w:pgMar w:top="0" w:right="0" w:bottom="0" w:left="0" w:header="0" w:footer="0" w:gutter="0"/>
+          <w:pgMar w:top="5485" w:right="0" w:bottom="4780" w:left="0" w:header="0" w:footer="0" w:gutter="0"/>
           <w:pgNumType/>
+          <w:titlePg/>
           <w:docGrid w:linePitch="360"/>
         </w:sectPr>
       </w:pPr>
     </w:p>
-    <w:tbl>
-      <w:tblPr>
-        <w:tblW w:type="dxa" w:w="9631"/>
-        <w:tblBorders>
-          <w:top w:val="none" w:color="FFFFFF" w:sz="0"/>
-          <w:left w:val="none" w:color="FFFFFF" w:sz="0"/>
-          <w:bottom w:val="none" w:color="FFFFFF" w:sz="0"/>
-          <w:right w:val="none" w:color="FFFFFF" w:sz="0"/>
-          <w:insideH w:val="none" w:color="FFFFFF" w:sz="0"/>
-          <w:insideV w:val="none" w:color="FFFFFF" w:sz="0"/>
-        </w:tblBorders>
-        <w:tblLayout w:type="fixed"/>
-      </w:tblPr>
-      <w:tblGrid>
-        <w:gridCol w:w="9631"/>
-      </w:tblGrid>
-      <w:tr>
-        <w:tc>
-          <w:tcPr>
-            <w:tcW w:type="dxa" w:w="9631"/>
-            <w:tcBorders>
-              <w:top w:val="none" w:color="FFFFFF" w:sz="0"/>
-              <w:left w:val="none" w:color="FFFFFF" w:sz="0"/>
-              <w:bottom w:val="none" w:color="FFFFFF" w:sz="0"/>
-              <w:right w:val="none" w:color="FFFFFF" w:sz="0"/>
-            </w:tcBorders>
-            <w:shd w:fill="D1EDF9" w:color="auto" w:val="clear"/>
-            <w:tcMar>
-              <w:top w:type="dxa" w:w="173"/>
-              <w:left w:type="dxa" w:w="374"/>
-              <w:bottom w:type="dxa" w:w="230"/>
-              <w:right w:type="dxa" w:w="374"/>
-            </w:tcMar>
-          </w:tcPr>
-          <w:p>
-            <w:pPr>
-              <w:spacing w:after="58" w:before="0"/>
-            </w:pPr>
-            <w:r>
-              <w:drawing>
-                <wp:inline distT="0" distB="0" distL="0" distR="0">
-                  <wp:extent cx="329102" cy="329102"/>
-                  <wp:effectExtent t="0" r="0" b="0" l="0"/>
-                  <wp:docPr id="1" name="" descr="" title=""/>
-                  <wp:cNvGraphicFramePr>
-                    <a:graphicFrameLocks xmlns:a="http://schemas.openxmlformats.org/drawingml/2006/main" noChangeAspect="1"/>
-                  </wp:cNvGraphicFramePr>
-                  <a:graphic xmlns:a="http://schemas.openxmlformats.org/drawingml/2006/main">
-                    <a:graphicData uri="http://schemas.openxmlformats.org/drawingml/2006/picture">
-                      <pic:pic xmlns:pic="http://schemas.openxmlformats.org/drawingml/2006/picture">
-                        <pic:nvPicPr>
-                          <pic:cNvPr id="0" name="" descr=""/>
-                          <pic:cNvPicPr>
-                            <a:picLocks noChangeAspect="1" noChangeArrowheads="1"/>
-                          </pic:cNvPicPr>
-                        </pic:nvPicPr>
-                        <pic:blipFill>
-                          <a:blip r:embed="rId10" cstate="none"/>
-                          <a:srcRect/>
-                          <a:stretch>
-                            <a:fillRect/>
-                          </a:stretch>
-                        </pic:blipFill>
-                        <pic:spPr bwMode="auto">
-                          <a:xfrm>
-                            <a:off x="0" y="0"/>
-                            <a:ext cx="329102" cy="329102"/>
-                          </a:xfrm>
-                          <a:prstGeom prst="rect">
-                            <a:avLst/>
-                          </a:prstGeom>
-                        </pic:spPr>
-                      </pic:pic>
-                    </a:graphicData>
-                  </a:graphic>
-                </wp:inline>
-              </w:drawing>
-            </w:r>
-          </w:p>
-          <w:p>
-            <w:pPr>
-              <w:spacing w:after="0" w:before="0" w:line="312" w:lineRule="auto"/>
-            </w:pPr>
-            <w:r>
-              <w:rPr>
-                <w:rFonts w:ascii="Poppins" w:cs="Poppins" w:eastAsia="Poppins" w:hAnsi="Poppins"/>
-                <w:b/>
-                <w:bCs/>
-                <w:color w:val="143548"/>
-                <w:sz w:val="24"/>
-                <w:szCs w:val="24"/>
-              </w:rPr>
-              <w:t xml:space="preserve">Decreto 51/2025, de 24 de febrero, por el que se regula la planificación y ordenación del empleo público, y el ingreso, promoción interna y provisión de puestos de trabajo del personal de la Administración General de la Junta de Andalucía.</w:t>
-            </w:r>
-          </w:p>
-        </w:tc>
-      </w:tr>
-    </w:tbl>
     <w:p>
       <w:pPr>
-        <w:spacing w:after="0" w:before="0" w:line="230" w:lineRule="exact"/>
+        <w:spacing w:after="58" w:before="0"/>
+      </w:pPr>
+      <w:r>
+        <w:drawing>
+          <wp:inline distT="0" distB="0" distL="0" distR="0">
+            <wp:extent cx="365669" cy="365669"/>
+            <wp:effectExtent t="0" r="0" b="0" l="0"/>
+            <wp:docPr id="1" name="" descr="" title=""/>
+            <wp:cNvGraphicFramePr>
+              <a:graphicFrameLocks xmlns:a="http://schemas.openxmlformats.org/drawingml/2006/main" noChangeAspect="1"/>
+            </wp:cNvGraphicFramePr>
+            <a:graphic xmlns:a="http://schemas.openxmlformats.org/drawingml/2006/main">
+              <a:graphicData uri="http://schemas.openxmlformats.org/drawingml/2006/picture">
+                <pic:pic xmlns:pic="http://schemas.openxmlformats.org/drawingml/2006/picture">
+                  <pic:nvPicPr>
+                    <pic:cNvPr id="0" name="" descr=""/>
+                    <pic:cNvPicPr>
+                      <a:picLocks noChangeAspect="1" noChangeArrowheads="1"/>
+                    </pic:cNvPicPr>
+                  </pic:nvPicPr>
+                  <pic:blipFill>
+                    <a:blip r:embed="rId15" cstate="none"/>
+                    <a:srcRect/>
+                    <a:stretch>
+                      <a:fillRect/>
+                    </a:stretch>
+                  </pic:blipFill>
+                  <pic:spPr bwMode="auto">
+                    <a:xfrm>
+                      <a:off x="0" y="0"/>
+                      <a:ext cx="365669" cy="365669"/>
+                    </a:xfrm>
+                    <a:prstGeom prst="rect">
+                      <a:avLst/>
+                    </a:prstGeom>
+                  </pic:spPr>
+                </pic:pic>
+              </a:graphicData>
+            </a:graphic>
+          </wp:inline>
+        </w:drawing>
+      </w:r>
+    </w:p>
+    <w:p>
+      <w:pPr>
+        <w:spacing w:after="0" w:before="0"/>
+      </w:pPr>
+      <w:r>
+        <w:drawing>
+          <wp:inline distT="0" distB="0" distL="0" distR="0">
+            <wp:extent cx="6115998" cy="1371300"/>
+            <wp:effectExtent l="0" t="0" r="0" b="0"/>
+            <wp:docPr id="5007" name="Forma 5007"/>
+            <wp:cNvGraphicFramePr/>
+            <a:graphic xmlns:a="http://schemas.openxmlformats.org/drawingml/2006/main">
+              <a:graphicData uri="http://schemas.microsoft.com/office/word/2010/wordprocessingShape">
+                <wps:wsp>
+                  <wps:cNvSpPr/>
+                  <wps:spPr>
+                    <a:xfrm>
+                      <a:off x="0" y="0"/>
+                      <a:ext cx="6115998" cy="1371300"/>
+                    </a:xfrm>
+                    <a:prstGeom prst="roundRect">
+                      <a:avLst>
+                        <a:gd name="adj" fmla="val 11000"/>
+                      </a:avLst>
+                    </a:prstGeom>
+                    <a:solidFill>
+                      <a:srgbClr val="D1EDF9"/>
+                    </a:solidFill>
+                    <a:ln>
+                      <a:noFill/>
+                    </a:ln>
+                  </wps:spPr>
+                  <wps:txbx>
+                    <w:txbxContent>
+                      <w:p>
+                        <w:pPr>
+                          <w:spacing w:before="0" w:after="0" w:line="300" w:lineRule="auto"/>
+                          <w:jc w:val="left"/>
+                        </w:pPr>
+                        <w:r>
+                          <w:rPr>
+                            <w:rFonts w:ascii="Poppins" w:hAnsi="Poppins" w:cs="Poppins"/>
+                            <w:b/>
+                            <w:bCs/>
+                            <w:color w:val="143548"/>
+                            <w:sz w:val="24"/>
+                            <w:szCs w:val="24"/>
+                          </w:rPr>
+                          <w:t xml:space="preserve">Decreto 51/2025, de 24 de febrero, por el que se regula la planificación y ordenación del empleo público, y el ingreso, promoción interna y provisión de puestos de trabajo del personal de la Administración General de la Junta de Andalucía.</w:t>
+                        </w:r>
+                      </w:p>
+                    </w:txbxContent>
+                  </wps:txbx>
+                  <wps:bodyPr rot="0" vert="horz" wrap="square" lIns="255976" tIns="127988" rIns="255976" bIns="127988" anchor="ctr" anchorCtr="0">
+                    <a:noAutofit/>
+                  </wps:bodyPr>
+                </wps:wsp>
+              </a:graphicData>
+            </a:graphic>
+          </wp:inline>
+        </w:drawing>
+      </w:r>
+    </w:p>
+    <w:p>
+      <w:pPr>
+        <w:spacing w:after="0" w:before="0" w:line="259" w:lineRule="exact"/>
       </w:pPr>
       <w:r>
         <w:rPr>
@@ -176,38 +683,55 @@
       <w:r>
         <w:drawing>
           <wp:inline distT="0" distB="0" distL="0" distR="0">
-            <wp:extent cx="1343832" cy="301677"/>
-            <wp:effectExtent t="0" r="0" b="0" l="0"/>
-            <wp:docPr id="1" name="" descr="" title=""/>
-            <wp:cNvGraphicFramePr>
-              <a:graphicFrameLocks xmlns:a="http://schemas.openxmlformats.org/drawingml/2006/main" noChangeAspect="1"/>
-            </wp:cNvGraphicFramePr>
+            <wp:extent cx="1371300" cy="292544"/>
+            <wp:effectExtent l="0" t="0" r="0" b="0"/>
+            <wp:docPr id="5008" name="Forma 5008"/>
+            <wp:cNvGraphicFramePr/>
             <a:graphic xmlns:a="http://schemas.openxmlformats.org/drawingml/2006/main">
-              <a:graphicData uri="http://schemas.openxmlformats.org/drawingml/2006/picture">
-                <pic:pic xmlns:pic="http://schemas.openxmlformats.org/drawingml/2006/picture">
-                  <pic:nvPicPr>
-                    <pic:cNvPr id="0" name="" descr=""/>
-                    <pic:cNvPicPr>
-                      <a:picLocks noChangeAspect="1" noChangeArrowheads="1"/>
-                    </pic:cNvPicPr>
-                  </pic:nvPicPr>
-                  <pic:blipFill>
-                    <a:blip r:embed="rId11" cstate="none"/>
-                    <a:srcRect/>
-                    <a:stretch>
-                      <a:fillRect/>
-                    </a:stretch>
-                  </pic:blipFill>
-                  <pic:spPr bwMode="auto">
+              <a:graphicData uri="http://schemas.microsoft.com/office/word/2010/wordprocessingShape">
+                <wps:wsp>
+                  <wps:cNvSpPr/>
+                  <wps:spPr>
                     <a:xfrm>
                       <a:off x="0" y="0"/>
-                      <a:ext cx="1343832" cy="301677"/>
+                      <a:ext cx="1371300" cy="292544"/>
                     </a:xfrm>
-                    <a:prstGeom prst="rect">
+                    <a:prstGeom prst="flowChartDelay">
                       <a:avLst/>
                     </a:prstGeom>
-                  </pic:spPr>
-                </pic:pic>
+                    <a:solidFill>
+                      <a:srgbClr val="143548"/>
+                    </a:solidFill>
+                    <a:ln>
+                      <a:noFill/>
+                    </a:ln>
+                  </wps:spPr>
+                  <wps:txbx>
+                    <w:txbxContent>
+                      <w:p>
+                        <w:pPr>
+                          <w:spacing w:before="0" w:after="0" w:line="240" w:lineRule="auto"/>
+                          <w:jc w:val="center"/>
+                        </w:pPr>
+                        <w:r>
+                          <w:rPr>
+                            <w:rFonts w:ascii="Poppins" w:hAnsi="Poppins" w:cs="Poppins"/>
+                            <w:b/>
+                            <w:bCs/>
+                            <w:color w:val="FFFFFF"/>
+                            <w:spacing w:val="42"/>
+                            <w:sz w:val="17"/>
+                            <w:szCs w:val="17"/>
+                          </w:rPr>
+                          <w:t xml:space="preserve">ESTRUCTURA</w:t>
+                        </w:r>
+                      </w:p>
+                    </w:txbxContent>
+                  </wps:txbx>
+                  <wps:bodyPr rot="0" vert="horz" wrap="square" lIns="54852" tIns="0" rIns="91420" bIns="0" anchor="ctr" anchorCtr="0">
+                    <a:noAutofit/>
+                  </wps:bodyPr>
+                </wps:wsp>
               </a:graphicData>
             </a:graphic>
           </wp:inline>
@@ -216,7 +740,7 @@
     </w:p>
     <w:p>
       <w:pPr>
-        <w:spacing w:after="0" w:before="0" w:line="173" w:lineRule="exact"/>
+        <w:spacing w:after="0" w:before="0" w:line="202" w:lineRule="exact"/>
       </w:pPr>
       <w:r>
         <w:rPr>
@@ -287,7 +811,7 @@
                           </pic:cNvPicPr>
                         </pic:nvPicPr>
                         <pic:blipFill>
-                          <a:blip r:embed="rId12" cstate="none"/>
+                          <a:blip r:embed="rId16" cstate="none"/>
                           <a:srcRect/>
                           <a:stretch>
                             <a:fillRect/>
@@ -361,1249 +885,7 @@
           </w:p>
           <w:p>
             <w:pPr>
-              <w:spacing w:after="0" w:before="0" w:line="144" w:lineRule="exact"/>
-            </w:pPr>
-            <w:r>
-              <w:rPr>
-                <w:sz w:val="2"/>
-                <w:szCs w:val="2"/>
-              </w:rPr>
-              <w:t xml:space="preserve"/>
-            </w:r>
-          </w:p>
-        </w:tc>
-      </w:tr>
-      <w:tr>
-        <w:tc>
-          <w:tcPr>
-            <w:tcW w:type="dxa" w:w="475"/>
-            <w:tcBorders>
-              <w:top w:val="none" w:color="FFFFFF" w:sz="0"/>
-              <w:left w:val="none" w:color="FFFFFF" w:sz="0"/>
-              <w:bottom w:val="none" w:color="FFFFFF" w:sz="0"/>
-              <w:right w:val="single" w:color="9DDFEA" w:sz="12"/>
-            </w:tcBorders>
-            <w:tcMar>
-              <w:top w:type="dxa" w:w="0"/>
-              <w:left w:type="dxa" w:w="0"/>
-              <w:bottom w:type="dxa" w:w="0"/>
-              <w:right w:type="dxa" w:w="0"/>
-            </w:tcMar>
-          </w:tcPr>
-          <w:p>
-            <w:pPr>
-              <w:spacing w:after="0" w:before="0" w:line="14" w:lineRule="exact"/>
-            </w:pPr>
-            <w:r>
-              <w:rPr>
-                <w:sz w:val="2"/>
-                <w:szCs w:val="2"/>
-              </w:rPr>
-              <w:t xml:space="preserve"/>
-            </w:r>
-          </w:p>
-        </w:tc>
-        <w:tc>
-          <w:tcPr>
-            <w:tcW w:type="dxa" w:w="475"/>
-            <w:tcBorders>
-              <w:top w:val="none" w:color="FFFFFF" w:sz="0"/>
-              <w:left w:val="single" w:color="9DDFEA" w:sz="12"/>
-              <w:bottom w:val="none" w:color="FFFFFF" w:sz="0"/>
-              <w:right w:val="none" w:color="FFFFFF" w:sz="0"/>
-            </w:tcBorders>
-            <w:tcMar>
-              <w:top w:type="dxa" w:w="0"/>
-              <w:left w:type="dxa" w:w="0"/>
-              <w:bottom w:type="dxa" w:w="0"/>
-              <w:right w:type="dxa" w:w="0"/>
-            </w:tcMar>
-          </w:tcPr>
-          <w:p>
-            <w:pPr>
-              <w:spacing w:after="0" w:before="0" w:line="14" w:lineRule="exact"/>
-            </w:pPr>
-            <w:r>
-              <w:rPr>
-                <w:sz w:val="2"/>
-                <w:szCs w:val="2"/>
-              </w:rPr>
-              <w:t xml:space="preserve"/>
-            </w:r>
-          </w:p>
-        </w:tc>
-        <w:tc>
-          <w:tcPr>
-            <w:vMerge w:val="continue"/>
-            <w:tcBorders>
-              <w:top w:val="none" w:color="FFFFFF" w:sz="0"/>
-              <w:left w:val="none" w:color="FFFFFF" w:sz="0"/>
-              <w:bottom w:val="none" w:color="FFFFFF" w:sz="0"/>
-              <w:right w:val="none" w:color="FFFFFF" w:sz="0"/>
-            </w:tcBorders>
-          </w:tcPr>
-          <w:p/>
-        </w:tc>
-      </w:tr>
-      <w:tr>
-        <w:tc>
-          <w:tcPr>
-            <w:tcW w:type="dxa" w:w="950"/>
-            <w:gridSpan w:val="2"/>
-            <w:tcBorders>
-              <w:top w:val="none" w:color="FFFFFF" w:sz="0"/>
-              <w:left w:val="none" w:color="FFFFFF" w:sz="0"/>
-              <w:bottom w:val="none" w:color="FFFFFF" w:sz="0"/>
-              <w:right w:val="none" w:color="FFFFFF" w:sz="0"/>
-            </w:tcBorders>
-            <w:tcMar>
-              <w:top w:type="dxa" w:w="0"/>
-              <w:left w:type="dxa" w:w="0"/>
-              <w:bottom w:type="dxa" w:w="0"/>
-              <w:right w:type="dxa" w:w="0"/>
-            </w:tcMar>
-            <w:vAlign w:val="top"/>
-          </w:tcPr>
-          <w:p>
-            <w:pPr>
-              <w:spacing w:after="0" w:before="0"/>
-              <w:jc w:val="center"/>
-            </w:pPr>
-            <w:r>
-              <w:drawing>
-                <wp:inline distT="0" distB="0" distL="0" distR="0">
-                  <wp:extent cx="402235" cy="447944"/>
-                  <wp:effectExtent t="0" r="0" b="0" l="0"/>
-                  <wp:docPr id="1" name="" descr="" title=""/>
-                  <wp:cNvGraphicFramePr>
-                    <a:graphicFrameLocks xmlns:a="http://schemas.openxmlformats.org/drawingml/2006/main" noChangeAspect="1"/>
-                  </wp:cNvGraphicFramePr>
-                  <a:graphic xmlns:a="http://schemas.openxmlformats.org/drawingml/2006/main">
-                    <a:graphicData uri="http://schemas.openxmlformats.org/drawingml/2006/picture">
-                      <pic:pic xmlns:pic="http://schemas.openxmlformats.org/drawingml/2006/picture">
-                        <pic:nvPicPr>
-                          <pic:cNvPr id="0" name="" descr=""/>
-                          <pic:cNvPicPr>
-                            <a:picLocks noChangeAspect="1" noChangeArrowheads="1"/>
-                          </pic:cNvPicPr>
-                        </pic:nvPicPr>
-                        <pic:blipFill>
-                          <a:blip r:embed="rId13" cstate="none"/>
-                          <a:srcRect/>
-                          <a:stretch>
-                            <a:fillRect/>
-                          </a:stretch>
-                        </pic:blipFill>
-                        <pic:spPr bwMode="auto">
-                          <a:xfrm>
-                            <a:off x="0" y="0"/>
-                            <a:ext cx="402235" cy="447944"/>
-                          </a:xfrm>
-                          <a:prstGeom prst="rect">
-                            <a:avLst/>
-                          </a:prstGeom>
-                        </pic:spPr>
-                      </pic:pic>
-                    </a:graphicData>
-                  </a:graphic>
-                </wp:inline>
-              </w:drawing>
-            </w:r>
-          </w:p>
-        </w:tc>
-        <w:tc>
-          <w:tcPr>
-            <w:tcW w:type="dxa" w:w="8681"/>
-            <w:vMerge w:val="restart"/>
-            <w:tcBorders>
-              <w:top w:val="none" w:color="FFFFFF" w:sz="0"/>
-              <w:left w:val="none" w:color="FFFFFF" w:sz="0"/>
-              <w:bottom w:val="none" w:color="FFFFFF" w:sz="0"/>
-              <w:right w:val="none" w:color="FFFFFF" w:sz="0"/>
-            </w:tcBorders>
-            <w:tcMar>
-              <w:top w:type="dxa" w:w="29"/>
-              <w:left w:type="dxa" w:w="0"/>
-              <w:bottom w:type="dxa" w:w="0"/>
-              <w:right w:type="dxa" w:w="0"/>
-            </w:tcMar>
-          </w:tcPr>
-          <w:p>
-            <w:pPr>
-              <w:spacing w:after="43" w:before="0"/>
-            </w:pPr>
-            <w:r>
-              <w:rPr>
-                <w:rFonts w:ascii="Poppins" w:cs="Poppins" w:eastAsia="Poppins" w:hAnsi="Poppins"/>
-                <w:b/>
-                <w:bCs/>
-                <w:color w:val="6F8290"/>
-                <w:sz w:val="12"/>
-                <w:szCs w:val="12"/>
-              </w:rPr>
-              <w:t xml:space="preserve">TÍTULO I</w:t>
-            </w:r>
-          </w:p>
-          <w:p>
-            <w:pPr>
-              <w:spacing w:after="86" w:before="0"/>
-            </w:pPr>
-            <w:r>
-              <w:rPr>
-                <w:rFonts w:ascii="Poppins" w:cs="Poppins" w:eastAsia="Poppins" w:hAnsi="Poppins"/>
-                <w:b/>
-                <w:bCs/>
-                <w:color w:val="143548"/>
-                <w:sz w:val="21"/>
-                <w:szCs w:val="21"/>
-              </w:rPr>
-              <w:t xml:space="preserve">Planificación y ordenación del empleo público</w:t>
-            </w:r>
-          </w:p>
-          <w:p>
-            <w:pPr>
-              <w:spacing w:after="0" w:before="0" w:line="372" w:lineRule="auto"/>
-            </w:pPr>
-            <w:r>
-              <w:rPr>
-                <w:rFonts w:ascii="Poppins" w:cs="Poppins" w:eastAsia="Poppins" w:hAnsi="Poppins"/>
-                <w:b/>
-                <w:bCs/>
-                <w:color w:val="143548"/>
-                <w:sz w:val="15"/>
-                <w:szCs w:val="15"/>
-                <w:shd w:fill="E3F3FA" w:color="auto" w:val="clear"/>
-              </w:rPr>
-              <w:t xml:space="preserve"> Capítulo I  </w:t>
-            </w:r>
-            <w:r>
-              <w:rPr>
-                <w:rFonts w:ascii="Poppins" w:cs="Poppins" w:eastAsia="Poppins" w:hAnsi="Poppins"/>
-                <w:color w:val="2B2B2B"/>
-                <w:sz w:val="15"/>
-                <w:szCs w:val="15"/>
-                <w:shd w:fill="E3F3FA" w:color="auto" w:val="clear"/>
-              </w:rPr>
-              <w:t xml:space="preserve">Planificación de recursos humanos </w:t>
-            </w:r>
-            <w:r>
-              <w:rPr>
-                <w:rFonts w:ascii="Poppins" w:cs="Poppins" w:eastAsia="Poppins" w:hAnsi="Poppins"/>
-                <w:sz w:val="15"/>
-                <w:szCs w:val="15"/>
-              </w:rPr>
-              <w:t xml:space="preserve">   </w:t>
-            </w:r>
-            <w:r>
-              <w:rPr>
-                <w:rFonts w:ascii="Poppins" w:cs="Poppins" w:eastAsia="Poppins" w:hAnsi="Poppins"/>
-                <w:b/>
-                <w:bCs/>
-                <w:color w:val="143548"/>
-                <w:sz w:val="15"/>
-                <w:szCs w:val="15"/>
-                <w:shd w:fill="E3F3FA" w:color="auto" w:val="clear"/>
-              </w:rPr>
-              <w:t xml:space="preserve"> Capítulo II  </w:t>
-            </w:r>
-            <w:r>
-              <w:rPr>
-                <w:rFonts w:ascii="Poppins" w:cs="Poppins" w:eastAsia="Poppins" w:hAnsi="Poppins"/>
-                <w:color w:val="2B2B2B"/>
-                <w:sz w:val="15"/>
-                <w:szCs w:val="15"/>
-                <w:shd w:fill="E3F3FA" w:color="auto" w:val="clear"/>
-              </w:rPr>
-              <w:t xml:space="preserve">Planes de ordenación de recursos humanos </w:t>
-            </w:r>
-            <w:r>
-              <w:rPr>
-                <w:rFonts w:ascii="Poppins" w:cs="Poppins" w:eastAsia="Poppins" w:hAnsi="Poppins"/>
-                <w:sz w:val="15"/>
-                <w:szCs w:val="15"/>
-              </w:rPr>
-              <w:t xml:space="preserve">   </w:t>
-            </w:r>
-            <w:r>
-              <w:rPr>
-                <w:rFonts w:ascii="Poppins" w:cs="Poppins" w:eastAsia="Poppins" w:hAnsi="Poppins"/>
-                <w:b/>
-                <w:bCs/>
-                <w:color w:val="143548"/>
-                <w:sz w:val="15"/>
-                <w:szCs w:val="15"/>
-                <w:shd w:fill="E3F3FA" w:color="auto" w:val="clear"/>
-              </w:rPr>
-              <w:t xml:space="preserve"> Capítulo III  </w:t>
-            </w:r>
-            <w:r>
-              <w:rPr>
-                <w:rFonts w:ascii="Poppins" w:cs="Poppins" w:eastAsia="Poppins" w:hAnsi="Poppins"/>
-                <w:color w:val="2B2B2B"/>
-                <w:sz w:val="15"/>
-                <w:szCs w:val="15"/>
-                <w:shd w:fill="E3F3FA" w:color="auto" w:val="clear"/>
-              </w:rPr>
-              <w:t xml:space="preserve">Oferta de empleo público </w:t>
-            </w:r>
-          </w:p>
-          <w:p>
-            <w:pPr>
-              <w:spacing w:after="0" w:before="0" w:line="144" w:lineRule="exact"/>
-            </w:pPr>
-            <w:r>
-              <w:rPr>
-                <w:sz w:val="2"/>
-                <w:szCs w:val="2"/>
-              </w:rPr>
-              <w:t xml:space="preserve"/>
-            </w:r>
-          </w:p>
-        </w:tc>
-      </w:tr>
-      <w:tr>
-        <w:tc>
-          <w:tcPr>
-            <w:tcW w:type="dxa" w:w="475"/>
-            <w:tcBorders>
-              <w:top w:val="none" w:color="FFFFFF" w:sz="0"/>
-              <w:left w:val="none" w:color="FFFFFF" w:sz="0"/>
-              <w:bottom w:val="none" w:color="FFFFFF" w:sz="0"/>
-              <w:right w:val="single" w:color="9DDFEA" w:sz="12"/>
-            </w:tcBorders>
-            <w:tcMar>
-              <w:top w:type="dxa" w:w="0"/>
-              <w:left w:type="dxa" w:w="0"/>
-              <w:bottom w:type="dxa" w:w="0"/>
-              <w:right w:type="dxa" w:w="0"/>
-            </w:tcMar>
-          </w:tcPr>
-          <w:p>
-            <w:pPr>
-              <w:spacing w:after="0" w:before="0" w:line="14" w:lineRule="exact"/>
-            </w:pPr>
-            <w:r>
-              <w:rPr>
-                <w:sz w:val="2"/>
-                <w:szCs w:val="2"/>
-              </w:rPr>
-              <w:t xml:space="preserve"/>
-            </w:r>
-          </w:p>
-        </w:tc>
-        <w:tc>
-          <w:tcPr>
-            <w:tcW w:type="dxa" w:w="475"/>
-            <w:tcBorders>
-              <w:top w:val="none" w:color="FFFFFF" w:sz="0"/>
-              <w:left w:val="single" w:color="9DDFEA" w:sz="12"/>
-              <w:bottom w:val="none" w:color="FFFFFF" w:sz="0"/>
-              <w:right w:val="none" w:color="FFFFFF" w:sz="0"/>
-            </w:tcBorders>
-            <w:tcMar>
-              <w:top w:type="dxa" w:w="0"/>
-              <w:left w:type="dxa" w:w="0"/>
-              <w:bottom w:type="dxa" w:w="0"/>
-              <w:right w:type="dxa" w:w="0"/>
-            </w:tcMar>
-          </w:tcPr>
-          <w:p>
-            <w:pPr>
-              <w:spacing w:after="0" w:before="0" w:line="14" w:lineRule="exact"/>
-            </w:pPr>
-            <w:r>
-              <w:rPr>
-                <w:sz w:val="2"/>
-                <w:szCs w:val="2"/>
-              </w:rPr>
-              <w:t xml:space="preserve"/>
-            </w:r>
-          </w:p>
-        </w:tc>
-        <w:tc>
-          <w:tcPr>
-            <w:vMerge w:val="continue"/>
-            <w:tcBorders>
-              <w:top w:val="none" w:color="FFFFFF" w:sz="0"/>
-              <w:left w:val="none" w:color="FFFFFF" w:sz="0"/>
-              <w:bottom w:val="none" w:color="FFFFFF" w:sz="0"/>
-              <w:right w:val="none" w:color="FFFFFF" w:sz="0"/>
-            </w:tcBorders>
-          </w:tcPr>
-          <w:p/>
-        </w:tc>
-      </w:tr>
-      <w:tr>
-        <w:tc>
-          <w:tcPr>
-            <w:tcW w:type="dxa" w:w="950"/>
-            <w:gridSpan w:val="2"/>
-            <w:tcBorders>
-              <w:top w:val="none" w:color="FFFFFF" w:sz="0"/>
-              <w:left w:val="none" w:color="FFFFFF" w:sz="0"/>
-              <w:bottom w:val="none" w:color="FFFFFF" w:sz="0"/>
-              <w:right w:val="none" w:color="FFFFFF" w:sz="0"/>
-            </w:tcBorders>
-            <w:tcMar>
-              <w:top w:type="dxa" w:w="0"/>
-              <w:left w:type="dxa" w:w="0"/>
-              <w:bottom w:type="dxa" w:w="0"/>
-              <w:right w:type="dxa" w:w="0"/>
-            </w:tcMar>
-            <w:vAlign w:val="top"/>
-          </w:tcPr>
-          <w:p>
-            <w:pPr>
-              <w:spacing w:after="0" w:before="0"/>
-              <w:jc w:val="center"/>
-            </w:pPr>
-            <w:r>
-              <w:drawing>
-                <wp:inline distT="0" distB="0" distL="0" distR="0">
-                  <wp:extent cx="402235" cy="447944"/>
-                  <wp:effectExtent t="0" r="0" b="0" l="0"/>
-                  <wp:docPr id="1" name="" descr="" title=""/>
-                  <wp:cNvGraphicFramePr>
-                    <a:graphicFrameLocks xmlns:a="http://schemas.openxmlformats.org/drawingml/2006/main" noChangeAspect="1"/>
-                  </wp:cNvGraphicFramePr>
-                  <a:graphic xmlns:a="http://schemas.openxmlformats.org/drawingml/2006/main">
-                    <a:graphicData uri="http://schemas.openxmlformats.org/drawingml/2006/picture">
-                      <pic:pic xmlns:pic="http://schemas.openxmlformats.org/drawingml/2006/picture">
-                        <pic:nvPicPr>
-                          <pic:cNvPr id="0" name="" descr=""/>
-                          <pic:cNvPicPr>
-                            <a:picLocks noChangeAspect="1" noChangeArrowheads="1"/>
-                          </pic:cNvPicPr>
-                        </pic:nvPicPr>
-                        <pic:blipFill>
-                          <a:blip r:embed="rId14" cstate="none"/>
-                          <a:srcRect/>
-                          <a:stretch>
-                            <a:fillRect/>
-                          </a:stretch>
-                        </pic:blipFill>
-                        <pic:spPr bwMode="auto">
-                          <a:xfrm>
-                            <a:off x="0" y="0"/>
-                            <a:ext cx="402235" cy="447944"/>
-                          </a:xfrm>
-                          <a:prstGeom prst="rect">
-                            <a:avLst/>
-                          </a:prstGeom>
-                        </pic:spPr>
-                      </pic:pic>
-                    </a:graphicData>
-                  </a:graphic>
-                </wp:inline>
-              </w:drawing>
-            </w:r>
-          </w:p>
-        </w:tc>
-        <w:tc>
-          <w:tcPr>
-            <w:tcW w:type="dxa" w:w="8681"/>
-            <w:vMerge w:val="restart"/>
-            <w:tcBorders>
-              <w:top w:val="none" w:color="FFFFFF" w:sz="0"/>
-              <w:left w:val="none" w:color="FFFFFF" w:sz="0"/>
-              <w:bottom w:val="none" w:color="FFFFFF" w:sz="0"/>
-              <w:right w:val="none" w:color="FFFFFF" w:sz="0"/>
-            </w:tcBorders>
-            <w:tcMar>
-              <w:top w:type="dxa" w:w="29"/>
-              <w:left w:type="dxa" w:w="0"/>
-              <w:bottom w:type="dxa" w:w="0"/>
-              <w:right w:type="dxa" w:w="0"/>
-            </w:tcMar>
-          </w:tcPr>
-          <w:p>
-            <w:pPr>
-              <w:spacing w:after="43" w:before="0"/>
-            </w:pPr>
-            <w:r>
-              <w:rPr>
-                <w:rFonts w:ascii="Poppins" w:cs="Poppins" w:eastAsia="Poppins" w:hAnsi="Poppins"/>
-                <w:b/>
-                <w:bCs/>
-                <w:color w:val="6F8290"/>
-                <w:sz w:val="12"/>
-                <w:szCs w:val="12"/>
-              </w:rPr>
-              <w:t xml:space="preserve">TÍTULO II</w:t>
-            </w:r>
-          </w:p>
-          <w:p>
-            <w:pPr>
-              <w:spacing w:after="86" w:before="0"/>
-            </w:pPr>
-            <w:r>
-              <w:rPr>
-                <w:rFonts w:ascii="Poppins" w:cs="Poppins" w:eastAsia="Poppins" w:hAnsi="Poppins"/>
-                <w:b/>
-                <w:bCs/>
-                <w:color w:val="143548"/>
-                <w:sz w:val="21"/>
-                <w:szCs w:val="21"/>
-              </w:rPr>
-              <w:t xml:space="preserve">Selección de personal</w:t>
-            </w:r>
-          </w:p>
-          <w:p>
-            <w:pPr>
-              <w:spacing w:after="0" w:before="0" w:line="372" w:lineRule="auto"/>
-            </w:pPr>
-            <w:r>
-              <w:rPr>
-                <w:rFonts w:ascii="Poppins" w:cs="Poppins" w:eastAsia="Poppins" w:hAnsi="Poppins"/>
-                <w:b/>
-                <w:bCs/>
-                <w:color w:val="143548"/>
-                <w:sz w:val="15"/>
-                <w:szCs w:val="15"/>
-                <w:shd w:fill="E3F3FA" w:color="auto" w:val="clear"/>
-              </w:rPr>
-              <w:t xml:space="preserve"> Capítulo I  </w:t>
-            </w:r>
-            <w:r>
-              <w:rPr>
-                <w:rFonts w:ascii="Poppins" w:cs="Poppins" w:eastAsia="Poppins" w:hAnsi="Poppins"/>
-                <w:color w:val="2B2B2B"/>
-                <w:sz w:val="15"/>
-                <w:szCs w:val="15"/>
-                <w:shd w:fill="E3F3FA" w:color="auto" w:val="clear"/>
-              </w:rPr>
-              <w:t xml:space="preserve">Normas generales </w:t>
-            </w:r>
-            <w:r>
-              <w:rPr>
-                <w:rFonts w:ascii="Poppins" w:cs="Poppins" w:eastAsia="Poppins" w:hAnsi="Poppins"/>
-                <w:sz w:val="15"/>
-                <w:szCs w:val="15"/>
-              </w:rPr>
-              <w:t xml:space="preserve">   </w:t>
-            </w:r>
-            <w:r>
-              <w:rPr>
-                <w:rFonts w:ascii="Poppins" w:cs="Poppins" w:eastAsia="Poppins" w:hAnsi="Poppins"/>
-                <w:b/>
-                <w:bCs/>
-                <w:color w:val="143548"/>
-                <w:sz w:val="15"/>
-                <w:szCs w:val="15"/>
-                <w:shd w:fill="E3F3FA" w:color="auto" w:val="clear"/>
-              </w:rPr>
-              <w:t xml:space="preserve"> Capítulo II  </w:t>
-            </w:r>
-            <w:r>
-              <w:rPr>
-                <w:rFonts w:ascii="Poppins" w:cs="Poppins" w:eastAsia="Poppins" w:hAnsi="Poppins"/>
-                <w:color w:val="2B2B2B"/>
-                <w:sz w:val="15"/>
-                <w:szCs w:val="15"/>
-                <w:shd w:fill="E3F3FA" w:color="auto" w:val="clear"/>
-              </w:rPr>
-              <w:t xml:space="preserve">Sistema de selección </w:t>
-            </w:r>
-            <w:r>
-              <w:rPr>
-                <w:rFonts w:ascii="Poppins" w:cs="Poppins" w:eastAsia="Poppins" w:hAnsi="Poppins"/>
-                <w:sz w:val="15"/>
-                <w:szCs w:val="15"/>
-              </w:rPr>
-              <w:t xml:space="preserve">   </w:t>
-            </w:r>
-            <w:r>
-              <w:rPr>
-                <w:rFonts w:ascii="Poppins" w:cs="Poppins" w:eastAsia="Poppins" w:hAnsi="Poppins"/>
-                <w:b/>
-                <w:bCs/>
-                <w:color w:val="143548"/>
-                <w:sz w:val="15"/>
-                <w:szCs w:val="15"/>
-                <w:shd w:fill="E3F3FA" w:color="auto" w:val="clear"/>
-              </w:rPr>
-              <w:t xml:space="preserve"> Capítulo III  </w:t>
-            </w:r>
-            <w:r>
-              <w:rPr>
-                <w:rFonts w:ascii="Poppins" w:cs="Poppins" w:eastAsia="Poppins" w:hAnsi="Poppins"/>
-                <w:color w:val="2B2B2B"/>
-                <w:sz w:val="15"/>
-                <w:szCs w:val="15"/>
-                <w:shd w:fill="E3F3FA" w:color="auto" w:val="clear"/>
-              </w:rPr>
-              <w:t xml:space="preserve">Inicio y desarrollo de los procesos selectivos </w:t>
-            </w:r>
-            <w:r>
-              <w:rPr>
-                <w:rFonts w:ascii="Poppins" w:cs="Poppins" w:eastAsia="Poppins" w:hAnsi="Poppins"/>
-                <w:sz w:val="15"/>
-                <w:szCs w:val="15"/>
-              </w:rPr>
-              <w:t xml:space="preserve">   </w:t>
-            </w:r>
-            <w:r>
-              <w:rPr>
-                <w:rFonts w:ascii="Poppins" w:cs="Poppins" w:eastAsia="Poppins" w:hAnsi="Poppins"/>
-                <w:b/>
-                <w:bCs/>
-                <w:color w:val="143548"/>
-                <w:sz w:val="15"/>
-                <w:szCs w:val="15"/>
-                <w:shd w:fill="E3F3FA" w:color="auto" w:val="clear"/>
-              </w:rPr>
-              <w:t xml:space="preserve"> Capítulo IV  </w:t>
-            </w:r>
-            <w:r>
-              <w:rPr>
-                <w:rFonts w:ascii="Poppins" w:cs="Poppins" w:eastAsia="Poppins" w:hAnsi="Poppins"/>
-                <w:color w:val="2B2B2B"/>
-                <w:sz w:val="15"/>
-                <w:szCs w:val="15"/>
-                <w:shd w:fill="E3F3FA" w:color="auto" w:val="clear"/>
-              </w:rPr>
-              <w:t xml:space="preserve">Personal funcionario en prácticas </w:t>
-            </w:r>
-            <w:r>
-              <w:rPr>
-                <w:rFonts w:ascii="Poppins" w:cs="Poppins" w:eastAsia="Poppins" w:hAnsi="Poppins"/>
-                <w:sz w:val="15"/>
-                <w:szCs w:val="15"/>
-              </w:rPr>
-              <w:t xml:space="preserve">   </w:t>
-            </w:r>
-            <w:r>
-              <w:rPr>
-                <w:rFonts w:ascii="Poppins" w:cs="Poppins" w:eastAsia="Poppins" w:hAnsi="Poppins"/>
-                <w:b/>
-                <w:bCs/>
-                <w:color w:val="143548"/>
-                <w:sz w:val="15"/>
-                <w:szCs w:val="15"/>
-                <w:shd w:fill="E3F3FA" w:color="auto" w:val="clear"/>
-              </w:rPr>
-              <w:t xml:space="preserve"> Capítulo V  </w:t>
-            </w:r>
-            <w:r>
-              <w:rPr>
-                <w:rFonts w:ascii="Poppins" w:cs="Poppins" w:eastAsia="Poppins" w:hAnsi="Poppins"/>
-                <w:color w:val="2B2B2B"/>
-                <w:sz w:val="15"/>
-                <w:szCs w:val="15"/>
-                <w:shd w:fill="E3F3FA" w:color="auto" w:val="clear"/>
-              </w:rPr>
-              <w:t xml:space="preserve">Comisiones de selección </w:t>
-            </w:r>
-            <w:r>
-              <w:rPr>
-                <w:rFonts w:ascii="Poppins" w:cs="Poppins" w:eastAsia="Poppins" w:hAnsi="Poppins"/>
-                <w:sz w:val="15"/>
-                <w:szCs w:val="15"/>
-              </w:rPr>
-              <w:t xml:space="preserve">   </w:t>
-            </w:r>
-            <w:r>
-              <w:rPr>
-                <w:rFonts w:ascii="Poppins" w:cs="Poppins" w:eastAsia="Poppins" w:hAnsi="Poppins"/>
-                <w:b/>
-                <w:bCs/>
-                <w:color w:val="143548"/>
-                <w:sz w:val="15"/>
-                <w:szCs w:val="15"/>
-                <w:shd w:fill="E3F3FA" w:color="auto" w:val="clear"/>
-              </w:rPr>
-              <w:t xml:space="preserve"> Capítulo VI  </w:t>
-            </w:r>
-            <w:r>
-              <w:rPr>
-                <w:rFonts w:ascii="Poppins" w:cs="Poppins" w:eastAsia="Poppins" w:hAnsi="Poppins"/>
-                <w:color w:val="2B2B2B"/>
-                <w:sz w:val="15"/>
-                <w:szCs w:val="15"/>
-                <w:shd w:fill="E3F3FA" w:color="auto" w:val="clear"/>
-              </w:rPr>
-              <w:t xml:space="preserve">Selección de personal funcionario interino y personal laboral temporal </w:t>
-            </w:r>
-          </w:p>
-          <w:p>
-            <w:pPr>
-              <w:spacing w:after="0" w:before="0" w:line="144" w:lineRule="exact"/>
-            </w:pPr>
-            <w:r>
-              <w:rPr>
-                <w:sz w:val="2"/>
-                <w:szCs w:val="2"/>
-              </w:rPr>
-              <w:t xml:space="preserve"/>
-            </w:r>
-          </w:p>
-        </w:tc>
-      </w:tr>
-      <w:tr>
-        <w:tc>
-          <w:tcPr>
-            <w:tcW w:type="dxa" w:w="475"/>
-            <w:tcBorders>
-              <w:top w:val="none" w:color="FFFFFF" w:sz="0"/>
-              <w:left w:val="none" w:color="FFFFFF" w:sz="0"/>
-              <w:bottom w:val="none" w:color="FFFFFF" w:sz="0"/>
-              <w:right w:val="single" w:color="9DDFEA" w:sz="12"/>
-            </w:tcBorders>
-            <w:tcMar>
-              <w:top w:type="dxa" w:w="0"/>
-              <w:left w:type="dxa" w:w="0"/>
-              <w:bottom w:type="dxa" w:w="0"/>
-              <w:right w:type="dxa" w:w="0"/>
-            </w:tcMar>
-          </w:tcPr>
-          <w:p>
-            <w:pPr>
-              <w:spacing w:after="0" w:before="0" w:line="14" w:lineRule="exact"/>
-            </w:pPr>
-            <w:r>
-              <w:rPr>
-                <w:sz w:val="2"/>
-                <w:szCs w:val="2"/>
-              </w:rPr>
-              <w:t xml:space="preserve"/>
-            </w:r>
-          </w:p>
-        </w:tc>
-        <w:tc>
-          <w:tcPr>
-            <w:tcW w:type="dxa" w:w="475"/>
-            <w:tcBorders>
-              <w:top w:val="none" w:color="FFFFFF" w:sz="0"/>
-              <w:left w:val="single" w:color="9DDFEA" w:sz="12"/>
-              <w:bottom w:val="none" w:color="FFFFFF" w:sz="0"/>
-              <w:right w:val="none" w:color="FFFFFF" w:sz="0"/>
-            </w:tcBorders>
-            <w:tcMar>
-              <w:top w:type="dxa" w:w="0"/>
-              <w:left w:type="dxa" w:w="0"/>
-              <w:bottom w:type="dxa" w:w="0"/>
-              <w:right w:type="dxa" w:w="0"/>
-            </w:tcMar>
-          </w:tcPr>
-          <w:p>
-            <w:pPr>
-              <w:spacing w:after="0" w:before="0" w:line="14" w:lineRule="exact"/>
-            </w:pPr>
-            <w:r>
-              <w:rPr>
-                <w:sz w:val="2"/>
-                <w:szCs w:val="2"/>
-              </w:rPr>
-              <w:t xml:space="preserve"/>
-            </w:r>
-          </w:p>
-        </w:tc>
-        <w:tc>
-          <w:tcPr>
-            <w:vMerge w:val="continue"/>
-            <w:tcBorders>
-              <w:top w:val="none" w:color="FFFFFF" w:sz="0"/>
-              <w:left w:val="none" w:color="FFFFFF" w:sz="0"/>
-              <w:bottom w:val="none" w:color="FFFFFF" w:sz="0"/>
-              <w:right w:val="none" w:color="FFFFFF" w:sz="0"/>
-            </w:tcBorders>
-          </w:tcPr>
-          <w:p/>
-        </w:tc>
-      </w:tr>
-      <w:tr>
-        <w:tc>
-          <w:tcPr>
-            <w:tcW w:type="dxa" w:w="950"/>
-            <w:gridSpan w:val="2"/>
-            <w:tcBorders>
-              <w:top w:val="none" w:color="FFFFFF" w:sz="0"/>
-              <w:left w:val="none" w:color="FFFFFF" w:sz="0"/>
-              <w:bottom w:val="none" w:color="FFFFFF" w:sz="0"/>
-              <w:right w:val="none" w:color="FFFFFF" w:sz="0"/>
-            </w:tcBorders>
-            <w:tcMar>
-              <w:top w:type="dxa" w:w="0"/>
-              <w:left w:type="dxa" w:w="0"/>
-              <w:bottom w:type="dxa" w:w="0"/>
-              <w:right w:type="dxa" w:w="0"/>
-            </w:tcMar>
-            <w:vAlign w:val="top"/>
-          </w:tcPr>
-          <w:p>
-            <w:pPr>
-              <w:spacing w:after="0" w:before="0"/>
-              <w:jc w:val="center"/>
-            </w:pPr>
-            <w:r>
-              <w:drawing>
-                <wp:inline distT="0" distB="0" distL="0" distR="0">
-                  <wp:extent cx="402235" cy="447944"/>
-                  <wp:effectExtent t="0" r="0" b="0" l="0"/>
-                  <wp:docPr id="1" name="" descr="" title=""/>
-                  <wp:cNvGraphicFramePr>
-                    <a:graphicFrameLocks xmlns:a="http://schemas.openxmlformats.org/drawingml/2006/main" noChangeAspect="1"/>
-                  </wp:cNvGraphicFramePr>
-                  <a:graphic xmlns:a="http://schemas.openxmlformats.org/drawingml/2006/main">
-                    <a:graphicData uri="http://schemas.openxmlformats.org/drawingml/2006/picture">
-                      <pic:pic xmlns:pic="http://schemas.openxmlformats.org/drawingml/2006/picture">
-                        <pic:nvPicPr>
-                          <pic:cNvPr id="0" name="" descr=""/>
-                          <pic:cNvPicPr>
-                            <a:picLocks noChangeAspect="1" noChangeArrowheads="1"/>
-                          </pic:cNvPicPr>
-                        </pic:nvPicPr>
-                        <pic:blipFill>
-                          <a:blip r:embed="rId15" cstate="none"/>
-                          <a:srcRect/>
-                          <a:stretch>
-                            <a:fillRect/>
-                          </a:stretch>
-                        </pic:blipFill>
-                        <pic:spPr bwMode="auto">
-                          <a:xfrm>
-                            <a:off x="0" y="0"/>
-                            <a:ext cx="402235" cy="447944"/>
-                          </a:xfrm>
-                          <a:prstGeom prst="rect">
-                            <a:avLst/>
-                          </a:prstGeom>
-                        </pic:spPr>
-                      </pic:pic>
-                    </a:graphicData>
-                  </a:graphic>
-                </wp:inline>
-              </w:drawing>
-            </w:r>
-          </w:p>
-        </w:tc>
-        <w:tc>
-          <w:tcPr>
-            <w:tcW w:type="dxa" w:w="8681"/>
-            <w:vMerge w:val="restart"/>
-            <w:tcBorders>
-              <w:top w:val="none" w:color="FFFFFF" w:sz="0"/>
-              <w:left w:val="none" w:color="FFFFFF" w:sz="0"/>
-              <w:bottom w:val="none" w:color="FFFFFF" w:sz="0"/>
-              <w:right w:val="none" w:color="FFFFFF" w:sz="0"/>
-            </w:tcBorders>
-            <w:tcMar>
-              <w:top w:type="dxa" w:w="29"/>
-              <w:left w:type="dxa" w:w="0"/>
-              <w:bottom w:type="dxa" w:w="0"/>
-              <w:right w:type="dxa" w:w="0"/>
-            </w:tcMar>
-          </w:tcPr>
-          <w:p>
-            <w:pPr>
-              <w:spacing w:after="43" w:before="0"/>
-            </w:pPr>
-            <w:r>
-              <w:rPr>
-                <w:rFonts w:ascii="Poppins" w:cs="Poppins" w:eastAsia="Poppins" w:hAnsi="Poppins"/>
-                <w:b/>
-                <w:bCs/>
-                <w:color w:val="6F8290"/>
-                <w:sz w:val="12"/>
-                <w:szCs w:val="12"/>
-              </w:rPr>
-              <w:t xml:space="preserve">TÍTULO III</w:t>
-            </w:r>
-          </w:p>
-          <w:p>
-            <w:pPr>
-              <w:spacing w:after="86" w:before="0"/>
-            </w:pPr>
-            <w:r>
-              <w:rPr>
-                <w:rFonts w:ascii="Poppins" w:cs="Poppins" w:eastAsia="Poppins" w:hAnsi="Poppins"/>
-                <w:b/>
-                <w:bCs/>
-                <w:color w:val="143548"/>
-                <w:sz w:val="21"/>
-                <w:szCs w:val="21"/>
-              </w:rPr>
-              <w:t xml:space="preserve">Promoción interna del personal funcionario de carrera y del personal laboral</w:t>
-            </w:r>
-          </w:p>
-          <w:p>
-            <w:pPr>
-              <w:spacing w:after="0" w:before="0" w:line="372" w:lineRule="auto"/>
-            </w:pPr>
-            <w:r>
-              <w:rPr>
-                <w:rFonts w:ascii="Poppins" w:cs="Poppins" w:eastAsia="Poppins" w:hAnsi="Poppins"/>
-                <w:b/>
-                <w:bCs/>
-                <w:color w:val="143548"/>
-                <w:sz w:val="15"/>
-                <w:szCs w:val="15"/>
-                <w:shd w:fill="E3F3FA" w:color="auto" w:val="clear"/>
-              </w:rPr>
-              <w:t xml:space="preserve"> Capítulo I  </w:t>
-            </w:r>
-            <w:r>
-              <w:rPr>
-                <w:rFonts w:ascii="Poppins" w:cs="Poppins" w:eastAsia="Poppins" w:hAnsi="Poppins"/>
-                <w:color w:val="2B2B2B"/>
-                <w:sz w:val="15"/>
-                <w:szCs w:val="15"/>
-                <w:shd w:fill="E3F3FA" w:color="auto" w:val="clear"/>
-              </w:rPr>
-              <w:t xml:space="preserve">Normas generales </w:t>
-            </w:r>
-            <w:r>
-              <w:rPr>
-                <w:rFonts w:ascii="Poppins" w:cs="Poppins" w:eastAsia="Poppins" w:hAnsi="Poppins"/>
-                <w:sz w:val="15"/>
-                <w:szCs w:val="15"/>
-              </w:rPr>
-              <w:t xml:space="preserve">   </w:t>
-            </w:r>
-            <w:r>
-              <w:rPr>
-                <w:rFonts w:ascii="Poppins" w:cs="Poppins" w:eastAsia="Poppins" w:hAnsi="Poppins"/>
-                <w:b/>
-                <w:bCs/>
-                <w:color w:val="143548"/>
-                <w:sz w:val="15"/>
-                <w:szCs w:val="15"/>
-                <w:shd w:fill="E3F3FA" w:color="auto" w:val="clear"/>
-              </w:rPr>
-              <w:t xml:space="preserve"> Capítulo II  </w:t>
-            </w:r>
-            <w:r>
-              <w:rPr>
-                <w:rFonts w:ascii="Poppins" w:cs="Poppins" w:eastAsia="Poppins" w:hAnsi="Poppins"/>
-                <w:color w:val="2B2B2B"/>
-                <w:sz w:val="15"/>
-                <w:szCs w:val="15"/>
-                <w:shd w:fill="E3F3FA" w:color="auto" w:val="clear"/>
-              </w:rPr>
-              <w:t xml:space="preserve">Promoción interna vertical del personal funcionario de carrera </w:t>
-            </w:r>
-            <w:r>
-              <w:rPr>
-                <w:rFonts w:ascii="Poppins" w:cs="Poppins" w:eastAsia="Poppins" w:hAnsi="Poppins"/>
-                <w:sz w:val="15"/>
-                <w:szCs w:val="15"/>
-              </w:rPr>
-              <w:t xml:space="preserve">   </w:t>
-            </w:r>
-            <w:r>
-              <w:rPr>
-                <w:rFonts w:ascii="Poppins" w:cs="Poppins" w:eastAsia="Poppins" w:hAnsi="Poppins"/>
-                <w:b/>
-                <w:bCs/>
-                <w:color w:val="143548"/>
-                <w:sz w:val="15"/>
-                <w:szCs w:val="15"/>
-                <w:shd w:fill="E3F3FA" w:color="auto" w:val="clear"/>
-              </w:rPr>
-              <w:t xml:space="preserve"> Capítulo III  </w:t>
-            </w:r>
-            <w:r>
-              <w:rPr>
-                <w:rFonts w:ascii="Poppins" w:cs="Poppins" w:eastAsia="Poppins" w:hAnsi="Poppins"/>
-                <w:color w:val="2B2B2B"/>
-                <w:sz w:val="15"/>
-                <w:szCs w:val="15"/>
-                <w:shd w:fill="E3F3FA" w:color="auto" w:val="clear"/>
-              </w:rPr>
-              <w:t xml:space="preserve">Promoción interna horizontal del personal funcionario de carrera </w:t>
-            </w:r>
-          </w:p>
-          <w:p>
-            <w:pPr>
-              <w:spacing w:after="0" w:before="0" w:line="144" w:lineRule="exact"/>
-            </w:pPr>
-            <w:r>
-              <w:rPr>
-                <w:sz w:val="2"/>
-                <w:szCs w:val="2"/>
-              </w:rPr>
-              <w:t xml:space="preserve"/>
-            </w:r>
-          </w:p>
-        </w:tc>
-      </w:tr>
-      <w:tr>
-        <w:tc>
-          <w:tcPr>
-            <w:tcW w:type="dxa" w:w="475"/>
-            <w:tcBorders>
-              <w:top w:val="none" w:color="FFFFFF" w:sz="0"/>
-              <w:left w:val="none" w:color="FFFFFF" w:sz="0"/>
-              <w:bottom w:val="none" w:color="FFFFFF" w:sz="0"/>
-              <w:right w:val="single" w:color="9DDFEA" w:sz="12"/>
-            </w:tcBorders>
-            <w:tcMar>
-              <w:top w:type="dxa" w:w="0"/>
-              <w:left w:type="dxa" w:w="0"/>
-              <w:bottom w:type="dxa" w:w="0"/>
-              <w:right w:type="dxa" w:w="0"/>
-            </w:tcMar>
-          </w:tcPr>
-          <w:p>
-            <w:pPr>
-              <w:spacing w:after="0" w:before="0" w:line="14" w:lineRule="exact"/>
-            </w:pPr>
-            <w:r>
-              <w:rPr>
-                <w:sz w:val="2"/>
-                <w:szCs w:val="2"/>
-              </w:rPr>
-              <w:t xml:space="preserve"/>
-            </w:r>
-          </w:p>
-        </w:tc>
-        <w:tc>
-          <w:tcPr>
-            <w:tcW w:type="dxa" w:w="475"/>
-            <w:tcBorders>
-              <w:top w:val="none" w:color="FFFFFF" w:sz="0"/>
-              <w:left w:val="single" w:color="9DDFEA" w:sz="12"/>
-              <w:bottom w:val="none" w:color="FFFFFF" w:sz="0"/>
-              <w:right w:val="none" w:color="FFFFFF" w:sz="0"/>
-            </w:tcBorders>
-            <w:tcMar>
-              <w:top w:type="dxa" w:w="0"/>
-              <w:left w:type="dxa" w:w="0"/>
-              <w:bottom w:type="dxa" w:w="0"/>
-              <w:right w:type="dxa" w:w="0"/>
-            </w:tcMar>
-          </w:tcPr>
-          <w:p>
-            <w:pPr>
-              <w:spacing w:after="0" w:before="0" w:line="14" w:lineRule="exact"/>
-            </w:pPr>
-            <w:r>
-              <w:rPr>
-                <w:sz w:val="2"/>
-                <w:szCs w:val="2"/>
-              </w:rPr>
-              <w:t xml:space="preserve"/>
-            </w:r>
-          </w:p>
-        </w:tc>
-        <w:tc>
-          <w:tcPr>
-            <w:vMerge w:val="continue"/>
-            <w:tcBorders>
-              <w:top w:val="none" w:color="FFFFFF" w:sz="0"/>
-              <w:left w:val="none" w:color="FFFFFF" w:sz="0"/>
-              <w:bottom w:val="none" w:color="FFFFFF" w:sz="0"/>
-              <w:right w:val="none" w:color="FFFFFF" w:sz="0"/>
-            </w:tcBorders>
-          </w:tcPr>
-          <w:p/>
-        </w:tc>
-      </w:tr>
-      <w:tr>
-        <w:tc>
-          <w:tcPr>
-            <w:tcW w:type="dxa" w:w="950"/>
-            <w:gridSpan w:val="2"/>
-            <w:tcBorders>
-              <w:top w:val="none" w:color="FFFFFF" w:sz="0"/>
-              <w:left w:val="none" w:color="FFFFFF" w:sz="0"/>
-              <w:bottom w:val="none" w:color="FFFFFF" w:sz="0"/>
-              <w:right w:val="none" w:color="FFFFFF" w:sz="0"/>
-            </w:tcBorders>
-            <w:tcMar>
-              <w:top w:type="dxa" w:w="0"/>
-              <w:left w:type="dxa" w:w="0"/>
-              <w:bottom w:type="dxa" w:w="0"/>
-              <w:right w:type="dxa" w:w="0"/>
-            </w:tcMar>
-            <w:vAlign w:val="top"/>
-          </w:tcPr>
-          <w:p>
-            <w:pPr>
-              <w:spacing w:after="0" w:before="0"/>
-              <w:jc w:val="center"/>
-            </w:pPr>
-            <w:r>
-              <w:drawing>
-                <wp:inline distT="0" distB="0" distL="0" distR="0">
-                  <wp:extent cx="402235" cy="447944"/>
-                  <wp:effectExtent t="0" r="0" b="0" l="0"/>
-                  <wp:docPr id="1" name="" descr="" title=""/>
-                  <wp:cNvGraphicFramePr>
-                    <a:graphicFrameLocks xmlns:a="http://schemas.openxmlformats.org/drawingml/2006/main" noChangeAspect="1"/>
-                  </wp:cNvGraphicFramePr>
-                  <a:graphic xmlns:a="http://schemas.openxmlformats.org/drawingml/2006/main">
-                    <a:graphicData uri="http://schemas.openxmlformats.org/drawingml/2006/picture">
-                      <pic:pic xmlns:pic="http://schemas.openxmlformats.org/drawingml/2006/picture">
-                        <pic:nvPicPr>
-                          <pic:cNvPr id="0" name="" descr=""/>
-                          <pic:cNvPicPr>
-                            <a:picLocks noChangeAspect="1" noChangeArrowheads="1"/>
-                          </pic:cNvPicPr>
-                        </pic:nvPicPr>
-                        <pic:blipFill>
-                          <a:blip r:embed="rId16" cstate="none"/>
-                          <a:srcRect/>
-                          <a:stretch>
-                            <a:fillRect/>
-                          </a:stretch>
-                        </pic:blipFill>
-                        <pic:spPr bwMode="auto">
-                          <a:xfrm>
-                            <a:off x="0" y="0"/>
-                            <a:ext cx="402235" cy="447944"/>
-                          </a:xfrm>
-                          <a:prstGeom prst="rect">
-                            <a:avLst/>
-                          </a:prstGeom>
-                        </pic:spPr>
-                      </pic:pic>
-                    </a:graphicData>
-                  </a:graphic>
-                </wp:inline>
-              </w:drawing>
-            </w:r>
-          </w:p>
-        </w:tc>
-        <w:tc>
-          <w:tcPr>
-            <w:tcW w:type="dxa" w:w="8681"/>
-            <w:vMerge w:val="restart"/>
-            <w:tcBorders>
-              <w:top w:val="none" w:color="FFFFFF" w:sz="0"/>
-              <w:left w:val="none" w:color="FFFFFF" w:sz="0"/>
-              <w:bottom w:val="none" w:color="FFFFFF" w:sz="0"/>
-              <w:right w:val="none" w:color="FFFFFF" w:sz="0"/>
-            </w:tcBorders>
-            <w:tcMar>
-              <w:top w:type="dxa" w:w="29"/>
-              <w:left w:type="dxa" w:w="0"/>
-              <w:bottom w:type="dxa" w:w="0"/>
-              <w:right w:type="dxa" w:w="0"/>
-            </w:tcMar>
-          </w:tcPr>
-          <w:p>
-            <w:pPr>
-              <w:spacing w:after="43" w:before="0"/>
-            </w:pPr>
-            <w:r>
-              <w:rPr>
-                <w:rFonts w:ascii="Poppins" w:cs="Poppins" w:eastAsia="Poppins" w:hAnsi="Poppins"/>
-                <w:b/>
-                <w:bCs/>
-                <w:color w:val="6F8290"/>
-                <w:sz w:val="12"/>
-                <w:szCs w:val="12"/>
-              </w:rPr>
-              <w:t xml:space="preserve">TÍTULO IV</w:t>
-            </w:r>
-          </w:p>
-          <w:p>
-            <w:pPr>
-              <w:spacing w:after="86" w:before="0"/>
-            </w:pPr>
-            <w:r>
-              <w:rPr>
-                <w:rFonts w:ascii="Poppins" w:cs="Poppins" w:eastAsia="Poppins" w:hAnsi="Poppins"/>
-                <w:b/>
-                <w:bCs/>
-                <w:color w:val="143548"/>
-                <w:sz w:val="21"/>
-                <w:szCs w:val="21"/>
-              </w:rPr>
-              <w:t xml:space="preserve">Provisión de puestos de trabajo y movilidad del personal funcionario y laboral</w:t>
-            </w:r>
-          </w:p>
-          <w:p>
-            <w:pPr>
-              <w:spacing w:after="0" w:before="0" w:line="372" w:lineRule="auto"/>
-            </w:pPr>
-            <w:r>
-              <w:rPr>
-                <w:rFonts w:ascii="Poppins" w:cs="Poppins" w:eastAsia="Poppins" w:hAnsi="Poppins"/>
-                <w:b/>
-                <w:bCs/>
-                <w:color w:val="143548"/>
-                <w:sz w:val="15"/>
-                <w:szCs w:val="15"/>
-                <w:shd w:fill="E3F3FA" w:color="auto" w:val="clear"/>
-              </w:rPr>
-              <w:t xml:space="preserve"> Capítulo I  </w:t>
-            </w:r>
-            <w:r>
-              <w:rPr>
-                <w:rFonts w:ascii="Poppins" w:cs="Poppins" w:eastAsia="Poppins" w:hAnsi="Poppins"/>
-                <w:color w:val="2B2B2B"/>
-                <w:sz w:val="15"/>
-                <w:szCs w:val="15"/>
-                <w:shd w:fill="E3F3FA" w:color="auto" w:val="clear"/>
-              </w:rPr>
-              <w:t xml:space="preserve">Normas generales </w:t>
-            </w:r>
-            <w:r>
-              <w:rPr>
-                <w:rFonts w:ascii="Poppins" w:cs="Poppins" w:eastAsia="Poppins" w:hAnsi="Poppins"/>
-                <w:sz w:val="15"/>
-                <w:szCs w:val="15"/>
-              </w:rPr>
-              <w:t xml:space="preserve">   </w:t>
-            </w:r>
-            <w:r>
-              <w:rPr>
-                <w:rFonts w:ascii="Poppins" w:cs="Poppins" w:eastAsia="Poppins" w:hAnsi="Poppins"/>
-                <w:b/>
-                <w:bCs/>
-                <w:color w:val="143548"/>
-                <w:sz w:val="15"/>
-                <w:szCs w:val="15"/>
-                <w:shd w:fill="E3F3FA" w:color="auto" w:val="clear"/>
-              </w:rPr>
-              <w:t xml:space="preserve"> Capítulo II  </w:t>
-            </w:r>
-            <w:r>
-              <w:rPr>
-                <w:rFonts w:ascii="Poppins" w:cs="Poppins" w:eastAsia="Poppins" w:hAnsi="Poppins"/>
-                <w:color w:val="2B2B2B"/>
-                <w:sz w:val="15"/>
-                <w:szCs w:val="15"/>
-                <w:shd w:fill="E3F3FA" w:color="auto" w:val="clear"/>
-              </w:rPr>
-              <w:t xml:space="preserve">Procedimientos ordinarios de provisión de personal funcionario de carrera </w:t>
-            </w:r>
-            <w:r>
-              <w:rPr>
-                <w:rFonts w:ascii="Poppins" w:cs="Poppins" w:eastAsia="Poppins" w:hAnsi="Poppins"/>
-                <w:sz w:val="15"/>
-                <w:szCs w:val="15"/>
-              </w:rPr>
-              <w:t xml:space="preserve">   </w:t>
-            </w:r>
-            <w:r>
-              <w:rPr>
-                <w:rFonts w:ascii="Poppins" w:cs="Poppins" w:eastAsia="Poppins" w:hAnsi="Poppins"/>
-                <w:b/>
-                <w:bCs/>
-                <w:color w:val="143548"/>
-                <w:sz w:val="15"/>
-                <w:szCs w:val="15"/>
-                <w:shd w:fill="E3F3FA" w:color="auto" w:val="clear"/>
-              </w:rPr>
-              <w:t xml:space="preserve"> Capítulo III  </w:t>
-            </w:r>
-            <w:r>
-              <w:rPr>
-                <w:rFonts w:ascii="Poppins" w:cs="Poppins" w:eastAsia="Poppins" w:hAnsi="Poppins"/>
-                <w:color w:val="2B2B2B"/>
-                <w:sz w:val="15"/>
-                <w:szCs w:val="15"/>
-                <w:shd w:fill="E3F3FA" w:color="auto" w:val="clear"/>
-              </w:rPr>
-              <w:t xml:space="preserve">Procedimientos de provisión de carácter extraordinario </w:t>
-            </w:r>
-          </w:p>
-          <w:p>
-            <w:pPr>
-              <w:spacing w:after="0" w:before="0" w:line="144" w:lineRule="exact"/>
+              <w:spacing w:after="0" w:before="0" w:line="173" w:lineRule="exact"/>
             </w:pPr>
             <w:r>
               <w:rPr>
@@ -1783,7 +1065,7 @@
                 <w:sz w:val="12"/>
                 <w:szCs w:val="12"/>
               </w:rPr>
-              <w:t xml:space="preserve">TÍTULO V</w:t>
+              <w:t xml:space="preserve">TÍTULO I</w:t>
             </w:r>
           </w:p>
           <w:p>
@@ -1799,12 +1081,421 @@
                 <w:sz w:val="21"/>
                 <w:szCs w:val="21"/>
               </w:rPr>
-              <w:t xml:space="preserve">Adquisición y pérdida de la relación de servicio</w:t>
-            </w:r>
-          </w:p>
-          <w:p>
-            <w:pPr>
-              <w:spacing w:after="0" w:before="0" w:line="372" w:lineRule="auto"/>
+              <w:t xml:space="preserve">Planificación y ordenación del empleo público</w:t>
+            </w:r>
+          </w:p>
+          <w:p>
+            <w:pPr>
+              <w:spacing w:after="0" w:before="0"/>
+            </w:pPr>
+            <w:r>
+              <w:drawing>
+                <wp:inline distT="0" distB="0" distL="0" distR="0">
+                  <wp:extent cx="2440000" cy="210266"/>
+                  <wp:effectExtent l="0" t="0" r="0" b="0"/>
+                  <wp:docPr id="5009" name="Forma 5009"/>
+                  <wp:cNvGraphicFramePr/>
+                  <a:graphic xmlns:a="http://schemas.openxmlformats.org/drawingml/2006/main">
+                    <a:graphicData uri="http://schemas.microsoft.com/office/word/2010/wordprocessingShape">
+                      <wps:wsp>
+                        <wps:cNvSpPr/>
+                        <wps:spPr>
+                          <a:xfrm>
+                            <a:off x="0" y="0"/>
+                            <a:ext cx="2440000" cy="210266"/>
+                          </a:xfrm>
+                          <a:prstGeom prst="roundRect">
+                            <a:avLst>
+                              <a:gd name="adj" fmla="val 50000"/>
+                            </a:avLst>
+                          </a:prstGeom>
+                          <a:solidFill>
+                            <a:srgbClr val="FFFFFF"/>
+                          </a:solidFill>
+                          <a:ln w="9525">
+                            <a:solidFill>
+                              <a:srgbClr val="CFE3EC"/>
+                            </a:solidFill>
+                          </a:ln>
+                        </wps:spPr>
+                        <wps:txbx>
+                          <w:txbxContent>
+                            <w:p>
+                              <w:pPr>
+                                <w:spacing w:before="0" w:after="0" w:line="240" w:lineRule="auto"/>
+                                <w:jc w:val="center"/>
+                              </w:pPr>
+                              <w:r>
+                                <w:rPr>
+                                  <w:rFonts w:ascii="Poppins" w:hAnsi="Poppins" w:cs="Poppins"/>
+                                  <w:b/>
+                                  <w:bCs/>
+                                  <w:color w:val="143548"/>
+                                  <w:sz w:val="15"/>
+                                  <w:szCs w:val="15"/>
+                                </w:rPr>
+                                <w:t xml:space="preserve">Capítulo I </w:t>
+                              </w:r>
+                              <w:r>
+                                <w:rPr>
+                                  <w:rFonts w:ascii="Poppins" w:hAnsi="Poppins" w:cs="Poppins"/>
+                                  <w:color w:val="2B2B2B"/>
+                                  <w:sz w:val="15"/>
+                                  <w:szCs w:val="15"/>
+                                </w:rPr>
+                                <w:t xml:space="preserve">Planificación de recursos humanos</w:t>
+                              </w:r>
+                            </w:p>
+                          </w:txbxContent>
+                        </wps:txbx>
+                        <wps:bodyPr rot="0" vert="horz" wrap="square" lIns="54852" tIns="0" rIns="54852" bIns="0" anchor="ctr" anchorCtr="0">
+                          <a:noAutofit/>
+                        </wps:bodyPr>
+                      </wps:wsp>
+                    </a:graphicData>
+                  </a:graphic>
+                </wp:inline>
+              </w:drawing>
+            </w:r>
+            <w:r>
+              <w:rPr>
+                <w:sz w:val="12"/>
+                <w:szCs w:val="12"/>
+              </w:rPr>
+              <w:t xml:space="preserve"> </w:t>
+            </w:r>
+            <w:r>
+              <w:drawing>
+                <wp:inline distT="0" distB="0" distL="0" distR="0">
+                  <wp:extent cx="2896186" cy="210266"/>
+                  <wp:effectExtent l="0" t="0" r="0" b="0"/>
+                  <wp:docPr id="5010" name="Forma 5010"/>
+                  <wp:cNvGraphicFramePr/>
+                  <a:graphic xmlns:a="http://schemas.openxmlformats.org/drawingml/2006/main">
+                    <a:graphicData uri="http://schemas.microsoft.com/office/word/2010/wordprocessingShape">
+                      <wps:wsp>
+                        <wps:cNvSpPr/>
+                        <wps:spPr>
+                          <a:xfrm>
+                            <a:off x="0" y="0"/>
+                            <a:ext cx="2896186" cy="210266"/>
+                          </a:xfrm>
+                          <a:prstGeom prst="roundRect">
+                            <a:avLst>
+                              <a:gd name="adj" fmla="val 50000"/>
+                            </a:avLst>
+                          </a:prstGeom>
+                          <a:solidFill>
+                            <a:srgbClr val="FFFFFF"/>
+                          </a:solidFill>
+                          <a:ln w="9525">
+                            <a:solidFill>
+                              <a:srgbClr val="CFE3EC"/>
+                            </a:solidFill>
+                          </a:ln>
+                        </wps:spPr>
+                        <wps:txbx>
+                          <w:txbxContent>
+                            <w:p>
+                              <w:pPr>
+                                <w:spacing w:before="0" w:after="0" w:line="240" w:lineRule="auto"/>
+                                <w:jc w:val="center"/>
+                              </w:pPr>
+                              <w:r>
+                                <w:rPr>
+                                  <w:rFonts w:ascii="Poppins" w:hAnsi="Poppins" w:cs="Poppins"/>
+                                  <w:b/>
+                                  <w:bCs/>
+                                  <w:color w:val="143548"/>
+                                  <w:sz w:val="15"/>
+                                  <w:szCs w:val="15"/>
+                                </w:rPr>
+                                <w:t xml:space="preserve">Capítulo II </w:t>
+                              </w:r>
+                              <w:r>
+                                <w:rPr>
+                                  <w:rFonts w:ascii="Poppins" w:hAnsi="Poppins" w:cs="Poppins"/>
+                                  <w:color w:val="2B2B2B"/>
+                                  <w:sz w:val="15"/>
+                                  <w:szCs w:val="15"/>
+                                </w:rPr>
+                                <w:t xml:space="preserve">Planes de ordenación de recursos humanos</w:t>
+                              </w:r>
+                            </w:p>
+                          </w:txbxContent>
+                        </wps:txbx>
+                        <wps:bodyPr rot="0" vert="horz" wrap="square" lIns="54852" tIns="0" rIns="54852" bIns="0" anchor="ctr" anchorCtr="0">
+                          <a:noAutofit/>
+                        </wps:bodyPr>
+                      </wps:wsp>
+                    </a:graphicData>
+                  </a:graphic>
+                </wp:inline>
+              </w:drawing>
+            </w:r>
+          </w:p>
+          <w:p>
+            <w:pPr>
+              <w:spacing w:after="0" w:before="72"/>
+            </w:pPr>
+            <w:r>
+              <w:drawing>
+                <wp:inline distT="0" distB="0" distL="0" distR="0">
+                  <wp:extent cx="2043237" cy="210266"/>
+                  <wp:effectExtent l="0" t="0" r="0" b="0"/>
+                  <wp:docPr id="5011" name="Forma 5011"/>
+                  <wp:cNvGraphicFramePr/>
+                  <a:graphic xmlns:a="http://schemas.openxmlformats.org/drawingml/2006/main">
+                    <a:graphicData uri="http://schemas.microsoft.com/office/word/2010/wordprocessingShape">
+                      <wps:wsp>
+                        <wps:cNvSpPr/>
+                        <wps:spPr>
+                          <a:xfrm>
+                            <a:off x="0" y="0"/>
+                            <a:ext cx="2043237" cy="210266"/>
+                          </a:xfrm>
+                          <a:prstGeom prst="roundRect">
+                            <a:avLst>
+                              <a:gd name="adj" fmla="val 50000"/>
+                            </a:avLst>
+                          </a:prstGeom>
+                          <a:solidFill>
+                            <a:srgbClr val="FFFFFF"/>
+                          </a:solidFill>
+                          <a:ln w="9525">
+                            <a:solidFill>
+                              <a:srgbClr val="CFE3EC"/>
+                            </a:solidFill>
+                          </a:ln>
+                        </wps:spPr>
+                        <wps:txbx>
+                          <w:txbxContent>
+                            <w:p>
+                              <w:pPr>
+                                <w:spacing w:before="0" w:after="0" w:line="240" w:lineRule="auto"/>
+                                <w:jc w:val="center"/>
+                              </w:pPr>
+                              <w:r>
+                                <w:rPr>
+                                  <w:rFonts w:ascii="Poppins" w:hAnsi="Poppins" w:cs="Poppins"/>
+                                  <w:b/>
+                                  <w:bCs/>
+                                  <w:color w:val="143548"/>
+                                  <w:sz w:val="15"/>
+                                  <w:szCs w:val="15"/>
+                                </w:rPr>
+                                <w:t xml:space="preserve">Capítulo III </w:t>
+                              </w:r>
+                              <w:r>
+                                <w:rPr>
+                                  <w:rFonts w:ascii="Poppins" w:hAnsi="Poppins" w:cs="Poppins"/>
+                                  <w:color w:val="2B2B2B"/>
+                                  <w:sz w:val="15"/>
+                                  <w:szCs w:val="15"/>
+                                </w:rPr>
+                                <w:t xml:space="preserve">Oferta de empleo público</w:t>
+                              </w:r>
+                            </w:p>
+                          </w:txbxContent>
+                        </wps:txbx>
+                        <wps:bodyPr rot="0" vert="horz" wrap="square" lIns="54852" tIns="0" rIns="54852" bIns="0" anchor="ctr" anchorCtr="0">
+                          <a:noAutofit/>
+                        </wps:bodyPr>
+                      </wps:wsp>
+                    </a:graphicData>
+                  </a:graphic>
+                </wp:inline>
+              </w:drawing>
+            </w:r>
+          </w:p>
+          <w:p>
+            <w:pPr>
+              <w:spacing w:after="0" w:before="0" w:line="173" w:lineRule="exact"/>
+            </w:pPr>
+            <w:r>
+              <w:rPr>
+                <w:sz w:val="2"/>
+                <w:szCs w:val="2"/>
+              </w:rPr>
+              <w:t xml:space="preserve"/>
+            </w:r>
+          </w:p>
+        </w:tc>
+      </w:tr>
+      <w:tr>
+        <w:tc>
+          <w:tcPr>
+            <w:tcW w:type="dxa" w:w="475"/>
+            <w:tcBorders>
+              <w:top w:val="none" w:color="FFFFFF" w:sz="0"/>
+              <w:left w:val="none" w:color="FFFFFF" w:sz="0"/>
+              <w:bottom w:val="none" w:color="FFFFFF" w:sz="0"/>
+              <w:right w:val="single" w:color="9DDFEA" w:sz="12"/>
+            </w:tcBorders>
+            <w:tcMar>
+              <w:top w:type="dxa" w:w="0"/>
+              <w:left w:type="dxa" w:w="0"/>
+              <w:bottom w:type="dxa" w:w="0"/>
+              <w:right w:type="dxa" w:w="0"/>
+            </w:tcMar>
+          </w:tcPr>
+          <w:p>
+            <w:pPr>
+              <w:spacing w:after="0" w:before="0" w:line="14" w:lineRule="exact"/>
+            </w:pPr>
+            <w:r>
+              <w:rPr>
+                <w:sz w:val="2"/>
+                <w:szCs w:val="2"/>
+              </w:rPr>
+              <w:t xml:space="preserve"/>
+            </w:r>
+          </w:p>
+        </w:tc>
+        <w:tc>
+          <w:tcPr>
+            <w:tcW w:type="dxa" w:w="475"/>
+            <w:tcBorders>
+              <w:top w:val="none" w:color="FFFFFF" w:sz="0"/>
+              <w:left w:val="single" w:color="9DDFEA" w:sz="12"/>
+              <w:bottom w:val="none" w:color="FFFFFF" w:sz="0"/>
+              <w:right w:val="none" w:color="FFFFFF" w:sz="0"/>
+            </w:tcBorders>
+            <w:tcMar>
+              <w:top w:type="dxa" w:w="0"/>
+              <w:left w:type="dxa" w:w="0"/>
+              <w:bottom w:type="dxa" w:w="0"/>
+              <w:right w:type="dxa" w:w="0"/>
+            </w:tcMar>
+          </w:tcPr>
+          <w:p>
+            <w:pPr>
+              <w:spacing w:after="0" w:before="0" w:line="14" w:lineRule="exact"/>
+            </w:pPr>
+            <w:r>
+              <w:rPr>
+                <w:sz w:val="2"/>
+                <w:szCs w:val="2"/>
+              </w:rPr>
+              <w:t xml:space="preserve"/>
+            </w:r>
+          </w:p>
+        </w:tc>
+        <w:tc>
+          <w:tcPr>
+            <w:vMerge w:val="continue"/>
+            <w:tcBorders>
+              <w:top w:val="none" w:color="FFFFFF" w:sz="0"/>
+              <w:left w:val="none" w:color="FFFFFF" w:sz="0"/>
+              <w:bottom w:val="none" w:color="FFFFFF" w:sz="0"/>
+              <w:right w:val="none" w:color="FFFFFF" w:sz="0"/>
+            </w:tcBorders>
+          </w:tcPr>
+          <w:p/>
+        </w:tc>
+      </w:tr>
+      <w:tr>
+        <w:tc>
+          <w:tcPr>
+            <w:tcW w:type="dxa" w:w="950"/>
+            <w:gridSpan w:val="2"/>
+            <w:tcBorders>
+              <w:top w:val="none" w:color="FFFFFF" w:sz="0"/>
+              <w:left w:val="none" w:color="FFFFFF" w:sz="0"/>
+              <w:bottom w:val="none" w:color="FFFFFF" w:sz="0"/>
+              <w:right w:val="none" w:color="FFFFFF" w:sz="0"/>
+            </w:tcBorders>
+            <w:tcMar>
+              <w:top w:type="dxa" w:w="0"/>
+              <w:left w:type="dxa" w:w="0"/>
+              <w:bottom w:type="dxa" w:w="0"/>
+              <w:right w:type="dxa" w:w="0"/>
+            </w:tcMar>
+            <w:vAlign w:val="top"/>
+          </w:tcPr>
+          <w:p>
+            <w:pPr>
+              <w:spacing w:after="0" w:before="0"/>
+              <w:jc w:val="center"/>
+            </w:pPr>
+            <w:r>
+              <w:drawing>
+                <wp:inline distT="0" distB="0" distL="0" distR="0">
+                  <wp:extent cx="402235" cy="447944"/>
+                  <wp:effectExtent t="0" r="0" b="0" l="0"/>
+                  <wp:docPr id="1" name="" descr="" title=""/>
+                  <wp:cNvGraphicFramePr>
+                    <a:graphicFrameLocks xmlns:a="http://schemas.openxmlformats.org/drawingml/2006/main" noChangeAspect="1"/>
+                  </wp:cNvGraphicFramePr>
+                  <a:graphic xmlns:a="http://schemas.openxmlformats.org/drawingml/2006/main">
+                    <a:graphicData uri="http://schemas.openxmlformats.org/drawingml/2006/picture">
+                      <pic:pic xmlns:pic="http://schemas.openxmlformats.org/drawingml/2006/picture">
+                        <pic:nvPicPr>
+                          <pic:cNvPr id="0" name="" descr=""/>
+                          <pic:cNvPicPr>
+                            <a:picLocks noChangeAspect="1" noChangeArrowheads="1"/>
+                          </pic:cNvPicPr>
+                        </pic:nvPicPr>
+                        <pic:blipFill>
+                          <a:blip r:embed="rId18" cstate="none"/>
+                          <a:srcRect/>
+                          <a:stretch>
+                            <a:fillRect/>
+                          </a:stretch>
+                        </pic:blipFill>
+                        <pic:spPr bwMode="auto">
+                          <a:xfrm>
+                            <a:off x="0" y="0"/>
+                            <a:ext cx="402235" cy="447944"/>
+                          </a:xfrm>
+                          <a:prstGeom prst="rect">
+                            <a:avLst/>
+                          </a:prstGeom>
+                        </pic:spPr>
+                      </pic:pic>
+                    </a:graphicData>
+                  </a:graphic>
+                </wp:inline>
+              </w:drawing>
+            </w:r>
+          </w:p>
+        </w:tc>
+        <w:tc>
+          <w:tcPr>
+            <w:tcW w:type="dxa" w:w="8681"/>
+            <w:vMerge w:val="restart"/>
+            <w:tcBorders>
+              <w:top w:val="none" w:color="FFFFFF" w:sz="0"/>
+              <w:left w:val="none" w:color="FFFFFF" w:sz="0"/>
+              <w:bottom w:val="none" w:color="FFFFFF" w:sz="0"/>
+              <w:right w:val="none" w:color="FFFFFF" w:sz="0"/>
+            </w:tcBorders>
+            <w:tcMar>
+              <w:top w:type="dxa" w:w="29"/>
+              <w:left w:type="dxa" w:w="0"/>
+              <w:bottom w:type="dxa" w:w="0"/>
+              <w:right w:type="dxa" w:w="0"/>
+            </w:tcMar>
+          </w:tcPr>
+          <w:p>
+            <w:pPr>
+              <w:spacing w:after="43" w:before="0"/>
+            </w:pPr>
+            <w:r>
+              <w:rPr>
+                <w:rFonts w:ascii="Poppins" w:cs="Poppins" w:eastAsia="Poppins" w:hAnsi="Poppins"/>
+                <w:b/>
+                <w:bCs/>
+                <w:color w:val="6F8290"/>
+                <w:sz w:val="12"/>
+                <w:szCs w:val="12"/>
+              </w:rPr>
+              <w:t xml:space="preserve">TÍTULO II</w:t>
+            </w:r>
+          </w:p>
+          <w:p>
+            <w:pPr>
+              <w:spacing w:after="86" w:before="0"/>
             </w:pPr>
             <w:r>
               <w:rPr>
@@ -1812,81 +1503,1727 @@
                 <w:b/>
                 <w:bCs/>
                 <w:color w:val="143548"/>
-                <w:sz w:val="15"/>
-                <w:szCs w:val="15"/>
-                <w:shd w:fill="E3F3FA" w:color="auto" w:val="clear"/>
-              </w:rPr>
-              <w:t xml:space="preserve"> Capítulo I  </w:t>
-            </w:r>
+                <w:sz w:val="21"/>
+                <w:szCs w:val="21"/>
+              </w:rPr>
+              <w:t xml:space="preserve">Selección de personal</w:t>
+            </w:r>
+          </w:p>
+          <w:p>
+            <w:pPr>
+              <w:spacing w:after="0" w:before="0"/>
+            </w:pPr>
+            <w:r>
+              <w:drawing>
+                <wp:inline distT="0" distB="0" distL="0" distR="0">
+                  <wp:extent cx="1643732" cy="210266"/>
+                  <wp:effectExtent l="0" t="0" r="0" b="0"/>
+                  <wp:docPr id="5012" name="Forma 5012"/>
+                  <wp:cNvGraphicFramePr/>
+                  <a:graphic xmlns:a="http://schemas.openxmlformats.org/drawingml/2006/main">
+                    <a:graphicData uri="http://schemas.microsoft.com/office/word/2010/wordprocessingShape">
+                      <wps:wsp>
+                        <wps:cNvSpPr/>
+                        <wps:spPr>
+                          <a:xfrm>
+                            <a:off x="0" y="0"/>
+                            <a:ext cx="1643732" cy="210266"/>
+                          </a:xfrm>
+                          <a:prstGeom prst="roundRect">
+                            <a:avLst>
+                              <a:gd name="adj" fmla="val 50000"/>
+                            </a:avLst>
+                          </a:prstGeom>
+                          <a:solidFill>
+                            <a:srgbClr val="FFFFFF"/>
+                          </a:solidFill>
+                          <a:ln w="9525">
+                            <a:solidFill>
+                              <a:srgbClr val="CFE3EC"/>
+                            </a:solidFill>
+                          </a:ln>
+                        </wps:spPr>
+                        <wps:txbx>
+                          <w:txbxContent>
+                            <w:p>
+                              <w:pPr>
+                                <w:spacing w:before="0" w:after="0" w:line="240" w:lineRule="auto"/>
+                                <w:jc w:val="center"/>
+                              </w:pPr>
+                              <w:r>
+                                <w:rPr>
+                                  <w:rFonts w:ascii="Poppins" w:hAnsi="Poppins" w:cs="Poppins"/>
+                                  <w:b/>
+                                  <w:bCs/>
+                                  <w:color w:val="143548"/>
+                                  <w:sz w:val="15"/>
+                                  <w:szCs w:val="15"/>
+                                </w:rPr>
+                                <w:t xml:space="preserve">Capítulo I </w:t>
+                              </w:r>
+                              <w:r>
+                                <w:rPr>
+                                  <w:rFonts w:ascii="Poppins" w:hAnsi="Poppins" w:cs="Poppins"/>
+                                  <w:color w:val="2B2B2B"/>
+                                  <w:sz w:val="15"/>
+                                  <w:szCs w:val="15"/>
+                                </w:rPr>
+                                <w:t xml:space="preserve">Normas generales</w:t>
+                              </w:r>
+                            </w:p>
+                          </w:txbxContent>
+                        </wps:txbx>
+                        <wps:bodyPr rot="0" vert="horz" wrap="square" lIns="54852" tIns="0" rIns="54852" bIns="0" anchor="ctr" anchorCtr="0">
+                          <a:noAutofit/>
+                        </wps:bodyPr>
+                      </wps:wsp>
+                    </a:graphicData>
+                  </a:graphic>
+                </wp:inline>
+              </w:drawing>
+            </w:r>
+            <w:r>
+              <w:rPr>
+                <w:sz w:val="12"/>
+                <w:szCs w:val="12"/>
+              </w:rPr>
+              <w:t xml:space="preserve"> </w:t>
+            </w:r>
+            <w:r>
+              <w:drawing>
+                <wp:inline distT="0" distB="0" distL="0" distR="0">
+                  <wp:extent cx="1807373" cy="210266"/>
+                  <wp:effectExtent l="0" t="0" r="0" b="0"/>
+                  <wp:docPr id="5013" name="Forma 5013"/>
+                  <wp:cNvGraphicFramePr/>
+                  <a:graphic xmlns:a="http://schemas.openxmlformats.org/drawingml/2006/main">
+                    <a:graphicData uri="http://schemas.microsoft.com/office/word/2010/wordprocessingShape">
+                      <wps:wsp>
+                        <wps:cNvSpPr/>
+                        <wps:spPr>
+                          <a:xfrm>
+                            <a:off x="0" y="0"/>
+                            <a:ext cx="1807373" cy="210266"/>
+                          </a:xfrm>
+                          <a:prstGeom prst="roundRect">
+                            <a:avLst>
+                              <a:gd name="adj" fmla="val 50000"/>
+                            </a:avLst>
+                          </a:prstGeom>
+                          <a:solidFill>
+                            <a:srgbClr val="FFFFFF"/>
+                          </a:solidFill>
+                          <a:ln w="9525">
+                            <a:solidFill>
+                              <a:srgbClr val="CFE3EC"/>
+                            </a:solidFill>
+                          </a:ln>
+                        </wps:spPr>
+                        <wps:txbx>
+                          <w:txbxContent>
+                            <w:p>
+                              <w:pPr>
+                                <w:spacing w:before="0" w:after="0" w:line="240" w:lineRule="auto"/>
+                                <w:jc w:val="center"/>
+                              </w:pPr>
+                              <w:r>
+                                <w:rPr>
+                                  <w:rFonts w:ascii="Poppins" w:hAnsi="Poppins" w:cs="Poppins"/>
+                                  <w:b/>
+                                  <w:bCs/>
+                                  <w:color w:val="143548"/>
+                                  <w:sz w:val="15"/>
+                                  <w:szCs w:val="15"/>
+                                </w:rPr>
+                                <w:t xml:space="preserve">Capítulo II </w:t>
+                              </w:r>
+                              <w:r>
+                                <w:rPr>
+                                  <w:rFonts w:ascii="Poppins" w:hAnsi="Poppins" w:cs="Poppins"/>
+                                  <w:color w:val="2B2B2B"/>
+                                  <w:sz w:val="15"/>
+                                  <w:szCs w:val="15"/>
+                                </w:rPr>
+                                <w:t xml:space="preserve">Sistema de selección</w:t>
+                              </w:r>
+                            </w:p>
+                          </w:txbxContent>
+                        </wps:txbx>
+                        <wps:bodyPr rot="0" vert="horz" wrap="square" lIns="54852" tIns="0" rIns="54852" bIns="0" anchor="ctr" anchorCtr="0">
+                          <a:noAutofit/>
+                        </wps:bodyPr>
+                      </wps:wsp>
+                    </a:graphicData>
+                  </a:graphic>
+                </wp:inline>
+              </w:drawing>
+            </w:r>
+          </w:p>
+          <w:p>
+            <w:pPr>
+              <w:spacing w:after="0" w:before="72"/>
+            </w:pPr>
+            <w:r>
+              <w:drawing>
+                <wp:inline distT="0" distB="0" distL="0" distR="0">
+                  <wp:extent cx="2924526" cy="210266"/>
+                  <wp:effectExtent l="0" t="0" r="0" b="0"/>
+                  <wp:docPr id="5014" name="Forma 5014"/>
+                  <wp:cNvGraphicFramePr/>
+                  <a:graphic xmlns:a="http://schemas.openxmlformats.org/drawingml/2006/main">
+                    <a:graphicData uri="http://schemas.microsoft.com/office/word/2010/wordprocessingShape">
+                      <wps:wsp>
+                        <wps:cNvSpPr/>
+                        <wps:spPr>
+                          <a:xfrm>
+                            <a:off x="0" y="0"/>
+                            <a:ext cx="2924526" cy="210266"/>
+                          </a:xfrm>
+                          <a:prstGeom prst="roundRect">
+                            <a:avLst>
+                              <a:gd name="adj" fmla="val 50000"/>
+                            </a:avLst>
+                          </a:prstGeom>
+                          <a:solidFill>
+                            <a:srgbClr val="FFFFFF"/>
+                          </a:solidFill>
+                          <a:ln w="9525">
+                            <a:solidFill>
+                              <a:srgbClr val="CFE3EC"/>
+                            </a:solidFill>
+                          </a:ln>
+                        </wps:spPr>
+                        <wps:txbx>
+                          <w:txbxContent>
+                            <w:p>
+                              <w:pPr>
+                                <w:spacing w:before="0" w:after="0" w:line="240" w:lineRule="auto"/>
+                                <w:jc w:val="center"/>
+                              </w:pPr>
+                              <w:r>
+                                <w:rPr>
+                                  <w:rFonts w:ascii="Poppins" w:hAnsi="Poppins" w:cs="Poppins"/>
+                                  <w:b/>
+                                  <w:bCs/>
+                                  <w:color w:val="143548"/>
+                                  <w:sz w:val="15"/>
+                                  <w:szCs w:val="15"/>
+                                </w:rPr>
+                                <w:t xml:space="preserve">Capítulo III </w:t>
+                              </w:r>
+                              <w:r>
+                                <w:rPr>
+                                  <w:rFonts w:ascii="Poppins" w:hAnsi="Poppins" w:cs="Poppins"/>
+                                  <w:color w:val="2B2B2B"/>
+                                  <w:sz w:val="15"/>
+                                  <w:szCs w:val="15"/>
+                                </w:rPr>
+                                <w:t xml:space="preserve">Inicio y desarrollo de los procesos selectivos</w:t>
+                              </w:r>
+                            </w:p>
+                          </w:txbxContent>
+                        </wps:txbx>
+                        <wps:bodyPr rot="0" vert="horz" wrap="square" lIns="54852" tIns="0" rIns="54852" bIns="0" anchor="ctr" anchorCtr="0">
+                          <a:noAutofit/>
+                        </wps:bodyPr>
+                      </wps:wsp>
+                    </a:graphicData>
+                  </a:graphic>
+                </wp:inline>
+              </w:drawing>
+            </w:r>
+            <w:r>
+              <w:rPr>
+                <w:sz w:val="12"/>
+                <w:szCs w:val="12"/>
+              </w:rPr>
+              <w:t xml:space="preserve"> </w:t>
+            </w:r>
+            <w:r>
+              <w:drawing>
+                <wp:inline distT="0" distB="0" distL="0" distR="0">
+                  <wp:extent cx="2435429" cy="210266"/>
+                  <wp:effectExtent l="0" t="0" r="0" b="0"/>
+                  <wp:docPr id="5015" name="Forma 5015"/>
+                  <wp:cNvGraphicFramePr/>
+                  <a:graphic xmlns:a="http://schemas.openxmlformats.org/drawingml/2006/main">
+                    <a:graphicData uri="http://schemas.microsoft.com/office/word/2010/wordprocessingShape">
+                      <wps:wsp>
+                        <wps:cNvSpPr/>
+                        <wps:spPr>
+                          <a:xfrm>
+                            <a:off x="0" y="0"/>
+                            <a:ext cx="2435429" cy="210266"/>
+                          </a:xfrm>
+                          <a:prstGeom prst="roundRect">
+                            <a:avLst>
+                              <a:gd name="adj" fmla="val 50000"/>
+                            </a:avLst>
+                          </a:prstGeom>
+                          <a:solidFill>
+                            <a:srgbClr val="FFFFFF"/>
+                          </a:solidFill>
+                          <a:ln w="9525">
+                            <a:solidFill>
+                              <a:srgbClr val="CFE3EC"/>
+                            </a:solidFill>
+                          </a:ln>
+                        </wps:spPr>
+                        <wps:txbx>
+                          <w:txbxContent>
+                            <w:p>
+                              <w:pPr>
+                                <w:spacing w:before="0" w:after="0" w:line="240" w:lineRule="auto"/>
+                                <w:jc w:val="center"/>
+                              </w:pPr>
+                              <w:r>
+                                <w:rPr>
+                                  <w:rFonts w:ascii="Poppins" w:hAnsi="Poppins" w:cs="Poppins"/>
+                                  <w:b/>
+                                  <w:bCs/>
+                                  <w:color w:val="143548"/>
+                                  <w:sz w:val="15"/>
+                                  <w:szCs w:val="15"/>
+                                </w:rPr>
+                                <w:t xml:space="preserve">Capítulo IV </w:t>
+                              </w:r>
+                              <w:r>
+                                <w:rPr>
+                                  <w:rFonts w:ascii="Poppins" w:hAnsi="Poppins" w:cs="Poppins"/>
+                                  <w:color w:val="2B2B2B"/>
+                                  <w:sz w:val="15"/>
+                                  <w:szCs w:val="15"/>
+                                </w:rPr>
+                                <w:t xml:space="preserve">Personal funcionario en prácticas</w:t>
+                              </w:r>
+                            </w:p>
+                          </w:txbxContent>
+                        </wps:txbx>
+                        <wps:bodyPr rot="0" vert="horz" wrap="square" lIns="54852" tIns="0" rIns="54852" bIns="0" anchor="ctr" anchorCtr="0">
+                          <a:noAutofit/>
+                        </wps:bodyPr>
+                      </wps:wsp>
+                    </a:graphicData>
+                  </a:graphic>
+                </wp:inline>
+              </w:drawing>
+            </w:r>
+          </w:p>
+          <w:p>
+            <w:pPr>
+              <w:spacing w:after="0" w:before="72"/>
+            </w:pPr>
+            <w:r>
+              <w:drawing>
+                <wp:inline distT="0" distB="0" distL="0" distR="0">
+                  <wp:extent cx="1994784" cy="210266"/>
+                  <wp:effectExtent l="0" t="0" r="0" b="0"/>
+                  <wp:docPr id="5016" name="Forma 5016"/>
+                  <wp:cNvGraphicFramePr/>
+                  <a:graphic xmlns:a="http://schemas.openxmlformats.org/drawingml/2006/main">
+                    <a:graphicData uri="http://schemas.microsoft.com/office/word/2010/wordprocessingShape">
+                      <wps:wsp>
+                        <wps:cNvSpPr/>
+                        <wps:spPr>
+                          <a:xfrm>
+                            <a:off x="0" y="0"/>
+                            <a:ext cx="1994784" cy="210266"/>
+                          </a:xfrm>
+                          <a:prstGeom prst="roundRect">
+                            <a:avLst>
+                              <a:gd name="adj" fmla="val 50000"/>
+                            </a:avLst>
+                          </a:prstGeom>
+                          <a:solidFill>
+                            <a:srgbClr val="FFFFFF"/>
+                          </a:solidFill>
+                          <a:ln w="9525">
+                            <a:solidFill>
+                              <a:srgbClr val="CFE3EC"/>
+                            </a:solidFill>
+                          </a:ln>
+                        </wps:spPr>
+                        <wps:txbx>
+                          <w:txbxContent>
+                            <w:p>
+                              <w:pPr>
+                                <w:spacing w:before="0" w:after="0" w:line="240" w:lineRule="auto"/>
+                                <w:jc w:val="center"/>
+                              </w:pPr>
+                              <w:r>
+                                <w:rPr>
+                                  <w:rFonts w:ascii="Poppins" w:hAnsi="Poppins" w:cs="Poppins"/>
+                                  <w:b/>
+                                  <w:bCs/>
+                                  <w:color w:val="143548"/>
+                                  <w:sz w:val="15"/>
+                                  <w:szCs w:val="15"/>
+                                </w:rPr>
+                                <w:t xml:space="preserve">Capítulo V </w:t>
+                              </w:r>
+                              <w:r>
+                                <w:rPr>
+                                  <w:rFonts w:ascii="Poppins" w:hAnsi="Poppins" w:cs="Poppins"/>
+                                  <w:color w:val="2B2B2B"/>
+                                  <w:sz w:val="15"/>
+                                  <w:szCs w:val="15"/>
+                                </w:rPr>
+                                <w:t xml:space="preserve">Comisiones de selección</w:t>
+                              </w:r>
+                            </w:p>
+                          </w:txbxContent>
+                        </wps:txbx>
+                        <wps:bodyPr rot="0" vert="horz" wrap="square" lIns="54852" tIns="0" rIns="54852" bIns="0" anchor="ctr" anchorCtr="0">
+                          <a:noAutofit/>
+                        </wps:bodyPr>
+                      </wps:wsp>
+                    </a:graphicData>
+                  </a:graphic>
+                </wp:inline>
+              </w:drawing>
+            </w:r>
+          </w:p>
+          <w:p>
+            <w:pPr>
+              <w:spacing w:after="0" w:before="72"/>
+            </w:pPr>
+            <w:r>
+              <w:drawing>
+                <wp:inline distT="0" distB="0" distL="0" distR="0">
+                  <wp:extent cx="4189779" cy="210266"/>
+                  <wp:effectExtent l="0" t="0" r="0" b="0"/>
+                  <wp:docPr id="5017" name="Forma 5017"/>
+                  <wp:cNvGraphicFramePr/>
+                  <a:graphic xmlns:a="http://schemas.openxmlformats.org/drawingml/2006/main">
+                    <a:graphicData uri="http://schemas.microsoft.com/office/word/2010/wordprocessingShape">
+                      <wps:wsp>
+                        <wps:cNvSpPr/>
+                        <wps:spPr>
+                          <a:xfrm>
+                            <a:off x="0" y="0"/>
+                            <a:ext cx="4189779" cy="210266"/>
+                          </a:xfrm>
+                          <a:prstGeom prst="roundRect">
+                            <a:avLst>
+                              <a:gd name="adj" fmla="val 50000"/>
+                            </a:avLst>
+                          </a:prstGeom>
+                          <a:solidFill>
+                            <a:srgbClr val="FFFFFF"/>
+                          </a:solidFill>
+                          <a:ln w="9525">
+                            <a:solidFill>
+                              <a:srgbClr val="CFE3EC"/>
+                            </a:solidFill>
+                          </a:ln>
+                        </wps:spPr>
+                        <wps:txbx>
+                          <w:txbxContent>
+                            <w:p>
+                              <w:pPr>
+                                <w:spacing w:before="0" w:after="0" w:line="240" w:lineRule="auto"/>
+                                <w:jc w:val="center"/>
+                              </w:pPr>
+                              <w:r>
+                                <w:rPr>
+                                  <w:rFonts w:ascii="Poppins" w:hAnsi="Poppins" w:cs="Poppins"/>
+                                  <w:b/>
+                                  <w:bCs/>
+                                  <w:color w:val="143548"/>
+                                  <w:sz w:val="15"/>
+                                  <w:szCs w:val="15"/>
+                                </w:rPr>
+                                <w:t xml:space="preserve">Capítulo VI </w:t>
+                              </w:r>
+                              <w:r>
+                                <w:rPr>
+                                  <w:rFonts w:ascii="Poppins" w:hAnsi="Poppins" w:cs="Poppins"/>
+                                  <w:color w:val="2B2B2B"/>
+                                  <w:sz w:val="15"/>
+                                  <w:szCs w:val="15"/>
+                                </w:rPr>
+                                <w:t xml:space="preserve">Selección de personal funcionario interino y personal laboral temporal</w:t>
+                              </w:r>
+                            </w:p>
+                          </w:txbxContent>
+                        </wps:txbx>
+                        <wps:bodyPr rot="0" vert="horz" wrap="square" lIns="54852" tIns="0" rIns="54852" bIns="0" anchor="ctr" anchorCtr="0">
+                          <a:noAutofit/>
+                        </wps:bodyPr>
+                      </wps:wsp>
+                    </a:graphicData>
+                  </a:graphic>
+                </wp:inline>
+              </w:drawing>
+            </w:r>
+          </w:p>
+          <w:p>
+            <w:pPr>
+              <w:spacing w:after="0" w:before="0" w:line="173" w:lineRule="exact"/>
+            </w:pPr>
+            <w:r>
+              <w:rPr>
+                <w:sz w:val="2"/>
+                <w:szCs w:val="2"/>
+              </w:rPr>
+              <w:t xml:space="preserve"/>
+            </w:r>
+          </w:p>
+        </w:tc>
+      </w:tr>
+      <w:tr>
+        <w:tc>
+          <w:tcPr>
+            <w:tcW w:type="dxa" w:w="475"/>
+            <w:tcBorders>
+              <w:top w:val="none" w:color="FFFFFF" w:sz="0"/>
+              <w:left w:val="none" w:color="FFFFFF" w:sz="0"/>
+              <w:bottom w:val="none" w:color="FFFFFF" w:sz="0"/>
+              <w:right w:val="single" w:color="9DDFEA" w:sz="12"/>
+            </w:tcBorders>
+            <w:tcMar>
+              <w:top w:type="dxa" w:w="0"/>
+              <w:left w:type="dxa" w:w="0"/>
+              <w:bottom w:type="dxa" w:w="0"/>
+              <w:right w:type="dxa" w:w="0"/>
+            </w:tcMar>
+          </w:tcPr>
+          <w:p>
+            <w:pPr>
+              <w:spacing w:after="0" w:before="0" w:line="14" w:lineRule="exact"/>
+            </w:pPr>
+            <w:r>
+              <w:rPr>
+                <w:sz w:val="2"/>
+                <w:szCs w:val="2"/>
+              </w:rPr>
+              <w:t xml:space="preserve"/>
+            </w:r>
+          </w:p>
+        </w:tc>
+        <w:tc>
+          <w:tcPr>
+            <w:tcW w:type="dxa" w:w="475"/>
+            <w:tcBorders>
+              <w:top w:val="none" w:color="FFFFFF" w:sz="0"/>
+              <w:left w:val="single" w:color="9DDFEA" w:sz="12"/>
+              <w:bottom w:val="none" w:color="FFFFFF" w:sz="0"/>
+              <w:right w:val="none" w:color="FFFFFF" w:sz="0"/>
+            </w:tcBorders>
+            <w:tcMar>
+              <w:top w:type="dxa" w:w="0"/>
+              <w:left w:type="dxa" w:w="0"/>
+              <w:bottom w:type="dxa" w:w="0"/>
+              <w:right w:type="dxa" w:w="0"/>
+            </w:tcMar>
+          </w:tcPr>
+          <w:p>
+            <w:pPr>
+              <w:spacing w:after="0" w:before="0" w:line="14" w:lineRule="exact"/>
+            </w:pPr>
+            <w:r>
+              <w:rPr>
+                <w:sz w:val="2"/>
+                <w:szCs w:val="2"/>
+              </w:rPr>
+              <w:t xml:space="preserve"/>
+            </w:r>
+          </w:p>
+        </w:tc>
+        <w:tc>
+          <w:tcPr>
+            <w:vMerge w:val="continue"/>
+            <w:tcBorders>
+              <w:top w:val="none" w:color="FFFFFF" w:sz="0"/>
+              <w:left w:val="none" w:color="FFFFFF" w:sz="0"/>
+              <w:bottom w:val="none" w:color="FFFFFF" w:sz="0"/>
+              <w:right w:val="none" w:color="FFFFFF" w:sz="0"/>
+            </w:tcBorders>
+          </w:tcPr>
+          <w:p/>
+        </w:tc>
+      </w:tr>
+      <w:tr>
+        <w:tc>
+          <w:tcPr>
+            <w:tcW w:type="dxa" w:w="950"/>
+            <w:gridSpan w:val="2"/>
+            <w:tcBorders>
+              <w:top w:val="none" w:color="FFFFFF" w:sz="0"/>
+              <w:left w:val="none" w:color="FFFFFF" w:sz="0"/>
+              <w:bottom w:val="none" w:color="FFFFFF" w:sz="0"/>
+              <w:right w:val="none" w:color="FFFFFF" w:sz="0"/>
+            </w:tcBorders>
+            <w:tcMar>
+              <w:top w:type="dxa" w:w="0"/>
+              <w:left w:type="dxa" w:w="0"/>
+              <w:bottom w:type="dxa" w:w="0"/>
+              <w:right w:type="dxa" w:w="0"/>
+            </w:tcMar>
+            <w:vAlign w:val="top"/>
+          </w:tcPr>
+          <w:p>
+            <w:pPr>
+              <w:spacing w:after="0" w:before="0"/>
+              <w:jc w:val="center"/>
+            </w:pPr>
+            <w:r>
+              <w:drawing>
+                <wp:inline distT="0" distB="0" distL="0" distR="0">
+                  <wp:extent cx="402235" cy="447944"/>
+                  <wp:effectExtent t="0" r="0" b="0" l="0"/>
+                  <wp:docPr id="1" name="" descr="" title=""/>
+                  <wp:cNvGraphicFramePr>
+                    <a:graphicFrameLocks xmlns:a="http://schemas.openxmlformats.org/drawingml/2006/main" noChangeAspect="1"/>
+                  </wp:cNvGraphicFramePr>
+                  <a:graphic xmlns:a="http://schemas.openxmlformats.org/drawingml/2006/main">
+                    <a:graphicData uri="http://schemas.openxmlformats.org/drawingml/2006/picture">
+                      <pic:pic xmlns:pic="http://schemas.openxmlformats.org/drawingml/2006/picture">
+                        <pic:nvPicPr>
+                          <pic:cNvPr id="0" name="" descr=""/>
+                          <pic:cNvPicPr>
+                            <a:picLocks noChangeAspect="1" noChangeArrowheads="1"/>
+                          </pic:cNvPicPr>
+                        </pic:nvPicPr>
+                        <pic:blipFill>
+                          <a:blip r:embed="rId19" cstate="none"/>
+                          <a:srcRect/>
+                          <a:stretch>
+                            <a:fillRect/>
+                          </a:stretch>
+                        </pic:blipFill>
+                        <pic:spPr bwMode="auto">
+                          <a:xfrm>
+                            <a:off x="0" y="0"/>
+                            <a:ext cx="402235" cy="447944"/>
+                          </a:xfrm>
+                          <a:prstGeom prst="rect">
+                            <a:avLst/>
+                          </a:prstGeom>
+                        </pic:spPr>
+                      </pic:pic>
+                    </a:graphicData>
+                  </a:graphic>
+                </wp:inline>
+              </w:drawing>
+            </w:r>
+          </w:p>
+        </w:tc>
+        <w:tc>
+          <w:tcPr>
+            <w:tcW w:type="dxa" w:w="8681"/>
+            <w:vMerge w:val="restart"/>
+            <w:tcBorders>
+              <w:top w:val="none" w:color="FFFFFF" w:sz="0"/>
+              <w:left w:val="none" w:color="FFFFFF" w:sz="0"/>
+              <w:bottom w:val="none" w:color="FFFFFF" w:sz="0"/>
+              <w:right w:val="none" w:color="FFFFFF" w:sz="0"/>
+            </w:tcBorders>
+            <w:tcMar>
+              <w:top w:type="dxa" w:w="29"/>
+              <w:left w:type="dxa" w:w="0"/>
+              <w:bottom w:type="dxa" w:w="0"/>
+              <w:right w:type="dxa" w:w="0"/>
+            </w:tcMar>
+          </w:tcPr>
+          <w:p>
+            <w:pPr>
+              <w:spacing w:after="43" w:before="0"/>
+            </w:pPr>
             <w:r>
               <w:rPr>
                 <w:rFonts w:ascii="Poppins" w:cs="Poppins" w:eastAsia="Poppins" w:hAnsi="Poppins"/>
-                <w:color w:val="2B2B2B"/>
-                <w:sz w:val="15"/>
-                <w:szCs w:val="15"/>
-                <w:shd w:fill="E3F3FA" w:color="auto" w:val="clear"/>
-              </w:rPr>
-              <w:t xml:space="preserve">Adquisición y pérdida de la condición de personal funcionario de carrera </w:t>
-            </w:r>
-            <w:r>
-              <w:rPr>
-                <w:rFonts w:ascii="Poppins" w:cs="Poppins" w:eastAsia="Poppins" w:hAnsi="Poppins"/>
-                <w:sz w:val="15"/>
-                <w:szCs w:val="15"/>
-              </w:rPr>
-              <w:t xml:space="preserve">   </w:t>
-            </w:r>
+                <w:b/>
+                <w:bCs/>
+                <w:color w:val="6F8290"/>
+                <w:sz w:val="12"/>
+                <w:szCs w:val="12"/>
+              </w:rPr>
+              <w:t xml:space="preserve">TÍTULO III</w:t>
+            </w:r>
+          </w:p>
+          <w:p>
+            <w:pPr>
+              <w:spacing w:after="86" w:before="0"/>
+            </w:pPr>
             <w:r>
               <w:rPr>
                 <w:rFonts w:ascii="Poppins" w:cs="Poppins" w:eastAsia="Poppins" w:hAnsi="Poppins"/>
                 <w:b/>
                 <w:bCs/>
                 <w:color w:val="143548"/>
-                <w:sz w:val="15"/>
-                <w:szCs w:val="15"/>
-                <w:shd w:fill="E3F3FA" w:color="auto" w:val="clear"/>
-              </w:rPr>
-              <w:t xml:space="preserve"> Capítulo II  </w:t>
-            </w:r>
+                <w:sz w:val="21"/>
+                <w:szCs w:val="21"/>
+              </w:rPr>
+              <w:t xml:space="preserve">Promoción interna del personal funcionario de carrera y del personal laboral</w:t>
+            </w:r>
+          </w:p>
+          <w:p>
+            <w:pPr>
+              <w:spacing w:after="0" w:before="0"/>
+            </w:pPr>
+            <w:r>
+              <w:drawing>
+                <wp:inline distT="0" distB="0" distL="0" distR="0">
+                  <wp:extent cx="1643732" cy="210266"/>
+                  <wp:effectExtent l="0" t="0" r="0" b="0"/>
+                  <wp:docPr id="5018" name="Forma 5018"/>
+                  <wp:cNvGraphicFramePr/>
+                  <a:graphic xmlns:a="http://schemas.openxmlformats.org/drawingml/2006/main">
+                    <a:graphicData uri="http://schemas.microsoft.com/office/word/2010/wordprocessingShape">
+                      <wps:wsp>
+                        <wps:cNvSpPr/>
+                        <wps:spPr>
+                          <a:xfrm>
+                            <a:off x="0" y="0"/>
+                            <a:ext cx="1643732" cy="210266"/>
+                          </a:xfrm>
+                          <a:prstGeom prst="roundRect">
+                            <a:avLst>
+                              <a:gd name="adj" fmla="val 50000"/>
+                            </a:avLst>
+                          </a:prstGeom>
+                          <a:solidFill>
+                            <a:srgbClr val="FFFFFF"/>
+                          </a:solidFill>
+                          <a:ln w="9525">
+                            <a:solidFill>
+                              <a:srgbClr val="CFE3EC"/>
+                            </a:solidFill>
+                          </a:ln>
+                        </wps:spPr>
+                        <wps:txbx>
+                          <w:txbxContent>
+                            <w:p>
+                              <w:pPr>
+                                <w:spacing w:before="0" w:after="0" w:line="240" w:lineRule="auto"/>
+                                <w:jc w:val="center"/>
+                              </w:pPr>
+                              <w:r>
+                                <w:rPr>
+                                  <w:rFonts w:ascii="Poppins" w:hAnsi="Poppins" w:cs="Poppins"/>
+                                  <w:b/>
+                                  <w:bCs/>
+                                  <w:color w:val="143548"/>
+                                  <w:sz w:val="15"/>
+                                  <w:szCs w:val="15"/>
+                                </w:rPr>
+                                <w:t xml:space="preserve">Capítulo I </w:t>
+                              </w:r>
+                              <w:r>
+                                <w:rPr>
+                                  <w:rFonts w:ascii="Poppins" w:hAnsi="Poppins" w:cs="Poppins"/>
+                                  <w:color w:val="2B2B2B"/>
+                                  <w:sz w:val="15"/>
+                                  <w:szCs w:val="15"/>
+                                </w:rPr>
+                                <w:t xml:space="preserve">Normas generales</w:t>
+                              </w:r>
+                            </w:p>
+                          </w:txbxContent>
+                        </wps:txbx>
+                        <wps:bodyPr rot="0" vert="horz" wrap="square" lIns="54852" tIns="0" rIns="54852" bIns="0" anchor="ctr" anchorCtr="0">
+                          <a:noAutofit/>
+                        </wps:bodyPr>
+                      </wps:wsp>
+                    </a:graphicData>
+                  </a:graphic>
+                </wp:inline>
+              </w:drawing>
+            </w:r>
+          </w:p>
+          <w:p>
+            <w:pPr>
+              <w:spacing w:after="0" w:before="72"/>
+            </w:pPr>
+            <w:r>
+              <w:drawing>
+                <wp:inline distT="0" distB="0" distL="0" distR="0">
+                  <wp:extent cx="3760105" cy="210266"/>
+                  <wp:effectExtent l="0" t="0" r="0" b="0"/>
+                  <wp:docPr id="5019" name="Forma 5019"/>
+                  <wp:cNvGraphicFramePr/>
+                  <a:graphic xmlns:a="http://schemas.openxmlformats.org/drawingml/2006/main">
+                    <a:graphicData uri="http://schemas.microsoft.com/office/word/2010/wordprocessingShape">
+                      <wps:wsp>
+                        <wps:cNvSpPr/>
+                        <wps:spPr>
+                          <a:xfrm>
+                            <a:off x="0" y="0"/>
+                            <a:ext cx="3760105" cy="210266"/>
+                          </a:xfrm>
+                          <a:prstGeom prst="roundRect">
+                            <a:avLst>
+                              <a:gd name="adj" fmla="val 50000"/>
+                            </a:avLst>
+                          </a:prstGeom>
+                          <a:solidFill>
+                            <a:srgbClr val="FFFFFF"/>
+                          </a:solidFill>
+                          <a:ln w="9525">
+                            <a:solidFill>
+                              <a:srgbClr val="CFE3EC"/>
+                            </a:solidFill>
+                          </a:ln>
+                        </wps:spPr>
+                        <wps:txbx>
+                          <w:txbxContent>
+                            <w:p>
+                              <w:pPr>
+                                <w:spacing w:before="0" w:after="0" w:line="240" w:lineRule="auto"/>
+                                <w:jc w:val="center"/>
+                              </w:pPr>
+                              <w:r>
+                                <w:rPr>
+                                  <w:rFonts w:ascii="Poppins" w:hAnsi="Poppins" w:cs="Poppins"/>
+                                  <w:b/>
+                                  <w:bCs/>
+                                  <w:color w:val="143548"/>
+                                  <w:sz w:val="15"/>
+                                  <w:szCs w:val="15"/>
+                                </w:rPr>
+                                <w:t xml:space="preserve">Capítulo II </w:t>
+                              </w:r>
+                              <w:r>
+                                <w:rPr>
+                                  <w:rFonts w:ascii="Poppins" w:hAnsi="Poppins" w:cs="Poppins"/>
+                                  <w:color w:val="2B2B2B"/>
+                                  <w:sz w:val="15"/>
+                                  <w:szCs w:val="15"/>
+                                </w:rPr>
+                                <w:t xml:space="preserve">Promoción interna vertical del personal funcionario de carrera</w:t>
+                              </w:r>
+                            </w:p>
+                          </w:txbxContent>
+                        </wps:txbx>
+                        <wps:bodyPr rot="0" vert="horz" wrap="square" lIns="54852" tIns="0" rIns="54852" bIns="0" anchor="ctr" anchorCtr="0">
+                          <a:noAutofit/>
+                        </wps:bodyPr>
+                      </wps:wsp>
+                    </a:graphicData>
+                  </a:graphic>
+                </wp:inline>
+              </w:drawing>
+            </w:r>
+          </w:p>
+          <w:p>
+            <w:pPr>
+              <w:spacing w:after="0" w:before="72"/>
+            </w:pPr>
+            <w:r>
+              <w:drawing>
+                <wp:inline distT="0" distB="0" distL="0" distR="0">
+                  <wp:extent cx="3904548" cy="210266"/>
+                  <wp:effectExtent l="0" t="0" r="0" b="0"/>
+                  <wp:docPr id="5020" name="Forma 5020"/>
+                  <wp:cNvGraphicFramePr/>
+                  <a:graphic xmlns:a="http://schemas.openxmlformats.org/drawingml/2006/main">
+                    <a:graphicData uri="http://schemas.microsoft.com/office/word/2010/wordprocessingShape">
+                      <wps:wsp>
+                        <wps:cNvSpPr/>
+                        <wps:spPr>
+                          <a:xfrm>
+                            <a:off x="0" y="0"/>
+                            <a:ext cx="3904548" cy="210266"/>
+                          </a:xfrm>
+                          <a:prstGeom prst="roundRect">
+                            <a:avLst>
+                              <a:gd name="adj" fmla="val 50000"/>
+                            </a:avLst>
+                          </a:prstGeom>
+                          <a:solidFill>
+                            <a:srgbClr val="FFFFFF"/>
+                          </a:solidFill>
+                          <a:ln w="9525">
+                            <a:solidFill>
+                              <a:srgbClr val="CFE3EC"/>
+                            </a:solidFill>
+                          </a:ln>
+                        </wps:spPr>
+                        <wps:txbx>
+                          <w:txbxContent>
+                            <w:p>
+                              <w:pPr>
+                                <w:spacing w:before="0" w:after="0" w:line="240" w:lineRule="auto"/>
+                                <w:jc w:val="center"/>
+                              </w:pPr>
+                              <w:r>
+                                <w:rPr>
+                                  <w:rFonts w:ascii="Poppins" w:hAnsi="Poppins" w:cs="Poppins"/>
+                                  <w:b/>
+                                  <w:bCs/>
+                                  <w:color w:val="143548"/>
+                                  <w:sz w:val="15"/>
+                                  <w:szCs w:val="15"/>
+                                </w:rPr>
+                                <w:t xml:space="preserve">Capítulo III </w:t>
+                              </w:r>
+                              <w:r>
+                                <w:rPr>
+                                  <w:rFonts w:ascii="Poppins" w:hAnsi="Poppins" w:cs="Poppins"/>
+                                  <w:color w:val="2B2B2B"/>
+                                  <w:sz w:val="15"/>
+                                  <w:szCs w:val="15"/>
+                                </w:rPr>
+                                <w:t xml:space="preserve">Promoción interna horizontal del personal funcionario de carrera</w:t>
+                              </w:r>
+                            </w:p>
+                          </w:txbxContent>
+                        </wps:txbx>
+                        <wps:bodyPr rot="0" vert="horz" wrap="square" lIns="54852" tIns="0" rIns="54852" bIns="0" anchor="ctr" anchorCtr="0">
+                          <a:noAutofit/>
+                        </wps:bodyPr>
+                      </wps:wsp>
+                    </a:graphicData>
+                  </a:graphic>
+                </wp:inline>
+              </w:drawing>
+            </w:r>
+          </w:p>
+          <w:p>
+            <w:pPr>
+              <w:spacing w:after="0" w:before="0" w:line="173" w:lineRule="exact"/>
+            </w:pPr>
+            <w:r>
+              <w:rPr>
+                <w:sz w:val="2"/>
+                <w:szCs w:val="2"/>
+              </w:rPr>
+              <w:t xml:space="preserve"/>
+            </w:r>
+          </w:p>
+        </w:tc>
+      </w:tr>
+      <w:tr>
+        <w:tc>
+          <w:tcPr>
+            <w:tcW w:type="dxa" w:w="475"/>
+            <w:tcBorders>
+              <w:top w:val="none" w:color="FFFFFF" w:sz="0"/>
+              <w:left w:val="none" w:color="FFFFFF" w:sz="0"/>
+              <w:bottom w:val="none" w:color="FFFFFF" w:sz="0"/>
+              <w:right w:val="single" w:color="9DDFEA" w:sz="12"/>
+            </w:tcBorders>
+            <w:tcMar>
+              <w:top w:type="dxa" w:w="0"/>
+              <w:left w:type="dxa" w:w="0"/>
+              <w:bottom w:type="dxa" w:w="0"/>
+              <w:right w:type="dxa" w:w="0"/>
+            </w:tcMar>
+          </w:tcPr>
+          <w:p>
+            <w:pPr>
+              <w:spacing w:after="0" w:before="0" w:line="14" w:lineRule="exact"/>
+            </w:pPr>
+            <w:r>
+              <w:rPr>
+                <w:sz w:val="2"/>
+                <w:szCs w:val="2"/>
+              </w:rPr>
+              <w:t xml:space="preserve"/>
+            </w:r>
+          </w:p>
+        </w:tc>
+        <w:tc>
+          <w:tcPr>
+            <w:tcW w:type="dxa" w:w="475"/>
+            <w:tcBorders>
+              <w:top w:val="none" w:color="FFFFFF" w:sz="0"/>
+              <w:left w:val="single" w:color="9DDFEA" w:sz="12"/>
+              <w:bottom w:val="none" w:color="FFFFFF" w:sz="0"/>
+              <w:right w:val="none" w:color="FFFFFF" w:sz="0"/>
+            </w:tcBorders>
+            <w:tcMar>
+              <w:top w:type="dxa" w:w="0"/>
+              <w:left w:type="dxa" w:w="0"/>
+              <w:bottom w:type="dxa" w:w="0"/>
+              <w:right w:type="dxa" w:w="0"/>
+            </w:tcMar>
+          </w:tcPr>
+          <w:p>
+            <w:pPr>
+              <w:spacing w:after="0" w:before="0" w:line="14" w:lineRule="exact"/>
+            </w:pPr>
+            <w:r>
+              <w:rPr>
+                <w:sz w:val="2"/>
+                <w:szCs w:val="2"/>
+              </w:rPr>
+              <w:t xml:space="preserve"/>
+            </w:r>
+          </w:p>
+        </w:tc>
+        <w:tc>
+          <w:tcPr>
+            <w:vMerge w:val="continue"/>
+            <w:tcBorders>
+              <w:top w:val="none" w:color="FFFFFF" w:sz="0"/>
+              <w:left w:val="none" w:color="FFFFFF" w:sz="0"/>
+              <w:bottom w:val="none" w:color="FFFFFF" w:sz="0"/>
+              <w:right w:val="none" w:color="FFFFFF" w:sz="0"/>
+            </w:tcBorders>
+          </w:tcPr>
+          <w:p/>
+        </w:tc>
+      </w:tr>
+      <w:tr>
+        <w:tc>
+          <w:tcPr>
+            <w:tcW w:type="dxa" w:w="950"/>
+            <w:gridSpan w:val="2"/>
+            <w:tcBorders>
+              <w:top w:val="none" w:color="FFFFFF" w:sz="0"/>
+              <w:left w:val="none" w:color="FFFFFF" w:sz="0"/>
+              <w:bottom w:val="none" w:color="FFFFFF" w:sz="0"/>
+              <w:right w:val="none" w:color="FFFFFF" w:sz="0"/>
+            </w:tcBorders>
+            <w:tcMar>
+              <w:top w:type="dxa" w:w="0"/>
+              <w:left w:type="dxa" w:w="0"/>
+              <w:bottom w:type="dxa" w:w="0"/>
+              <w:right w:type="dxa" w:w="0"/>
+            </w:tcMar>
+            <w:vAlign w:val="top"/>
+          </w:tcPr>
+          <w:p>
+            <w:pPr>
+              <w:spacing w:after="0" w:before="0"/>
+              <w:jc w:val="center"/>
+            </w:pPr>
+            <w:r>
+              <w:drawing>
+                <wp:inline distT="0" distB="0" distL="0" distR="0">
+                  <wp:extent cx="402235" cy="447944"/>
+                  <wp:effectExtent t="0" r="0" b="0" l="0"/>
+                  <wp:docPr id="1" name="" descr="" title=""/>
+                  <wp:cNvGraphicFramePr>
+                    <a:graphicFrameLocks xmlns:a="http://schemas.openxmlformats.org/drawingml/2006/main" noChangeAspect="1"/>
+                  </wp:cNvGraphicFramePr>
+                  <a:graphic xmlns:a="http://schemas.openxmlformats.org/drawingml/2006/main">
+                    <a:graphicData uri="http://schemas.openxmlformats.org/drawingml/2006/picture">
+                      <pic:pic xmlns:pic="http://schemas.openxmlformats.org/drawingml/2006/picture">
+                        <pic:nvPicPr>
+                          <pic:cNvPr id="0" name="" descr=""/>
+                          <pic:cNvPicPr>
+                            <a:picLocks noChangeAspect="1" noChangeArrowheads="1"/>
+                          </pic:cNvPicPr>
+                        </pic:nvPicPr>
+                        <pic:blipFill>
+                          <a:blip r:embed="rId20" cstate="none"/>
+                          <a:srcRect/>
+                          <a:stretch>
+                            <a:fillRect/>
+                          </a:stretch>
+                        </pic:blipFill>
+                        <pic:spPr bwMode="auto">
+                          <a:xfrm>
+                            <a:off x="0" y="0"/>
+                            <a:ext cx="402235" cy="447944"/>
+                          </a:xfrm>
+                          <a:prstGeom prst="rect">
+                            <a:avLst/>
+                          </a:prstGeom>
+                        </pic:spPr>
+                      </pic:pic>
+                    </a:graphicData>
+                  </a:graphic>
+                </wp:inline>
+              </w:drawing>
+            </w:r>
+          </w:p>
+        </w:tc>
+        <w:tc>
+          <w:tcPr>
+            <w:tcW w:type="dxa" w:w="8681"/>
+            <w:vMerge w:val="restart"/>
+            <w:tcBorders>
+              <w:top w:val="none" w:color="FFFFFF" w:sz="0"/>
+              <w:left w:val="none" w:color="FFFFFF" w:sz="0"/>
+              <w:bottom w:val="none" w:color="FFFFFF" w:sz="0"/>
+              <w:right w:val="none" w:color="FFFFFF" w:sz="0"/>
+            </w:tcBorders>
+            <w:tcMar>
+              <w:top w:type="dxa" w:w="29"/>
+              <w:left w:type="dxa" w:w="0"/>
+              <w:bottom w:type="dxa" w:w="0"/>
+              <w:right w:type="dxa" w:w="0"/>
+            </w:tcMar>
+          </w:tcPr>
+          <w:p>
+            <w:pPr>
+              <w:spacing w:after="43" w:before="0"/>
+            </w:pPr>
             <w:r>
               <w:rPr>
                 <w:rFonts w:ascii="Poppins" w:cs="Poppins" w:eastAsia="Poppins" w:hAnsi="Poppins"/>
-                <w:color w:val="2B2B2B"/>
-                <w:sz w:val="15"/>
-                <w:szCs w:val="15"/>
-                <w:shd w:fill="E3F3FA" w:color="auto" w:val="clear"/>
-              </w:rPr>
-              <w:t xml:space="preserve">Rehabilitación de la condición de personal funcionario de carrera </w:t>
-            </w:r>
-            <w:r>
-              <w:rPr>
-                <w:rFonts w:ascii="Poppins" w:cs="Poppins" w:eastAsia="Poppins" w:hAnsi="Poppins"/>
-                <w:sz w:val="15"/>
-                <w:szCs w:val="15"/>
-              </w:rPr>
-              <w:t xml:space="preserve">   </w:t>
-            </w:r>
+                <w:b/>
+                <w:bCs/>
+                <w:color w:val="6F8290"/>
+                <w:sz w:val="12"/>
+                <w:szCs w:val="12"/>
+              </w:rPr>
+              <w:t xml:space="preserve">TÍTULO IV</w:t>
+            </w:r>
+          </w:p>
+          <w:p>
+            <w:pPr>
+              <w:spacing w:after="86" w:before="0"/>
+            </w:pPr>
             <w:r>
               <w:rPr>
                 <w:rFonts w:ascii="Poppins" w:cs="Poppins" w:eastAsia="Poppins" w:hAnsi="Poppins"/>
                 <w:b/>
                 <w:bCs/>
                 <w:color w:val="143548"/>
-                <w:sz w:val="15"/>
-                <w:szCs w:val="15"/>
-                <w:shd w:fill="E3F3FA" w:color="auto" w:val="clear"/>
-              </w:rPr>
-              <w:t xml:space="preserve"> Capítulo III  </w:t>
-            </w:r>
+                <w:sz w:val="21"/>
+                <w:szCs w:val="21"/>
+              </w:rPr>
+              <w:t xml:space="preserve">Provisión de puestos de trabajo y movilidad del personal funcionario y laboral</w:t>
+            </w:r>
+          </w:p>
+          <w:p>
+            <w:pPr>
+              <w:spacing w:after="0" w:before="0"/>
+            </w:pPr>
+            <w:r>
+              <w:drawing>
+                <wp:inline distT="0" distB="0" distL="0" distR="0">
+                  <wp:extent cx="1643732" cy="210266"/>
+                  <wp:effectExtent l="0" t="0" r="0" b="0"/>
+                  <wp:docPr id="5021" name="Forma 5021"/>
+                  <wp:cNvGraphicFramePr/>
+                  <a:graphic xmlns:a="http://schemas.openxmlformats.org/drawingml/2006/main">
+                    <a:graphicData uri="http://schemas.microsoft.com/office/word/2010/wordprocessingShape">
+                      <wps:wsp>
+                        <wps:cNvSpPr/>
+                        <wps:spPr>
+                          <a:xfrm>
+                            <a:off x="0" y="0"/>
+                            <a:ext cx="1643732" cy="210266"/>
+                          </a:xfrm>
+                          <a:prstGeom prst="roundRect">
+                            <a:avLst>
+                              <a:gd name="adj" fmla="val 50000"/>
+                            </a:avLst>
+                          </a:prstGeom>
+                          <a:solidFill>
+                            <a:srgbClr val="FFFFFF"/>
+                          </a:solidFill>
+                          <a:ln w="9525">
+                            <a:solidFill>
+                              <a:srgbClr val="CFE3EC"/>
+                            </a:solidFill>
+                          </a:ln>
+                        </wps:spPr>
+                        <wps:txbx>
+                          <w:txbxContent>
+                            <w:p>
+                              <w:pPr>
+                                <w:spacing w:before="0" w:after="0" w:line="240" w:lineRule="auto"/>
+                                <w:jc w:val="center"/>
+                              </w:pPr>
+                              <w:r>
+                                <w:rPr>
+                                  <w:rFonts w:ascii="Poppins" w:hAnsi="Poppins" w:cs="Poppins"/>
+                                  <w:b/>
+                                  <w:bCs/>
+                                  <w:color w:val="143548"/>
+                                  <w:sz w:val="15"/>
+                                  <w:szCs w:val="15"/>
+                                </w:rPr>
+                                <w:t xml:space="preserve">Capítulo I </w:t>
+                              </w:r>
+                              <w:r>
+                                <w:rPr>
+                                  <w:rFonts w:ascii="Poppins" w:hAnsi="Poppins" w:cs="Poppins"/>
+                                  <w:color w:val="2B2B2B"/>
+                                  <w:sz w:val="15"/>
+                                  <w:szCs w:val="15"/>
+                                </w:rPr>
+                                <w:t xml:space="preserve">Normas generales</w:t>
+                              </w:r>
+                            </w:p>
+                          </w:txbxContent>
+                        </wps:txbx>
+                        <wps:bodyPr rot="0" vert="horz" wrap="square" lIns="54852" tIns="0" rIns="54852" bIns="0" anchor="ctr" anchorCtr="0">
+                          <a:noAutofit/>
+                        </wps:bodyPr>
+                      </wps:wsp>
+                    </a:graphicData>
+                  </a:graphic>
+                </wp:inline>
+              </w:drawing>
+            </w:r>
+          </w:p>
+          <w:p>
+            <w:pPr>
+              <w:spacing w:after="0" w:before="72"/>
+            </w:pPr>
+            <w:r>
+              <w:drawing>
+                <wp:inline distT="0" distB="0" distL="0" distR="0">
+                  <wp:extent cx="4336051" cy="210266"/>
+                  <wp:effectExtent l="0" t="0" r="0" b="0"/>
+                  <wp:docPr id="5022" name="Forma 5022"/>
+                  <wp:cNvGraphicFramePr/>
+                  <a:graphic xmlns:a="http://schemas.openxmlformats.org/drawingml/2006/main">
+                    <a:graphicData uri="http://schemas.microsoft.com/office/word/2010/wordprocessingShape">
+                      <wps:wsp>
+                        <wps:cNvSpPr/>
+                        <wps:spPr>
+                          <a:xfrm>
+                            <a:off x="0" y="0"/>
+                            <a:ext cx="4336051" cy="210266"/>
+                          </a:xfrm>
+                          <a:prstGeom prst="roundRect">
+                            <a:avLst>
+                              <a:gd name="adj" fmla="val 50000"/>
+                            </a:avLst>
+                          </a:prstGeom>
+                          <a:solidFill>
+                            <a:srgbClr val="FFFFFF"/>
+                          </a:solidFill>
+                          <a:ln w="9525">
+                            <a:solidFill>
+                              <a:srgbClr val="CFE3EC"/>
+                            </a:solidFill>
+                          </a:ln>
+                        </wps:spPr>
+                        <wps:txbx>
+                          <w:txbxContent>
+                            <w:p>
+                              <w:pPr>
+                                <w:spacing w:before="0" w:after="0" w:line="240" w:lineRule="auto"/>
+                                <w:jc w:val="center"/>
+                              </w:pPr>
+                              <w:r>
+                                <w:rPr>
+                                  <w:rFonts w:ascii="Poppins" w:hAnsi="Poppins" w:cs="Poppins"/>
+                                  <w:b/>
+                                  <w:bCs/>
+                                  <w:color w:val="143548"/>
+                                  <w:sz w:val="15"/>
+                                  <w:szCs w:val="15"/>
+                                </w:rPr>
+                                <w:t xml:space="preserve">Capítulo II </w:t>
+                              </w:r>
+                              <w:r>
+                                <w:rPr>
+                                  <w:rFonts w:ascii="Poppins" w:hAnsi="Poppins" w:cs="Poppins"/>
+                                  <w:color w:val="2B2B2B"/>
+                                  <w:sz w:val="15"/>
+                                  <w:szCs w:val="15"/>
+                                </w:rPr>
+                                <w:t xml:space="preserve">Procedimientos ordinarios de provisión de personal funcionario de carrera</w:t>
+                              </w:r>
+                            </w:p>
+                          </w:txbxContent>
+                        </wps:txbx>
+                        <wps:bodyPr rot="0" vert="horz" wrap="square" lIns="54852" tIns="0" rIns="54852" bIns="0" anchor="ctr" anchorCtr="0">
+                          <a:noAutofit/>
+                        </wps:bodyPr>
+                      </wps:wsp>
+                    </a:graphicData>
+                  </a:graphic>
+                </wp:inline>
+              </w:drawing>
+            </w:r>
+          </w:p>
+          <w:p>
+            <w:pPr>
+              <w:spacing w:after="0" w:before="72"/>
+            </w:pPr>
+            <w:r>
+              <w:drawing>
+                <wp:inline distT="0" distB="0" distL="0" distR="0">
+                  <wp:extent cx="3452019" cy="210266"/>
+                  <wp:effectExtent l="0" t="0" r="0" b="0"/>
+                  <wp:docPr id="5023" name="Forma 5023"/>
+                  <wp:cNvGraphicFramePr/>
+                  <a:graphic xmlns:a="http://schemas.openxmlformats.org/drawingml/2006/main">
+                    <a:graphicData uri="http://schemas.microsoft.com/office/word/2010/wordprocessingShape">
+                      <wps:wsp>
+                        <wps:cNvSpPr/>
+                        <wps:spPr>
+                          <a:xfrm>
+                            <a:off x="0" y="0"/>
+                            <a:ext cx="3452019" cy="210266"/>
+                          </a:xfrm>
+                          <a:prstGeom prst="roundRect">
+                            <a:avLst>
+                              <a:gd name="adj" fmla="val 50000"/>
+                            </a:avLst>
+                          </a:prstGeom>
+                          <a:solidFill>
+                            <a:srgbClr val="FFFFFF"/>
+                          </a:solidFill>
+                          <a:ln w="9525">
+                            <a:solidFill>
+                              <a:srgbClr val="CFE3EC"/>
+                            </a:solidFill>
+                          </a:ln>
+                        </wps:spPr>
+                        <wps:txbx>
+                          <w:txbxContent>
+                            <w:p>
+                              <w:pPr>
+                                <w:spacing w:before="0" w:after="0" w:line="240" w:lineRule="auto"/>
+                                <w:jc w:val="center"/>
+                              </w:pPr>
+                              <w:r>
+                                <w:rPr>
+                                  <w:rFonts w:ascii="Poppins" w:hAnsi="Poppins" w:cs="Poppins"/>
+                                  <w:b/>
+                                  <w:bCs/>
+                                  <w:color w:val="143548"/>
+                                  <w:sz w:val="15"/>
+                                  <w:szCs w:val="15"/>
+                                </w:rPr>
+                                <w:t xml:space="preserve">Capítulo III </w:t>
+                              </w:r>
+                              <w:r>
+                                <w:rPr>
+                                  <w:rFonts w:ascii="Poppins" w:hAnsi="Poppins" w:cs="Poppins"/>
+                                  <w:color w:val="2B2B2B"/>
+                                  <w:sz w:val="15"/>
+                                  <w:szCs w:val="15"/>
+                                </w:rPr>
+                                <w:t xml:space="preserve">Procedimientos de provisión de carácter extraordinario</w:t>
+                              </w:r>
+                            </w:p>
+                          </w:txbxContent>
+                        </wps:txbx>
+                        <wps:bodyPr rot="0" vert="horz" wrap="square" lIns="54852" tIns="0" rIns="54852" bIns="0" anchor="ctr" anchorCtr="0">
+                          <a:noAutofit/>
+                        </wps:bodyPr>
+                      </wps:wsp>
+                    </a:graphicData>
+                  </a:graphic>
+                </wp:inline>
+              </w:drawing>
+            </w:r>
+          </w:p>
+          <w:p>
+            <w:pPr>
+              <w:spacing w:after="0" w:before="0" w:line="173" w:lineRule="exact"/>
+            </w:pPr>
+            <w:r>
+              <w:rPr>
+                <w:sz w:val="2"/>
+                <w:szCs w:val="2"/>
+              </w:rPr>
+              <w:t xml:space="preserve"/>
+            </w:r>
+          </w:p>
+        </w:tc>
+      </w:tr>
+      <w:tr>
+        <w:tc>
+          <w:tcPr>
+            <w:tcW w:type="dxa" w:w="475"/>
+            <w:tcBorders>
+              <w:top w:val="none" w:color="FFFFFF" w:sz="0"/>
+              <w:left w:val="none" w:color="FFFFFF" w:sz="0"/>
+              <w:bottom w:val="none" w:color="FFFFFF" w:sz="0"/>
+              <w:right w:val="single" w:color="9DDFEA" w:sz="12"/>
+            </w:tcBorders>
+            <w:tcMar>
+              <w:top w:type="dxa" w:w="0"/>
+              <w:left w:type="dxa" w:w="0"/>
+              <w:bottom w:type="dxa" w:w="0"/>
+              <w:right w:type="dxa" w:w="0"/>
+            </w:tcMar>
+          </w:tcPr>
+          <w:p>
+            <w:pPr>
+              <w:spacing w:after="0" w:before="0" w:line="14" w:lineRule="exact"/>
+            </w:pPr>
+            <w:r>
+              <w:rPr>
+                <w:sz w:val="2"/>
+                <w:szCs w:val="2"/>
+              </w:rPr>
+              <w:t xml:space="preserve"/>
+            </w:r>
+          </w:p>
+        </w:tc>
+        <w:tc>
+          <w:tcPr>
+            <w:tcW w:type="dxa" w:w="475"/>
+            <w:tcBorders>
+              <w:top w:val="none" w:color="FFFFFF" w:sz="0"/>
+              <w:left w:val="single" w:color="9DDFEA" w:sz="12"/>
+              <w:bottom w:val="none" w:color="FFFFFF" w:sz="0"/>
+              <w:right w:val="none" w:color="FFFFFF" w:sz="0"/>
+            </w:tcBorders>
+            <w:tcMar>
+              <w:top w:type="dxa" w:w="0"/>
+              <w:left w:type="dxa" w:w="0"/>
+              <w:bottom w:type="dxa" w:w="0"/>
+              <w:right w:type="dxa" w:w="0"/>
+            </w:tcMar>
+          </w:tcPr>
+          <w:p>
+            <w:pPr>
+              <w:spacing w:after="0" w:before="0" w:line="14" w:lineRule="exact"/>
+            </w:pPr>
+            <w:r>
+              <w:rPr>
+                <w:sz w:val="2"/>
+                <w:szCs w:val="2"/>
+              </w:rPr>
+              <w:t xml:space="preserve"/>
+            </w:r>
+          </w:p>
+        </w:tc>
+        <w:tc>
+          <w:tcPr>
+            <w:vMerge w:val="continue"/>
+            <w:tcBorders>
+              <w:top w:val="none" w:color="FFFFFF" w:sz="0"/>
+              <w:left w:val="none" w:color="FFFFFF" w:sz="0"/>
+              <w:bottom w:val="none" w:color="FFFFFF" w:sz="0"/>
+              <w:right w:val="none" w:color="FFFFFF" w:sz="0"/>
+            </w:tcBorders>
+          </w:tcPr>
+          <w:p/>
+        </w:tc>
+      </w:tr>
+      <w:tr>
+        <w:tc>
+          <w:tcPr>
+            <w:tcW w:type="dxa" w:w="950"/>
+            <w:gridSpan w:val="2"/>
+            <w:tcBorders>
+              <w:top w:val="none" w:color="FFFFFF" w:sz="0"/>
+              <w:left w:val="none" w:color="FFFFFF" w:sz="0"/>
+              <w:bottom w:val="none" w:color="FFFFFF" w:sz="0"/>
+              <w:right w:val="none" w:color="FFFFFF" w:sz="0"/>
+            </w:tcBorders>
+            <w:tcMar>
+              <w:top w:type="dxa" w:w="0"/>
+              <w:left w:type="dxa" w:w="0"/>
+              <w:bottom w:type="dxa" w:w="0"/>
+              <w:right w:type="dxa" w:w="0"/>
+            </w:tcMar>
+            <w:vAlign w:val="top"/>
+          </w:tcPr>
+          <w:p>
+            <w:pPr>
+              <w:spacing w:after="0" w:before="0"/>
+              <w:jc w:val="center"/>
+            </w:pPr>
+            <w:r>
+              <w:drawing>
+                <wp:inline distT="0" distB="0" distL="0" distR="0">
+                  <wp:extent cx="402235" cy="447944"/>
+                  <wp:effectExtent t="0" r="0" b="0" l="0"/>
+                  <wp:docPr id="1" name="" descr="" title=""/>
+                  <wp:cNvGraphicFramePr>
+                    <a:graphicFrameLocks xmlns:a="http://schemas.openxmlformats.org/drawingml/2006/main" noChangeAspect="1"/>
+                  </wp:cNvGraphicFramePr>
+                  <a:graphic xmlns:a="http://schemas.openxmlformats.org/drawingml/2006/main">
+                    <a:graphicData uri="http://schemas.openxmlformats.org/drawingml/2006/picture">
+                      <pic:pic xmlns:pic="http://schemas.openxmlformats.org/drawingml/2006/picture">
+                        <pic:nvPicPr>
+                          <pic:cNvPr id="0" name="" descr=""/>
+                          <pic:cNvPicPr>
+                            <a:picLocks noChangeAspect="1" noChangeArrowheads="1"/>
+                          </pic:cNvPicPr>
+                        </pic:nvPicPr>
+                        <pic:blipFill>
+                          <a:blip r:embed="rId21" cstate="none"/>
+                          <a:srcRect/>
+                          <a:stretch>
+                            <a:fillRect/>
+                          </a:stretch>
+                        </pic:blipFill>
+                        <pic:spPr bwMode="auto">
+                          <a:xfrm>
+                            <a:off x="0" y="0"/>
+                            <a:ext cx="402235" cy="447944"/>
+                          </a:xfrm>
+                          <a:prstGeom prst="rect">
+                            <a:avLst/>
+                          </a:prstGeom>
+                        </pic:spPr>
+                      </pic:pic>
+                    </a:graphicData>
+                  </a:graphic>
+                </wp:inline>
+              </w:drawing>
+            </w:r>
+          </w:p>
+        </w:tc>
+        <w:tc>
+          <w:tcPr>
+            <w:tcW w:type="dxa" w:w="8681"/>
+            <w:vMerge w:val="restart"/>
+            <w:tcBorders>
+              <w:top w:val="none" w:color="FFFFFF" w:sz="0"/>
+              <w:left w:val="none" w:color="FFFFFF" w:sz="0"/>
+              <w:bottom w:val="none" w:color="FFFFFF" w:sz="0"/>
+              <w:right w:val="none" w:color="FFFFFF" w:sz="0"/>
+            </w:tcBorders>
+            <w:tcMar>
+              <w:top w:type="dxa" w:w="29"/>
+              <w:left w:type="dxa" w:w="0"/>
+              <w:bottom w:type="dxa" w:w="0"/>
+              <w:right w:type="dxa" w:w="0"/>
+            </w:tcMar>
+          </w:tcPr>
+          <w:p>
+            <w:pPr>
+              <w:spacing w:after="43" w:before="0"/>
+            </w:pPr>
             <w:r>
               <w:rPr>
                 <w:rFonts w:ascii="Poppins" w:cs="Poppins" w:eastAsia="Poppins" w:hAnsi="Poppins"/>
-                <w:color w:val="2B2B2B"/>
-                <w:sz w:val="15"/>
-                <w:szCs w:val="15"/>
-                <w:shd w:fill="E3F3FA" w:color="auto" w:val="clear"/>
-              </w:rPr>
-              <w:t xml:space="preserve">Adquisición y pérdida de la condición de personal laboral fijo </w:t>
+                <w:b/>
+                <w:bCs/>
+                <w:color w:val="6F8290"/>
+                <w:sz w:val="12"/>
+                <w:szCs w:val="12"/>
+              </w:rPr>
+              <w:t xml:space="preserve">TÍTULO V</w:t>
+            </w:r>
+          </w:p>
+          <w:p>
+            <w:pPr>
+              <w:spacing w:after="86" w:before="0"/>
+            </w:pPr>
+            <w:r>
+              <w:rPr>
+                <w:rFonts w:ascii="Poppins" w:cs="Poppins" w:eastAsia="Poppins" w:hAnsi="Poppins"/>
+                <w:b/>
+                <w:bCs/>
+                <w:color w:val="143548"/>
+                <w:sz w:val="21"/>
+                <w:szCs w:val="21"/>
+              </w:rPr>
+              <w:t xml:space="preserve">Adquisición y pérdida de la relación de servicio</w:t>
+            </w:r>
+          </w:p>
+          <w:p>
+            <w:pPr>
+              <w:spacing w:after="0" w:before="0"/>
+            </w:pPr>
+            <w:r>
+              <w:drawing>
+                <wp:inline distT="0" distB="0" distL="0" distR="0">
+                  <wp:extent cx="4244631" cy="210266"/>
+                  <wp:effectExtent l="0" t="0" r="0" b="0"/>
+                  <wp:docPr id="5024" name="Forma 5024"/>
+                  <wp:cNvGraphicFramePr/>
+                  <a:graphic xmlns:a="http://schemas.openxmlformats.org/drawingml/2006/main">
+                    <a:graphicData uri="http://schemas.microsoft.com/office/word/2010/wordprocessingShape">
+                      <wps:wsp>
+                        <wps:cNvSpPr/>
+                        <wps:spPr>
+                          <a:xfrm>
+                            <a:off x="0" y="0"/>
+                            <a:ext cx="4244631" cy="210266"/>
+                          </a:xfrm>
+                          <a:prstGeom prst="roundRect">
+                            <a:avLst>
+                              <a:gd name="adj" fmla="val 50000"/>
+                            </a:avLst>
+                          </a:prstGeom>
+                          <a:solidFill>
+                            <a:srgbClr val="FFFFFF"/>
+                          </a:solidFill>
+                          <a:ln w="9525">
+                            <a:solidFill>
+                              <a:srgbClr val="CFE3EC"/>
+                            </a:solidFill>
+                          </a:ln>
+                        </wps:spPr>
+                        <wps:txbx>
+                          <w:txbxContent>
+                            <w:p>
+                              <w:pPr>
+                                <w:spacing w:before="0" w:after="0" w:line="240" w:lineRule="auto"/>
+                                <w:jc w:val="center"/>
+                              </w:pPr>
+                              <w:r>
+                                <w:rPr>
+                                  <w:rFonts w:ascii="Poppins" w:hAnsi="Poppins" w:cs="Poppins"/>
+                                  <w:b/>
+                                  <w:bCs/>
+                                  <w:color w:val="143548"/>
+                                  <w:sz w:val="15"/>
+                                  <w:szCs w:val="15"/>
+                                </w:rPr>
+                                <w:t xml:space="preserve">Capítulo I </w:t>
+                              </w:r>
+                              <w:r>
+                                <w:rPr>
+                                  <w:rFonts w:ascii="Poppins" w:hAnsi="Poppins" w:cs="Poppins"/>
+                                  <w:color w:val="2B2B2B"/>
+                                  <w:sz w:val="15"/>
+                                  <w:szCs w:val="15"/>
+                                </w:rPr>
+                                <w:t xml:space="preserve">Adquisición y pérdida de la condición de personal funcionario de carrera</w:t>
+                              </w:r>
+                            </w:p>
+                          </w:txbxContent>
+                        </wps:txbx>
+                        <wps:bodyPr rot="0" vert="horz" wrap="square" lIns="54852" tIns="0" rIns="54852" bIns="0" anchor="ctr" anchorCtr="0">
+                          <a:noAutofit/>
+                        </wps:bodyPr>
+                      </wps:wsp>
+                    </a:graphicData>
+                  </a:graphic>
+                </wp:inline>
+              </w:drawing>
+            </w:r>
+          </w:p>
+          <w:p>
+            <w:pPr>
+              <w:spacing w:after="0" w:before="72"/>
+            </w:pPr>
+            <w:r>
+              <w:drawing>
+                <wp:inline distT="0" distB="0" distL="0" distR="0">
+                  <wp:extent cx="3918261" cy="210266"/>
+                  <wp:effectExtent l="0" t="0" r="0" b="0"/>
+                  <wp:docPr id="5025" name="Forma 5025"/>
+                  <wp:cNvGraphicFramePr/>
+                  <a:graphic xmlns:a="http://schemas.openxmlformats.org/drawingml/2006/main">
+                    <a:graphicData uri="http://schemas.microsoft.com/office/word/2010/wordprocessingShape">
+                      <wps:wsp>
+                        <wps:cNvSpPr/>
+                        <wps:spPr>
+                          <a:xfrm>
+                            <a:off x="0" y="0"/>
+                            <a:ext cx="3918261" cy="210266"/>
+                          </a:xfrm>
+                          <a:prstGeom prst="roundRect">
+                            <a:avLst>
+                              <a:gd name="adj" fmla="val 50000"/>
+                            </a:avLst>
+                          </a:prstGeom>
+                          <a:solidFill>
+                            <a:srgbClr val="FFFFFF"/>
+                          </a:solidFill>
+                          <a:ln w="9525">
+                            <a:solidFill>
+                              <a:srgbClr val="CFE3EC"/>
+                            </a:solidFill>
+                          </a:ln>
+                        </wps:spPr>
+                        <wps:txbx>
+                          <w:txbxContent>
+                            <w:p>
+                              <w:pPr>
+                                <w:spacing w:before="0" w:after="0" w:line="240" w:lineRule="auto"/>
+                                <w:jc w:val="center"/>
+                              </w:pPr>
+                              <w:r>
+                                <w:rPr>
+                                  <w:rFonts w:ascii="Poppins" w:hAnsi="Poppins" w:cs="Poppins"/>
+                                  <w:b/>
+                                  <w:bCs/>
+                                  <w:color w:val="143548"/>
+                                  <w:sz w:val="15"/>
+                                  <w:szCs w:val="15"/>
+                                </w:rPr>
+                                <w:t xml:space="preserve">Capítulo II </w:t>
+                              </w:r>
+                              <w:r>
+                                <w:rPr>
+                                  <w:rFonts w:ascii="Poppins" w:hAnsi="Poppins" w:cs="Poppins"/>
+                                  <w:color w:val="2B2B2B"/>
+                                  <w:sz w:val="15"/>
+                                  <w:szCs w:val="15"/>
+                                </w:rPr>
+                                <w:t xml:space="preserve">Rehabilitación de la condición de personal funcionario de carrera</w:t>
+                              </w:r>
+                            </w:p>
+                          </w:txbxContent>
+                        </wps:txbx>
+                        <wps:bodyPr rot="0" vert="horz" wrap="square" lIns="54852" tIns="0" rIns="54852" bIns="0" anchor="ctr" anchorCtr="0">
+                          <a:noAutofit/>
+                        </wps:bodyPr>
+                      </wps:wsp>
+                    </a:graphicData>
+                  </a:graphic>
+                </wp:inline>
+              </w:drawing>
+            </w:r>
+          </w:p>
+          <w:p>
+            <w:pPr>
+              <w:spacing w:after="0" w:before="72"/>
+            </w:pPr>
+            <w:r>
+              <w:drawing>
+                <wp:inline distT="0" distB="0" distL="0" distR="0">
+                  <wp:extent cx="3735421" cy="210266"/>
+                  <wp:effectExtent l="0" t="0" r="0" b="0"/>
+                  <wp:docPr id="5026" name="Forma 5026"/>
+                  <wp:cNvGraphicFramePr/>
+                  <a:graphic xmlns:a="http://schemas.openxmlformats.org/drawingml/2006/main">
+                    <a:graphicData uri="http://schemas.microsoft.com/office/word/2010/wordprocessingShape">
+                      <wps:wsp>
+                        <wps:cNvSpPr/>
+                        <wps:spPr>
+                          <a:xfrm>
+                            <a:off x="0" y="0"/>
+                            <a:ext cx="3735421" cy="210266"/>
+                          </a:xfrm>
+                          <a:prstGeom prst="roundRect">
+                            <a:avLst>
+                              <a:gd name="adj" fmla="val 50000"/>
+                            </a:avLst>
+                          </a:prstGeom>
+                          <a:solidFill>
+                            <a:srgbClr val="FFFFFF"/>
+                          </a:solidFill>
+                          <a:ln w="9525">
+                            <a:solidFill>
+                              <a:srgbClr val="CFE3EC"/>
+                            </a:solidFill>
+                          </a:ln>
+                        </wps:spPr>
+                        <wps:txbx>
+                          <w:txbxContent>
+                            <w:p>
+                              <w:pPr>
+                                <w:spacing w:before="0" w:after="0" w:line="240" w:lineRule="auto"/>
+                                <w:jc w:val="center"/>
+                              </w:pPr>
+                              <w:r>
+                                <w:rPr>
+                                  <w:rFonts w:ascii="Poppins" w:hAnsi="Poppins" w:cs="Poppins"/>
+                                  <w:b/>
+                                  <w:bCs/>
+                                  <w:color w:val="143548"/>
+                                  <w:sz w:val="15"/>
+                                  <w:szCs w:val="15"/>
+                                </w:rPr>
+                                <w:t xml:space="preserve">Capítulo III </w:t>
+                              </w:r>
+                              <w:r>
+                                <w:rPr>
+                                  <w:rFonts w:ascii="Poppins" w:hAnsi="Poppins" w:cs="Poppins"/>
+                                  <w:color w:val="2B2B2B"/>
+                                  <w:sz w:val="15"/>
+                                  <w:szCs w:val="15"/>
+                                </w:rPr>
+                                <w:t xml:space="preserve">Adquisición y pérdida de la condición de personal laboral fijo</w:t>
+                              </w:r>
+                            </w:p>
+                          </w:txbxContent>
+                        </wps:txbx>
+                        <wps:bodyPr rot="0" vert="horz" wrap="square" lIns="54852" tIns="0" rIns="54852" bIns="0" anchor="ctr" anchorCtr="0">
+                          <a:noAutofit/>
+                        </wps:bodyPr>
+                      </wps:wsp>
+                    </a:graphicData>
+                  </a:graphic>
+                </wp:inline>
+              </w:drawing>
             </w:r>
           </w:p>
           <w:p>
@@ -2011,7 +3348,7 @@
                     </pic:cNvPicPr>
                   </pic:nvPicPr>
                   <pic:blipFill>
-                    <a:blip r:embed="rId18" cstate="none"/>
+                    <a:blip r:embed="rId22" cstate="none"/>
                     <a:srcRect/>
                     <a:stretch>
                       <a:fillRect/>
@@ -2096,61 +3433,69 @@
         <w:t xml:space="preserve"/>
       </w:r>
     </w:p>
-    <w:tbl>
-      <w:tblPr>
-        <w:tblW w:type="dxa" w:w="9631"/>
-        <w:tblBorders>
-          <w:top w:val="none" w:color="FFFFFF" w:sz="0"/>
-          <w:left w:val="none" w:color="FFFFFF" w:sz="0"/>
-          <w:bottom w:val="none" w:color="FFFFFF" w:sz="0"/>
-          <w:right w:val="none" w:color="FFFFFF" w:sz="0"/>
-          <w:insideH w:val="none" w:color="FFFFFF" w:sz="0"/>
-          <w:insideV w:val="none" w:color="FFFFFF" w:sz="0"/>
-        </w:tblBorders>
-        <w:tblLayout w:type="fixed"/>
-      </w:tblPr>
-      <w:tblGrid>
-        <w:gridCol w:w="9631"/>
-      </w:tblGrid>
-      <w:tr>
-        <w:tc>
-          <w:tcPr>
-            <w:tcW w:type="dxa" w:w="9631"/>
-            <w:tcBorders>
-              <w:top w:val="none" w:color="FFFFFF" w:sz="0"/>
-              <w:left w:val="none" w:color="FFFFFF" w:sz="0"/>
-              <w:bottom w:val="none" w:color="FFFFFF" w:sz="0"/>
-              <w:right w:val="none" w:color="FFFFFF" w:sz="0"/>
-            </w:tcBorders>
-            <w:shd w:fill="143548" w:color="auto" w:val="clear"/>
-            <w:tcMar>
-              <w:top w:type="dxa" w:w="115"/>
-              <w:left w:type="dxa" w:w="144"/>
-              <w:bottom w:type="dxa" w:w="115"/>
-              <w:right w:type="dxa" w:w="144"/>
-            </w:tcMar>
-            <w:vAlign w:val="center"/>
-          </w:tcPr>
-          <w:p>
-            <w:pPr>
-              <w:spacing w:after="0" w:before="0"/>
-              <w:jc w:val="center"/>
-            </w:pPr>
-            <w:r>
-              <w:rPr>
-                <w:rFonts w:ascii="Poppins" w:cs="Poppins" w:eastAsia="Poppins" w:hAnsi="Poppins"/>
-                <w:b/>
-                <w:bCs/>
-                <w:color w:val="FFFFFF"/>
-                <w:sz w:val="30"/>
-                <w:szCs w:val="30"/>
-              </w:rPr>
-              <w:t xml:space="preserve">Título preliminar: Disposiciones generales</w:t>
-            </w:r>
-          </w:p>
-        </w:tc>
-      </w:tr>
-    </w:tbl>
+    <w:p>
+      <w:pPr>
+        <w:spacing w:after="0" w:before="0"/>
+      </w:pPr>
+      <w:r>
+        <w:drawing>
+          <wp:inline distT="0" distB="0" distL="0" distR="0">
+            <wp:extent cx="6115998" cy="438816"/>
+            <wp:effectExtent l="0" t="0" r="0" b="0"/>
+            <wp:docPr id="5027" name="Forma 5027"/>
+            <wp:cNvGraphicFramePr/>
+            <a:graphic xmlns:a="http://schemas.openxmlformats.org/drawingml/2006/main">
+              <a:graphicData uri="http://schemas.microsoft.com/office/word/2010/wordprocessingShape">
+                <wps:wsp>
+                  <wps:cNvSpPr/>
+                  <wps:spPr>
+                    <a:xfrm>
+                      <a:off x="0" y="0"/>
+                      <a:ext cx="6115998" cy="438816"/>
+                    </a:xfrm>
+                    <a:prstGeom prst="roundRect">
+                      <a:avLst>
+                        <a:gd name="adj" fmla="val 50000"/>
+                      </a:avLst>
+                    </a:prstGeom>
+                    <a:solidFill>
+                      <a:srgbClr val="143548"/>
+                    </a:solidFill>
+                    <a:ln>
+                      <a:noFill/>
+                    </a:ln>
+                  </wps:spPr>
+                  <wps:txbx>
+                    <w:txbxContent>
+                      <w:p>
+                        <w:pPr>
+                          <w:spacing w:before="0" w:after="0" w:line="240" w:lineRule="auto"/>
+                          <w:jc w:val="center"/>
+                        </w:pPr>
+                        <w:r>
+                          <w:rPr>
+                            <w:rFonts w:ascii="Poppins" w:hAnsi="Poppins" w:cs="Poppins"/>
+                            <w:b/>
+                            <w:bCs/>
+                            <w:color w:val="FFFFFF"/>
+                            <w:sz w:val="30"/>
+                            <w:szCs w:val="30"/>
+                          </w:rPr>
+                          <w:t xml:space="preserve">Título preliminar: Disposiciones generales</w:t>
+                        </w:r>
+                      </w:p>
+                    </w:txbxContent>
+                  </wps:txbx>
+                  <wps:bodyPr rot="0" vert="horz" wrap="square" lIns="91420" tIns="0" rIns="91420" bIns="0" anchor="ctr" anchorCtr="0">
+                    <a:noAutofit/>
+                  </wps:bodyPr>
+                </wps:wsp>
+              </a:graphicData>
+            </a:graphic>
+          </wp:inline>
+        </w:drawing>
+      </w:r>
+    </w:p>
     <w:p>
       <w:pPr>
         <w:spacing w:after="0" w:before="0" w:line="144" w:lineRule="exact"/>
@@ -2225,7 +3570,7 @@
                           </pic:cNvPicPr>
                         </pic:nvPicPr>
                         <pic:blipFill>
-                          <a:blip r:embed="rId19" cstate="none"/>
+                          <a:blip r:embed="rId23" cstate="none"/>
                           <a:srcRect/>
                           <a:stretch>
                             <a:fillRect/>
@@ -2588,7 +3933,7 @@
                           </pic:cNvPicPr>
                         </pic:nvPicPr>
                         <pic:blipFill>
-                          <a:blip r:embed="rId20" cstate="none"/>
+                          <a:blip r:embed="rId24" cstate="none"/>
                           <a:srcRect/>
                           <a:stretch>
                             <a:fillRect/>
@@ -3779,7 +5124,7 @@
                           </pic:cNvPicPr>
                         </pic:nvPicPr>
                         <pic:blipFill>
-                          <a:blip r:embed="rId21" cstate="none"/>
+                          <a:blip r:embed="rId25" cstate="none"/>
                           <a:srcRect/>
                           <a:stretch>
                             <a:fillRect/>
@@ -4723,7 +6068,7 @@
                           </pic:cNvPicPr>
                         </pic:nvPicPr>
                         <pic:blipFill>
-                          <a:blip r:embed="rId22" cstate="none"/>
+                          <a:blip r:embed="rId26" cstate="none"/>
                           <a:srcRect/>
                           <a:stretch>
                             <a:fillRect/>
@@ -5293,10 +6638,11 @@
       </w:r>
     </w:p>
     <w:sectPr>
-      <w:footerReference w:type="default" r:id="rId8"/>
+      <w:headerReference w:type="default" r:id="rId11"/>
+      <w:footerReference w:type="default" r:id="rId12"/>
       <w:type w:val="nextPage"/>
       <w:pgSz w:w="11906" w:h="16838" w:orient="portrait"/>
-      <w:pgMar w:top="691" w:right="1137" w:bottom="806" w:left="1137" w:header="0" w:footer="165" w:gutter="0"/>
+      <w:pgMar w:top="662" w:right="1137" w:bottom="806" w:left="1137" w:header="0" w:footer="165" w:gutter="0"/>
       <w:pgNumType/>
       <w:docGrid w:linePitch="360"/>
     </w:sectPr>
@@ -5355,6 +6701,56 @@
 <w:ftr xmlns:wpc="http://schemas.microsoft.com/office/word/2010/wordprocessingCanvas" xmlns:mc="http://schemas.openxmlformats.org/markup-compatibility/2006" xmlns:o="urn:schemas-microsoft-com:office:office" xmlns:r="http://schemas.openxmlformats.org/officeDocument/2006/relationships" xmlns:m="http://schemas.openxmlformats.org/officeDocument/2006/math" xmlns:v="urn:schemas-microsoft-com:vml" xmlns:wp14="http://schemas.microsoft.com/office/word/2010/wordprocessingDrawing" xmlns:wp="http://schemas.openxmlformats.org/drawingml/2006/wordprocessingDrawing" xmlns:w10="urn:schemas-microsoft-com:office:word" xmlns:w="http://schemas.openxmlformats.org/wordprocessingml/2006/main" xmlns:w14="http://schemas.microsoft.com/office/word/2010/wordml" xmlns:w15="http://schemas.microsoft.com/office/word/2012/wordml" xmlns:wpg="http://schemas.microsoft.com/office/word/2010/wordprocessingGroup" xmlns:wpi="http://schemas.microsoft.com/office/word/2010/wordprocessingInk" xmlns:wne="http://schemas.microsoft.com/office/word/2006/wordml" xmlns:wps="http://schemas.microsoft.com/office/word/2010/wordprocessingShape">
   <w:p>
     <w:pPr>
+      <w:spacing w:after="0" w:before="0" w:line="240" w:lineRule="auto"/>
+    </w:pPr>
+    <w:r>
+      <w:drawing>
+        <wp:inline distT="0" distB="0" distL="0" distR="0">
+          <wp:extent cx="7560197" cy="3035049"/>
+          <wp:effectExtent t="0" r="0" b="0" l="0"/>
+          <wp:docPr id="1" name="" descr="" title=""/>
+          <wp:cNvGraphicFramePr>
+            <a:graphicFrameLocks xmlns:a="http://schemas.openxmlformats.org/drawingml/2006/main" noChangeAspect="1"/>
+          </wp:cNvGraphicFramePr>
+          <a:graphic xmlns:a="http://schemas.openxmlformats.org/drawingml/2006/main">
+            <a:graphicData uri="http://schemas.openxmlformats.org/drawingml/2006/picture">
+              <pic:pic xmlns:pic="http://schemas.openxmlformats.org/drawingml/2006/picture">
+                <pic:nvPicPr>
+                  <pic:cNvPr id="0" name="" descr=""/>
+                  <pic:cNvPicPr>
+                    <a:picLocks noChangeAspect="1" noChangeArrowheads="1"/>
+                  </pic:cNvPicPr>
+                </pic:nvPicPr>
+                <pic:blipFill>
+                  <a:blip r:embed="rId0" cstate="none"/>
+                  <a:srcRect/>
+                  <a:stretch>
+                    <a:fillRect/>
+                  </a:stretch>
+                </pic:blipFill>
+                <pic:spPr bwMode="auto">
+                  <a:xfrm>
+                    <a:off x="0" y="0"/>
+                    <a:ext cx="7560197" cy="3035049"/>
+                  </a:xfrm>
+                  <a:prstGeom prst="rect">
+                    <a:avLst/>
+                  </a:prstGeom>
+                </pic:spPr>
+              </pic:pic>
+            </a:graphicData>
+          </a:graphic>
+        </wp:inline>
+      </w:drawing>
+    </w:r>
+  </w:p>
+</w:ftr>
+</file>
+
+<file path=word/footer3.xml><?xml version="1.0" encoding="utf-8"?>
+<w:ftr xmlns:wpc="http://schemas.microsoft.com/office/word/2010/wordprocessingCanvas" xmlns:mc="http://schemas.openxmlformats.org/markup-compatibility/2006" xmlns:o="urn:schemas-microsoft-com:office:office" xmlns:r="http://schemas.openxmlformats.org/officeDocument/2006/relationships" xmlns:m="http://schemas.openxmlformats.org/officeDocument/2006/math" xmlns:v="urn:schemas-microsoft-com:vml" xmlns:wp14="http://schemas.microsoft.com/office/word/2010/wordprocessingDrawing" xmlns:wp="http://schemas.openxmlformats.org/drawingml/2006/wordprocessingDrawing" xmlns:w10="urn:schemas-microsoft-com:office:word" xmlns:w="http://schemas.openxmlformats.org/wordprocessingml/2006/main" xmlns:w14="http://schemas.microsoft.com/office/word/2010/wordml" xmlns:w15="http://schemas.microsoft.com/office/word/2012/wordml" xmlns:wpg="http://schemas.microsoft.com/office/word/2010/wordprocessingGroup" xmlns:wpi="http://schemas.microsoft.com/office/word/2010/wordprocessingInk" xmlns:wne="http://schemas.microsoft.com/office/word/2006/wordml" xmlns:wps="http://schemas.microsoft.com/office/word/2010/wordprocessingShape">
+  <w:p>
+    <w:pPr>
       <w:jc w:val="right"/>
     </w:pPr>
     <w:r>
@@ -5408,6 +6804,68 @@
     </w:p>
   </w:footnote>
 </w:footnotes>
+</file>
+
+<file path=word/header1.xml><?xml version="1.0" encoding="utf-8"?>
+<w:hdr xmlns:wpc="http://schemas.microsoft.com/office/word/2010/wordprocessingCanvas" xmlns:mc="http://schemas.openxmlformats.org/markup-compatibility/2006" xmlns:o="urn:schemas-microsoft-com:office:office" xmlns:r="http://schemas.openxmlformats.org/officeDocument/2006/relationships" xmlns:m="http://schemas.openxmlformats.org/officeDocument/2006/math" xmlns:v="urn:schemas-microsoft-com:vml" xmlns:wp14="http://schemas.microsoft.com/office/word/2010/wordprocessingDrawing" xmlns:wp="http://schemas.openxmlformats.org/drawingml/2006/wordprocessingDrawing" xmlns:w10="urn:schemas-microsoft-com:office:word" xmlns:w="http://schemas.openxmlformats.org/wordprocessingml/2006/main" xmlns:w14="http://schemas.microsoft.com/office/word/2010/wordml" xmlns:w15="http://schemas.microsoft.com/office/word/2012/wordml" xmlns:wpg="http://schemas.microsoft.com/office/word/2010/wordprocessingGroup" xmlns:wpi="http://schemas.microsoft.com/office/word/2010/wordprocessingInk" xmlns:wne="http://schemas.microsoft.com/office/word/2006/wordml" xmlns:wps="http://schemas.microsoft.com/office/word/2010/wordprocessingShape" xmlns:cx="http://schemas.microsoft.com/office/drawing/2014/chartex" xmlns:cx1="http://schemas.microsoft.com/office/drawing/2015/9/8/chartex" xmlns:cx2="http://schemas.microsoft.com/office/drawing/2015/10/21/chartex" xmlns:cx3="http://schemas.microsoft.com/office/drawing/2016/5/9/chartex" xmlns:cx4="http://schemas.microsoft.com/office/drawing/2016/5/10/chartex" xmlns:cx5="http://schemas.microsoft.com/office/drawing/2016/5/11/chartex" xmlns:cx6="http://schemas.microsoft.com/office/drawing/2016/5/12/chartex" xmlns:cx7="http://schemas.microsoft.com/office/drawing/2016/5/13/chartex" xmlns:cx8="http://schemas.microsoft.com/office/drawing/2016/5/14/chartex" xmlns:w16cid="http://schemas.microsoft.com/office/word/2016/wordml/cid" xmlns:w16se="http://schemas.microsoft.com/office/word/2015/wordml/symex">
+  <w:p/>
+</w:hdr>
+</file>
+
+<file path=word/header2.xml><?xml version="1.0" encoding="utf-8"?>
+<w:hdr xmlns:wpc="http://schemas.microsoft.com/office/word/2010/wordprocessingCanvas" xmlns:mc="http://schemas.openxmlformats.org/markup-compatibility/2006" xmlns:o="urn:schemas-microsoft-com:office:office" xmlns:r="http://schemas.openxmlformats.org/officeDocument/2006/relationships" xmlns:m="http://schemas.openxmlformats.org/officeDocument/2006/math" xmlns:v="urn:schemas-microsoft-com:vml" xmlns:wp14="http://schemas.microsoft.com/office/word/2010/wordprocessingDrawing" xmlns:wp="http://schemas.openxmlformats.org/drawingml/2006/wordprocessingDrawing" xmlns:w10="urn:schemas-microsoft-com:office:word" xmlns:w="http://schemas.openxmlformats.org/wordprocessingml/2006/main" xmlns:w14="http://schemas.microsoft.com/office/word/2010/wordml" xmlns:w15="http://schemas.microsoft.com/office/word/2012/wordml" xmlns:wpg="http://schemas.microsoft.com/office/word/2010/wordprocessingGroup" xmlns:wpi="http://schemas.microsoft.com/office/word/2010/wordprocessingInk" xmlns:wne="http://schemas.microsoft.com/office/word/2006/wordml" xmlns:wps="http://schemas.microsoft.com/office/word/2010/wordprocessingShape" xmlns:cx="http://schemas.microsoft.com/office/drawing/2014/chartex" xmlns:cx1="http://schemas.microsoft.com/office/drawing/2015/9/8/chartex" xmlns:cx2="http://schemas.microsoft.com/office/drawing/2015/10/21/chartex" xmlns:cx3="http://schemas.microsoft.com/office/drawing/2016/5/9/chartex" xmlns:cx4="http://schemas.microsoft.com/office/drawing/2016/5/10/chartex" xmlns:cx5="http://schemas.microsoft.com/office/drawing/2016/5/11/chartex" xmlns:cx6="http://schemas.microsoft.com/office/drawing/2016/5/12/chartex" xmlns:cx7="http://schemas.microsoft.com/office/drawing/2016/5/13/chartex" xmlns:cx8="http://schemas.microsoft.com/office/drawing/2016/5/14/chartex" xmlns:w16cid="http://schemas.microsoft.com/office/word/2016/wordml/cid" xmlns:w16se="http://schemas.microsoft.com/office/word/2015/wordml/symex">
+  <w:p>
+    <w:pPr>
+      <w:spacing w:after="0" w:before="0" w:line="240" w:lineRule="auto"/>
+    </w:pPr>
+    <w:r>
+      <w:drawing>
+        <wp:inline distT="0" distB="0" distL="0" distR="0">
+          <wp:extent cx="7560197" cy="3482993"/>
+          <wp:effectExtent t="0" r="0" b="0" l="0"/>
+          <wp:docPr id="1" name="" descr="" title=""/>
+          <wp:cNvGraphicFramePr>
+            <a:graphicFrameLocks xmlns:a="http://schemas.openxmlformats.org/drawingml/2006/main" noChangeAspect="1"/>
+          </wp:cNvGraphicFramePr>
+          <a:graphic xmlns:a="http://schemas.openxmlformats.org/drawingml/2006/main">
+            <a:graphicData uri="http://schemas.openxmlformats.org/drawingml/2006/picture">
+              <pic:pic xmlns:pic="http://schemas.openxmlformats.org/drawingml/2006/picture">
+                <pic:nvPicPr>
+                  <pic:cNvPr id="0" name="" descr=""/>
+                  <pic:cNvPicPr>
+                    <a:picLocks noChangeAspect="1" noChangeArrowheads="1"/>
+                  </pic:cNvPicPr>
+                </pic:nvPicPr>
+                <pic:blipFill>
+                  <a:blip r:embed="rId0" cstate="none"/>
+                  <a:srcRect/>
+                  <a:stretch>
+                    <a:fillRect/>
+                  </a:stretch>
+                </pic:blipFill>
+                <pic:spPr bwMode="auto">
+                  <a:xfrm>
+                    <a:off x="0" y="0"/>
+                    <a:ext cx="7560197" cy="3482993"/>
+                  </a:xfrm>
+                  <a:prstGeom prst="rect">
+                    <a:avLst/>
+                  </a:prstGeom>
+                </pic:spPr>
+              </pic:pic>
+            </a:graphicData>
+          </a:graphic>
+        </wp:inline>
+      </w:drawing>
+    </w:r>
+  </w:p>
+</w:hdr>
+</file>
+
+<file path=word/header3.xml><?xml version="1.0" encoding="utf-8"?>
+<w:hdr xmlns:wpc="http://schemas.microsoft.com/office/word/2010/wordprocessingCanvas" xmlns:mc="http://schemas.openxmlformats.org/markup-compatibility/2006" xmlns:o="urn:schemas-microsoft-com:office:office" xmlns:r="http://schemas.openxmlformats.org/officeDocument/2006/relationships" xmlns:m="http://schemas.openxmlformats.org/officeDocument/2006/math" xmlns:v="urn:schemas-microsoft-com:vml" xmlns:wp14="http://schemas.microsoft.com/office/word/2010/wordprocessingDrawing" xmlns:wp="http://schemas.openxmlformats.org/drawingml/2006/wordprocessingDrawing" xmlns:w10="urn:schemas-microsoft-com:office:word" xmlns:w="http://schemas.openxmlformats.org/wordprocessingml/2006/main" xmlns:w14="http://schemas.microsoft.com/office/word/2010/wordml" xmlns:w15="http://schemas.microsoft.com/office/word/2012/wordml" xmlns:wpg="http://schemas.microsoft.com/office/word/2010/wordprocessingGroup" xmlns:wpi="http://schemas.microsoft.com/office/word/2010/wordprocessingInk" xmlns:wne="http://schemas.microsoft.com/office/word/2006/wordml" xmlns:wps="http://schemas.microsoft.com/office/word/2010/wordprocessingShape" xmlns:cx="http://schemas.microsoft.com/office/drawing/2014/chartex" xmlns:cx1="http://schemas.microsoft.com/office/drawing/2015/9/8/chartex" xmlns:cx2="http://schemas.microsoft.com/office/drawing/2015/10/21/chartex" xmlns:cx3="http://schemas.microsoft.com/office/drawing/2016/5/9/chartex" xmlns:cx4="http://schemas.microsoft.com/office/drawing/2016/5/10/chartex" xmlns:cx5="http://schemas.microsoft.com/office/drawing/2016/5/11/chartex" xmlns:cx6="http://schemas.microsoft.com/office/drawing/2016/5/12/chartex" xmlns:cx7="http://schemas.microsoft.com/office/drawing/2016/5/13/chartex" xmlns:cx8="http://schemas.microsoft.com/office/drawing/2016/5/14/chartex" xmlns:w16cid="http://schemas.microsoft.com/office/word/2016/wordml/cid" xmlns:w16se="http://schemas.microsoft.com/office/word/2015/wordml/symex">
+  <w:p/>
+</w:hdr>
 </file>
 
 <file path=word/numbering.xml><?xml version="1.0" encoding="utf-8"?>

</xml_diff>

<commit_message>
Decreto 51/2025 Google Docs v3: badge grouped on headline corner, tighter rows, cover bands in body/footer
Co-Authored-By: Claude Opus 5.5 <noreply@anthropic.com>
Claude-Session: https://claude.ai/code/session_01T98mbmRs8KdzUGJ1QXPFqC
</commit_message>
<xml_diff>
--- a/virginia-jurado/decreto-51-2025-muestra-google-docs.docx
+++ b/virginia-jurado/decreto-51-2025-muestra-google-docs.docx
@@ -4,7 +4,52 @@
   <w:body>
     <w:p>
       <w:pPr>
-        <w:spacing w:after="0" w:before="0" w:line="374" w:lineRule="exact"/>
+        <w:pStyle w:val="tight"/>
+      </w:pPr>
+      <w:r>
+        <w:drawing>
+          <wp:inline distT="0" distB="0" distL="0" distR="0">
+            <wp:extent cx="7560197" cy="3016766"/>
+            <wp:effectExtent t="0" r="0" b="0" l="0"/>
+            <wp:docPr id="1" name="" descr="" title=""/>
+            <wp:cNvGraphicFramePr>
+              <a:graphicFrameLocks xmlns:a="http://schemas.openxmlformats.org/drawingml/2006/main" noChangeAspect="1"/>
+            </wp:cNvGraphicFramePr>
+            <a:graphic xmlns:a="http://schemas.openxmlformats.org/drawingml/2006/main">
+              <a:graphicData uri="http://schemas.openxmlformats.org/drawingml/2006/picture">
+                <pic:pic xmlns:pic="http://schemas.openxmlformats.org/drawingml/2006/picture">
+                  <pic:nvPicPr>
+                    <pic:cNvPr id="0" name="" descr=""/>
+                    <pic:cNvPicPr>
+                      <a:picLocks noChangeAspect="1" noChangeArrowheads="1"/>
+                    </pic:cNvPicPr>
+                  </pic:nvPicPr>
+                  <pic:blipFill>
+                    <a:blip r:embed="rId11" cstate="none"/>
+                    <a:srcRect/>
+                    <a:stretch>
+                      <a:fillRect/>
+                    </a:stretch>
+                  </pic:blipFill>
+                  <pic:spPr bwMode="auto">
+                    <a:xfrm>
+                      <a:off x="0" y="0"/>
+                      <a:ext cx="7560197" cy="3016766"/>
+                    </a:xfrm>
+                    <a:prstGeom prst="rect">
+                      <a:avLst/>
+                    </a:prstGeom>
+                  </pic:spPr>
+                </pic:pic>
+              </a:graphicData>
+            </a:graphic>
+          </wp:inline>
+        </w:drawing>
+      </w:r>
+    </w:p>
+    <w:p>
+      <w:pPr>
+        <w:spacing w:after="0" w:before="0" w:line="432" w:lineRule="exact"/>
       </w:pPr>
       <w:r>
         <w:rPr>
@@ -16,7 +61,7 @@
     </w:p>
     <w:p>
       <w:pPr>
-        <w:spacing w:after="0" w:before="0" w:line="216" w:lineRule="auto"/>
+        <w:spacing w:after="0" w:before="0" w:line="200" w:lineRule="auto"/>
         <w:jc w:val="center"/>
       </w:pPr>
       <w:r>
@@ -47,7 +92,7 @@
     </w:p>
     <w:p>
       <w:pPr>
-        <w:spacing w:after="115" w:before="29"/>
+        <w:spacing w:after="58" w:before="0"/>
         <w:jc w:val="center"/>
       </w:pPr>
       <w:r>
@@ -69,7 +114,7 @@
                     </pic:cNvPicPr>
                   </pic:nvPicPr>
                   <pic:blipFill>
-                    <a:blip r:embed="rId13" cstate="none"/>
+                    <a:blip r:embed="rId12" cstate="none"/>
                     <a:srcRect/>
                     <a:stretch>
                       <a:fillRect/>
@@ -93,7 +138,7 @@
     </w:p>
     <w:p>
       <w:pPr>
-        <w:spacing w:after="230" w:before="0" w:line="250" w:lineRule="auto"/>
+        <w:spacing w:after="144" w:before="0" w:line="240" w:lineRule="auto"/>
         <w:ind w:left="1627" w:right="1627"/>
         <w:jc w:val="center"/>
       </w:pPr>
@@ -109,6 +154,7 @@
     </w:p>
     <w:p>
       <w:pPr>
+        <w:pStyle w:val="tight"/>
         <w:spacing w:after="0" w:before="0"/>
         <w:jc w:val="center"/>
       </w:pPr>
@@ -172,10 +218,11 @@
       </w:r>
       <w:r>
         <w:rPr>
-          <w:sz w:val="12"/>
-          <w:szCs w:val="12"/>
+          <w:spacing w:val="120"/>
+          <w:sz w:val="2"/>
+          <w:szCs w:val="2"/>
         </w:rPr>
-        <w:t xml:space="preserve">  </w:t>
+        <w:t xml:space="preserve"> </w:t>
       </w:r>
       <w:r>
         <w:drawing>
@@ -237,10 +284,11 @@
       </w:r>
       <w:r>
         <w:rPr>
-          <w:sz w:val="12"/>
-          <w:szCs w:val="12"/>
+          <w:spacing w:val="120"/>
+          <w:sz w:val="2"/>
+          <w:szCs w:val="2"/>
         </w:rPr>
-        <w:t xml:space="preserve">  </w:t>
+        <w:t xml:space="preserve"> </w:t>
       </w:r>
       <w:r>
         <w:drawing>
@@ -303,6 +351,7 @@
     </w:p>
     <w:p>
       <w:pPr>
+        <w:pStyle w:val="tight"/>
         <w:spacing w:after="0" w:before="86"/>
         <w:jc w:val="center"/>
       </w:pPr>
@@ -366,10 +415,11 @@
       </w:r>
       <w:r>
         <w:rPr>
-          <w:sz w:val="12"/>
-          <w:szCs w:val="12"/>
+          <w:spacing w:val="120"/>
+          <w:sz w:val="2"/>
+          <w:szCs w:val="2"/>
         </w:rPr>
-        <w:t xml:space="preserve">  </w:t>
+        <w:t xml:space="preserve"> </w:t>
       </w:r>
       <w:r>
         <w:drawing>
@@ -431,10 +481,11 @@
       </w:r>
       <w:r>
         <w:rPr>
-          <w:sz w:val="12"/>
-          <w:szCs w:val="12"/>
+          <w:spacing w:val="120"/>
+          <w:sz w:val="2"/>
+          <w:szCs w:val="2"/>
         </w:rPr>
-        <w:t xml:space="preserve">  </w:t>
+        <w:t xml:space="preserve"> </w:t>
       </w:r>
       <w:r>
         <w:drawing>
@@ -497,13 +548,13 @@
     </w:p>
     <w:p>
       <w:pPr>
-        <w:spacing w:after="0" w:before="230"/>
+        <w:spacing w:after="0" w:before="144"/>
         <w:jc w:val="center"/>
       </w:pPr>
       <w:r>
         <w:drawing>
           <wp:inline distT="0" distB="0" distL="0" distR="0">
-            <wp:extent cx="639920" cy="603353"/>
+            <wp:extent cx="530219" cy="502794"/>
             <wp:effectExtent t="0" r="0" b="0" l="0"/>
             <wp:docPr id="1" name="" descr="" title=""/>
             <wp:cNvGraphicFramePr>
@@ -519,7 +570,7 @@
                     </pic:cNvPicPr>
                   </pic:nvPicPr>
                   <pic:blipFill>
-                    <a:blip r:embed="rId14" cstate="none"/>
+                    <a:blip r:embed="rId13" cstate="none"/>
                     <a:srcRect/>
                     <a:stretch>
                       <a:fillRect/>
@@ -528,7 +579,7 @@
                   <pic:spPr bwMode="auto">
                     <a:xfrm>
                       <a:off x="0" y="0"/>
-                      <a:ext cx="639920" cy="603353"/>
+                      <a:ext cx="530219" cy="502794"/>
                     </a:xfrm>
                     <a:prstGeom prst="rect">
                       <a:avLst/>
@@ -544,12 +595,10 @@
     <w:p>
       <w:pPr>
         <w:sectPr>
-          <w:headerReference w:type="default" r:id="rId7"/>
-          <w:headerReference w:type="first" r:id="rId8"/>
-          <w:footerReference w:type="default" r:id="rId9"/>
-          <w:footerReference w:type="first" r:id="rId10"/>
+          <w:footerReference w:type="default" r:id="rId7"/>
+          <w:footerReference w:type="first" r:id="rId8"/>
           <w:pgSz w:w="11906" w:h="16838" w:orient="portrait"/>
-          <w:pgMar w:top="5485" w:right="0" w:bottom="4780" w:left="0" w:header="0" w:footer="0" w:gutter="0"/>
+          <w:pgMar w:top="0" w:right="0" w:bottom="4319" w:left="0" w:header="0" w:footer="0" w:gutter="0"/>
           <w:pgNumType/>
           <w:titlePg/>
           <w:docGrid w:linePitch="360"/>
@@ -558,43 +607,94 @@
     </w:p>
     <w:p>
       <w:pPr>
-        <w:spacing w:after="58" w:before="0"/>
+        <w:pStyle w:val="tight"/>
       </w:pPr>
       <w:r>
         <w:drawing>
           <wp:inline distT="0" distB="0" distL="0" distR="0">
-            <wp:extent cx="365669" cy="365669"/>
-            <wp:effectExtent t="0" r="0" b="0" l="0"/>
-            <wp:docPr id="1" name="" descr="" title=""/>
-            <wp:cNvGraphicFramePr>
-              <a:graphicFrameLocks xmlns:a="http://schemas.openxmlformats.org/drawingml/2006/main" noChangeAspect="1"/>
-            </wp:cNvGraphicFramePr>
+            <wp:extent cx="6115998" cy="1554140"/>
+            <wp:effectExtent l="0" t="0" r="0" b="0"/>
+            <wp:docPr id="5007" name="Titular 5007"/>
+            <wp:cNvGraphicFramePr/>
             <a:graphic xmlns:a="http://schemas.openxmlformats.org/drawingml/2006/main">
-              <a:graphicData uri="http://schemas.openxmlformats.org/drawingml/2006/picture">
-                <pic:pic xmlns:pic="http://schemas.openxmlformats.org/drawingml/2006/picture">
-                  <pic:nvPicPr>
-                    <pic:cNvPr id="0" name="" descr=""/>
-                    <pic:cNvPicPr>
-                      <a:picLocks noChangeAspect="1" noChangeArrowheads="1"/>
-                    </pic:cNvPicPr>
-                  </pic:nvPicPr>
-                  <pic:blipFill>
-                    <a:blip r:embed="rId15" cstate="none"/>
-                    <a:srcRect/>
-                    <a:stretch>
-                      <a:fillRect/>
-                    </a:stretch>
-                  </pic:blipFill>
-                  <pic:spPr bwMode="auto">
+              <a:graphicData uri="http://schemas.microsoft.com/office/word/2010/wordprocessingGroup">
+                <wpg:wgp>
+                  <wpg:cNvGrpSpPr/>
+                  <wpg:grpSpPr>
                     <a:xfrm>
                       <a:off x="0" y="0"/>
-                      <a:ext cx="365669" cy="365669"/>
+                      <a:ext cx="6115998" cy="1554140"/>
+                      <a:chOff x="0" y="0"/>
+                      <a:chExt cx="6115998" cy="1554140"/>
                     </a:xfrm>
-                    <a:prstGeom prst="rect">
-                      <a:avLst/>
-                    </a:prstGeom>
-                  </pic:spPr>
-                </pic:pic>
+                  </wpg:grpSpPr>
+                  <wps:wsp>
+                    <wps:cNvPr id="5907" name="Bloque"/>
+                    <wps:cNvSpPr/>
+                    <wps:spPr>
+                      <a:xfrm>
+                        <a:off x="219408" y="219408"/>
+                        <a:ext cx="5896590" cy="1334732"/>
+                      </a:xfrm>
+                      <a:prstGeom prst="roundRect">
+                        <a:avLst>
+                          <a:gd name="adj" fmla="val 11000"/>
+                        </a:avLst>
+                      </a:prstGeom>
+                      <a:solidFill>
+                        <a:srgbClr val="D1EDF9"/>
+                      </a:solidFill>
+                      <a:ln>
+                        <a:noFill/>
+                      </a:ln>
+                    </wps:spPr>
+                    <wps:txbx>
+                      <w:txbxContent>
+                        <w:p>
+                          <w:pPr>
+                            <w:spacing w:before="0" w:after="0" w:line="276" w:lineRule="auto"/>
+                            <w:jc w:val="left"/>
+                          </w:pPr>
+                          <w:r>
+                            <w:rPr>
+                              <w:rFonts w:ascii="Poppins" w:hAnsi="Poppins" w:cs="Poppins"/>
+                              <w:b/>
+                              <w:bCs/>
+                              <w:color w:val="143548"/>
+                              <w:sz w:val="24"/>
+                              <w:szCs w:val="24"/>
+                            </w:rPr>
+                            <w:t xml:space="preserve">Decreto 51/2025, de 24 de febrero, por el que se regula la planificación y ordenación del empleo público, y el ingreso, promoción interna y provisión de puestos de trabajo del personal de la Administración General de la Junta de Andalucía.</w:t>
+                          </w:r>
+                        </w:p>
+                      </w:txbxContent>
+                    </wps:txbx>
+                    <wps:bodyPr rot="0" vert="horz" wrap="square" lIns="274260" tIns="109704" rIns="237692" bIns="91420" anchor="ctr" anchorCtr="0">
+                      <a:noAutofit/>
+                    </wps:bodyPr>
+                  </wps:wsp>
+                  <pic:pic xmlns:pic="http://schemas.openxmlformats.org/drawingml/2006/picture">
+                    <pic:nvPicPr>
+                      <pic:cNvPr id="5908" name="Librito"/>
+                      <pic:cNvPicPr/>
+                    </pic:nvPicPr>
+                    <pic:blipFill>
+                      <a:blip r:embed="rIdBADGE"/>
+                      <a:stretch>
+                        <a:fillRect/>
+                      </a:stretch>
+                    </pic:blipFill>
+                    <pic:spPr>
+                      <a:xfrm>
+                        <a:off x="0" y="0"/>
+                        <a:ext cx="475384" cy="475384"/>
+                      </a:xfrm>
+                      <a:prstGeom prst="ellipse">
+                        <a:avLst/>
+                      </a:prstGeom>
+                    </pic:spPr>
+                  </pic:pic>
+                </wpg:wgp>
               </a:graphicData>
             </a:graphic>
           </wp:inline>
@@ -603,70 +703,7 @@
     </w:p>
     <w:p>
       <w:pPr>
-        <w:spacing w:after="0" w:before="0"/>
-      </w:pPr>
-      <w:r>
-        <w:drawing>
-          <wp:inline distT="0" distB="0" distL="0" distR="0">
-            <wp:extent cx="6115998" cy="1371300"/>
-            <wp:effectExtent l="0" t="0" r="0" b="0"/>
-            <wp:docPr id="5007" name="Forma 5007"/>
-            <wp:cNvGraphicFramePr/>
-            <a:graphic xmlns:a="http://schemas.openxmlformats.org/drawingml/2006/main">
-              <a:graphicData uri="http://schemas.microsoft.com/office/word/2010/wordprocessingShape">
-                <wps:wsp>
-                  <wps:cNvSpPr/>
-                  <wps:spPr>
-                    <a:xfrm>
-                      <a:off x="0" y="0"/>
-                      <a:ext cx="6115998" cy="1371300"/>
-                    </a:xfrm>
-                    <a:prstGeom prst="roundRect">
-                      <a:avLst>
-                        <a:gd name="adj" fmla="val 11000"/>
-                      </a:avLst>
-                    </a:prstGeom>
-                    <a:solidFill>
-                      <a:srgbClr val="D1EDF9"/>
-                    </a:solidFill>
-                    <a:ln>
-                      <a:noFill/>
-                    </a:ln>
-                  </wps:spPr>
-                  <wps:txbx>
-                    <w:txbxContent>
-                      <w:p>
-                        <w:pPr>
-                          <w:spacing w:before="0" w:after="0" w:line="300" w:lineRule="auto"/>
-                          <w:jc w:val="left"/>
-                        </w:pPr>
-                        <w:r>
-                          <w:rPr>
-                            <w:rFonts w:ascii="Poppins" w:hAnsi="Poppins" w:cs="Poppins"/>
-                            <w:b/>
-                            <w:bCs/>
-                            <w:color w:val="143548"/>
-                            <w:sz w:val="24"/>
-                            <w:szCs w:val="24"/>
-                          </w:rPr>
-                          <w:t xml:space="preserve">Decreto 51/2025, de 24 de febrero, por el que se regula la planificación y ordenación del empleo público, y el ingreso, promoción interna y provisión de puestos de trabajo del personal de la Administración General de la Junta de Andalucía.</w:t>
-                        </w:r>
-                      </w:p>
-                    </w:txbxContent>
-                  </wps:txbx>
-                  <wps:bodyPr rot="0" vert="horz" wrap="square" lIns="255976" tIns="127988" rIns="255976" bIns="127988" anchor="ctr" anchorCtr="0">
-                    <a:noAutofit/>
-                  </wps:bodyPr>
-                </wps:wsp>
-              </a:graphicData>
-            </a:graphic>
-          </wp:inline>
-        </w:drawing>
-      </w:r>
-    </w:p>
-    <w:p>
-      <w:pPr>
-        <w:spacing w:after="0" w:before="0" w:line="259" w:lineRule="exact"/>
+        <w:spacing w:after="0" w:before="0" w:line="173" w:lineRule="exact"/>
       </w:pPr>
       <w:r>
         <w:rPr>
@@ -678,7 +715,7 @@
     </w:p>
     <w:p>
       <w:pPr>
-        <w:spacing w:after="0" w:before="0"/>
+        <w:pStyle w:val="tight"/>
       </w:pPr>
       <w:r>
         <w:drawing>
@@ -740,7 +777,7 @@
     </w:p>
     <w:p>
       <w:pPr>
-        <w:spacing w:after="0" w:before="0" w:line="202" w:lineRule="exact"/>
+        <w:spacing w:after="0" w:before="0" w:line="115" w:lineRule="exact"/>
       </w:pPr>
       <w:r>
         <w:rPr>
@@ -789,7 +826,7 @@
           </w:tcPr>
           <w:p>
             <w:pPr>
-              <w:spacing w:after="0" w:before="0"/>
+              <w:pStyle w:val="tight"/>
               <w:jc w:val="center"/>
             </w:pPr>
             <w:r>
@@ -811,7 +848,7 @@
                           </pic:cNvPicPr>
                         </pic:nvPicPr>
                         <pic:blipFill>
-                          <a:blip r:embed="rId16" cstate="none"/>
+                          <a:blip r:embed="rId14" cstate="none"/>
                           <a:srcRect/>
                           <a:stretch>
                             <a:fillRect/>
@@ -885,7 +922,7 @@
           </w:p>
           <w:p>
             <w:pPr>
-              <w:spacing w:after="0" w:before="0" w:line="173" w:lineRule="exact"/>
+              <w:spacing w:after="0" w:before="0" w:line="86" w:lineRule="exact"/>
             </w:pPr>
             <w:r>
               <w:rPr>
@@ -990,7 +1027,7 @@
           </w:tcPr>
           <w:p>
             <w:pPr>
-              <w:spacing w:after="0" w:before="0"/>
+              <w:pStyle w:val="tight"/>
               <w:jc w:val="center"/>
             </w:pPr>
             <w:r>
@@ -1012,7 +1049,7 @@
                           </pic:cNvPicPr>
                         </pic:nvPicPr>
                         <pic:blipFill>
-                          <a:blip r:embed="rId17" cstate="none"/>
+                          <a:blip r:embed="rId15" cstate="none"/>
                           <a:srcRect/>
                           <a:stretch>
                             <a:fillRect/>
@@ -1070,7 +1107,7 @@
           </w:p>
           <w:p>
             <w:pPr>
-              <w:spacing w:after="86" w:before="0"/>
+              <w:spacing w:after="43" w:before="0"/>
             </w:pPr>
             <w:r>
               <w:rPr>
@@ -1086,12 +1123,13 @@
           </w:p>
           <w:p>
             <w:pPr>
+              <w:pStyle w:val="tight"/>
               <w:spacing w:after="0" w:before="0"/>
             </w:pPr>
             <w:r>
               <w:drawing>
                 <wp:inline distT="0" distB="0" distL="0" distR="0">
-                  <wp:extent cx="2440000" cy="210266"/>
+                  <wp:extent cx="2440000" cy="173698"/>
                   <wp:effectExtent l="0" t="0" r="0" b="0"/>
                   <wp:docPr id="5009" name="Forma 5009"/>
                   <wp:cNvGraphicFramePr/>
@@ -1102,7 +1140,7 @@
                         <wps:spPr>
                           <a:xfrm>
                             <a:off x="0" y="0"/>
-                            <a:ext cx="2440000" cy="210266"/>
+                            <a:ext cx="2440000" cy="173698"/>
                           </a:xfrm>
                           <a:prstGeom prst="roundRect">
                             <a:avLst>
@@ -1159,15 +1197,16 @@
             </w:r>
             <w:r>
               <w:rPr>
-                <w:sz w:val="12"/>
-                <w:szCs w:val="12"/>
+                <w:spacing w:val="110"/>
+                <w:sz w:val="2"/>
+                <w:szCs w:val="2"/>
               </w:rPr>
               <w:t xml:space="preserve"> </w:t>
             </w:r>
             <w:r>
               <w:drawing>
                 <wp:inline distT="0" distB="0" distL="0" distR="0">
-                  <wp:extent cx="2896186" cy="210266"/>
+                  <wp:extent cx="2896186" cy="173698"/>
                   <wp:effectExtent l="0" t="0" r="0" b="0"/>
                   <wp:docPr id="5010" name="Forma 5010"/>
                   <wp:cNvGraphicFramePr/>
@@ -1178,7 +1217,7 @@
                         <wps:spPr>
                           <a:xfrm>
                             <a:off x="0" y="0"/>
-                            <a:ext cx="2896186" cy="210266"/>
+                            <a:ext cx="2896186" cy="173698"/>
                           </a:xfrm>
                           <a:prstGeom prst="roundRect">
                             <a:avLst>
@@ -1236,12 +1275,13 @@
           </w:p>
           <w:p>
             <w:pPr>
-              <w:spacing w:after="0" w:before="72"/>
+              <w:pStyle w:val="tight"/>
+              <w:spacing w:after="0" w:before="58"/>
             </w:pPr>
             <w:r>
               <w:drawing>
                 <wp:inline distT="0" distB="0" distL="0" distR="0">
-                  <wp:extent cx="2043237" cy="210266"/>
+                  <wp:extent cx="2043237" cy="173698"/>
                   <wp:effectExtent l="0" t="0" r="0" b="0"/>
                   <wp:docPr id="5011" name="Forma 5011"/>
                   <wp:cNvGraphicFramePr/>
@@ -1252,7 +1292,7 @@
                         <wps:spPr>
                           <a:xfrm>
                             <a:off x="0" y="0"/>
-                            <a:ext cx="2043237" cy="210266"/>
+                            <a:ext cx="2043237" cy="173698"/>
                           </a:xfrm>
                           <a:prstGeom prst="roundRect">
                             <a:avLst>
@@ -1310,7 +1350,7 @@
           </w:p>
           <w:p>
             <w:pPr>
-              <w:spacing w:after="0" w:before="0" w:line="173" w:lineRule="exact"/>
+              <w:spacing w:after="0" w:before="0" w:line="86" w:lineRule="exact"/>
             </w:pPr>
             <w:r>
               <w:rPr>
@@ -1415,7 +1455,7 @@
           </w:tcPr>
           <w:p>
             <w:pPr>
-              <w:spacing w:after="0" w:before="0"/>
+              <w:pStyle w:val="tight"/>
               <w:jc w:val="center"/>
             </w:pPr>
             <w:r>
@@ -1437,7 +1477,7 @@
                           </pic:cNvPicPr>
                         </pic:nvPicPr>
                         <pic:blipFill>
-                          <a:blip r:embed="rId18" cstate="none"/>
+                          <a:blip r:embed="rId16" cstate="none"/>
                           <a:srcRect/>
                           <a:stretch>
                             <a:fillRect/>
@@ -1495,7 +1535,7 @@
           </w:p>
           <w:p>
             <w:pPr>
-              <w:spacing w:after="86" w:before="0"/>
+              <w:spacing w:after="43" w:before="0"/>
             </w:pPr>
             <w:r>
               <w:rPr>
@@ -1511,12 +1551,13 @@
           </w:p>
           <w:p>
             <w:pPr>
+              <w:pStyle w:val="tight"/>
               <w:spacing w:after="0" w:before="0"/>
             </w:pPr>
             <w:r>
               <w:drawing>
                 <wp:inline distT="0" distB="0" distL="0" distR="0">
-                  <wp:extent cx="1643732" cy="210266"/>
+                  <wp:extent cx="1643732" cy="173698"/>
                   <wp:effectExtent l="0" t="0" r="0" b="0"/>
                   <wp:docPr id="5012" name="Forma 5012"/>
                   <wp:cNvGraphicFramePr/>
@@ -1527,7 +1568,7 @@
                         <wps:spPr>
                           <a:xfrm>
                             <a:off x="0" y="0"/>
-                            <a:ext cx="1643732" cy="210266"/>
+                            <a:ext cx="1643732" cy="173698"/>
                           </a:xfrm>
                           <a:prstGeom prst="roundRect">
                             <a:avLst>
@@ -1584,15 +1625,16 @@
             </w:r>
             <w:r>
               <w:rPr>
-                <w:sz w:val="12"/>
-                <w:szCs w:val="12"/>
+                <w:spacing w:val="110"/>
+                <w:sz w:val="2"/>
+                <w:szCs w:val="2"/>
               </w:rPr>
               <w:t xml:space="preserve"> </w:t>
             </w:r>
             <w:r>
               <w:drawing>
                 <wp:inline distT="0" distB="0" distL="0" distR="0">
-                  <wp:extent cx="1807373" cy="210266"/>
+                  <wp:extent cx="1807373" cy="173698"/>
                   <wp:effectExtent l="0" t="0" r="0" b="0"/>
                   <wp:docPr id="5013" name="Forma 5013"/>
                   <wp:cNvGraphicFramePr/>
@@ -1603,7 +1645,7 @@
                         <wps:spPr>
                           <a:xfrm>
                             <a:off x="0" y="0"/>
-                            <a:ext cx="1807373" cy="210266"/>
+                            <a:ext cx="1807373" cy="173698"/>
                           </a:xfrm>
                           <a:prstGeom prst="roundRect">
                             <a:avLst>
@@ -1661,12 +1703,13 @@
           </w:p>
           <w:p>
             <w:pPr>
-              <w:spacing w:after="0" w:before="72"/>
+              <w:pStyle w:val="tight"/>
+              <w:spacing w:after="0" w:before="58"/>
             </w:pPr>
             <w:r>
               <w:drawing>
                 <wp:inline distT="0" distB="0" distL="0" distR="0">
-                  <wp:extent cx="2924526" cy="210266"/>
+                  <wp:extent cx="2924526" cy="173698"/>
                   <wp:effectExtent l="0" t="0" r="0" b="0"/>
                   <wp:docPr id="5014" name="Forma 5014"/>
                   <wp:cNvGraphicFramePr/>
@@ -1677,7 +1720,7 @@
                         <wps:spPr>
                           <a:xfrm>
                             <a:off x="0" y="0"/>
-                            <a:ext cx="2924526" cy="210266"/>
+                            <a:ext cx="2924526" cy="173698"/>
                           </a:xfrm>
                           <a:prstGeom prst="roundRect">
                             <a:avLst>
@@ -1734,15 +1777,16 @@
             </w:r>
             <w:r>
               <w:rPr>
-                <w:sz w:val="12"/>
-                <w:szCs w:val="12"/>
+                <w:spacing w:val="110"/>
+                <w:sz w:val="2"/>
+                <w:szCs w:val="2"/>
               </w:rPr>
               <w:t xml:space="preserve"> </w:t>
             </w:r>
             <w:r>
               <w:drawing>
                 <wp:inline distT="0" distB="0" distL="0" distR="0">
-                  <wp:extent cx="2435429" cy="210266"/>
+                  <wp:extent cx="2435429" cy="173698"/>
                   <wp:effectExtent l="0" t="0" r="0" b="0"/>
                   <wp:docPr id="5015" name="Forma 5015"/>
                   <wp:cNvGraphicFramePr/>
@@ -1753,7 +1797,7 @@
                         <wps:spPr>
                           <a:xfrm>
                             <a:off x="0" y="0"/>
-                            <a:ext cx="2435429" cy="210266"/>
+                            <a:ext cx="2435429" cy="173698"/>
                           </a:xfrm>
                           <a:prstGeom prst="roundRect">
                             <a:avLst>
@@ -1811,12 +1855,13 @@
           </w:p>
           <w:p>
             <w:pPr>
-              <w:spacing w:after="0" w:before="72"/>
+              <w:pStyle w:val="tight"/>
+              <w:spacing w:after="0" w:before="58"/>
             </w:pPr>
             <w:r>
               <w:drawing>
                 <wp:inline distT="0" distB="0" distL="0" distR="0">
-                  <wp:extent cx="1994784" cy="210266"/>
+                  <wp:extent cx="1994784" cy="173698"/>
                   <wp:effectExtent l="0" t="0" r="0" b="0"/>
                   <wp:docPr id="5016" name="Forma 5016"/>
                   <wp:cNvGraphicFramePr/>
@@ -1827,7 +1872,7 @@
                         <wps:spPr>
                           <a:xfrm>
                             <a:off x="0" y="0"/>
-                            <a:ext cx="1994784" cy="210266"/>
+                            <a:ext cx="1994784" cy="173698"/>
                           </a:xfrm>
                           <a:prstGeom prst="roundRect">
                             <a:avLst>
@@ -1885,12 +1930,13 @@
           </w:p>
           <w:p>
             <w:pPr>
-              <w:spacing w:after="0" w:before="72"/>
+              <w:pStyle w:val="tight"/>
+              <w:spacing w:after="0" w:before="58"/>
             </w:pPr>
             <w:r>
               <w:drawing>
                 <wp:inline distT="0" distB="0" distL="0" distR="0">
-                  <wp:extent cx="4189779" cy="210266"/>
+                  <wp:extent cx="4189779" cy="173698"/>
                   <wp:effectExtent l="0" t="0" r="0" b="0"/>
                   <wp:docPr id="5017" name="Forma 5017"/>
                   <wp:cNvGraphicFramePr/>
@@ -1901,7 +1947,7 @@
                         <wps:spPr>
                           <a:xfrm>
                             <a:off x="0" y="0"/>
-                            <a:ext cx="4189779" cy="210266"/>
+                            <a:ext cx="4189779" cy="173698"/>
                           </a:xfrm>
                           <a:prstGeom prst="roundRect">
                             <a:avLst>
@@ -1959,7 +2005,7 @@
           </w:p>
           <w:p>
             <w:pPr>
-              <w:spacing w:after="0" w:before="0" w:line="173" w:lineRule="exact"/>
+              <w:spacing w:after="0" w:before="0" w:line="86" w:lineRule="exact"/>
             </w:pPr>
             <w:r>
               <w:rPr>
@@ -2064,7 +2110,7 @@
           </w:tcPr>
           <w:p>
             <w:pPr>
-              <w:spacing w:after="0" w:before="0"/>
+              <w:pStyle w:val="tight"/>
               <w:jc w:val="center"/>
             </w:pPr>
             <w:r>
@@ -2086,7 +2132,7 @@
                           </pic:cNvPicPr>
                         </pic:nvPicPr>
                         <pic:blipFill>
-                          <a:blip r:embed="rId19" cstate="none"/>
+                          <a:blip r:embed="rId17" cstate="none"/>
                           <a:srcRect/>
                           <a:stretch>
                             <a:fillRect/>
@@ -2144,7 +2190,7 @@
           </w:p>
           <w:p>
             <w:pPr>
-              <w:spacing w:after="86" w:before="0"/>
+              <w:spacing w:after="43" w:before="0"/>
             </w:pPr>
             <w:r>
               <w:rPr>
@@ -2160,12 +2206,13 @@
           </w:p>
           <w:p>
             <w:pPr>
+              <w:pStyle w:val="tight"/>
               <w:spacing w:after="0" w:before="0"/>
             </w:pPr>
             <w:r>
               <w:drawing>
                 <wp:inline distT="0" distB="0" distL="0" distR="0">
-                  <wp:extent cx="1643732" cy="210266"/>
+                  <wp:extent cx="1643732" cy="173698"/>
                   <wp:effectExtent l="0" t="0" r="0" b="0"/>
                   <wp:docPr id="5018" name="Forma 5018"/>
                   <wp:cNvGraphicFramePr/>
@@ -2176,7 +2223,7 @@
                         <wps:spPr>
                           <a:xfrm>
                             <a:off x="0" y="0"/>
-                            <a:ext cx="1643732" cy="210266"/>
+                            <a:ext cx="1643732" cy="173698"/>
                           </a:xfrm>
                           <a:prstGeom prst="roundRect">
                             <a:avLst>
@@ -2234,12 +2281,13 @@
           </w:p>
           <w:p>
             <w:pPr>
-              <w:spacing w:after="0" w:before="72"/>
+              <w:pStyle w:val="tight"/>
+              <w:spacing w:after="0" w:before="58"/>
             </w:pPr>
             <w:r>
               <w:drawing>
                 <wp:inline distT="0" distB="0" distL="0" distR="0">
-                  <wp:extent cx="3760105" cy="210266"/>
+                  <wp:extent cx="3760105" cy="173698"/>
                   <wp:effectExtent l="0" t="0" r="0" b="0"/>
                   <wp:docPr id="5019" name="Forma 5019"/>
                   <wp:cNvGraphicFramePr/>
@@ -2250,7 +2298,7 @@
                         <wps:spPr>
                           <a:xfrm>
                             <a:off x="0" y="0"/>
-                            <a:ext cx="3760105" cy="210266"/>
+                            <a:ext cx="3760105" cy="173698"/>
                           </a:xfrm>
                           <a:prstGeom prst="roundRect">
                             <a:avLst>
@@ -2308,12 +2356,13 @@
           </w:p>
           <w:p>
             <w:pPr>
-              <w:spacing w:after="0" w:before="72"/>
+              <w:pStyle w:val="tight"/>
+              <w:spacing w:after="0" w:before="58"/>
             </w:pPr>
             <w:r>
               <w:drawing>
                 <wp:inline distT="0" distB="0" distL="0" distR="0">
-                  <wp:extent cx="3904548" cy="210266"/>
+                  <wp:extent cx="3904548" cy="173698"/>
                   <wp:effectExtent l="0" t="0" r="0" b="0"/>
                   <wp:docPr id="5020" name="Forma 5020"/>
                   <wp:cNvGraphicFramePr/>
@@ -2324,7 +2373,7 @@
                         <wps:spPr>
                           <a:xfrm>
                             <a:off x="0" y="0"/>
-                            <a:ext cx="3904548" cy="210266"/>
+                            <a:ext cx="3904548" cy="173698"/>
                           </a:xfrm>
                           <a:prstGeom prst="roundRect">
                             <a:avLst>
@@ -2382,7 +2431,7 @@
           </w:p>
           <w:p>
             <w:pPr>
-              <w:spacing w:after="0" w:before="0" w:line="173" w:lineRule="exact"/>
+              <w:spacing w:after="0" w:before="0" w:line="86" w:lineRule="exact"/>
             </w:pPr>
             <w:r>
               <w:rPr>
@@ -2487,7 +2536,7 @@
           </w:tcPr>
           <w:p>
             <w:pPr>
-              <w:spacing w:after="0" w:before="0"/>
+              <w:pStyle w:val="tight"/>
               <w:jc w:val="center"/>
             </w:pPr>
             <w:r>
@@ -2509,7 +2558,7 @@
                           </pic:cNvPicPr>
                         </pic:nvPicPr>
                         <pic:blipFill>
-                          <a:blip r:embed="rId20" cstate="none"/>
+                          <a:blip r:embed="rId18" cstate="none"/>
                           <a:srcRect/>
                           <a:stretch>
                             <a:fillRect/>
@@ -2567,7 +2616,7 @@
           </w:p>
           <w:p>
             <w:pPr>
-              <w:spacing w:after="86" w:before="0"/>
+              <w:spacing w:after="43" w:before="0"/>
             </w:pPr>
             <w:r>
               <w:rPr>
@@ -2583,12 +2632,13 @@
           </w:p>
           <w:p>
             <w:pPr>
+              <w:pStyle w:val="tight"/>
               <w:spacing w:after="0" w:before="0"/>
             </w:pPr>
             <w:r>
               <w:drawing>
                 <wp:inline distT="0" distB="0" distL="0" distR="0">
-                  <wp:extent cx="1643732" cy="210266"/>
+                  <wp:extent cx="1643732" cy="173698"/>
                   <wp:effectExtent l="0" t="0" r="0" b="0"/>
                   <wp:docPr id="5021" name="Forma 5021"/>
                   <wp:cNvGraphicFramePr/>
@@ -2599,7 +2649,7 @@
                         <wps:spPr>
                           <a:xfrm>
                             <a:off x="0" y="0"/>
-                            <a:ext cx="1643732" cy="210266"/>
+                            <a:ext cx="1643732" cy="173698"/>
                           </a:xfrm>
                           <a:prstGeom prst="roundRect">
                             <a:avLst>
@@ -2657,12 +2707,13 @@
           </w:p>
           <w:p>
             <w:pPr>
-              <w:spacing w:after="0" w:before="72"/>
+              <w:pStyle w:val="tight"/>
+              <w:spacing w:after="0" w:before="58"/>
             </w:pPr>
             <w:r>
               <w:drawing>
                 <wp:inline distT="0" distB="0" distL="0" distR="0">
-                  <wp:extent cx="4336051" cy="210266"/>
+                  <wp:extent cx="4336051" cy="173698"/>
                   <wp:effectExtent l="0" t="0" r="0" b="0"/>
                   <wp:docPr id="5022" name="Forma 5022"/>
                   <wp:cNvGraphicFramePr/>
@@ -2673,7 +2724,7 @@
                         <wps:spPr>
                           <a:xfrm>
                             <a:off x="0" y="0"/>
-                            <a:ext cx="4336051" cy="210266"/>
+                            <a:ext cx="4336051" cy="173698"/>
                           </a:xfrm>
                           <a:prstGeom prst="roundRect">
                             <a:avLst>
@@ -2731,12 +2782,13 @@
           </w:p>
           <w:p>
             <w:pPr>
-              <w:spacing w:after="0" w:before="72"/>
+              <w:pStyle w:val="tight"/>
+              <w:spacing w:after="0" w:before="58"/>
             </w:pPr>
             <w:r>
               <w:drawing>
                 <wp:inline distT="0" distB="0" distL="0" distR="0">
-                  <wp:extent cx="3452019" cy="210266"/>
+                  <wp:extent cx="3452019" cy="173698"/>
                   <wp:effectExtent l="0" t="0" r="0" b="0"/>
                   <wp:docPr id="5023" name="Forma 5023"/>
                   <wp:cNvGraphicFramePr/>
@@ -2747,7 +2799,7 @@
                         <wps:spPr>
                           <a:xfrm>
                             <a:off x="0" y="0"/>
-                            <a:ext cx="3452019" cy="210266"/>
+                            <a:ext cx="3452019" cy="173698"/>
                           </a:xfrm>
                           <a:prstGeom prst="roundRect">
                             <a:avLst>
@@ -2805,7 +2857,7 @@
           </w:p>
           <w:p>
             <w:pPr>
-              <w:spacing w:after="0" w:before="0" w:line="173" w:lineRule="exact"/>
+              <w:spacing w:after="0" w:before="0" w:line="86" w:lineRule="exact"/>
             </w:pPr>
             <w:r>
               <w:rPr>
@@ -2910,7 +2962,7 @@
           </w:tcPr>
           <w:p>
             <w:pPr>
-              <w:spacing w:after="0" w:before="0"/>
+              <w:pStyle w:val="tight"/>
               <w:jc w:val="center"/>
             </w:pPr>
             <w:r>
@@ -2932,7 +2984,7 @@
                           </pic:cNvPicPr>
                         </pic:nvPicPr>
                         <pic:blipFill>
-                          <a:blip r:embed="rId21" cstate="none"/>
+                          <a:blip r:embed="rId19" cstate="none"/>
                           <a:srcRect/>
                           <a:stretch>
                             <a:fillRect/>
@@ -2990,7 +3042,7 @@
           </w:p>
           <w:p>
             <w:pPr>
-              <w:spacing w:after="86" w:before="0"/>
+              <w:spacing w:after="43" w:before="0"/>
             </w:pPr>
             <w:r>
               <w:rPr>
@@ -3006,12 +3058,13 @@
           </w:p>
           <w:p>
             <w:pPr>
+              <w:pStyle w:val="tight"/>
               <w:spacing w:after="0" w:before="0"/>
             </w:pPr>
             <w:r>
               <w:drawing>
                 <wp:inline distT="0" distB="0" distL="0" distR="0">
-                  <wp:extent cx="4244631" cy="210266"/>
+                  <wp:extent cx="4244631" cy="173698"/>
                   <wp:effectExtent l="0" t="0" r="0" b="0"/>
                   <wp:docPr id="5024" name="Forma 5024"/>
                   <wp:cNvGraphicFramePr/>
@@ -3022,7 +3075,7 @@
                         <wps:spPr>
                           <a:xfrm>
                             <a:off x="0" y="0"/>
-                            <a:ext cx="4244631" cy="210266"/>
+                            <a:ext cx="4244631" cy="173698"/>
                           </a:xfrm>
                           <a:prstGeom prst="roundRect">
                             <a:avLst>
@@ -3080,12 +3133,13 @@
           </w:p>
           <w:p>
             <w:pPr>
-              <w:spacing w:after="0" w:before="72"/>
+              <w:pStyle w:val="tight"/>
+              <w:spacing w:after="0" w:before="58"/>
             </w:pPr>
             <w:r>
               <w:drawing>
                 <wp:inline distT="0" distB="0" distL="0" distR="0">
-                  <wp:extent cx="3918261" cy="210266"/>
+                  <wp:extent cx="3918261" cy="173698"/>
                   <wp:effectExtent l="0" t="0" r="0" b="0"/>
                   <wp:docPr id="5025" name="Forma 5025"/>
                   <wp:cNvGraphicFramePr/>
@@ -3096,7 +3150,7 @@
                         <wps:spPr>
                           <a:xfrm>
                             <a:off x="0" y="0"/>
-                            <a:ext cx="3918261" cy="210266"/>
+                            <a:ext cx="3918261" cy="173698"/>
                           </a:xfrm>
                           <a:prstGeom prst="roundRect">
                             <a:avLst>
@@ -3154,12 +3208,13 @@
           </w:p>
           <w:p>
             <w:pPr>
-              <w:spacing w:after="0" w:before="72"/>
+              <w:pStyle w:val="tight"/>
+              <w:spacing w:after="0" w:before="58"/>
             </w:pPr>
             <w:r>
               <w:drawing>
                 <wp:inline distT="0" distB="0" distL="0" distR="0">
-                  <wp:extent cx="3735421" cy="210266"/>
+                  <wp:extent cx="3735421" cy="173698"/>
                   <wp:effectExtent l="0" t="0" r="0" b="0"/>
                   <wp:docPr id="5026" name="Forma 5026"/>
                   <wp:cNvGraphicFramePr/>
@@ -3170,7 +3225,7 @@
                         <wps:spPr>
                           <a:xfrm>
                             <a:off x="0" y="0"/>
-                            <a:ext cx="3735421" cy="210266"/>
+                            <a:ext cx="3735421" cy="173698"/>
                           </a:xfrm>
                           <a:prstGeom prst="roundRect">
                             <a:avLst>
@@ -3315,7 +3370,7 @@
     </w:tbl>
     <w:p>
       <w:pPr>
-        <w:spacing w:after="0" w:before="0" w:line="202" w:lineRule="exact"/>
+        <w:spacing w:after="0" w:before="0" w:line="144" w:lineRule="exact"/>
       </w:pPr>
       <w:r>
         <w:rPr>
@@ -3348,7 +3403,7 @@
                     </pic:cNvPicPr>
                   </pic:nvPicPr>
                   <pic:blipFill>
-                    <a:blip r:embed="rId22" cstate="none"/>
+                    <a:blip r:embed="rId20" cstate="none"/>
                     <a:srcRect/>
                     <a:stretch>
                       <a:fillRect/>
@@ -3435,7 +3490,7 @@
     </w:p>
     <w:p>
       <w:pPr>
-        <w:spacing w:after="0" w:before="0"/>
+        <w:pStyle w:val="tight"/>
       </w:pPr>
       <w:r>
         <w:drawing>
@@ -3570,7 +3625,7 @@
                           </pic:cNvPicPr>
                         </pic:nvPicPr>
                         <pic:blipFill>
-                          <a:blip r:embed="rId23" cstate="none"/>
+                          <a:blip r:embed="rId21" cstate="none"/>
                           <a:srcRect/>
                           <a:stretch>
                             <a:fillRect/>
@@ -3933,7 +3988,7 @@
                           </pic:cNvPicPr>
                         </pic:nvPicPr>
                         <pic:blipFill>
-                          <a:blip r:embed="rId24" cstate="none"/>
+                          <a:blip r:embed="rId22" cstate="none"/>
                           <a:srcRect/>
                           <a:stretch>
                             <a:fillRect/>
@@ -5124,7 +5179,7 @@
                           </pic:cNvPicPr>
                         </pic:nvPicPr>
                         <pic:blipFill>
-                          <a:blip r:embed="rId25" cstate="none"/>
+                          <a:blip r:embed="rId23" cstate="none"/>
                           <a:srcRect/>
                           <a:stretch>
                             <a:fillRect/>
@@ -6068,7 +6123,7 @@
                           </pic:cNvPicPr>
                         </pic:nvPicPr>
                         <pic:blipFill>
-                          <a:blip r:embed="rId26" cstate="none"/>
+                          <a:blip r:embed="rId24" cstate="none"/>
                           <a:srcRect/>
                           <a:stretch>
                             <a:fillRect/>
@@ -6638,8 +6693,8 @@
       </w:r>
     </w:p>
     <w:sectPr>
-      <w:headerReference w:type="default" r:id="rId11"/>
-      <w:footerReference w:type="default" r:id="rId12"/>
+      <w:headerReference w:type="default" r:id="rId9"/>
+      <w:footerReference w:type="default" r:id="rId10"/>
       <w:type w:val="nextPage"/>
       <w:pgSz w:w="11906" w:h="16838" w:orient="portrait"/>
       <w:pgMar w:top="662" w:right="1137" w:bottom="806" w:left="1137" w:header="0" w:footer="165" w:gutter="0"/>
@@ -6701,12 +6756,12 @@
 <w:ftr xmlns:wpc="http://schemas.microsoft.com/office/word/2010/wordprocessingCanvas" xmlns:mc="http://schemas.openxmlformats.org/markup-compatibility/2006" xmlns:o="urn:schemas-microsoft-com:office:office" xmlns:r="http://schemas.openxmlformats.org/officeDocument/2006/relationships" xmlns:m="http://schemas.openxmlformats.org/officeDocument/2006/math" xmlns:v="urn:schemas-microsoft-com:vml" xmlns:wp14="http://schemas.microsoft.com/office/word/2010/wordprocessingDrawing" xmlns:wp="http://schemas.openxmlformats.org/drawingml/2006/wordprocessingDrawing" xmlns:w10="urn:schemas-microsoft-com:office:word" xmlns:w="http://schemas.openxmlformats.org/wordprocessingml/2006/main" xmlns:w14="http://schemas.microsoft.com/office/word/2010/wordml" xmlns:w15="http://schemas.microsoft.com/office/word/2012/wordml" xmlns:wpg="http://schemas.microsoft.com/office/word/2010/wordprocessingGroup" xmlns:wpi="http://schemas.microsoft.com/office/word/2010/wordprocessingInk" xmlns:wne="http://schemas.microsoft.com/office/word/2006/wordml" xmlns:wps="http://schemas.microsoft.com/office/word/2010/wordprocessingShape">
   <w:p>
     <w:pPr>
-      <w:spacing w:after="0" w:before="0" w:line="240" w:lineRule="auto"/>
+      <w:pStyle w:val="tight"/>
     </w:pPr>
     <w:r>
       <w:drawing>
         <wp:inline distT="0" distB="0" distL="0" distR="0">
-          <wp:extent cx="7560197" cy="3035049"/>
+          <wp:extent cx="7560197" cy="2742514"/>
           <wp:effectExtent t="0" r="0" b="0" l="0"/>
           <wp:docPr id="1" name="" descr="" title=""/>
           <wp:cNvGraphicFramePr>
@@ -6731,7 +6786,7 @@
                 <pic:spPr bwMode="auto">
                   <a:xfrm>
                     <a:off x="0" y="0"/>
-                    <a:ext cx="7560197" cy="3035049"/>
+                    <a:ext cx="7560197" cy="2742514"/>
                   </a:xfrm>
                   <a:prstGeom prst="rect">
                     <a:avLst/>
@@ -6807,62 +6862,6 @@
 </file>
 
 <file path=word/header1.xml><?xml version="1.0" encoding="utf-8"?>
-<w:hdr xmlns:wpc="http://schemas.microsoft.com/office/word/2010/wordprocessingCanvas" xmlns:mc="http://schemas.openxmlformats.org/markup-compatibility/2006" xmlns:o="urn:schemas-microsoft-com:office:office" xmlns:r="http://schemas.openxmlformats.org/officeDocument/2006/relationships" xmlns:m="http://schemas.openxmlformats.org/officeDocument/2006/math" xmlns:v="urn:schemas-microsoft-com:vml" xmlns:wp14="http://schemas.microsoft.com/office/word/2010/wordprocessingDrawing" xmlns:wp="http://schemas.openxmlformats.org/drawingml/2006/wordprocessingDrawing" xmlns:w10="urn:schemas-microsoft-com:office:word" xmlns:w="http://schemas.openxmlformats.org/wordprocessingml/2006/main" xmlns:w14="http://schemas.microsoft.com/office/word/2010/wordml" xmlns:w15="http://schemas.microsoft.com/office/word/2012/wordml" xmlns:wpg="http://schemas.microsoft.com/office/word/2010/wordprocessingGroup" xmlns:wpi="http://schemas.microsoft.com/office/word/2010/wordprocessingInk" xmlns:wne="http://schemas.microsoft.com/office/word/2006/wordml" xmlns:wps="http://schemas.microsoft.com/office/word/2010/wordprocessingShape" xmlns:cx="http://schemas.microsoft.com/office/drawing/2014/chartex" xmlns:cx1="http://schemas.microsoft.com/office/drawing/2015/9/8/chartex" xmlns:cx2="http://schemas.microsoft.com/office/drawing/2015/10/21/chartex" xmlns:cx3="http://schemas.microsoft.com/office/drawing/2016/5/9/chartex" xmlns:cx4="http://schemas.microsoft.com/office/drawing/2016/5/10/chartex" xmlns:cx5="http://schemas.microsoft.com/office/drawing/2016/5/11/chartex" xmlns:cx6="http://schemas.microsoft.com/office/drawing/2016/5/12/chartex" xmlns:cx7="http://schemas.microsoft.com/office/drawing/2016/5/13/chartex" xmlns:cx8="http://schemas.microsoft.com/office/drawing/2016/5/14/chartex" xmlns:w16cid="http://schemas.microsoft.com/office/word/2016/wordml/cid" xmlns:w16se="http://schemas.microsoft.com/office/word/2015/wordml/symex">
-  <w:p/>
-</w:hdr>
-</file>
-
-<file path=word/header2.xml><?xml version="1.0" encoding="utf-8"?>
-<w:hdr xmlns:wpc="http://schemas.microsoft.com/office/word/2010/wordprocessingCanvas" xmlns:mc="http://schemas.openxmlformats.org/markup-compatibility/2006" xmlns:o="urn:schemas-microsoft-com:office:office" xmlns:r="http://schemas.openxmlformats.org/officeDocument/2006/relationships" xmlns:m="http://schemas.openxmlformats.org/officeDocument/2006/math" xmlns:v="urn:schemas-microsoft-com:vml" xmlns:wp14="http://schemas.microsoft.com/office/word/2010/wordprocessingDrawing" xmlns:wp="http://schemas.openxmlformats.org/drawingml/2006/wordprocessingDrawing" xmlns:w10="urn:schemas-microsoft-com:office:word" xmlns:w="http://schemas.openxmlformats.org/wordprocessingml/2006/main" xmlns:w14="http://schemas.microsoft.com/office/word/2010/wordml" xmlns:w15="http://schemas.microsoft.com/office/word/2012/wordml" xmlns:wpg="http://schemas.microsoft.com/office/word/2010/wordprocessingGroup" xmlns:wpi="http://schemas.microsoft.com/office/word/2010/wordprocessingInk" xmlns:wne="http://schemas.microsoft.com/office/word/2006/wordml" xmlns:wps="http://schemas.microsoft.com/office/word/2010/wordprocessingShape" xmlns:cx="http://schemas.microsoft.com/office/drawing/2014/chartex" xmlns:cx1="http://schemas.microsoft.com/office/drawing/2015/9/8/chartex" xmlns:cx2="http://schemas.microsoft.com/office/drawing/2015/10/21/chartex" xmlns:cx3="http://schemas.microsoft.com/office/drawing/2016/5/9/chartex" xmlns:cx4="http://schemas.microsoft.com/office/drawing/2016/5/10/chartex" xmlns:cx5="http://schemas.microsoft.com/office/drawing/2016/5/11/chartex" xmlns:cx6="http://schemas.microsoft.com/office/drawing/2016/5/12/chartex" xmlns:cx7="http://schemas.microsoft.com/office/drawing/2016/5/13/chartex" xmlns:cx8="http://schemas.microsoft.com/office/drawing/2016/5/14/chartex" xmlns:w16cid="http://schemas.microsoft.com/office/word/2016/wordml/cid" xmlns:w16se="http://schemas.microsoft.com/office/word/2015/wordml/symex">
-  <w:p>
-    <w:pPr>
-      <w:spacing w:after="0" w:before="0" w:line="240" w:lineRule="auto"/>
-    </w:pPr>
-    <w:r>
-      <w:drawing>
-        <wp:inline distT="0" distB="0" distL="0" distR="0">
-          <wp:extent cx="7560197" cy="3482993"/>
-          <wp:effectExtent t="0" r="0" b="0" l="0"/>
-          <wp:docPr id="1" name="" descr="" title=""/>
-          <wp:cNvGraphicFramePr>
-            <a:graphicFrameLocks xmlns:a="http://schemas.openxmlformats.org/drawingml/2006/main" noChangeAspect="1"/>
-          </wp:cNvGraphicFramePr>
-          <a:graphic xmlns:a="http://schemas.openxmlformats.org/drawingml/2006/main">
-            <a:graphicData uri="http://schemas.openxmlformats.org/drawingml/2006/picture">
-              <pic:pic xmlns:pic="http://schemas.openxmlformats.org/drawingml/2006/picture">
-                <pic:nvPicPr>
-                  <pic:cNvPr id="0" name="" descr=""/>
-                  <pic:cNvPicPr>
-                    <a:picLocks noChangeAspect="1" noChangeArrowheads="1"/>
-                  </pic:cNvPicPr>
-                </pic:nvPicPr>
-                <pic:blipFill>
-                  <a:blip r:embed="rId0" cstate="none"/>
-                  <a:srcRect/>
-                  <a:stretch>
-                    <a:fillRect/>
-                  </a:stretch>
-                </pic:blipFill>
-                <pic:spPr bwMode="auto">
-                  <a:xfrm>
-                    <a:off x="0" y="0"/>
-                    <a:ext cx="7560197" cy="3482993"/>
-                  </a:xfrm>
-                  <a:prstGeom prst="rect">
-                    <a:avLst/>
-                  </a:prstGeom>
-                </pic:spPr>
-              </pic:pic>
-            </a:graphicData>
-          </a:graphic>
-        </wp:inline>
-      </w:drawing>
-    </w:r>
-  </w:p>
-</w:hdr>
-</file>
-
-<file path=word/header3.xml><?xml version="1.0" encoding="utf-8"?>
 <w:hdr xmlns:wpc="http://schemas.microsoft.com/office/word/2010/wordprocessingCanvas" xmlns:mc="http://schemas.openxmlformats.org/markup-compatibility/2006" xmlns:o="urn:schemas-microsoft-com:office:office" xmlns:r="http://schemas.openxmlformats.org/officeDocument/2006/relationships" xmlns:m="http://schemas.openxmlformats.org/officeDocument/2006/math" xmlns:v="urn:schemas-microsoft-com:vml" xmlns:wp14="http://schemas.microsoft.com/office/word/2010/wordprocessingDrawing" xmlns:wp="http://schemas.openxmlformats.org/drawingml/2006/wordprocessingDrawing" xmlns:w10="urn:schemas-microsoft-com:office:word" xmlns:w="http://schemas.openxmlformats.org/wordprocessingml/2006/main" xmlns:w14="http://schemas.microsoft.com/office/word/2010/wordml" xmlns:w15="http://schemas.microsoft.com/office/word/2012/wordml" xmlns:wpg="http://schemas.microsoft.com/office/word/2010/wordprocessingGroup" xmlns:wpi="http://schemas.microsoft.com/office/word/2010/wordprocessingInk" xmlns:wne="http://schemas.microsoft.com/office/word/2006/wordml" xmlns:wps="http://schemas.microsoft.com/office/word/2010/wordprocessingShape" xmlns:cx="http://schemas.microsoft.com/office/drawing/2014/chartex" xmlns:cx1="http://schemas.microsoft.com/office/drawing/2015/9/8/chartex" xmlns:cx2="http://schemas.microsoft.com/office/drawing/2015/10/21/chartex" xmlns:cx3="http://schemas.microsoft.com/office/drawing/2016/5/9/chartex" xmlns:cx4="http://schemas.microsoft.com/office/drawing/2016/5/10/chartex" xmlns:cx5="http://schemas.microsoft.com/office/drawing/2016/5/11/chartex" xmlns:cx6="http://schemas.microsoft.com/office/drawing/2016/5/12/chartex" xmlns:cx7="http://schemas.microsoft.com/office/drawing/2016/5/13/chartex" xmlns:cx8="http://schemas.microsoft.com/office/drawing/2016/5/14/chartex" xmlns:w16cid="http://schemas.microsoft.com/office/word/2016/wordml/cid" xmlns:w16se="http://schemas.microsoft.com/office/word/2015/wordml/symex">
   <w:p/>
 </w:hdr>
@@ -7175,5 +7174,16 @@
       <w:szCs w:val="20"/>
     </w:rPr>
   </w:style>
+  <w:style w:type="paragraph" w:styleId="tight">
+    <w:name w:val="Ajustado"/>
+    <w:basedOn w:val="Normal"/>
+    <w:pPr>
+      <w:spacing w:after="0" w:before="0" w:line="240" w:lineRule="auto"/>
+    </w:pPr>
+    <w:rPr>
+      <w:sz w:val="2"/>
+      <w:szCs w:val="2"/>
+    </w:rPr>
+  </w:style>
 </w:styles>
 </file>
</xml_diff>

<commit_message>
Decreto 51/2025 Google Docs v4: background images behind editable text for headline block, label and underline
Co-Authored-By: Claude Opus 5.5 <noreply@anthropic.com>
Claude-Session: https://claude.ai/code/session_01T98mbmRs8KdzUGJ1QXPFqC
</commit_message>
<xml_diff>
--- a/virginia-jurado/decreto-51-2025-muestra-google-docs.docx
+++ b/virginia-jurado/decreto-51-2025-muestra-google-docs.docx
@@ -607,98 +607,79 @@
     </w:p>
     <w:p>
       <w:pPr>
-        <w:pStyle w:val="tight"/>
+        <w:spacing w:after="0" w:before="0" w:line="691" w:lineRule="exact"/>
       </w:pPr>
       <w:r>
         <w:drawing>
-          <wp:inline distT="0" distB="0" distL="0" distR="0">
-            <wp:extent cx="6115998" cy="1554140"/>
-            <wp:effectExtent l="0" t="0" r="0" b="0"/>
-            <wp:docPr id="5007" name="Titular 5007"/>
-            <wp:cNvGraphicFramePr/>
+          <wp:anchor distT="0" distB="0" distL="0" distR="0" simplePos="0" allowOverlap="1" behindDoc="1" locked="1" layoutInCell="1" relativeHeight="1572375">
+            <wp:simplePos x="0" y="0"/>
+            <wp:positionH relativeFrom="page">
+              <wp:posOffset>484526</wp:posOffset>
+            </wp:positionH>
+            <wp:positionV relativeFrom="paragraph">
+              <wp:posOffset>0</wp:posOffset>
+            </wp:positionV>
+            <wp:extent cx="6371775" cy="1572375"/>
+            <wp:effectExtent t="0" r="0" b="0" l="0"/>
+            <wp:wrapNone/>
+            <wp:docPr id="1" name="" descr="" title=""/>
+            <wp:cNvGraphicFramePr>
+              <a:graphicFrameLocks xmlns:a="http://schemas.openxmlformats.org/drawingml/2006/main" noChangeAspect="1"/>
+            </wp:cNvGraphicFramePr>
             <a:graphic xmlns:a="http://schemas.openxmlformats.org/drawingml/2006/main">
-              <a:graphicData uri="http://schemas.microsoft.com/office/word/2010/wordprocessingGroup">
-                <wpg:wgp>
-                  <wpg:cNvGrpSpPr/>
-                  <wpg:grpSpPr>
+              <a:graphicData uri="http://schemas.openxmlformats.org/drawingml/2006/picture">
+                <pic:pic xmlns:pic="http://schemas.openxmlformats.org/drawingml/2006/picture">
+                  <pic:nvPicPr>
+                    <pic:cNvPr id="0" name="" descr=""/>
+                    <pic:cNvPicPr>
+                      <a:picLocks noChangeAspect="1" noChangeArrowheads="1"/>
+                    </pic:cNvPicPr>
+                  </pic:nvPicPr>
+                  <pic:blipFill>
+                    <a:blip r:embed="rId14" cstate="none"/>
+                    <a:srcRect/>
+                    <a:stretch>
+                      <a:fillRect/>
+                    </a:stretch>
+                  </pic:blipFill>
+                  <pic:spPr bwMode="auto">
                     <a:xfrm>
                       <a:off x="0" y="0"/>
-                      <a:ext cx="6115998" cy="1554140"/>
-                      <a:chOff x="0" y="0"/>
-                      <a:chExt cx="6115998" cy="1554140"/>
+                      <a:ext cx="6371775" cy="1572375"/>
                     </a:xfrm>
-                  </wpg:grpSpPr>
-                  <wps:wsp>
-                    <wps:cNvPr id="5907" name="Bloque"/>
-                    <wps:cNvSpPr/>
-                    <wps:spPr>
-                      <a:xfrm>
-                        <a:off x="219408" y="219408"/>
-                        <a:ext cx="5896590" cy="1334732"/>
-                      </a:xfrm>
-                      <a:prstGeom prst="roundRect">
-                        <a:avLst>
-                          <a:gd name="adj" fmla="val 11000"/>
-                        </a:avLst>
-                      </a:prstGeom>
-                      <a:solidFill>
-                        <a:srgbClr val="D1EDF9"/>
-                      </a:solidFill>
-                      <a:ln>
-                        <a:noFill/>
-                      </a:ln>
-                    </wps:spPr>
-                    <wps:txbx>
-                      <w:txbxContent>
-                        <w:p>
-                          <w:pPr>
-                            <w:spacing w:before="0" w:after="0" w:line="276" w:lineRule="auto"/>
-                            <w:jc w:val="left"/>
-                          </w:pPr>
-                          <w:r>
-                            <w:rPr>
-                              <w:rFonts w:ascii="Poppins" w:hAnsi="Poppins" w:cs="Poppins"/>
-                              <w:b/>
-                              <w:bCs/>
-                              <w:color w:val="143548"/>
-                              <w:sz w:val="24"/>
-                              <w:szCs w:val="24"/>
-                            </w:rPr>
-                            <w:t xml:space="preserve">Decreto 51/2025, de 24 de febrero, por el que se regula la planificación y ordenación del empleo público, y el ingreso, promoción interna y provisión de puestos de trabajo del personal de la Administración General de la Junta de Andalucía.</w:t>
-                          </w:r>
-                        </w:p>
-                      </w:txbxContent>
-                    </wps:txbx>
-                    <wps:bodyPr rot="0" vert="horz" wrap="square" lIns="274260" tIns="109704" rIns="237692" bIns="91420" anchor="ctr" anchorCtr="0">
-                      <a:noAutofit/>
-                    </wps:bodyPr>
-                  </wps:wsp>
-                  <pic:pic xmlns:pic="http://schemas.openxmlformats.org/drawingml/2006/picture">
-                    <pic:nvPicPr>
-                      <pic:cNvPr id="5908" name="Librito"/>
-                      <pic:cNvPicPr/>
-                    </pic:nvPicPr>
-                    <pic:blipFill>
-                      <a:blip r:embed="rIdBADGE"/>
-                      <a:stretch>
-                        <a:fillRect/>
-                      </a:stretch>
-                    </pic:blipFill>
-                    <pic:spPr>
-                      <a:xfrm>
-                        <a:off x="0" y="0"/>
-                        <a:ext cx="475384" cy="475384"/>
-                      </a:xfrm>
-                      <a:prstGeom prst="ellipse">
-                        <a:avLst/>
-                      </a:prstGeom>
-                    </pic:spPr>
-                  </pic:pic>
-                </wpg:wgp>
+                    <a:prstGeom prst="rect">
+                      <a:avLst/>
+                    </a:prstGeom>
+                  </pic:spPr>
+                </pic:pic>
               </a:graphicData>
             </a:graphic>
-          </wp:inline>
+          </wp:anchor>
         </w:drawing>
+      </w:r>
+      <w:r>
+        <w:rPr>
+          <w:sz w:val="2"/>
+          <w:szCs w:val="2"/>
+        </w:rPr>
+        <w:t xml:space="preserve"/>
+      </w:r>
+    </w:p>
+    <w:p>
+      <w:pPr>
+        <w:spacing w:after="432" w:before="0" w:line="353" w:lineRule="exact"/>
+        <w:ind w:left="432" w:right="489"/>
+      </w:pPr>
+      <w:r>
+        <w:rPr>
+          <w:rFonts w:ascii="Poppins" w:cs="Poppins" w:eastAsia="Poppins" w:hAnsi="Poppins"/>
+          <w:b/>
+          <w:bCs/>
+          <w:color w:val="143548"/>
+          <w:sz w:val="24"/>
+          <w:szCs w:val="24"/>
+        </w:rPr>
+        <w:t xml:space="preserve">Decreto 51/2025, de 24 de febrero, por el que se regula la planificación y ordenación del empleo público, y el ingreso, promoción interna y provisión de puestos de trabajo del personal de la Administración General de la Junta de Andalucía.</w:t>
       </w:r>
     </w:p>
     <w:p>
@@ -715,64 +696,69 @@
     </w:p>
     <w:p>
       <w:pPr>
-        <w:pStyle w:val="tight"/>
+        <w:spacing w:after="0" w:before="0" w:line="475" w:lineRule="exact"/>
+        <w:ind w:left="317"/>
       </w:pPr>
       <w:r>
         <w:drawing>
-          <wp:inline distT="0" distB="0" distL="0" distR="0">
-            <wp:extent cx="1371300" cy="292544"/>
-            <wp:effectExtent l="0" t="0" r="0" b="0"/>
-            <wp:docPr id="5008" name="Forma 5008"/>
-            <wp:cNvGraphicFramePr/>
+          <wp:anchor distT="0" distB="0" distL="0" distR="0" simplePos="0" allowOverlap="1" behindDoc="1" locked="1" layoutInCell="1" relativeHeight="301677">
+            <wp:simplePos x="0" y="0"/>
+            <wp:positionH relativeFrom="page">
+              <wp:posOffset>722218</wp:posOffset>
+            </wp:positionH>
+            <wp:positionV relativeFrom="paragraph">
+              <wp:posOffset>0</wp:posOffset>
+            </wp:positionV>
+            <wp:extent cx="1343832" cy="301677"/>
+            <wp:effectExtent t="0" r="0" b="0" l="0"/>
+            <wp:wrapNone/>
+            <wp:docPr id="1" name="" descr="" title=""/>
+            <wp:cNvGraphicFramePr>
+              <a:graphicFrameLocks xmlns:a="http://schemas.openxmlformats.org/drawingml/2006/main" noChangeAspect="1"/>
+            </wp:cNvGraphicFramePr>
             <a:graphic xmlns:a="http://schemas.openxmlformats.org/drawingml/2006/main">
-              <a:graphicData uri="http://schemas.microsoft.com/office/word/2010/wordprocessingShape">
-                <wps:wsp>
-                  <wps:cNvSpPr/>
-                  <wps:spPr>
+              <a:graphicData uri="http://schemas.openxmlformats.org/drawingml/2006/picture">
+                <pic:pic xmlns:pic="http://schemas.openxmlformats.org/drawingml/2006/picture">
+                  <pic:nvPicPr>
+                    <pic:cNvPr id="0" name="" descr=""/>
+                    <pic:cNvPicPr>
+                      <a:picLocks noChangeAspect="1" noChangeArrowheads="1"/>
+                    </pic:cNvPicPr>
+                  </pic:nvPicPr>
+                  <pic:blipFill>
+                    <a:blip r:embed="rId15" cstate="none"/>
+                    <a:srcRect/>
+                    <a:stretch>
+                      <a:fillRect/>
+                    </a:stretch>
+                  </pic:blipFill>
+                  <pic:spPr bwMode="auto">
                     <a:xfrm>
                       <a:off x="0" y="0"/>
-                      <a:ext cx="1371300" cy="292544"/>
+                      <a:ext cx="1343832" cy="301677"/>
                     </a:xfrm>
-                    <a:prstGeom prst="flowChartDelay">
+                    <a:prstGeom prst="rect">
                       <a:avLst/>
                     </a:prstGeom>
-                    <a:solidFill>
-                      <a:srgbClr val="143548"/>
-                    </a:solidFill>
-                    <a:ln>
-                      <a:noFill/>
-                    </a:ln>
-                  </wps:spPr>
-                  <wps:txbx>
-                    <w:txbxContent>
-                      <w:p>
-                        <w:pPr>
-                          <w:spacing w:before="0" w:after="0" w:line="240" w:lineRule="auto"/>
-                          <w:jc w:val="center"/>
-                        </w:pPr>
-                        <w:r>
-                          <w:rPr>
-                            <w:rFonts w:ascii="Poppins" w:hAnsi="Poppins" w:cs="Poppins"/>
-                            <w:b/>
-                            <w:bCs/>
-                            <w:color w:val="FFFFFF"/>
-                            <w:spacing w:val="42"/>
-                            <w:sz w:val="17"/>
-                            <w:szCs w:val="17"/>
-                          </w:rPr>
-                          <w:t xml:space="preserve">ESTRUCTURA</w:t>
-                        </w:r>
-                      </w:p>
-                    </w:txbxContent>
-                  </wps:txbx>
-                  <wps:bodyPr rot="0" vert="horz" wrap="square" lIns="54852" tIns="0" rIns="91420" bIns="0" anchor="ctr" anchorCtr="0">
-                    <a:noAutofit/>
-                  </wps:bodyPr>
-                </wps:wsp>
+                  </pic:spPr>
+                </pic:pic>
               </a:graphicData>
             </a:graphic>
-          </wp:inline>
+          </wp:anchor>
         </w:drawing>
+      </w:r>
+      <w:r>
+        <w:rPr>
+          <w:rFonts w:ascii="Poppins" w:cs="Poppins" w:eastAsia="Poppins" w:hAnsi="Poppins"/>
+          <w:b/>
+          <w:bCs/>
+          <w:color w:val="FFFFFF"/>
+          <w:spacing w:val="42"/>
+          <w:position w:val="5"/>
+          <w:sz w:val="17"/>
+          <w:szCs w:val="17"/>
+        </w:rPr>
+        <w:t xml:space="preserve">ESTRUCTURA</w:t>
       </w:r>
     </w:p>
     <w:p>
@@ -848,7 +834,7 @@
                           </pic:cNvPicPr>
                         </pic:nvPicPr>
                         <pic:blipFill>
-                          <a:blip r:embed="rId14" cstate="none"/>
+                          <a:blip r:embed="rId16" cstate="none"/>
                           <a:srcRect/>
                           <a:stretch>
                             <a:fillRect/>
@@ -1049,7 +1035,7 @@
                           </pic:cNvPicPr>
                         </pic:nvPicPr>
                         <pic:blipFill>
-                          <a:blip r:embed="rId15" cstate="none"/>
+                          <a:blip r:embed="rId17" cstate="none"/>
                           <a:srcRect/>
                           <a:stretch>
                             <a:fillRect/>
@@ -1131,7 +1117,7 @@
                 <wp:inline distT="0" distB="0" distL="0" distR="0">
                   <wp:extent cx="2440000" cy="173698"/>
                   <wp:effectExtent l="0" t="0" r="0" b="0"/>
-                  <wp:docPr id="5009" name="Forma 5009"/>
+                  <wp:docPr id="5007" name="Forma 5007"/>
                   <wp:cNvGraphicFramePr/>
                   <a:graphic xmlns:a="http://schemas.openxmlformats.org/drawingml/2006/main">
                     <a:graphicData uri="http://schemas.microsoft.com/office/word/2010/wordprocessingShape">
@@ -1208,7 +1194,7 @@
                 <wp:inline distT="0" distB="0" distL="0" distR="0">
                   <wp:extent cx="2896186" cy="173698"/>
                   <wp:effectExtent l="0" t="0" r="0" b="0"/>
-                  <wp:docPr id="5010" name="Forma 5010"/>
+                  <wp:docPr id="5008" name="Forma 5008"/>
                   <wp:cNvGraphicFramePr/>
                   <a:graphic xmlns:a="http://schemas.openxmlformats.org/drawingml/2006/main">
                     <a:graphicData uri="http://schemas.microsoft.com/office/word/2010/wordprocessingShape">
@@ -1283,7 +1269,7 @@
                 <wp:inline distT="0" distB="0" distL="0" distR="0">
                   <wp:extent cx="2043237" cy="173698"/>
                   <wp:effectExtent l="0" t="0" r="0" b="0"/>
-                  <wp:docPr id="5011" name="Forma 5011"/>
+                  <wp:docPr id="5009" name="Forma 5009"/>
                   <wp:cNvGraphicFramePr/>
                   <a:graphic xmlns:a="http://schemas.openxmlformats.org/drawingml/2006/main">
                     <a:graphicData uri="http://schemas.microsoft.com/office/word/2010/wordprocessingShape">
@@ -1477,7 +1463,7 @@
                           </pic:cNvPicPr>
                         </pic:nvPicPr>
                         <pic:blipFill>
-                          <a:blip r:embed="rId16" cstate="none"/>
+                          <a:blip r:embed="rId18" cstate="none"/>
                           <a:srcRect/>
                           <a:stretch>
                             <a:fillRect/>
@@ -1559,7 +1545,7 @@
                 <wp:inline distT="0" distB="0" distL="0" distR="0">
                   <wp:extent cx="1643732" cy="173698"/>
                   <wp:effectExtent l="0" t="0" r="0" b="0"/>
-                  <wp:docPr id="5012" name="Forma 5012"/>
+                  <wp:docPr id="5010" name="Forma 5010"/>
                   <wp:cNvGraphicFramePr/>
                   <a:graphic xmlns:a="http://schemas.openxmlformats.org/drawingml/2006/main">
                     <a:graphicData uri="http://schemas.microsoft.com/office/word/2010/wordprocessingShape">
@@ -1636,7 +1622,7 @@
                 <wp:inline distT="0" distB="0" distL="0" distR="0">
                   <wp:extent cx="1807373" cy="173698"/>
                   <wp:effectExtent l="0" t="0" r="0" b="0"/>
-                  <wp:docPr id="5013" name="Forma 5013"/>
+                  <wp:docPr id="5011" name="Forma 5011"/>
                   <wp:cNvGraphicFramePr/>
                   <a:graphic xmlns:a="http://schemas.openxmlformats.org/drawingml/2006/main">
                     <a:graphicData uri="http://schemas.microsoft.com/office/word/2010/wordprocessingShape">
@@ -1711,7 +1697,7 @@
                 <wp:inline distT="0" distB="0" distL="0" distR="0">
                   <wp:extent cx="2924526" cy="173698"/>
                   <wp:effectExtent l="0" t="0" r="0" b="0"/>
-                  <wp:docPr id="5014" name="Forma 5014"/>
+                  <wp:docPr id="5012" name="Forma 5012"/>
                   <wp:cNvGraphicFramePr/>
                   <a:graphic xmlns:a="http://schemas.openxmlformats.org/drawingml/2006/main">
                     <a:graphicData uri="http://schemas.microsoft.com/office/word/2010/wordprocessingShape">
@@ -1788,7 +1774,7 @@
                 <wp:inline distT="0" distB="0" distL="0" distR="0">
                   <wp:extent cx="2435429" cy="173698"/>
                   <wp:effectExtent l="0" t="0" r="0" b="0"/>
-                  <wp:docPr id="5015" name="Forma 5015"/>
+                  <wp:docPr id="5013" name="Forma 5013"/>
                   <wp:cNvGraphicFramePr/>
                   <a:graphic xmlns:a="http://schemas.openxmlformats.org/drawingml/2006/main">
                     <a:graphicData uri="http://schemas.microsoft.com/office/word/2010/wordprocessingShape">
@@ -1863,7 +1849,7 @@
                 <wp:inline distT="0" distB="0" distL="0" distR="0">
                   <wp:extent cx="1994784" cy="173698"/>
                   <wp:effectExtent l="0" t="0" r="0" b="0"/>
-                  <wp:docPr id="5016" name="Forma 5016"/>
+                  <wp:docPr id="5014" name="Forma 5014"/>
                   <wp:cNvGraphicFramePr/>
                   <a:graphic xmlns:a="http://schemas.openxmlformats.org/drawingml/2006/main">
                     <a:graphicData uri="http://schemas.microsoft.com/office/word/2010/wordprocessingShape">
@@ -1938,7 +1924,7 @@
                 <wp:inline distT="0" distB="0" distL="0" distR="0">
                   <wp:extent cx="4189779" cy="173698"/>
                   <wp:effectExtent l="0" t="0" r="0" b="0"/>
-                  <wp:docPr id="5017" name="Forma 5017"/>
+                  <wp:docPr id="5015" name="Forma 5015"/>
                   <wp:cNvGraphicFramePr/>
                   <a:graphic xmlns:a="http://schemas.openxmlformats.org/drawingml/2006/main">
                     <a:graphicData uri="http://schemas.microsoft.com/office/word/2010/wordprocessingShape">
@@ -2132,7 +2118,7 @@
                           </pic:cNvPicPr>
                         </pic:nvPicPr>
                         <pic:blipFill>
-                          <a:blip r:embed="rId17" cstate="none"/>
+                          <a:blip r:embed="rId19" cstate="none"/>
                           <a:srcRect/>
                           <a:stretch>
                             <a:fillRect/>
@@ -2214,7 +2200,7 @@
                 <wp:inline distT="0" distB="0" distL="0" distR="0">
                   <wp:extent cx="1643732" cy="173698"/>
                   <wp:effectExtent l="0" t="0" r="0" b="0"/>
-                  <wp:docPr id="5018" name="Forma 5018"/>
+                  <wp:docPr id="5016" name="Forma 5016"/>
                   <wp:cNvGraphicFramePr/>
                   <a:graphic xmlns:a="http://schemas.openxmlformats.org/drawingml/2006/main">
                     <a:graphicData uri="http://schemas.microsoft.com/office/word/2010/wordprocessingShape">
@@ -2289,7 +2275,7 @@
                 <wp:inline distT="0" distB="0" distL="0" distR="0">
                   <wp:extent cx="3760105" cy="173698"/>
                   <wp:effectExtent l="0" t="0" r="0" b="0"/>
-                  <wp:docPr id="5019" name="Forma 5019"/>
+                  <wp:docPr id="5017" name="Forma 5017"/>
                   <wp:cNvGraphicFramePr/>
                   <a:graphic xmlns:a="http://schemas.openxmlformats.org/drawingml/2006/main">
                     <a:graphicData uri="http://schemas.microsoft.com/office/word/2010/wordprocessingShape">
@@ -2364,7 +2350,7 @@
                 <wp:inline distT="0" distB="0" distL="0" distR="0">
                   <wp:extent cx="3904548" cy="173698"/>
                   <wp:effectExtent l="0" t="0" r="0" b="0"/>
-                  <wp:docPr id="5020" name="Forma 5020"/>
+                  <wp:docPr id="5018" name="Forma 5018"/>
                   <wp:cNvGraphicFramePr/>
                   <a:graphic xmlns:a="http://schemas.openxmlformats.org/drawingml/2006/main">
                     <a:graphicData uri="http://schemas.microsoft.com/office/word/2010/wordprocessingShape">
@@ -2558,7 +2544,7 @@
                           </pic:cNvPicPr>
                         </pic:nvPicPr>
                         <pic:blipFill>
-                          <a:blip r:embed="rId18" cstate="none"/>
+                          <a:blip r:embed="rId20" cstate="none"/>
                           <a:srcRect/>
                           <a:stretch>
                             <a:fillRect/>
@@ -2640,7 +2626,7 @@
                 <wp:inline distT="0" distB="0" distL="0" distR="0">
                   <wp:extent cx="1643732" cy="173698"/>
                   <wp:effectExtent l="0" t="0" r="0" b="0"/>
-                  <wp:docPr id="5021" name="Forma 5021"/>
+                  <wp:docPr id="5019" name="Forma 5019"/>
                   <wp:cNvGraphicFramePr/>
                   <a:graphic xmlns:a="http://schemas.openxmlformats.org/drawingml/2006/main">
                     <a:graphicData uri="http://schemas.microsoft.com/office/word/2010/wordprocessingShape">
@@ -2715,7 +2701,7 @@
                 <wp:inline distT="0" distB="0" distL="0" distR="0">
                   <wp:extent cx="4336051" cy="173698"/>
                   <wp:effectExtent l="0" t="0" r="0" b="0"/>
-                  <wp:docPr id="5022" name="Forma 5022"/>
+                  <wp:docPr id="5020" name="Forma 5020"/>
                   <wp:cNvGraphicFramePr/>
                   <a:graphic xmlns:a="http://schemas.openxmlformats.org/drawingml/2006/main">
                     <a:graphicData uri="http://schemas.microsoft.com/office/word/2010/wordprocessingShape">
@@ -2790,7 +2776,7 @@
                 <wp:inline distT="0" distB="0" distL="0" distR="0">
                   <wp:extent cx="3452019" cy="173698"/>
                   <wp:effectExtent l="0" t="0" r="0" b="0"/>
-                  <wp:docPr id="5023" name="Forma 5023"/>
+                  <wp:docPr id="5021" name="Forma 5021"/>
                   <wp:cNvGraphicFramePr/>
                   <a:graphic xmlns:a="http://schemas.openxmlformats.org/drawingml/2006/main">
                     <a:graphicData uri="http://schemas.microsoft.com/office/word/2010/wordprocessingShape">
@@ -2984,7 +2970,7 @@
                           </pic:cNvPicPr>
                         </pic:nvPicPr>
                         <pic:blipFill>
-                          <a:blip r:embed="rId19" cstate="none"/>
+                          <a:blip r:embed="rId21" cstate="none"/>
                           <a:srcRect/>
                           <a:stretch>
                             <a:fillRect/>
@@ -3066,7 +3052,7 @@
                 <wp:inline distT="0" distB="0" distL="0" distR="0">
                   <wp:extent cx="4244631" cy="173698"/>
                   <wp:effectExtent l="0" t="0" r="0" b="0"/>
-                  <wp:docPr id="5024" name="Forma 5024"/>
+                  <wp:docPr id="5022" name="Forma 5022"/>
                   <wp:cNvGraphicFramePr/>
                   <a:graphic xmlns:a="http://schemas.openxmlformats.org/drawingml/2006/main">
                     <a:graphicData uri="http://schemas.microsoft.com/office/word/2010/wordprocessingShape">
@@ -3141,7 +3127,7 @@
                 <wp:inline distT="0" distB="0" distL="0" distR="0">
                   <wp:extent cx="3918261" cy="173698"/>
                   <wp:effectExtent l="0" t="0" r="0" b="0"/>
-                  <wp:docPr id="5025" name="Forma 5025"/>
+                  <wp:docPr id="5023" name="Forma 5023"/>
                   <wp:cNvGraphicFramePr/>
                   <a:graphic xmlns:a="http://schemas.openxmlformats.org/drawingml/2006/main">
                     <a:graphicData uri="http://schemas.microsoft.com/office/word/2010/wordprocessingShape">
@@ -3216,7 +3202,7 @@
                 <wp:inline distT="0" distB="0" distL="0" distR="0">
                   <wp:extent cx="3735421" cy="173698"/>
                   <wp:effectExtent l="0" t="0" r="0" b="0"/>
-                  <wp:docPr id="5026" name="Forma 5026"/>
+                  <wp:docPr id="5024" name="Forma 5024"/>
                   <wp:cNvGraphicFramePr/>
                   <a:graphic xmlns:a="http://schemas.openxmlformats.org/drawingml/2006/main">
                     <a:graphicData uri="http://schemas.microsoft.com/office/word/2010/wordprocessingShape">
@@ -3386,6 +3372,54 @@
       </w:pPr>
       <w:r>
         <w:drawing>
+          <wp:anchor distT="0" distB="0" distL="0" distR="0" simplePos="0" allowOverlap="1" behindDoc="1" locked="1" layoutInCell="1" relativeHeight="45709">
+            <wp:simplePos x="0" y="0"/>
+            <wp:positionH relativeFrom="page">
+              <wp:posOffset>3129307</wp:posOffset>
+            </wp:positionH>
+            <wp:positionV relativeFrom="paragraph">
+              <wp:posOffset>187411</wp:posOffset>
+            </wp:positionV>
+            <wp:extent cx="555816" cy="45709"/>
+            <wp:effectExtent t="0" r="0" b="0" l="0"/>
+            <wp:wrapNone/>
+            <wp:docPr id="1" name="" descr="" title=""/>
+            <wp:cNvGraphicFramePr>
+              <a:graphicFrameLocks xmlns:a="http://schemas.openxmlformats.org/drawingml/2006/main" noChangeAspect="1"/>
+            </wp:cNvGraphicFramePr>
+            <a:graphic xmlns:a="http://schemas.openxmlformats.org/drawingml/2006/main">
+              <a:graphicData uri="http://schemas.openxmlformats.org/drawingml/2006/picture">
+                <pic:pic xmlns:pic="http://schemas.openxmlformats.org/drawingml/2006/picture">
+                  <pic:nvPicPr>
+                    <pic:cNvPr id="0" name="" descr=""/>
+                    <pic:cNvPicPr>
+                      <a:picLocks noChangeAspect="1" noChangeArrowheads="1"/>
+                    </pic:cNvPicPr>
+                  </pic:nvPicPr>
+                  <pic:blipFill>
+                    <a:blip r:embed="rId22" cstate="none"/>
+                    <a:srcRect/>
+                    <a:stretch>
+                      <a:fillRect/>
+                    </a:stretch>
+                  </pic:blipFill>
+                  <pic:spPr bwMode="auto">
+                    <a:xfrm>
+                      <a:off x="0" y="0"/>
+                      <a:ext cx="555816" cy="45709"/>
+                    </a:xfrm>
+                    <a:prstGeom prst="rect">
+                      <a:avLst/>
+                    </a:prstGeom>
+                  </pic:spPr>
+                </pic:pic>
+              </a:graphicData>
+            </a:graphic>
+          </wp:anchor>
+        </w:drawing>
+      </w:r>
+      <w:r>
+        <w:drawing>
           <wp:inline distT="0" distB="0" distL="0" distR="0">
             <wp:extent cx="201118" cy="210259"/>
             <wp:effectExtent t="0" r="0" b="0" l="0"/>
@@ -3403,7 +3437,7 @@
                     </pic:cNvPicPr>
                   </pic:nvPicPr>
                   <pic:blipFill>
-                    <a:blip r:embed="rId20" cstate="none"/>
+                    <a:blip r:embed="rId23" cstate="none"/>
                     <a:srcRect/>
                     <a:stretch>
                       <a:fillRect/>
@@ -3441,7 +3475,6 @@
           <w:color w:val="143548"/>
           <w:sz w:val="22"/>
           <w:szCs w:val="22"/>
-          <w:shd w:fill="9DDFEA" w:color="auto" w:val="clear"/>
         </w:rPr>
         <w:t xml:space="preserve">8, 9 y 10</w:t>
       </w:r>
@@ -3497,7 +3530,7 @@
           <wp:inline distT="0" distB="0" distL="0" distR="0">
             <wp:extent cx="6115998" cy="438816"/>
             <wp:effectExtent l="0" t="0" r="0" b="0"/>
-            <wp:docPr id="5027" name="Forma 5027"/>
+            <wp:docPr id="5025" name="Forma 5025"/>
             <wp:cNvGraphicFramePr/>
             <a:graphic xmlns:a="http://schemas.openxmlformats.org/drawingml/2006/main">
               <a:graphicData uri="http://schemas.microsoft.com/office/word/2010/wordprocessingShape">
@@ -3625,7 +3658,7 @@
                           </pic:cNvPicPr>
                         </pic:nvPicPr>
                         <pic:blipFill>
-                          <a:blip r:embed="rId21" cstate="none"/>
+                          <a:blip r:embed="rId24" cstate="none"/>
                           <a:srcRect/>
                           <a:stretch>
                             <a:fillRect/>
@@ -3988,7 +4021,7 @@
                           </pic:cNvPicPr>
                         </pic:nvPicPr>
                         <pic:blipFill>
-                          <a:blip r:embed="rId22" cstate="none"/>
+                          <a:blip r:embed="rId25" cstate="none"/>
                           <a:srcRect/>
                           <a:stretch>
                             <a:fillRect/>
@@ -5179,7 +5212,7 @@
                           </pic:cNvPicPr>
                         </pic:nvPicPr>
                         <pic:blipFill>
-                          <a:blip r:embed="rId23" cstate="none"/>
+                          <a:blip r:embed="rId26" cstate="none"/>
                           <a:srcRect/>
                           <a:stretch>
                             <a:fillRect/>
@@ -6123,7 +6156,7 @@
                           </pic:cNvPicPr>
                         </pic:nvPicPr>
                         <pic:blipFill>
-                          <a:blip r:embed="rId24" cstate="none"/>
+                          <a:blip r:embed="rId27" cstate="none"/>
                           <a:srcRect/>
                           <a:stretch>
                             <a:fillRect/>
@@ -6697,7 +6730,7 @@
       <w:footerReference w:type="default" r:id="rId10"/>
       <w:type w:val="nextPage"/>
       <w:pgSz w:w="11906" w:h="16838" w:orient="portrait"/>
-      <w:pgMar w:top="662" w:right="1137" w:bottom="806" w:left="1137" w:header="0" w:footer="165" w:gutter="0"/>
+      <w:pgMar w:top="576" w:right="1137" w:bottom="806" w:left="1137" w:header="0" w:footer="165" w:gutter="0"/>
       <w:pgNumType/>
       <w:docGrid w:linePitch="360"/>
     </w:sectPr>

</xml_diff>

<commit_message>
Decreto 51/2025 Google Docs: editable text over pill/chip background images
Co-Authored-By: Claude Opus 5.5 <noreply@anthropic.com>
Claude-Session: https://claude.ai/code/session_01T98mbmRs8KdzUGJ1QXPFqC
</commit_message>
<xml_diff>
--- a/virginia-jurado/decreto-51-2025-muestra-google-docs.docx
+++ b/virginia-jurado/decreto-51-2025-muestra-google-docs.docx
@@ -138,7 +138,7 @@
     </w:p>
     <w:p>
       <w:pPr>
-        <w:spacing w:after="144" w:before="0" w:line="240" w:lineRule="auto"/>
+        <w:spacing w:after="288" w:before="0" w:line="240" w:lineRule="auto"/>
         <w:ind w:left="1627" w:right="1627"/>
         <w:jc w:val="center"/>
       </w:pPr>
@@ -154,401 +154,387 @@
     </w:p>
     <w:p>
       <w:pPr>
-        <w:pStyle w:val="tight"/>
-        <w:spacing w:after="0" w:before="0"/>
-        <w:jc w:val="center"/>
+        <w:tabs>
+          <w:tab w:val="left" w:pos="3084"/>
+          <w:tab w:val="left" w:pos="4773"/>
+          <w:tab w:val="left" w:pos="7254"/>
+        </w:tabs>
+        <w:spacing w:after="173" w:before="0" w:line="240" w:lineRule="auto"/>
       </w:pPr>
       <w:r>
         <w:drawing>
-          <wp:inline distT="0" distB="0" distL="0" distR="0">
-            <wp:extent cx="999221" cy="265118"/>
-            <wp:effectExtent l="0" t="0" r="0" b="0"/>
-            <wp:docPr id="5001" name="Forma 5001"/>
-            <wp:cNvGraphicFramePr/>
+          <wp:anchor distT="0" distB="0" distL="0" distR="0" simplePos="0" allowOverlap="1" behindDoc="1" locked="1" layoutInCell="1" relativeHeight="265110">
+            <wp:simplePos x="0" y="0"/>
+            <wp:positionH relativeFrom="page">
+              <wp:posOffset>1803260</wp:posOffset>
+            </wp:positionH>
+            <wp:positionV relativeFrom="paragraph">
+              <wp:posOffset>-51608</wp:posOffset>
+            </wp:positionV>
+            <wp:extent cx="999189" cy="265110"/>
+            <wp:effectExtent t="0" r="0" b="0" l="0"/>
+            <wp:wrapNone/>
+            <wp:docPr id="1" name="" descr="" title=""/>
+            <wp:cNvGraphicFramePr>
+              <a:graphicFrameLocks xmlns:a="http://schemas.openxmlformats.org/drawingml/2006/main" noChangeAspect="1"/>
+            </wp:cNvGraphicFramePr>
             <a:graphic xmlns:a="http://schemas.openxmlformats.org/drawingml/2006/main">
-              <a:graphicData uri="http://schemas.microsoft.com/office/word/2010/wordprocessingShape">
-                <wps:wsp>
-                  <wps:cNvSpPr/>
-                  <wps:spPr>
+              <a:graphicData uri="http://schemas.openxmlformats.org/drawingml/2006/picture">
+                <pic:pic xmlns:pic="http://schemas.openxmlformats.org/drawingml/2006/picture">
+                  <pic:nvPicPr>
+                    <pic:cNvPr id="0" name="" descr=""/>
+                    <pic:cNvPicPr>
+                      <a:picLocks noChangeAspect="1" noChangeArrowheads="1"/>
+                    </pic:cNvPicPr>
+                  </pic:nvPicPr>
+                  <pic:blipFill>
+                    <a:blip r:embed="rId13" cstate="none"/>
+                    <a:srcRect/>
+                    <a:stretch>
+                      <a:fillRect/>
+                    </a:stretch>
+                  </pic:blipFill>
+                  <pic:spPr bwMode="auto">
                     <a:xfrm>
                       <a:off x="0" y="0"/>
-                      <a:ext cx="999221" cy="265118"/>
+                      <a:ext cx="999189" cy="265110"/>
                     </a:xfrm>
-                    <a:prstGeom prst="roundRect">
-                      <a:avLst>
-                        <a:gd name="adj" fmla="val 50000"/>
-                      </a:avLst>
+                    <a:prstGeom prst="rect">
+                      <a:avLst/>
                     </a:prstGeom>
-                    <a:solidFill>
-                      <a:srgbClr val="FFFFFF"/>
-                    </a:solidFill>
-                    <a:ln w="9525">
-                      <a:solidFill>
-                        <a:srgbClr val="8A8F94"/>
-                      </a:solidFill>
-                    </a:ln>
-                  </wps:spPr>
-                  <wps:txbx>
-                    <w:txbxContent>
-                      <w:p>
-                        <w:pPr>
-                          <w:spacing w:before="0" w:after="0" w:line="240" w:lineRule="auto"/>
-                          <w:jc w:val="center"/>
-                        </w:pPr>
-                        <w:r>
-                          <w:rPr>
-                            <w:rFonts w:ascii="Poppins" w:hAnsi="Poppins" w:cs="Poppins"/>
-                            <w:color w:val="4B4F53"/>
-                            <w:sz w:val="17"/>
-                            <w:szCs w:val="17"/>
-                          </w:rPr>
-                          <w:t xml:space="preserve">Planificación</w:t>
-                        </w:r>
-                      </w:p>
-                    </w:txbxContent>
-                  </wps:txbx>
-                  <wps:bodyPr rot="0" vert="horz" wrap="square" lIns="36568" tIns="0" rIns="36568" bIns="0" anchor="ctr" anchorCtr="0">
-                    <a:noAutofit/>
-                  </wps:bodyPr>
-                </wps:wsp>
+                  </pic:spPr>
+                </pic:pic>
               </a:graphicData>
             </a:graphic>
-          </wp:inline>
+          </wp:anchor>
         </w:drawing>
       </w:r>
       <w:r>
+        <w:t xml:space="preserve">	</w:t>
+      </w:r>
+      <w:r>
         <w:rPr>
-          <w:spacing w:val="120"/>
-          <w:sz w:val="2"/>
-          <w:szCs w:val="2"/>
+          <w:rFonts w:ascii="Poppins" w:cs="Poppins" w:eastAsia="Poppins" w:hAnsi="Poppins"/>
+          <w:color w:val="4B4F53"/>
+          <w:sz w:val="17"/>
+          <w:szCs w:val="17"/>
         </w:rPr>
-        <w:t xml:space="preserve"> </w:t>
+        <w:t xml:space="preserve">Planificación</w:t>
       </w:r>
       <w:r>
         <w:drawing>
-          <wp:inline distT="0" distB="0" distL="0" distR="0">
-            <wp:extent cx="1502031" cy="265118"/>
-            <wp:effectExtent l="0" t="0" r="0" b="0"/>
-            <wp:docPr id="5002" name="Forma 5002"/>
-            <wp:cNvGraphicFramePr/>
+          <wp:anchor distT="0" distB="0" distL="0" distR="0" simplePos="0" allowOverlap="1" behindDoc="1" locked="1" layoutInCell="1" relativeHeight="265110">
+            <wp:simplePos x="0" y="0"/>
+            <wp:positionH relativeFrom="page">
+              <wp:posOffset>2875616</wp:posOffset>
+            </wp:positionH>
+            <wp:positionV relativeFrom="paragraph">
+              <wp:posOffset>-51608</wp:posOffset>
+            </wp:positionV>
+            <wp:extent cx="1501984" cy="265110"/>
+            <wp:effectExtent t="0" r="0" b="0" l="0"/>
+            <wp:wrapNone/>
+            <wp:docPr id="1" name="" descr="" title=""/>
+            <wp:cNvGraphicFramePr>
+              <a:graphicFrameLocks xmlns:a="http://schemas.openxmlformats.org/drawingml/2006/main" noChangeAspect="1"/>
+            </wp:cNvGraphicFramePr>
             <a:graphic xmlns:a="http://schemas.openxmlformats.org/drawingml/2006/main">
-              <a:graphicData uri="http://schemas.microsoft.com/office/word/2010/wordprocessingShape">
-                <wps:wsp>
-                  <wps:cNvSpPr/>
-                  <wps:spPr>
+              <a:graphicData uri="http://schemas.openxmlformats.org/drawingml/2006/picture">
+                <pic:pic xmlns:pic="http://schemas.openxmlformats.org/drawingml/2006/picture">
+                  <pic:nvPicPr>
+                    <pic:cNvPr id="0" name="" descr=""/>
+                    <pic:cNvPicPr>
+                      <a:picLocks noChangeAspect="1" noChangeArrowheads="1"/>
+                    </pic:cNvPicPr>
+                  </pic:nvPicPr>
+                  <pic:blipFill>
+                    <a:blip r:embed="rId14" cstate="none"/>
+                    <a:srcRect/>
+                    <a:stretch>
+                      <a:fillRect/>
+                    </a:stretch>
+                  </pic:blipFill>
+                  <pic:spPr bwMode="auto">
                     <a:xfrm>
                       <a:off x="0" y="0"/>
-                      <a:ext cx="1502031" cy="265118"/>
+                      <a:ext cx="1501984" cy="265110"/>
                     </a:xfrm>
-                    <a:prstGeom prst="roundRect">
-                      <a:avLst>
-                        <a:gd name="adj" fmla="val 50000"/>
-                      </a:avLst>
+                    <a:prstGeom prst="rect">
+                      <a:avLst/>
                     </a:prstGeom>
-                    <a:solidFill>
-                      <a:srgbClr val="FFFFFF"/>
-                    </a:solidFill>
-                    <a:ln w="9525">
-                      <a:solidFill>
-                        <a:srgbClr val="8A8F94"/>
-                      </a:solidFill>
-                    </a:ln>
-                  </wps:spPr>
-                  <wps:txbx>
-                    <w:txbxContent>
-                      <w:p>
-                        <w:pPr>
-                          <w:spacing w:before="0" w:after="0" w:line="240" w:lineRule="auto"/>
-                          <w:jc w:val="center"/>
-                        </w:pPr>
-                        <w:r>
-                          <w:rPr>
-                            <w:rFonts w:ascii="Poppins" w:hAnsi="Poppins" w:cs="Poppins"/>
-                            <w:color w:val="4B4F53"/>
-                            <w:sz w:val="17"/>
-                            <w:szCs w:val="17"/>
-                          </w:rPr>
-                          <w:t xml:space="preserve">Selección de personal</w:t>
-                        </w:r>
-                      </w:p>
-                    </w:txbxContent>
-                  </wps:txbx>
-                  <wps:bodyPr rot="0" vert="horz" wrap="square" lIns="36568" tIns="0" rIns="36568" bIns="0" anchor="ctr" anchorCtr="0">
-                    <a:noAutofit/>
-                  </wps:bodyPr>
-                </wps:wsp>
+                  </pic:spPr>
+                </pic:pic>
               </a:graphicData>
             </a:graphic>
-          </wp:inline>
+          </wp:anchor>
         </w:drawing>
       </w:r>
       <w:r>
+        <w:t xml:space="preserve">	</w:t>
+      </w:r>
+      <w:r>
         <w:rPr>
-          <w:spacing w:val="120"/>
-          <w:sz w:val="2"/>
-          <w:szCs w:val="2"/>
+          <w:rFonts w:ascii="Poppins" w:cs="Poppins" w:eastAsia="Poppins" w:hAnsi="Poppins"/>
+          <w:color w:val="4B4F53"/>
+          <w:sz w:val="17"/>
+          <w:szCs w:val="17"/>
         </w:rPr>
-        <w:t xml:space="preserve"> </w:t>
+        <w:t xml:space="preserve">Selección de personal</w:t>
       </w:r>
       <w:r>
         <w:drawing>
-          <wp:inline distT="0" distB="0" distL="0" distR="0">
-            <wp:extent cx="1306392" cy="265118"/>
-            <wp:effectExtent l="0" t="0" r="0" b="0"/>
-            <wp:docPr id="5003" name="Forma 5003"/>
-            <wp:cNvGraphicFramePr/>
+          <wp:anchor distT="0" distB="0" distL="0" distR="0" simplePos="0" allowOverlap="1" behindDoc="1" locked="1" layoutInCell="1" relativeHeight="265110">
+            <wp:simplePos x="0" y="0"/>
+            <wp:positionH relativeFrom="page">
+              <wp:posOffset>4450783</wp:posOffset>
+            </wp:positionH>
+            <wp:positionV relativeFrom="paragraph">
+              <wp:posOffset>-51608</wp:posOffset>
+            </wp:positionV>
+            <wp:extent cx="1306351" cy="265110"/>
+            <wp:effectExtent t="0" r="0" b="0" l="0"/>
+            <wp:wrapNone/>
+            <wp:docPr id="1" name="" descr="" title=""/>
+            <wp:cNvGraphicFramePr>
+              <a:graphicFrameLocks xmlns:a="http://schemas.openxmlformats.org/drawingml/2006/main" noChangeAspect="1"/>
+            </wp:cNvGraphicFramePr>
             <a:graphic xmlns:a="http://schemas.openxmlformats.org/drawingml/2006/main">
-              <a:graphicData uri="http://schemas.microsoft.com/office/word/2010/wordprocessingShape">
-                <wps:wsp>
-                  <wps:cNvSpPr/>
-                  <wps:spPr>
+              <a:graphicData uri="http://schemas.openxmlformats.org/drawingml/2006/picture">
+                <pic:pic xmlns:pic="http://schemas.openxmlformats.org/drawingml/2006/picture">
+                  <pic:nvPicPr>
+                    <pic:cNvPr id="0" name="" descr=""/>
+                    <pic:cNvPicPr>
+                      <a:picLocks noChangeAspect="1" noChangeArrowheads="1"/>
+                    </pic:cNvPicPr>
+                  </pic:nvPicPr>
+                  <pic:blipFill>
+                    <a:blip r:embed="rId15" cstate="none"/>
+                    <a:srcRect/>
+                    <a:stretch>
+                      <a:fillRect/>
+                    </a:stretch>
+                  </pic:blipFill>
+                  <pic:spPr bwMode="auto">
                     <a:xfrm>
                       <a:off x="0" y="0"/>
-                      <a:ext cx="1306392" cy="265118"/>
+                      <a:ext cx="1306351" cy="265110"/>
                     </a:xfrm>
-                    <a:prstGeom prst="roundRect">
-                      <a:avLst>
-                        <a:gd name="adj" fmla="val 50000"/>
-                      </a:avLst>
+                    <a:prstGeom prst="rect">
+                      <a:avLst/>
                     </a:prstGeom>
-                    <a:solidFill>
-                      <a:srgbClr val="FFFFFF"/>
-                    </a:solidFill>
-                    <a:ln w="9525">
-                      <a:solidFill>
-                        <a:srgbClr val="8A8F94"/>
-                      </a:solidFill>
-                    </a:ln>
-                  </wps:spPr>
-                  <wps:txbx>
-                    <w:txbxContent>
-                      <w:p>
-                        <w:pPr>
-                          <w:spacing w:before="0" w:after="0" w:line="240" w:lineRule="auto"/>
-                          <w:jc w:val="center"/>
-                        </w:pPr>
-                        <w:r>
-                          <w:rPr>
-                            <w:rFonts w:ascii="Poppins" w:hAnsi="Poppins" w:cs="Poppins"/>
-                            <w:color w:val="4B4F53"/>
-                            <w:sz w:val="17"/>
-                            <w:szCs w:val="17"/>
-                          </w:rPr>
-                          <w:t xml:space="preserve">Promoción interna</w:t>
-                        </w:r>
-                      </w:p>
-                    </w:txbxContent>
-                  </wps:txbx>
-                  <wps:bodyPr rot="0" vert="horz" wrap="square" lIns="36568" tIns="0" rIns="36568" bIns="0" anchor="ctr" anchorCtr="0">
-                    <a:noAutofit/>
-                  </wps:bodyPr>
-                </wps:wsp>
+                  </pic:spPr>
+                </pic:pic>
               </a:graphicData>
             </a:graphic>
-          </wp:inline>
+          </wp:anchor>
         </w:drawing>
+      </w:r>
+      <w:r>
+        <w:t xml:space="preserve">	</w:t>
+      </w:r>
+      <w:r>
+        <w:rPr>
+          <w:rFonts w:ascii="Poppins" w:cs="Poppins" w:eastAsia="Poppins" w:hAnsi="Poppins"/>
+          <w:color w:val="4B4F53"/>
+          <w:sz w:val="17"/>
+          <w:szCs w:val="17"/>
+        </w:rPr>
+        <w:t xml:space="preserve">Promoción interna</w:t>
       </w:r>
     </w:p>
     <w:p>
       <w:pPr>
-        <w:pStyle w:val="tight"/>
-        <w:spacing w:after="0" w:before="86"/>
-        <w:jc w:val="center"/>
+        <w:tabs>
+          <w:tab w:val="left" w:pos="1597"/>
+          <w:tab w:val="left" w:pos="4878"/>
+          <w:tab w:val="left" w:pos="6303"/>
+        </w:tabs>
+        <w:spacing w:after="0" w:before="0" w:line="240" w:lineRule="auto"/>
       </w:pPr>
       <w:r>
         <w:drawing>
-          <wp:inline distT="0" distB="0" distL="0" distR="0">
-            <wp:extent cx="2010326" cy="265118"/>
-            <wp:effectExtent l="0" t="0" r="0" b="0"/>
-            <wp:docPr id="5004" name="Forma 5004"/>
-            <wp:cNvGraphicFramePr/>
+          <wp:anchor distT="0" distB="0" distL="0" distR="0" simplePos="0" allowOverlap="1" behindDoc="1" locked="1" layoutInCell="1" relativeHeight="265110">
+            <wp:simplePos x="0" y="0"/>
+            <wp:positionH relativeFrom="page">
+              <wp:posOffset>858434</wp:posOffset>
+            </wp:positionH>
+            <wp:positionV relativeFrom="paragraph">
+              <wp:posOffset>-51608</wp:posOffset>
+            </wp:positionV>
+            <wp:extent cx="2010263" cy="265110"/>
+            <wp:effectExtent t="0" r="0" b="0" l="0"/>
+            <wp:wrapNone/>
+            <wp:docPr id="1" name="" descr="" title=""/>
+            <wp:cNvGraphicFramePr>
+              <a:graphicFrameLocks xmlns:a="http://schemas.openxmlformats.org/drawingml/2006/main" noChangeAspect="1"/>
+            </wp:cNvGraphicFramePr>
             <a:graphic xmlns:a="http://schemas.openxmlformats.org/drawingml/2006/main">
-              <a:graphicData uri="http://schemas.microsoft.com/office/word/2010/wordprocessingShape">
-                <wps:wsp>
-                  <wps:cNvSpPr/>
-                  <wps:spPr>
+              <a:graphicData uri="http://schemas.openxmlformats.org/drawingml/2006/picture">
+                <pic:pic xmlns:pic="http://schemas.openxmlformats.org/drawingml/2006/picture">
+                  <pic:nvPicPr>
+                    <pic:cNvPr id="0" name="" descr=""/>
+                    <pic:cNvPicPr>
+                      <a:picLocks noChangeAspect="1" noChangeArrowheads="1"/>
+                    </pic:cNvPicPr>
+                  </pic:nvPicPr>
+                  <pic:blipFill>
+                    <a:blip r:embed="rId16" cstate="none"/>
+                    <a:srcRect/>
+                    <a:stretch>
+                      <a:fillRect/>
+                    </a:stretch>
+                  </pic:blipFill>
+                  <pic:spPr bwMode="auto">
                     <a:xfrm>
                       <a:off x="0" y="0"/>
-                      <a:ext cx="2010326" cy="265118"/>
+                      <a:ext cx="2010263" cy="265110"/>
                     </a:xfrm>
-                    <a:prstGeom prst="roundRect">
-                      <a:avLst>
-                        <a:gd name="adj" fmla="val 50000"/>
-                      </a:avLst>
+                    <a:prstGeom prst="rect">
+                      <a:avLst/>
                     </a:prstGeom>
-                    <a:solidFill>
-                      <a:srgbClr val="FFFFFF"/>
-                    </a:solidFill>
-                    <a:ln w="9525">
-                      <a:solidFill>
-                        <a:srgbClr val="8A8F94"/>
-                      </a:solidFill>
-                    </a:ln>
-                  </wps:spPr>
-                  <wps:txbx>
-                    <w:txbxContent>
-                      <w:p>
-                        <w:pPr>
-                          <w:spacing w:before="0" w:after="0" w:line="240" w:lineRule="auto"/>
-                          <w:jc w:val="center"/>
-                        </w:pPr>
-                        <w:r>
-                          <w:rPr>
-                            <w:rFonts w:ascii="Poppins" w:hAnsi="Poppins" w:cs="Poppins"/>
-                            <w:color w:val="4B4F53"/>
-                            <w:sz w:val="17"/>
-                            <w:szCs w:val="17"/>
-                          </w:rPr>
-                          <w:t xml:space="preserve">Provisión de puestos de trabajo</w:t>
-                        </w:r>
-                      </w:p>
-                    </w:txbxContent>
-                  </wps:txbx>
-                  <wps:bodyPr rot="0" vert="horz" wrap="square" lIns="36568" tIns="0" rIns="36568" bIns="0" anchor="ctr" anchorCtr="0">
-                    <a:noAutofit/>
-                  </wps:bodyPr>
-                </wps:wsp>
+                  </pic:spPr>
+                </pic:pic>
               </a:graphicData>
             </a:graphic>
-          </wp:inline>
+          </wp:anchor>
         </w:drawing>
       </w:r>
       <w:r>
+        <w:t xml:space="preserve">	</w:t>
+      </w:r>
+      <w:r>
         <w:rPr>
-          <w:spacing w:val="120"/>
-          <w:sz w:val="2"/>
-          <w:szCs w:val="2"/>
+          <w:rFonts w:ascii="Poppins" w:cs="Poppins" w:eastAsia="Poppins" w:hAnsi="Poppins"/>
+          <w:color w:val="4B4F53"/>
+          <w:sz w:val="17"/>
+          <w:szCs w:val="17"/>
         </w:rPr>
-        <w:t xml:space="preserve"> </w:t>
+        <w:t xml:space="preserve">Provisión de puestos de trabajo</w:t>
       </w:r>
       <w:r>
         <w:drawing>
-          <wp:inline distT="0" distB="0" distL="0" distR="0">
-            <wp:extent cx="831922" cy="265118"/>
-            <wp:effectExtent l="0" t="0" r="0" b="0"/>
-            <wp:docPr id="5005" name="Forma 5005"/>
-            <wp:cNvGraphicFramePr/>
+          <wp:anchor distT="0" distB="0" distL="0" distR="0" simplePos="0" allowOverlap="1" behindDoc="1" locked="1" layoutInCell="1" relativeHeight="265110">
+            <wp:simplePos x="0" y="0"/>
+            <wp:positionH relativeFrom="page">
+              <wp:posOffset>2941896</wp:posOffset>
+            </wp:positionH>
+            <wp:positionV relativeFrom="paragraph">
+              <wp:posOffset>-51608</wp:posOffset>
+            </wp:positionV>
+            <wp:extent cx="831896" cy="265110"/>
+            <wp:effectExtent t="0" r="0" b="0" l="0"/>
+            <wp:wrapNone/>
+            <wp:docPr id="1" name="" descr="" title=""/>
+            <wp:cNvGraphicFramePr>
+              <a:graphicFrameLocks xmlns:a="http://schemas.openxmlformats.org/drawingml/2006/main" noChangeAspect="1"/>
+            </wp:cNvGraphicFramePr>
             <a:graphic xmlns:a="http://schemas.openxmlformats.org/drawingml/2006/main">
-              <a:graphicData uri="http://schemas.microsoft.com/office/word/2010/wordprocessingShape">
-                <wps:wsp>
-                  <wps:cNvSpPr/>
-                  <wps:spPr>
+              <a:graphicData uri="http://schemas.openxmlformats.org/drawingml/2006/picture">
+                <pic:pic xmlns:pic="http://schemas.openxmlformats.org/drawingml/2006/picture">
+                  <pic:nvPicPr>
+                    <pic:cNvPr id="0" name="" descr=""/>
+                    <pic:cNvPicPr>
+                      <a:picLocks noChangeAspect="1" noChangeArrowheads="1"/>
+                    </pic:cNvPicPr>
+                  </pic:nvPicPr>
+                  <pic:blipFill>
+                    <a:blip r:embed="rId17" cstate="none"/>
+                    <a:srcRect/>
+                    <a:stretch>
+                      <a:fillRect/>
+                    </a:stretch>
+                  </pic:blipFill>
+                  <pic:spPr bwMode="auto">
                     <a:xfrm>
                       <a:off x="0" y="0"/>
-                      <a:ext cx="831922" cy="265118"/>
+                      <a:ext cx="831896" cy="265110"/>
                     </a:xfrm>
-                    <a:prstGeom prst="roundRect">
-                      <a:avLst>
-                        <a:gd name="adj" fmla="val 50000"/>
-                      </a:avLst>
+                    <a:prstGeom prst="rect">
+                      <a:avLst/>
                     </a:prstGeom>
-                    <a:solidFill>
-                      <a:srgbClr val="FFFFFF"/>
-                    </a:solidFill>
-                    <a:ln w="9525">
-                      <a:solidFill>
-                        <a:srgbClr val="8A8F94"/>
-                      </a:solidFill>
-                    </a:ln>
-                  </wps:spPr>
-                  <wps:txbx>
-                    <w:txbxContent>
-                      <w:p>
-                        <w:pPr>
-                          <w:spacing w:before="0" w:after="0" w:line="240" w:lineRule="auto"/>
-                          <w:jc w:val="center"/>
-                        </w:pPr>
-                        <w:r>
-                          <w:rPr>
-                            <w:rFonts w:ascii="Poppins" w:hAnsi="Poppins" w:cs="Poppins"/>
-                            <w:color w:val="4B4F53"/>
-                            <w:sz w:val="17"/>
-                            <w:szCs w:val="17"/>
-                          </w:rPr>
-                          <w:t xml:space="preserve">Movilidad</w:t>
-                        </w:r>
-                      </w:p>
-                    </w:txbxContent>
-                  </wps:txbx>
-                  <wps:bodyPr rot="0" vert="horz" wrap="square" lIns="36568" tIns="0" rIns="36568" bIns="0" anchor="ctr" anchorCtr="0">
-                    <a:noAutofit/>
-                  </wps:bodyPr>
-                </wps:wsp>
+                  </pic:spPr>
+                </pic:pic>
               </a:graphicData>
             </a:graphic>
-          </wp:inline>
+          </wp:anchor>
         </w:drawing>
       </w:r>
       <w:r>
+        <w:t xml:space="preserve">	</w:t>
+      </w:r>
+      <w:r>
         <w:rPr>
-          <w:spacing w:val="120"/>
-          <w:sz w:val="2"/>
-          <w:szCs w:val="2"/>
+          <w:rFonts w:ascii="Poppins" w:cs="Poppins" w:eastAsia="Poppins" w:hAnsi="Poppins"/>
+          <w:color w:val="4B4F53"/>
+          <w:sz w:val="17"/>
+          <w:szCs w:val="17"/>
         </w:rPr>
-        <w:t xml:space="preserve"> </w:t>
+        <w:t xml:space="preserve">Movilidad</w:t>
       </w:r>
       <w:r>
         <w:drawing>
-          <wp:inline distT="0" distB="0" distL="0" distR="0">
-            <wp:extent cx="2855047" cy="265118"/>
-            <wp:effectExtent l="0" t="0" r="0" b="0"/>
-            <wp:docPr id="5006" name="Forma 5006"/>
-            <wp:cNvGraphicFramePr/>
+          <wp:anchor distT="0" distB="0" distL="0" distR="0" simplePos="0" allowOverlap="1" behindDoc="1" locked="1" layoutInCell="1" relativeHeight="265110">
+            <wp:simplePos x="0" y="0"/>
+            <wp:positionH relativeFrom="page">
+              <wp:posOffset>3846954</wp:posOffset>
+            </wp:positionH>
+            <wp:positionV relativeFrom="paragraph">
+              <wp:posOffset>-51608</wp:posOffset>
+            </wp:positionV>
+            <wp:extent cx="2854957" cy="265110"/>
+            <wp:effectExtent t="0" r="0" b="0" l="0"/>
+            <wp:wrapNone/>
+            <wp:docPr id="1" name="" descr="" title=""/>
+            <wp:cNvGraphicFramePr>
+              <a:graphicFrameLocks xmlns:a="http://schemas.openxmlformats.org/drawingml/2006/main" noChangeAspect="1"/>
+            </wp:cNvGraphicFramePr>
             <a:graphic xmlns:a="http://schemas.openxmlformats.org/drawingml/2006/main">
-              <a:graphicData uri="http://schemas.microsoft.com/office/word/2010/wordprocessingShape">
-                <wps:wsp>
-                  <wps:cNvSpPr/>
-                  <wps:spPr>
+              <a:graphicData uri="http://schemas.openxmlformats.org/drawingml/2006/picture">
+                <pic:pic xmlns:pic="http://schemas.openxmlformats.org/drawingml/2006/picture">
+                  <pic:nvPicPr>
+                    <pic:cNvPr id="0" name="" descr=""/>
+                    <pic:cNvPicPr>
+                      <a:picLocks noChangeAspect="1" noChangeArrowheads="1"/>
+                    </pic:cNvPicPr>
+                  </pic:nvPicPr>
+                  <pic:blipFill>
+                    <a:blip r:embed="rId18" cstate="none"/>
+                    <a:srcRect/>
+                    <a:stretch>
+                      <a:fillRect/>
+                    </a:stretch>
+                  </pic:blipFill>
+                  <pic:spPr bwMode="auto">
                     <a:xfrm>
                       <a:off x="0" y="0"/>
-                      <a:ext cx="2855047" cy="265118"/>
+                      <a:ext cx="2854957" cy="265110"/>
                     </a:xfrm>
-                    <a:prstGeom prst="roundRect">
-                      <a:avLst>
-                        <a:gd name="adj" fmla="val 50000"/>
-                      </a:avLst>
+                    <a:prstGeom prst="rect">
+                      <a:avLst/>
                     </a:prstGeom>
-                    <a:solidFill>
-                      <a:srgbClr val="FFFFFF"/>
-                    </a:solidFill>
-                    <a:ln w="9525">
-                      <a:solidFill>
-                        <a:srgbClr val="8A8F94"/>
-                      </a:solidFill>
-                    </a:ln>
-                  </wps:spPr>
-                  <wps:txbx>
-                    <w:txbxContent>
-                      <w:p>
-                        <w:pPr>
-                          <w:spacing w:before="0" w:after="0" w:line="240" w:lineRule="auto"/>
-                          <w:jc w:val="center"/>
-                        </w:pPr>
-                        <w:r>
-                          <w:rPr>
-                            <w:rFonts w:ascii="Poppins" w:hAnsi="Poppins" w:cs="Poppins"/>
-                            <w:color w:val="4B4F53"/>
-                            <w:sz w:val="17"/>
-                            <w:szCs w:val="17"/>
-                          </w:rPr>
-                          <w:t xml:space="preserve">Adquisición y pérdida de la relación de servicio</w:t>
-                        </w:r>
-                      </w:p>
-                    </w:txbxContent>
-                  </wps:txbx>
-                  <wps:bodyPr rot="0" vert="horz" wrap="square" lIns="36568" tIns="0" rIns="36568" bIns="0" anchor="ctr" anchorCtr="0">
-                    <a:noAutofit/>
-                  </wps:bodyPr>
-                </wps:wsp>
+                  </pic:spPr>
+                </pic:pic>
               </a:graphicData>
             </a:graphic>
-          </wp:inline>
+          </wp:anchor>
         </w:drawing>
+      </w:r>
+      <w:r>
+        <w:t xml:space="preserve">	</w:t>
+      </w:r>
+      <w:r>
+        <w:rPr>
+          <w:rFonts w:ascii="Poppins" w:cs="Poppins" w:eastAsia="Poppins" w:hAnsi="Poppins"/>
+          <w:color w:val="4B4F53"/>
+          <w:sz w:val="17"/>
+          <w:szCs w:val="17"/>
+        </w:rPr>
+        <w:t xml:space="preserve">Adquisición y pérdida de la relación de servicio</w:t>
       </w:r>
     </w:p>
     <w:p>
       <w:pPr>
-        <w:spacing w:after="0" w:before="144"/>
+        <w:spacing w:after="0" w:before="317"/>
         <w:jc w:val="center"/>
       </w:pPr>
       <w:r>
@@ -570,7 +556,7 @@
                     </pic:cNvPicPr>
                   </pic:nvPicPr>
                   <pic:blipFill>
-                    <a:blip r:embed="rId13" cstate="none"/>
+                    <a:blip r:embed="rId19" cstate="none"/>
                     <a:srcRect/>
                     <a:stretch>
                       <a:fillRect/>
@@ -636,7 +622,7 @@
                     </pic:cNvPicPr>
                   </pic:nvPicPr>
                   <pic:blipFill>
-                    <a:blip r:embed="rId14" cstate="none"/>
+                    <a:blip r:embed="rId20" cstate="none"/>
                     <a:srcRect/>
                     <a:stretch>
                       <a:fillRect/>
@@ -726,7 +712,7 @@
                     </pic:cNvPicPr>
                   </pic:nvPicPr>
                   <pic:blipFill>
-                    <a:blip r:embed="rId15" cstate="none"/>
+                    <a:blip r:embed="rId21" cstate="none"/>
                     <a:srcRect/>
                     <a:stretch>
                       <a:fillRect/>
@@ -834,7 +820,7 @@
                           </pic:cNvPicPr>
                         </pic:nvPicPr>
                         <pic:blipFill>
-                          <a:blip r:embed="rId16" cstate="none"/>
+                          <a:blip r:embed="rId22" cstate="none"/>
                           <a:srcRect/>
                           <a:stretch>
                             <a:fillRect/>
@@ -1035,7 +1021,7 @@
                           </pic:cNvPicPr>
                         </pic:nvPicPr>
                         <pic:blipFill>
-                          <a:blip r:embed="rId17" cstate="none"/>
+                          <a:blip r:embed="rId23" cstate="none"/>
                           <a:srcRect/>
                           <a:stretch>
                             <a:fillRect/>
@@ -1109,229 +1095,232 @@
           </w:p>
           <w:p>
             <w:pPr>
-              <w:pStyle w:val="tight"/>
-              <w:spacing w:after="0" w:before="0"/>
+              <w:tabs>
+                <w:tab w:val="left" w:pos="216"/>
+                <w:tab w:val="left" w:pos="4145"/>
+              </w:tabs>
+              <w:spacing w:after="86" w:before="0" w:line="240" w:lineRule="auto"/>
             </w:pPr>
             <w:r>
               <w:drawing>
-                <wp:inline distT="0" distB="0" distL="0" distR="0">
-                  <wp:extent cx="2440000" cy="173698"/>
-                  <wp:effectExtent l="0" t="0" r="0" b="0"/>
-                  <wp:docPr id="5007" name="Forma 5007"/>
-                  <wp:cNvGraphicFramePr/>
+                <wp:anchor distT="0" distB="0" distL="0" distR="0" simplePos="0" allowOverlap="1" behindDoc="1" locked="1" layoutInCell="1" relativeHeight="173693">
+                  <wp:simplePos x="0" y="0"/>
+                  <wp:positionH relativeFrom="column">
+                    <wp:posOffset>0</wp:posOffset>
+                  </wp:positionH>
+                  <wp:positionV relativeFrom="paragraph">
+                    <wp:posOffset>-15421</wp:posOffset>
+                  </wp:positionV>
+                  <wp:extent cx="2439923" cy="173693"/>
+                  <wp:effectExtent t="0" r="0" b="0" l="0"/>
+                  <wp:wrapNone/>
+                  <wp:docPr id="1" name="" descr="" title=""/>
+                  <wp:cNvGraphicFramePr>
+                    <a:graphicFrameLocks xmlns:a="http://schemas.openxmlformats.org/drawingml/2006/main" noChangeAspect="1"/>
+                  </wp:cNvGraphicFramePr>
                   <a:graphic xmlns:a="http://schemas.openxmlformats.org/drawingml/2006/main">
-                    <a:graphicData uri="http://schemas.microsoft.com/office/word/2010/wordprocessingShape">
-                      <wps:wsp>
-                        <wps:cNvSpPr/>
-                        <wps:spPr>
+                    <a:graphicData uri="http://schemas.openxmlformats.org/drawingml/2006/picture">
+                      <pic:pic xmlns:pic="http://schemas.openxmlformats.org/drawingml/2006/picture">
+                        <pic:nvPicPr>
+                          <pic:cNvPr id="0" name="" descr=""/>
+                          <pic:cNvPicPr>
+                            <a:picLocks noChangeAspect="1" noChangeArrowheads="1"/>
+                          </pic:cNvPicPr>
+                        </pic:nvPicPr>
+                        <pic:blipFill>
+                          <a:blip r:embed="rId24" cstate="none"/>
+                          <a:srcRect/>
+                          <a:stretch>
+                            <a:fillRect/>
+                          </a:stretch>
+                        </pic:blipFill>
+                        <pic:spPr bwMode="auto">
                           <a:xfrm>
                             <a:off x="0" y="0"/>
-                            <a:ext cx="2440000" cy="173698"/>
+                            <a:ext cx="2439923" cy="173693"/>
                           </a:xfrm>
-                          <a:prstGeom prst="roundRect">
-                            <a:avLst>
-                              <a:gd name="adj" fmla="val 50000"/>
-                            </a:avLst>
+                          <a:prstGeom prst="rect">
+                            <a:avLst/>
                           </a:prstGeom>
-                          <a:solidFill>
-                            <a:srgbClr val="FFFFFF"/>
-                          </a:solidFill>
-                          <a:ln w="9525">
-                            <a:solidFill>
-                              <a:srgbClr val="CFE3EC"/>
-                            </a:solidFill>
-                          </a:ln>
-                        </wps:spPr>
-                        <wps:txbx>
-                          <w:txbxContent>
-                            <w:p>
-                              <w:pPr>
-                                <w:spacing w:before="0" w:after="0" w:line="240" w:lineRule="auto"/>
-                                <w:jc w:val="center"/>
-                              </w:pPr>
-                              <w:r>
-                                <w:rPr>
-                                  <w:rFonts w:ascii="Poppins" w:hAnsi="Poppins" w:cs="Poppins"/>
-                                  <w:b/>
-                                  <w:bCs/>
-                                  <w:color w:val="143548"/>
-                                  <w:sz w:val="15"/>
-                                  <w:szCs w:val="15"/>
-                                </w:rPr>
-                                <w:t xml:space="preserve">Capítulo I </w:t>
-                              </w:r>
-                              <w:r>
-                                <w:rPr>
-                                  <w:rFonts w:ascii="Poppins" w:hAnsi="Poppins" w:cs="Poppins"/>
-                                  <w:color w:val="2B2B2B"/>
-                                  <w:sz w:val="15"/>
-                                  <w:szCs w:val="15"/>
-                                </w:rPr>
-                                <w:t xml:space="preserve">Planificación de recursos humanos</w:t>
-                              </w:r>
-                            </w:p>
-                          </w:txbxContent>
-                        </wps:txbx>
-                        <wps:bodyPr rot="0" vert="horz" wrap="square" lIns="54852" tIns="0" rIns="54852" bIns="0" anchor="ctr" anchorCtr="0">
-                          <a:noAutofit/>
-                        </wps:bodyPr>
-                      </wps:wsp>
+                        </pic:spPr>
+                      </pic:pic>
                     </a:graphicData>
                   </a:graphic>
-                </wp:inline>
+                </wp:anchor>
               </w:drawing>
             </w:r>
             <w:r>
-              <w:rPr>
-                <w:spacing w:val="110"/>
-                <w:sz w:val="2"/>
-                <w:szCs w:val="2"/>
-              </w:rPr>
-              <w:t xml:space="preserve"> </w:t>
+              <w:t xml:space="preserve">	</w:t>
+            </w:r>
+            <w:r>
+              <w:rPr>
+                <w:rFonts w:ascii="Poppins" w:cs="Poppins" w:eastAsia="Poppins" w:hAnsi="Poppins"/>
+                <w:b/>
+                <w:bCs/>
+                <w:color w:val="143548"/>
+                <w:sz w:val="15"/>
+                <w:szCs w:val="15"/>
+              </w:rPr>
+              <w:t xml:space="preserve">Capítulo I </w:t>
+            </w:r>
+            <w:r>
+              <w:rPr>
+                <w:rFonts w:ascii="Poppins" w:cs="Poppins" w:eastAsia="Poppins" w:hAnsi="Poppins"/>
+                <w:color w:val="2B2B2B"/>
+                <w:sz w:val="15"/>
+                <w:szCs w:val="15"/>
+              </w:rPr>
+              <w:t xml:space="preserve">Planificación de recursos humanos</w:t>
             </w:r>
             <w:r>
               <w:drawing>
-                <wp:inline distT="0" distB="0" distL="0" distR="0">
-                  <wp:extent cx="2896186" cy="173698"/>
-                  <wp:effectExtent l="0" t="0" r="0" b="0"/>
-                  <wp:docPr id="5008" name="Forma 5008"/>
-                  <wp:cNvGraphicFramePr/>
+                <wp:anchor distT="0" distB="0" distL="0" distR="0" simplePos="0" allowOverlap="1" behindDoc="1" locked="1" layoutInCell="1" relativeHeight="173693">
+                  <wp:simplePos x="0" y="0"/>
+                  <wp:positionH relativeFrom="column">
+                    <wp:posOffset>2494852</wp:posOffset>
+                  </wp:positionH>
+                  <wp:positionV relativeFrom="paragraph">
+                    <wp:posOffset>-15421</wp:posOffset>
+                  </wp:positionV>
+                  <wp:extent cx="2896095" cy="173693"/>
+                  <wp:effectExtent t="0" r="0" b="0" l="0"/>
+                  <wp:wrapNone/>
+                  <wp:docPr id="1" name="" descr="" title=""/>
+                  <wp:cNvGraphicFramePr>
+                    <a:graphicFrameLocks xmlns:a="http://schemas.openxmlformats.org/drawingml/2006/main" noChangeAspect="1"/>
+                  </wp:cNvGraphicFramePr>
                   <a:graphic xmlns:a="http://schemas.openxmlformats.org/drawingml/2006/main">
-                    <a:graphicData uri="http://schemas.microsoft.com/office/word/2010/wordprocessingShape">
-                      <wps:wsp>
-                        <wps:cNvSpPr/>
-                        <wps:spPr>
+                    <a:graphicData uri="http://schemas.openxmlformats.org/drawingml/2006/picture">
+                      <pic:pic xmlns:pic="http://schemas.openxmlformats.org/drawingml/2006/picture">
+                        <pic:nvPicPr>
+                          <pic:cNvPr id="0" name="" descr=""/>
+                          <pic:cNvPicPr>
+                            <a:picLocks noChangeAspect="1" noChangeArrowheads="1"/>
+                          </pic:cNvPicPr>
+                        </pic:nvPicPr>
+                        <pic:blipFill>
+                          <a:blip r:embed="rId25" cstate="none"/>
+                          <a:srcRect/>
+                          <a:stretch>
+                            <a:fillRect/>
+                          </a:stretch>
+                        </pic:blipFill>
+                        <pic:spPr bwMode="auto">
                           <a:xfrm>
                             <a:off x="0" y="0"/>
-                            <a:ext cx="2896186" cy="173698"/>
+                            <a:ext cx="2896095" cy="173693"/>
                           </a:xfrm>
-                          <a:prstGeom prst="roundRect">
-                            <a:avLst>
-                              <a:gd name="adj" fmla="val 50000"/>
-                            </a:avLst>
+                          <a:prstGeom prst="rect">
+                            <a:avLst/>
                           </a:prstGeom>
-                          <a:solidFill>
-                            <a:srgbClr val="FFFFFF"/>
-                          </a:solidFill>
-                          <a:ln w="9525">
-                            <a:solidFill>
-                              <a:srgbClr val="CFE3EC"/>
-                            </a:solidFill>
-                          </a:ln>
-                        </wps:spPr>
-                        <wps:txbx>
-                          <w:txbxContent>
-                            <w:p>
-                              <w:pPr>
-                                <w:spacing w:before="0" w:after="0" w:line="240" w:lineRule="auto"/>
-                                <w:jc w:val="center"/>
-                              </w:pPr>
-                              <w:r>
-                                <w:rPr>
-                                  <w:rFonts w:ascii="Poppins" w:hAnsi="Poppins" w:cs="Poppins"/>
-                                  <w:b/>
-                                  <w:bCs/>
-                                  <w:color w:val="143548"/>
-                                  <w:sz w:val="15"/>
-                                  <w:szCs w:val="15"/>
-                                </w:rPr>
-                                <w:t xml:space="preserve">Capítulo II </w:t>
-                              </w:r>
-                              <w:r>
-                                <w:rPr>
-                                  <w:rFonts w:ascii="Poppins" w:hAnsi="Poppins" w:cs="Poppins"/>
-                                  <w:color w:val="2B2B2B"/>
-                                  <w:sz w:val="15"/>
-                                  <w:szCs w:val="15"/>
-                                </w:rPr>
-                                <w:t xml:space="preserve">Planes de ordenación de recursos humanos</w:t>
-                              </w:r>
-                            </w:p>
-                          </w:txbxContent>
-                        </wps:txbx>
-                        <wps:bodyPr rot="0" vert="horz" wrap="square" lIns="54852" tIns="0" rIns="54852" bIns="0" anchor="ctr" anchorCtr="0">
-                          <a:noAutofit/>
-                        </wps:bodyPr>
-                      </wps:wsp>
+                        </pic:spPr>
+                      </pic:pic>
                     </a:graphicData>
                   </a:graphic>
-                </wp:inline>
+                </wp:anchor>
               </w:drawing>
             </w:r>
-          </w:p>
-          <w:p>
-            <w:pPr>
-              <w:pStyle w:val="tight"/>
-              <w:spacing w:after="0" w:before="58"/>
+            <w:r>
+              <w:t xml:space="preserve">	</w:t>
+            </w:r>
+            <w:r>
+              <w:rPr>
+                <w:rFonts w:ascii="Poppins" w:cs="Poppins" w:eastAsia="Poppins" w:hAnsi="Poppins"/>
+                <w:b/>
+                <w:bCs/>
+                <w:color w:val="143548"/>
+                <w:sz w:val="15"/>
+                <w:szCs w:val="15"/>
+              </w:rPr>
+              <w:t xml:space="preserve">Capítulo II </w:t>
+            </w:r>
+            <w:r>
+              <w:rPr>
+                <w:rFonts w:ascii="Poppins" w:cs="Poppins" w:eastAsia="Poppins" w:hAnsi="Poppins"/>
+                <w:color w:val="2B2B2B"/>
+                <w:sz w:val="15"/>
+                <w:szCs w:val="15"/>
+              </w:rPr>
+              <w:t xml:space="preserve">Planes de ordenación de recursos humanos</w:t>
+            </w:r>
+          </w:p>
+          <w:p>
+            <w:pPr>
+              <w:tabs>
+                <w:tab w:val="left" w:pos="216"/>
+              </w:tabs>
+              <w:spacing w:after="0" w:before="0" w:line="240" w:lineRule="auto"/>
             </w:pPr>
             <w:r>
               <w:drawing>
-                <wp:inline distT="0" distB="0" distL="0" distR="0">
-                  <wp:extent cx="2043237" cy="173698"/>
-                  <wp:effectExtent l="0" t="0" r="0" b="0"/>
-                  <wp:docPr id="5009" name="Forma 5009"/>
-                  <wp:cNvGraphicFramePr/>
+                <wp:anchor distT="0" distB="0" distL="0" distR="0" simplePos="0" allowOverlap="1" behindDoc="1" locked="1" layoutInCell="1" relativeHeight="173693">
+                  <wp:simplePos x="0" y="0"/>
+                  <wp:positionH relativeFrom="column">
+                    <wp:posOffset>0</wp:posOffset>
+                  </wp:positionH>
+                  <wp:positionV relativeFrom="paragraph">
+                    <wp:posOffset>-15421</wp:posOffset>
+                  </wp:positionV>
+                  <wp:extent cx="2043173" cy="173693"/>
+                  <wp:effectExtent t="0" r="0" b="0" l="0"/>
+                  <wp:wrapNone/>
+                  <wp:docPr id="1" name="" descr="" title=""/>
+                  <wp:cNvGraphicFramePr>
+                    <a:graphicFrameLocks xmlns:a="http://schemas.openxmlformats.org/drawingml/2006/main" noChangeAspect="1"/>
+                  </wp:cNvGraphicFramePr>
                   <a:graphic xmlns:a="http://schemas.openxmlformats.org/drawingml/2006/main">
-                    <a:graphicData uri="http://schemas.microsoft.com/office/word/2010/wordprocessingShape">
-                      <wps:wsp>
-                        <wps:cNvSpPr/>
-                        <wps:spPr>
+                    <a:graphicData uri="http://schemas.openxmlformats.org/drawingml/2006/picture">
+                      <pic:pic xmlns:pic="http://schemas.openxmlformats.org/drawingml/2006/picture">
+                        <pic:nvPicPr>
+                          <pic:cNvPr id="0" name="" descr=""/>
+                          <pic:cNvPicPr>
+                            <a:picLocks noChangeAspect="1" noChangeArrowheads="1"/>
+                          </pic:cNvPicPr>
+                        </pic:nvPicPr>
+                        <pic:blipFill>
+                          <a:blip r:embed="rId26" cstate="none"/>
+                          <a:srcRect/>
+                          <a:stretch>
+                            <a:fillRect/>
+                          </a:stretch>
+                        </pic:blipFill>
+                        <pic:spPr bwMode="auto">
                           <a:xfrm>
                             <a:off x="0" y="0"/>
-                            <a:ext cx="2043237" cy="173698"/>
+                            <a:ext cx="2043173" cy="173693"/>
                           </a:xfrm>
-                          <a:prstGeom prst="roundRect">
-                            <a:avLst>
-                              <a:gd name="adj" fmla="val 50000"/>
-                            </a:avLst>
+                          <a:prstGeom prst="rect">
+                            <a:avLst/>
                           </a:prstGeom>
-                          <a:solidFill>
-                            <a:srgbClr val="FFFFFF"/>
-                          </a:solidFill>
-                          <a:ln w="9525">
-                            <a:solidFill>
-                              <a:srgbClr val="CFE3EC"/>
-                            </a:solidFill>
-                          </a:ln>
-                        </wps:spPr>
-                        <wps:txbx>
-                          <w:txbxContent>
-                            <w:p>
-                              <w:pPr>
-                                <w:spacing w:before="0" w:after="0" w:line="240" w:lineRule="auto"/>
-                                <w:jc w:val="center"/>
-                              </w:pPr>
-                              <w:r>
-                                <w:rPr>
-                                  <w:rFonts w:ascii="Poppins" w:hAnsi="Poppins" w:cs="Poppins"/>
-                                  <w:b/>
-                                  <w:bCs/>
-                                  <w:color w:val="143548"/>
-                                  <w:sz w:val="15"/>
-                                  <w:szCs w:val="15"/>
-                                </w:rPr>
-                                <w:t xml:space="preserve">Capítulo III </w:t>
-                              </w:r>
-                              <w:r>
-                                <w:rPr>
-                                  <w:rFonts w:ascii="Poppins" w:hAnsi="Poppins" w:cs="Poppins"/>
-                                  <w:color w:val="2B2B2B"/>
-                                  <w:sz w:val="15"/>
-                                  <w:szCs w:val="15"/>
-                                </w:rPr>
-                                <w:t xml:space="preserve">Oferta de empleo público</w:t>
-                              </w:r>
-                            </w:p>
-                          </w:txbxContent>
-                        </wps:txbx>
-                        <wps:bodyPr rot="0" vert="horz" wrap="square" lIns="54852" tIns="0" rIns="54852" bIns="0" anchor="ctr" anchorCtr="0">
-                          <a:noAutofit/>
-                        </wps:bodyPr>
-                      </wps:wsp>
+                        </pic:spPr>
+                      </pic:pic>
                     </a:graphicData>
                   </a:graphic>
-                </wp:inline>
+                </wp:anchor>
               </w:drawing>
+            </w:r>
+            <w:r>
+              <w:t xml:space="preserve">	</w:t>
+            </w:r>
+            <w:r>
+              <w:rPr>
+                <w:rFonts w:ascii="Poppins" w:cs="Poppins" w:eastAsia="Poppins" w:hAnsi="Poppins"/>
+                <w:b/>
+                <w:bCs/>
+                <w:color w:val="143548"/>
+                <w:sz w:val="15"/>
+                <w:szCs w:val="15"/>
+              </w:rPr>
+              <w:t xml:space="preserve">Capítulo III </w:t>
+            </w:r>
+            <w:r>
+              <w:rPr>
+                <w:rFonts w:ascii="Poppins" w:cs="Poppins" w:eastAsia="Poppins" w:hAnsi="Poppins"/>
+                <w:color w:val="2B2B2B"/>
+                <w:sz w:val="15"/>
+                <w:szCs w:val="15"/>
+              </w:rPr>
+              <w:t xml:space="preserve">Oferta de empleo público</w:t>
             </w:r>
           </w:p>
           <w:p>
@@ -1463,7 +1452,7 @@
                           </pic:cNvPicPr>
                         </pic:nvPicPr>
                         <pic:blipFill>
-                          <a:blip r:embed="rId18" cstate="none"/>
+                          <a:blip r:embed="rId27" cstate="none"/>
                           <a:srcRect/>
                           <a:stretch>
                             <a:fillRect/>
@@ -1537,456 +1526,462 @@
           </w:p>
           <w:p>
             <w:pPr>
-              <w:pStyle w:val="tight"/>
-              <w:spacing w:after="0" w:before="0"/>
+              <w:tabs>
+                <w:tab w:val="left" w:pos="216"/>
+                <w:tab w:val="left" w:pos="2891"/>
+              </w:tabs>
+              <w:spacing w:after="86" w:before="0" w:line="240" w:lineRule="auto"/>
             </w:pPr>
             <w:r>
               <w:drawing>
-                <wp:inline distT="0" distB="0" distL="0" distR="0">
-                  <wp:extent cx="1643732" cy="173698"/>
-                  <wp:effectExtent l="0" t="0" r="0" b="0"/>
-                  <wp:docPr id="5010" name="Forma 5010"/>
-                  <wp:cNvGraphicFramePr/>
+                <wp:anchor distT="0" distB="0" distL="0" distR="0" simplePos="0" allowOverlap="1" behindDoc="1" locked="1" layoutInCell="1" relativeHeight="173693">
+                  <wp:simplePos x="0" y="0"/>
+                  <wp:positionH relativeFrom="column">
+                    <wp:posOffset>0</wp:posOffset>
+                  </wp:positionH>
+                  <wp:positionV relativeFrom="paragraph">
+                    <wp:posOffset>-15421</wp:posOffset>
+                  </wp:positionV>
+                  <wp:extent cx="1643680" cy="173693"/>
+                  <wp:effectExtent t="0" r="0" b="0" l="0"/>
+                  <wp:wrapNone/>
+                  <wp:docPr id="1" name="" descr="" title=""/>
+                  <wp:cNvGraphicFramePr>
+                    <a:graphicFrameLocks xmlns:a="http://schemas.openxmlformats.org/drawingml/2006/main" noChangeAspect="1"/>
+                  </wp:cNvGraphicFramePr>
                   <a:graphic xmlns:a="http://schemas.openxmlformats.org/drawingml/2006/main">
-                    <a:graphicData uri="http://schemas.microsoft.com/office/word/2010/wordprocessingShape">
-                      <wps:wsp>
-                        <wps:cNvSpPr/>
-                        <wps:spPr>
+                    <a:graphicData uri="http://schemas.openxmlformats.org/drawingml/2006/picture">
+                      <pic:pic xmlns:pic="http://schemas.openxmlformats.org/drawingml/2006/picture">
+                        <pic:nvPicPr>
+                          <pic:cNvPr id="0" name="" descr=""/>
+                          <pic:cNvPicPr>
+                            <a:picLocks noChangeAspect="1" noChangeArrowheads="1"/>
+                          </pic:cNvPicPr>
+                        </pic:nvPicPr>
+                        <pic:blipFill>
+                          <a:blip r:embed="rId28" cstate="none"/>
+                          <a:srcRect/>
+                          <a:stretch>
+                            <a:fillRect/>
+                          </a:stretch>
+                        </pic:blipFill>
+                        <pic:spPr bwMode="auto">
                           <a:xfrm>
                             <a:off x="0" y="0"/>
-                            <a:ext cx="1643732" cy="173698"/>
+                            <a:ext cx="1643680" cy="173693"/>
                           </a:xfrm>
-                          <a:prstGeom prst="roundRect">
-                            <a:avLst>
-                              <a:gd name="adj" fmla="val 50000"/>
-                            </a:avLst>
+                          <a:prstGeom prst="rect">
+                            <a:avLst/>
                           </a:prstGeom>
-                          <a:solidFill>
-                            <a:srgbClr val="FFFFFF"/>
-                          </a:solidFill>
-                          <a:ln w="9525">
-                            <a:solidFill>
-                              <a:srgbClr val="CFE3EC"/>
-                            </a:solidFill>
-                          </a:ln>
-                        </wps:spPr>
-                        <wps:txbx>
-                          <w:txbxContent>
-                            <w:p>
-                              <w:pPr>
-                                <w:spacing w:before="0" w:after="0" w:line="240" w:lineRule="auto"/>
-                                <w:jc w:val="center"/>
-                              </w:pPr>
-                              <w:r>
-                                <w:rPr>
-                                  <w:rFonts w:ascii="Poppins" w:hAnsi="Poppins" w:cs="Poppins"/>
-                                  <w:b/>
-                                  <w:bCs/>
-                                  <w:color w:val="143548"/>
-                                  <w:sz w:val="15"/>
-                                  <w:szCs w:val="15"/>
-                                </w:rPr>
-                                <w:t xml:space="preserve">Capítulo I </w:t>
-                              </w:r>
-                              <w:r>
-                                <w:rPr>
-                                  <w:rFonts w:ascii="Poppins" w:hAnsi="Poppins" w:cs="Poppins"/>
-                                  <w:color w:val="2B2B2B"/>
-                                  <w:sz w:val="15"/>
-                                  <w:szCs w:val="15"/>
-                                </w:rPr>
-                                <w:t xml:space="preserve">Normas generales</w:t>
-                              </w:r>
-                            </w:p>
-                          </w:txbxContent>
-                        </wps:txbx>
-                        <wps:bodyPr rot="0" vert="horz" wrap="square" lIns="54852" tIns="0" rIns="54852" bIns="0" anchor="ctr" anchorCtr="0">
-                          <a:noAutofit/>
-                        </wps:bodyPr>
-                      </wps:wsp>
+                        </pic:spPr>
+                      </pic:pic>
                     </a:graphicData>
                   </a:graphic>
-                </wp:inline>
+                </wp:anchor>
               </w:drawing>
             </w:r>
             <w:r>
-              <w:rPr>
-                <w:spacing w:val="110"/>
-                <w:sz w:val="2"/>
-                <w:szCs w:val="2"/>
-              </w:rPr>
-              <w:t xml:space="preserve"> </w:t>
+              <w:t xml:space="preserve">	</w:t>
+            </w:r>
+            <w:r>
+              <w:rPr>
+                <w:rFonts w:ascii="Poppins" w:cs="Poppins" w:eastAsia="Poppins" w:hAnsi="Poppins"/>
+                <w:b/>
+                <w:bCs/>
+                <w:color w:val="143548"/>
+                <w:sz w:val="15"/>
+                <w:szCs w:val="15"/>
+              </w:rPr>
+              <w:t xml:space="preserve">Capítulo I </w:t>
+            </w:r>
+            <w:r>
+              <w:rPr>
+                <w:rFonts w:ascii="Poppins" w:cs="Poppins" w:eastAsia="Poppins" w:hAnsi="Poppins"/>
+                <w:color w:val="2B2B2B"/>
+                <w:sz w:val="15"/>
+                <w:szCs w:val="15"/>
+              </w:rPr>
+              <w:t xml:space="preserve">Normas generales</w:t>
             </w:r>
             <w:r>
               <w:drawing>
-                <wp:inline distT="0" distB="0" distL="0" distR="0">
-                  <wp:extent cx="1807373" cy="173698"/>
-                  <wp:effectExtent l="0" t="0" r="0" b="0"/>
-                  <wp:docPr id="5011" name="Forma 5011"/>
-                  <wp:cNvGraphicFramePr/>
+                <wp:anchor distT="0" distB="0" distL="0" distR="0" simplePos="0" allowOverlap="1" behindDoc="1" locked="1" layoutInCell="1" relativeHeight="173693">
+                  <wp:simplePos x="0" y="0"/>
+                  <wp:positionH relativeFrom="column">
+                    <wp:posOffset>1698584</wp:posOffset>
+                  </wp:positionH>
+                  <wp:positionV relativeFrom="paragraph">
+                    <wp:posOffset>-15421</wp:posOffset>
+                  </wp:positionV>
+                  <wp:extent cx="1807317" cy="173693"/>
+                  <wp:effectExtent t="0" r="0" b="0" l="0"/>
+                  <wp:wrapNone/>
+                  <wp:docPr id="1" name="" descr="" title=""/>
+                  <wp:cNvGraphicFramePr>
+                    <a:graphicFrameLocks xmlns:a="http://schemas.openxmlformats.org/drawingml/2006/main" noChangeAspect="1"/>
+                  </wp:cNvGraphicFramePr>
                   <a:graphic xmlns:a="http://schemas.openxmlformats.org/drawingml/2006/main">
-                    <a:graphicData uri="http://schemas.microsoft.com/office/word/2010/wordprocessingShape">
-                      <wps:wsp>
-                        <wps:cNvSpPr/>
-                        <wps:spPr>
+                    <a:graphicData uri="http://schemas.openxmlformats.org/drawingml/2006/picture">
+                      <pic:pic xmlns:pic="http://schemas.openxmlformats.org/drawingml/2006/picture">
+                        <pic:nvPicPr>
+                          <pic:cNvPr id="0" name="" descr=""/>
+                          <pic:cNvPicPr>
+                            <a:picLocks noChangeAspect="1" noChangeArrowheads="1"/>
+                          </pic:cNvPicPr>
+                        </pic:nvPicPr>
+                        <pic:blipFill>
+                          <a:blip r:embed="rId29" cstate="none"/>
+                          <a:srcRect/>
+                          <a:stretch>
+                            <a:fillRect/>
+                          </a:stretch>
+                        </pic:blipFill>
+                        <pic:spPr bwMode="auto">
                           <a:xfrm>
                             <a:off x="0" y="0"/>
-                            <a:ext cx="1807373" cy="173698"/>
+                            <a:ext cx="1807317" cy="173693"/>
                           </a:xfrm>
-                          <a:prstGeom prst="roundRect">
-                            <a:avLst>
-                              <a:gd name="adj" fmla="val 50000"/>
-                            </a:avLst>
+                          <a:prstGeom prst="rect">
+                            <a:avLst/>
                           </a:prstGeom>
-                          <a:solidFill>
-                            <a:srgbClr val="FFFFFF"/>
-                          </a:solidFill>
-                          <a:ln w="9525">
-                            <a:solidFill>
-                              <a:srgbClr val="CFE3EC"/>
-                            </a:solidFill>
-                          </a:ln>
-                        </wps:spPr>
-                        <wps:txbx>
-                          <w:txbxContent>
-                            <w:p>
-                              <w:pPr>
-                                <w:spacing w:before="0" w:after="0" w:line="240" w:lineRule="auto"/>
-                                <w:jc w:val="center"/>
-                              </w:pPr>
-                              <w:r>
-                                <w:rPr>
-                                  <w:rFonts w:ascii="Poppins" w:hAnsi="Poppins" w:cs="Poppins"/>
-                                  <w:b/>
-                                  <w:bCs/>
-                                  <w:color w:val="143548"/>
-                                  <w:sz w:val="15"/>
-                                  <w:szCs w:val="15"/>
-                                </w:rPr>
-                                <w:t xml:space="preserve">Capítulo II </w:t>
-                              </w:r>
-                              <w:r>
-                                <w:rPr>
-                                  <w:rFonts w:ascii="Poppins" w:hAnsi="Poppins" w:cs="Poppins"/>
-                                  <w:color w:val="2B2B2B"/>
-                                  <w:sz w:val="15"/>
-                                  <w:szCs w:val="15"/>
-                                </w:rPr>
-                                <w:t xml:space="preserve">Sistema de selección</w:t>
-                              </w:r>
-                            </w:p>
-                          </w:txbxContent>
-                        </wps:txbx>
-                        <wps:bodyPr rot="0" vert="horz" wrap="square" lIns="54852" tIns="0" rIns="54852" bIns="0" anchor="ctr" anchorCtr="0">
-                          <a:noAutofit/>
-                        </wps:bodyPr>
-                      </wps:wsp>
+                        </pic:spPr>
+                      </pic:pic>
                     </a:graphicData>
                   </a:graphic>
-                </wp:inline>
+                </wp:anchor>
               </w:drawing>
             </w:r>
-          </w:p>
-          <w:p>
-            <w:pPr>
-              <w:pStyle w:val="tight"/>
-              <w:spacing w:after="0" w:before="58"/>
+            <w:r>
+              <w:t xml:space="preserve">	</w:t>
+            </w:r>
+            <w:r>
+              <w:rPr>
+                <w:rFonts w:ascii="Poppins" w:cs="Poppins" w:eastAsia="Poppins" w:hAnsi="Poppins"/>
+                <w:b/>
+                <w:bCs/>
+                <w:color w:val="143548"/>
+                <w:sz w:val="15"/>
+                <w:szCs w:val="15"/>
+              </w:rPr>
+              <w:t xml:space="preserve">Capítulo II </w:t>
+            </w:r>
+            <w:r>
+              <w:rPr>
+                <w:rFonts w:ascii="Poppins" w:cs="Poppins" w:eastAsia="Poppins" w:hAnsi="Poppins"/>
+                <w:color w:val="2B2B2B"/>
+                <w:sz w:val="15"/>
+                <w:szCs w:val="15"/>
+              </w:rPr>
+              <w:t xml:space="preserve">Sistema de selección</w:t>
+            </w:r>
+          </w:p>
+          <w:p>
+            <w:pPr>
+              <w:tabs>
+                <w:tab w:val="left" w:pos="216"/>
+                <w:tab w:val="left" w:pos="4908"/>
+              </w:tabs>
+              <w:spacing w:after="86" w:before="0" w:line="240" w:lineRule="auto"/>
             </w:pPr>
             <w:r>
               <w:drawing>
-                <wp:inline distT="0" distB="0" distL="0" distR="0">
-                  <wp:extent cx="2924526" cy="173698"/>
-                  <wp:effectExtent l="0" t="0" r="0" b="0"/>
-                  <wp:docPr id="5012" name="Forma 5012"/>
-                  <wp:cNvGraphicFramePr/>
+                <wp:anchor distT="0" distB="0" distL="0" distR="0" simplePos="0" allowOverlap="1" behindDoc="1" locked="1" layoutInCell="1" relativeHeight="173693">
+                  <wp:simplePos x="0" y="0"/>
+                  <wp:positionH relativeFrom="column">
+                    <wp:posOffset>0</wp:posOffset>
+                  </wp:positionH>
+                  <wp:positionV relativeFrom="paragraph">
+                    <wp:posOffset>-15421</wp:posOffset>
+                  </wp:positionV>
+                  <wp:extent cx="2924434" cy="173693"/>
+                  <wp:effectExtent t="0" r="0" b="0" l="0"/>
+                  <wp:wrapNone/>
+                  <wp:docPr id="1" name="" descr="" title=""/>
+                  <wp:cNvGraphicFramePr>
+                    <a:graphicFrameLocks xmlns:a="http://schemas.openxmlformats.org/drawingml/2006/main" noChangeAspect="1"/>
+                  </wp:cNvGraphicFramePr>
                   <a:graphic xmlns:a="http://schemas.openxmlformats.org/drawingml/2006/main">
-                    <a:graphicData uri="http://schemas.microsoft.com/office/word/2010/wordprocessingShape">
-                      <wps:wsp>
-                        <wps:cNvSpPr/>
-                        <wps:spPr>
+                    <a:graphicData uri="http://schemas.openxmlformats.org/drawingml/2006/picture">
+                      <pic:pic xmlns:pic="http://schemas.openxmlformats.org/drawingml/2006/picture">
+                        <pic:nvPicPr>
+                          <pic:cNvPr id="0" name="" descr=""/>
+                          <pic:cNvPicPr>
+                            <a:picLocks noChangeAspect="1" noChangeArrowheads="1"/>
+                          </pic:cNvPicPr>
+                        </pic:nvPicPr>
+                        <pic:blipFill>
+                          <a:blip r:embed="rId30" cstate="none"/>
+                          <a:srcRect/>
+                          <a:stretch>
+                            <a:fillRect/>
+                          </a:stretch>
+                        </pic:blipFill>
+                        <pic:spPr bwMode="auto">
                           <a:xfrm>
                             <a:off x="0" y="0"/>
-                            <a:ext cx="2924526" cy="173698"/>
+                            <a:ext cx="2924434" cy="173693"/>
                           </a:xfrm>
-                          <a:prstGeom prst="roundRect">
-                            <a:avLst>
-                              <a:gd name="adj" fmla="val 50000"/>
-                            </a:avLst>
+                          <a:prstGeom prst="rect">
+                            <a:avLst/>
                           </a:prstGeom>
-                          <a:solidFill>
-                            <a:srgbClr val="FFFFFF"/>
-                          </a:solidFill>
-                          <a:ln w="9525">
-                            <a:solidFill>
-                              <a:srgbClr val="CFE3EC"/>
-                            </a:solidFill>
-                          </a:ln>
-                        </wps:spPr>
-                        <wps:txbx>
-                          <w:txbxContent>
-                            <w:p>
-                              <w:pPr>
-                                <w:spacing w:before="0" w:after="0" w:line="240" w:lineRule="auto"/>
-                                <w:jc w:val="center"/>
-                              </w:pPr>
-                              <w:r>
-                                <w:rPr>
-                                  <w:rFonts w:ascii="Poppins" w:hAnsi="Poppins" w:cs="Poppins"/>
-                                  <w:b/>
-                                  <w:bCs/>
-                                  <w:color w:val="143548"/>
-                                  <w:sz w:val="15"/>
-                                  <w:szCs w:val="15"/>
-                                </w:rPr>
-                                <w:t xml:space="preserve">Capítulo III </w:t>
-                              </w:r>
-                              <w:r>
-                                <w:rPr>
-                                  <w:rFonts w:ascii="Poppins" w:hAnsi="Poppins" w:cs="Poppins"/>
-                                  <w:color w:val="2B2B2B"/>
-                                  <w:sz w:val="15"/>
-                                  <w:szCs w:val="15"/>
-                                </w:rPr>
-                                <w:t xml:space="preserve">Inicio y desarrollo de los procesos selectivos</w:t>
-                              </w:r>
-                            </w:p>
-                          </w:txbxContent>
-                        </wps:txbx>
-                        <wps:bodyPr rot="0" vert="horz" wrap="square" lIns="54852" tIns="0" rIns="54852" bIns="0" anchor="ctr" anchorCtr="0">
-                          <a:noAutofit/>
-                        </wps:bodyPr>
-                      </wps:wsp>
+                        </pic:spPr>
+                      </pic:pic>
                     </a:graphicData>
                   </a:graphic>
-                </wp:inline>
+                </wp:anchor>
               </w:drawing>
             </w:r>
             <w:r>
-              <w:rPr>
-                <w:spacing w:val="110"/>
-                <w:sz w:val="2"/>
-                <w:szCs w:val="2"/>
-              </w:rPr>
-              <w:t xml:space="preserve"> </w:t>
+              <w:t xml:space="preserve">	</w:t>
+            </w:r>
+            <w:r>
+              <w:rPr>
+                <w:rFonts w:ascii="Poppins" w:cs="Poppins" w:eastAsia="Poppins" w:hAnsi="Poppins"/>
+                <w:b/>
+                <w:bCs/>
+                <w:color w:val="143548"/>
+                <w:sz w:val="15"/>
+                <w:szCs w:val="15"/>
+              </w:rPr>
+              <w:t xml:space="preserve">Capítulo III </w:t>
+            </w:r>
+            <w:r>
+              <w:rPr>
+                <w:rFonts w:ascii="Poppins" w:cs="Poppins" w:eastAsia="Poppins" w:hAnsi="Poppins"/>
+                <w:color w:val="2B2B2B"/>
+                <w:sz w:val="15"/>
+                <w:szCs w:val="15"/>
+              </w:rPr>
+              <w:t xml:space="preserve">Inicio y desarrollo de los procesos selectivos</w:t>
             </w:r>
             <w:r>
               <w:drawing>
-                <wp:inline distT="0" distB="0" distL="0" distR="0">
-                  <wp:extent cx="2435429" cy="173698"/>
-                  <wp:effectExtent l="0" t="0" r="0" b="0"/>
-                  <wp:docPr id="5013" name="Forma 5013"/>
-                  <wp:cNvGraphicFramePr/>
+                <wp:anchor distT="0" distB="0" distL="0" distR="0" simplePos="0" allowOverlap="1" behindDoc="1" locked="1" layoutInCell="1" relativeHeight="173693">
+                  <wp:simplePos x="0" y="0"/>
+                  <wp:positionH relativeFrom="column">
+                    <wp:posOffset>2979378</wp:posOffset>
+                  </wp:positionH>
+                  <wp:positionV relativeFrom="paragraph">
+                    <wp:posOffset>-15421</wp:posOffset>
+                  </wp:positionV>
+                  <wp:extent cx="2435353" cy="173693"/>
+                  <wp:effectExtent t="0" r="0" b="0" l="0"/>
+                  <wp:wrapNone/>
+                  <wp:docPr id="1" name="" descr="" title=""/>
+                  <wp:cNvGraphicFramePr>
+                    <a:graphicFrameLocks xmlns:a="http://schemas.openxmlformats.org/drawingml/2006/main" noChangeAspect="1"/>
+                  </wp:cNvGraphicFramePr>
                   <a:graphic xmlns:a="http://schemas.openxmlformats.org/drawingml/2006/main">
-                    <a:graphicData uri="http://schemas.microsoft.com/office/word/2010/wordprocessingShape">
-                      <wps:wsp>
-                        <wps:cNvSpPr/>
-                        <wps:spPr>
+                    <a:graphicData uri="http://schemas.openxmlformats.org/drawingml/2006/picture">
+                      <pic:pic xmlns:pic="http://schemas.openxmlformats.org/drawingml/2006/picture">
+                        <pic:nvPicPr>
+                          <pic:cNvPr id="0" name="" descr=""/>
+                          <pic:cNvPicPr>
+                            <a:picLocks noChangeAspect="1" noChangeArrowheads="1"/>
+                          </pic:cNvPicPr>
+                        </pic:nvPicPr>
+                        <pic:blipFill>
+                          <a:blip r:embed="rId31" cstate="none"/>
+                          <a:srcRect/>
+                          <a:stretch>
+                            <a:fillRect/>
+                          </a:stretch>
+                        </pic:blipFill>
+                        <pic:spPr bwMode="auto">
                           <a:xfrm>
                             <a:off x="0" y="0"/>
-                            <a:ext cx="2435429" cy="173698"/>
+                            <a:ext cx="2435353" cy="173693"/>
                           </a:xfrm>
-                          <a:prstGeom prst="roundRect">
-                            <a:avLst>
-                              <a:gd name="adj" fmla="val 50000"/>
-                            </a:avLst>
+                          <a:prstGeom prst="rect">
+                            <a:avLst/>
                           </a:prstGeom>
-                          <a:solidFill>
-                            <a:srgbClr val="FFFFFF"/>
-                          </a:solidFill>
-                          <a:ln w="9525">
-                            <a:solidFill>
-                              <a:srgbClr val="CFE3EC"/>
-                            </a:solidFill>
-                          </a:ln>
-                        </wps:spPr>
-                        <wps:txbx>
-                          <w:txbxContent>
-                            <w:p>
-                              <w:pPr>
-                                <w:spacing w:before="0" w:after="0" w:line="240" w:lineRule="auto"/>
-                                <w:jc w:val="center"/>
-                              </w:pPr>
-                              <w:r>
-                                <w:rPr>
-                                  <w:rFonts w:ascii="Poppins" w:hAnsi="Poppins" w:cs="Poppins"/>
-                                  <w:b/>
-                                  <w:bCs/>
-                                  <w:color w:val="143548"/>
-                                  <w:sz w:val="15"/>
-                                  <w:szCs w:val="15"/>
-                                </w:rPr>
-                                <w:t xml:space="preserve">Capítulo IV </w:t>
-                              </w:r>
-                              <w:r>
-                                <w:rPr>
-                                  <w:rFonts w:ascii="Poppins" w:hAnsi="Poppins" w:cs="Poppins"/>
-                                  <w:color w:val="2B2B2B"/>
-                                  <w:sz w:val="15"/>
-                                  <w:szCs w:val="15"/>
-                                </w:rPr>
-                                <w:t xml:space="preserve">Personal funcionario en prácticas</w:t>
-                              </w:r>
-                            </w:p>
-                          </w:txbxContent>
-                        </wps:txbx>
-                        <wps:bodyPr rot="0" vert="horz" wrap="square" lIns="54852" tIns="0" rIns="54852" bIns="0" anchor="ctr" anchorCtr="0">
-                          <a:noAutofit/>
-                        </wps:bodyPr>
-                      </wps:wsp>
+                        </pic:spPr>
+                      </pic:pic>
                     </a:graphicData>
                   </a:graphic>
-                </wp:inline>
+                </wp:anchor>
               </w:drawing>
             </w:r>
-          </w:p>
-          <w:p>
-            <w:pPr>
-              <w:pStyle w:val="tight"/>
-              <w:spacing w:after="0" w:before="58"/>
+            <w:r>
+              <w:t xml:space="preserve">	</w:t>
+            </w:r>
+            <w:r>
+              <w:rPr>
+                <w:rFonts w:ascii="Poppins" w:cs="Poppins" w:eastAsia="Poppins" w:hAnsi="Poppins"/>
+                <w:b/>
+                <w:bCs/>
+                <w:color w:val="143548"/>
+                <w:sz w:val="15"/>
+                <w:szCs w:val="15"/>
+              </w:rPr>
+              <w:t xml:space="preserve">Capítulo IV </w:t>
+            </w:r>
+            <w:r>
+              <w:rPr>
+                <w:rFonts w:ascii="Poppins" w:cs="Poppins" w:eastAsia="Poppins" w:hAnsi="Poppins"/>
+                <w:color w:val="2B2B2B"/>
+                <w:sz w:val="15"/>
+                <w:szCs w:val="15"/>
+              </w:rPr>
+              <w:t xml:space="preserve">Personal funcionario en prácticas</w:t>
+            </w:r>
+          </w:p>
+          <w:p>
+            <w:pPr>
+              <w:tabs>
+                <w:tab w:val="left" w:pos="216"/>
+              </w:tabs>
+              <w:spacing w:after="86" w:before="0" w:line="240" w:lineRule="auto"/>
             </w:pPr>
             <w:r>
               <w:drawing>
-                <wp:inline distT="0" distB="0" distL="0" distR="0">
-                  <wp:extent cx="1994784" cy="173698"/>
-                  <wp:effectExtent l="0" t="0" r="0" b="0"/>
-                  <wp:docPr id="5014" name="Forma 5014"/>
-                  <wp:cNvGraphicFramePr/>
+                <wp:anchor distT="0" distB="0" distL="0" distR="0" simplePos="0" allowOverlap="1" behindDoc="1" locked="1" layoutInCell="1" relativeHeight="173693">
+                  <wp:simplePos x="0" y="0"/>
+                  <wp:positionH relativeFrom="column">
+                    <wp:posOffset>0</wp:posOffset>
+                  </wp:positionH>
+                  <wp:positionV relativeFrom="paragraph">
+                    <wp:posOffset>-15421</wp:posOffset>
+                  </wp:positionV>
+                  <wp:extent cx="1994722" cy="173693"/>
+                  <wp:effectExtent t="0" r="0" b="0" l="0"/>
+                  <wp:wrapNone/>
+                  <wp:docPr id="1" name="" descr="" title=""/>
+                  <wp:cNvGraphicFramePr>
+                    <a:graphicFrameLocks xmlns:a="http://schemas.openxmlformats.org/drawingml/2006/main" noChangeAspect="1"/>
+                  </wp:cNvGraphicFramePr>
                   <a:graphic xmlns:a="http://schemas.openxmlformats.org/drawingml/2006/main">
-                    <a:graphicData uri="http://schemas.microsoft.com/office/word/2010/wordprocessingShape">
-                      <wps:wsp>
-                        <wps:cNvSpPr/>
-                        <wps:spPr>
+                    <a:graphicData uri="http://schemas.openxmlformats.org/drawingml/2006/picture">
+                      <pic:pic xmlns:pic="http://schemas.openxmlformats.org/drawingml/2006/picture">
+                        <pic:nvPicPr>
+                          <pic:cNvPr id="0" name="" descr=""/>
+                          <pic:cNvPicPr>
+                            <a:picLocks noChangeAspect="1" noChangeArrowheads="1"/>
+                          </pic:cNvPicPr>
+                        </pic:nvPicPr>
+                        <pic:blipFill>
+                          <a:blip r:embed="rId32" cstate="none"/>
+                          <a:srcRect/>
+                          <a:stretch>
+                            <a:fillRect/>
+                          </a:stretch>
+                        </pic:blipFill>
+                        <pic:spPr bwMode="auto">
                           <a:xfrm>
                             <a:off x="0" y="0"/>
-                            <a:ext cx="1994784" cy="173698"/>
+                            <a:ext cx="1994722" cy="173693"/>
                           </a:xfrm>
-                          <a:prstGeom prst="roundRect">
-                            <a:avLst>
-                              <a:gd name="adj" fmla="val 50000"/>
-                            </a:avLst>
+                          <a:prstGeom prst="rect">
+                            <a:avLst/>
                           </a:prstGeom>
-                          <a:solidFill>
-                            <a:srgbClr val="FFFFFF"/>
-                          </a:solidFill>
-                          <a:ln w="9525">
-                            <a:solidFill>
-                              <a:srgbClr val="CFE3EC"/>
-                            </a:solidFill>
-                          </a:ln>
-                        </wps:spPr>
-                        <wps:txbx>
-                          <w:txbxContent>
-                            <w:p>
-                              <w:pPr>
-                                <w:spacing w:before="0" w:after="0" w:line="240" w:lineRule="auto"/>
-                                <w:jc w:val="center"/>
-                              </w:pPr>
-                              <w:r>
-                                <w:rPr>
-                                  <w:rFonts w:ascii="Poppins" w:hAnsi="Poppins" w:cs="Poppins"/>
-                                  <w:b/>
-                                  <w:bCs/>
-                                  <w:color w:val="143548"/>
-                                  <w:sz w:val="15"/>
-                                  <w:szCs w:val="15"/>
-                                </w:rPr>
-                                <w:t xml:space="preserve">Capítulo V </w:t>
-                              </w:r>
-                              <w:r>
-                                <w:rPr>
-                                  <w:rFonts w:ascii="Poppins" w:hAnsi="Poppins" w:cs="Poppins"/>
-                                  <w:color w:val="2B2B2B"/>
-                                  <w:sz w:val="15"/>
-                                  <w:szCs w:val="15"/>
-                                </w:rPr>
-                                <w:t xml:space="preserve">Comisiones de selección</w:t>
-                              </w:r>
-                            </w:p>
-                          </w:txbxContent>
-                        </wps:txbx>
-                        <wps:bodyPr rot="0" vert="horz" wrap="square" lIns="54852" tIns="0" rIns="54852" bIns="0" anchor="ctr" anchorCtr="0">
-                          <a:noAutofit/>
-                        </wps:bodyPr>
-                      </wps:wsp>
+                        </pic:spPr>
+                      </pic:pic>
                     </a:graphicData>
                   </a:graphic>
-                </wp:inline>
+                </wp:anchor>
               </w:drawing>
             </w:r>
-          </w:p>
-          <w:p>
-            <w:pPr>
-              <w:pStyle w:val="tight"/>
-              <w:spacing w:after="0" w:before="58"/>
+            <w:r>
+              <w:t xml:space="preserve">	</w:t>
+            </w:r>
+            <w:r>
+              <w:rPr>
+                <w:rFonts w:ascii="Poppins" w:cs="Poppins" w:eastAsia="Poppins" w:hAnsi="Poppins"/>
+                <w:b/>
+                <w:bCs/>
+                <w:color w:val="143548"/>
+                <w:sz w:val="15"/>
+                <w:szCs w:val="15"/>
+              </w:rPr>
+              <w:t xml:space="preserve">Capítulo V </w:t>
+            </w:r>
+            <w:r>
+              <w:rPr>
+                <w:rFonts w:ascii="Poppins" w:cs="Poppins" w:eastAsia="Poppins" w:hAnsi="Poppins"/>
+                <w:color w:val="2B2B2B"/>
+                <w:sz w:val="15"/>
+                <w:szCs w:val="15"/>
+              </w:rPr>
+              <w:t xml:space="preserve">Comisiones de selección</w:t>
+            </w:r>
+          </w:p>
+          <w:p>
+            <w:pPr>
+              <w:tabs>
+                <w:tab w:val="left" w:pos="216"/>
+              </w:tabs>
+              <w:spacing w:after="0" w:before="0" w:line="240" w:lineRule="auto"/>
             </w:pPr>
             <w:r>
               <w:drawing>
-                <wp:inline distT="0" distB="0" distL="0" distR="0">
-                  <wp:extent cx="4189779" cy="173698"/>
-                  <wp:effectExtent l="0" t="0" r="0" b="0"/>
-                  <wp:docPr id="5015" name="Forma 5015"/>
-                  <wp:cNvGraphicFramePr/>
+                <wp:anchor distT="0" distB="0" distL="0" distR="0" simplePos="0" allowOverlap="1" behindDoc="1" locked="1" layoutInCell="1" relativeHeight="173693">
+                  <wp:simplePos x="0" y="0"/>
+                  <wp:positionH relativeFrom="column">
+                    <wp:posOffset>0</wp:posOffset>
+                  </wp:positionH>
+                  <wp:positionV relativeFrom="paragraph">
+                    <wp:posOffset>-15421</wp:posOffset>
+                  </wp:positionV>
+                  <wp:extent cx="4189648" cy="173693"/>
+                  <wp:effectExtent t="0" r="0" b="0" l="0"/>
+                  <wp:wrapNone/>
+                  <wp:docPr id="1" name="" descr="" title=""/>
+                  <wp:cNvGraphicFramePr>
+                    <a:graphicFrameLocks xmlns:a="http://schemas.openxmlformats.org/drawingml/2006/main" noChangeAspect="1"/>
+                  </wp:cNvGraphicFramePr>
                   <a:graphic xmlns:a="http://schemas.openxmlformats.org/drawingml/2006/main">
-                    <a:graphicData uri="http://schemas.microsoft.com/office/word/2010/wordprocessingShape">
-                      <wps:wsp>
-                        <wps:cNvSpPr/>
-                        <wps:spPr>
+                    <a:graphicData uri="http://schemas.openxmlformats.org/drawingml/2006/picture">
+                      <pic:pic xmlns:pic="http://schemas.openxmlformats.org/drawingml/2006/picture">
+                        <pic:nvPicPr>
+                          <pic:cNvPr id="0" name="" descr=""/>
+                          <pic:cNvPicPr>
+                            <a:picLocks noChangeAspect="1" noChangeArrowheads="1"/>
+                          </pic:cNvPicPr>
+                        </pic:nvPicPr>
+                        <pic:blipFill>
+                          <a:blip r:embed="rId33" cstate="none"/>
+                          <a:srcRect/>
+                          <a:stretch>
+                            <a:fillRect/>
+                          </a:stretch>
+                        </pic:blipFill>
+                        <pic:spPr bwMode="auto">
                           <a:xfrm>
                             <a:off x="0" y="0"/>
-                            <a:ext cx="4189779" cy="173698"/>
+                            <a:ext cx="4189648" cy="173693"/>
                           </a:xfrm>
-                          <a:prstGeom prst="roundRect">
-                            <a:avLst>
-                              <a:gd name="adj" fmla="val 50000"/>
-                            </a:avLst>
+                          <a:prstGeom prst="rect">
+                            <a:avLst/>
                           </a:prstGeom>
-                          <a:solidFill>
-                            <a:srgbClr val="FFFFFF"/>
-                          </a:solidFill>
-                          <a:ln w="9525">
-                            <a:solidFill>
-                              <a:srgbClr val="CFE3EC"/>
-                            </a:solidFill>
-                          </a:ln>
-                        </wps:spPr>
-                        <wps:txbx>
-                          <w:txbxContent>
-                            <w:p>
-                              <w:pPr>
-                                <w:spacing w:before="0" w:after="0" w:line="240" w:lineRule="auto"/>
-                                <w:jc w:val="center"/>
-                              </w:pPr>
-                              <w:r>
-                                <w:rPr>
-                                  <w:rFonts w:ascii="Poppins" w:hAnsi="Poppins" w:cs="Poppins"/>
-                                  <w:b/>
-                                  <w:bCs/>
-                                  <w:color w:val="143548"/>
-                                  <w:sz w:val="15"/>
-                                  <w:szCs w:val="15"/>
-                                </w:rPr>
-                                <w:t xml:space="preserve">Capítulo VI </w:t>
-                              </w:r>
-                              <w:r>
-                                <w:rPr>
-                                  <w:rFonts w:ascii="Poppins" w:hAnsi="Poppins" w:cs="Poppins"/>
-                                  <w:color w:val="2B2B2B"/>
-                                  <w:sz w:val="15"/>
-                                  <w:szCs w:val="15"/>
-                                </w:rPr>
-                                <w:t xml:space="preserve">Selección de personal funcionario interino y personal laboral temporal</w:t>
-                              </w:r>
-                            </w:p>
-                          </w:txbxContent>
-                        </wps:txbx>
-                        <wps:bodyPr rot="0" vert="horz" wrap="square" lIns="54852" tIns="0" rIns="54852" bIns="0" anchor="ctr" anchorCtr="0">
-                          <a:noAutofit/>
-                        </wps:bodyPr>
-                      </wps:wsp>
+                        </pic:spPr>
+                      </pic:pic>
                     </a:graphicData>
                   </a:graphic>
-                </wp:inline>
+                </wp:anchor>
               </w:drawing>
+            </w:r>
+            <w:r>
+              <w:t xml:space="preserve">	</w:t>
+            </w:r>
+            <w:r>
+              <w:rPr>
+                <w:rFonts w:ascii="Poppins" w:cs="Poppins" w:eastAsia="Poppins" w:hAnsi="Poppins"/>
+                <w:b/>
+                <w:bCs/>
+                <w:color w:val="143548"/>
+                <w:sz w:val="15"/>
+                <w:szCs w:val="15"/>
+              </w:rPr>
+              <w:t xml:space="preserve">Capítulo VI </w:t>
+            </w:r>
+            <w:r>
+              <w:rPr>
+                <w:rFonts w:ascii="Poppins" w:cs="Poppins" w:eastAsia="Poppins" w:hAnsi="Poppins"/>
+                <w:color w:val="2B2B2B"/>
+                <w:sz w:val="15"/>
+                <w:szCs w:val="15"/>
+              </w:rPr>
+              <w:t xml:space="preserve">Selección de personal funcionario interino y personal laboral temporal</w:t>
             </w:r>
           </w:p>
           <w:p>
@@ -2118,7 +2113,7 @@
                           </pic:cNvPicPr>
                         </pic:nvPicPr>
                         <pic:blipFill>
-                          <a:blip r:embed="rId19" cstate="none"/>
+                          <a:blip r:embed="rId34" cstate="none"/>
                           <a:srcRect/>
                           <a:stretch>
                             <a:fillRect/>
@@ -2192,227 +2187,239 @@
           </w:p>
           <w:p>
             <w:pPr>
-              <w:pStyle w:val="tight"/>
-              <w:spacing w:after="0" w:before="0"/>
+              <w:tabs>
+                <w:tab w:val="left" w:pos="216"/>
+              </w:tabs>
+              <w:spacing w:after="86" w:before="0" w:line="240" w:lineRule="auto"/>
             </w:pPr>
             <w:r>
               <w:drawing>
-                <wp:inline distT="0" distB="0" distL="0" distR="0">
-                  <wp:extent cx="1643732" cy="173698"/>
-                  <wp:effectExtent l="0" t="0" r="0" b="0"/>
-                  <wp:docPr id="5016" name="Forma 5016"/>
-                  <wp:cNvGraphicFramePr/>
+                <wp:anchor distT="0" distB="0" distL="0" distR="0" simplePos="0" allowOverlap="1" behindDoc="1" locked="1" layoutInCell="1" relativeHeight="173693">
+                  <wp:simplePos x="0" y="0"/>
+                  <wp:positionH relativeFrom="column">
+                    <wp:posOffset>0</wp:posOffset>
+                  </wp:positionH>
+                  <wp:positionV relativeFrom="paragraph">
+                    <wp:posOffset>-15421</wp:posOffset>
+                  </wp:positionV>
+                  <wp:extent cx="1643680" cy="173693"/>
+                  <wp:effectExtent t="0" r="0" b="0" l="0"/>
+                  <wp:wrapNone/>
+                  <wp:docPr id="1" name="" descr="" title=""/>
+                  <wp:cNvGraphicFramePr>
+                    <a:graphicFrameLocks xmlns:a="http://schemas.openxmlformats.org/drawingml/2006/main" noChangeAspect="1"/>
+                  </wp:cNvGraphicFramePr>
                   <a:graphic xmlns:a="http://schemas.openxmlformats.org/drawingml/2006/main">
-                    <a:graphicData uri="http://schemas.microsoft.com/office/word/2010/wordprocessingShape">
-                      <wps:wsp>
-                        <wps:cNvSpPr/>
-                        <wps:spPr>
+                    <a:graphicData uri="http://schemas.openxmlformats.org/drawingml/2006/picture">
+                      <pic:pic xmlns:pic="http://schemas.openxmlformats.org/drawingml/2006/picture">
+                        <pic:nvPicPr>
+                          <pic:cNvPr id="0" name="" descr=""/>
+                          <pic:cNvPicPr>
+                            <a:picLocks noChangeAspect="1" noChangeArrowheads="1"/>
+                          </pic:cNvPicPr>
+                        </pic:nvPicPr>
+                        <pic:blipFill>
+                          <a:blip r:embed="rId28" cstate="none"/>
+                          <a:srcRect/>
+                          <a:stretch>
+                            <a:fillRect/>
+                          </a:stretch>
+                        </pic:blipFill>
+                        <pic:spPr bwMode="auto">
                           <a:xfrm>
                             <a:off x="0" y="0"/>
-                            <a:ext cx="1643732" cy="173698"/>
+                            <a:ext cx="1643680" cy="173693"/>
                           </a:xfrm>
-                          <a:prstGeom prst="roundRect">
-                            <a:avLst>
-                              <a:gd name="adj" fmla="val 50000"/>
-                            </a:avLst>
+                          <a:prstGeom prst="rect">
+                            <a:avLst/>
                           </a:prstGeom>
-                          <a:solidFill>
-                            <a:srgbClr val="FFFFFF"/>
-                          </a:solidFill>
-                          <a:ln w="9525">
-                            <a:solidFill>
-                              <a:srgbClr val="CFE3EC"/>
-                            </a:solidFill>
-                          </a:ln>
-                        </wps:spPr>
-                        <wps:txbx>
-                          <w:txbxContent>
-                            <w:p>
-                              <w:pPr>
-                                <w:spacing w:before="0" w:after="0" w:line="240" w:lineRule="auto"/>
-                                <w:jc w:val="center"/>
-                              </w:pPr>
-                              <w:r>
-                                <w:rPr>
-                                  <w:rFonts w:ascii="Poppins" w:hAnsi="Poppins" w:cs="Poppins"/>
-                                  <w:b/>
-                                  <w:bCs/>
-                                  <w:color w:val="143548"/>
-                                  <w:sz w:val="15"/>
-                                  <w:szCs w:val="15"/>
-                                </w:rPr>
-                                <w:t xml:space="preserve">Capítulo I </w:t>
-                              </w:r>
-                              <w:r>
-                                <w:rPr>
-                                  <w:rFonts w:ascii="Poppins" w:hAnsi="Poppins" w:cs="Poppins"/>
-                                  <w:color w:val="2B2B2B"/>
-                                  <w:sz w:val="15"/>
-                                  <w:szCs w:val="15"/>
-                                </w:rPr>
-                                <w:t xml:space="preserve">Normas generales</w:t>
-                              </w:r>
-                            </w:p>
-                          </w:txbxContent>
-                        </wps:txbx>
-                        <wps:bodyPr rot="0" vert="horz" wrap="square" lIns="54852" tIns="0" rIns="54852" bIns="0" anchor="ctr" anchorCtr="0">
-                          <a:noAutofit/>
-                        </wps:bodyPr>
-                      </wps:wsp>
+                        </pic:spPr>
+                      </pic:pic>
                     </a:graphicData>
                   </a:graphic>
-                </wp:inline>
+                </wp:anchor>
               </w:drawing>
             </w:r>
-          </w:p>
-          <w:p>
-            <w:pPr>
-              <w:pStyle w:val="tight"/>
-              <w:spacing w:after="0" w:before="58"/>
+            <w:r>
+              <w:t xml:space="preserve">	</w:t>
+            </w:r>
+            <w:r>
+              <w:rPr>
+                <w:rFonts w:ascii="Poppins" w:cs="Poppins" w:eastAsia="Poppins" w:hAnsi="Poppins"/>
+                <w:b/>
+                <w:bCs/>
+                <w:color w:val="143548"/>
+                <w:sz w:val="15"/>
+                <w:szCs w:val="15"/>
+              </w:rPr>
+              <w:t xml:space="preserve">Capítulo I </w:t>
+            </w:r>
+            <w:r>
+              <w:rPr>
+                <w:rFonts w:ascii="Poppins" w:cs="Poppins" w:eastAsia="Poppins" w:hAnsi="Poppins"/>
+                <w:color w:val="2B2B2B"/>
+                <w:sz w:val="15"/>
+                <w:szCs w:val="15"/>
+              </w:rPr>
+              <w:t xml:space="preserve">Normas generales</w:t>
+            </w:r>
+          </w:p>
+          <w:p>
+            <w:pPr>
+              <w:tabs>
+                <w:tab w:val="left" w:pos="216"/>
+              </w:tabs>
+              <w:spacing w:after="86" w:before="0" w:line="240" w:lineRule="auto"/>
             </w:pPr>
             <w:r>
               <w:drawing>
-                <wp:inline distT="0" distB="0" distL="0" distR="0">
-                  <wp:extent cx="3760105" cy="173698"/>
-                  <wp:effectExtent l="0" t="0" r="0" b="0"/>
-                  <wp:docPr id="5017" name="Forma 5017"/>
-                  <wp:cNvGraphicFramePr/>
+                <wp:anchor distT="0" distB="0" distL="0" distR="0" simplePos="0" allowOverlap="1" behindDoc="1" locked="1" layoutInCell="1" relativeHeight="173693">
+                  <wp:simplePos x="0" y="0"/>
+                  <wp:positionH relativeFrom="column">
+                    <wp:posOffset>0</wp:posOffset>
+                  </wp:positionH>
+                  <wp:positionV relativeFrom="paragraph">
+                    <wp:posOffset>-15421</wp:posOffset>
+                  </wp:positionV>
+                  <wp:extent cx="3759987" cy="173693"/>
+                  <wp:effectExtent t="0" r="0" b="0" l="0"/>
+                  <wp:wrapNone/>
+                  <wp:docPr id="1" name="" descr="" title=""/>
+                  <wp:cNvGraphicFramePr>
+                    <a:graphicFrameLocks xmlns:a="http://schemas.openxmlformats.org/drawingml/2006/main" noChangeAspect="1"/>
+                  </wp:cNvGraphicFramePr>
                   <a:graphic xmlns:a="http://schemas.openxmlformats.org/drawingml/2006/main">
-                    <a:graphicData uri="http://schemas.microsoft.com/office/word/2010/wordprocessingShape">
-                      <wps:wsp>
-                        <wps:cNvSpPr/>
-                        <wps:spPr>
+                    <a:graphicData uri="http://schemas.openxmlformats.org/drawingml/2006/picture">
+                      <pic:pic xmlns:pic="http://schemas.openxmlformats.org/drawingml/2006/picture">
+                        <pic:nvPicPr>
+                          <pic:cNvPr id="0" name="" descr=""/>
+                          <pic:cNvPicPr>
+                            <a:picLocks noChangeAspect="1" noChangeArrowheads="1"/>
+                          </pic:cNvPicPr>
+                        </pic:nvPicPr>
+                        <pic:blipFill>
+                          <a:blip r:embed="rId35" cstate="none"/>
+                          <a:srcRect/>
+                          <a:stretch>
+                            <a:fillRect/>
+                          </a:stretch>
+                        </pic:blipFill>
+                        <pic:spPr bwMode="auto">
                           <a:xfrm>
                             <a:off x="0" y="0"/>
-                            <a:ext cx="3760105" cy="173698"/>
+                            <a:ext cx="3759987" cy="173693"/>
                           </a:xfrm>
-                          <a:prstGeom prst="roundRect">
-                            <a:avLst>
-                              <a:gd name="adj" fmla="val 50000"/>
-                            </a:avLst>
+                          <a:prstGeom prst="rect">
+                            <a:avLst/>
                           </a:prstGeom>
-                          <a:solidFill>
-                            <a:srgbClr val="FFFFFF"/>
-                          </a:solidFill>
-                          <a:ln w="9525">
-                            <a:solidFill>
-                              <a:srgbClr val="CFE3EC"/>
-                            </a:solidFill>
-                          </a:ln>
-                        </wps:spPr>
-                        <wps:txbx>
-                          <w:txbxContent>
-                            <w:p>
-                              <w:pPr>
-                                <w:spacing w:before="0" w:after="0" w:line="240" w:lineRule="auto"/>
-                                <w:jc w:val="center"/>
-                              </w:pPr>
-                              <w:r>
-                                <w:rPr>
-                                  <w:rFonts w:ascii="Poppins" w:hAnsi="Poppins" w:cs="Poppins"/>
-                                  <w:b/>
-                                  <w:bCs/>
-                                  <w:color w:val="143548"/>
-                                  <w:sz w:val="15"/>
-                                  <w:szCs w:val="15"/>
-                                </w:rPr>
-                                <w:t xml:space="preserve">Capítulo II </w:t>
-                              </w:r>
-                              <w:r>
-                                <w:rPr>
-                                  <w:rFonts w:ascii="Poppins" w:hAnsi="Poppins" w:cs="Poppins"/>
-                                  <w:color w:val="2B2B2B"/>
-                                  <w:sz w:val="15"/>
-                                  <w:szCs w:val="15"/>
-                                </w:rPr>
-                                <w:t xml:space="preserve">Promoción interna vertical del personal funcionario de carrera</w:t>
-                              </w:r>
-                            </w:p>
-                          </w:txbxContent>
-                        </wps:txbx>
-                        <wps:bodyPr rot="0" vert="horz" wrap="square" lIns="54852" tIns="0" rIns="54852" bIns="0" anchor="ctr" anchorCtr="0">
-                          <a:noAutofit/>
-                        </wps:bodyPr>
-                      </wps:wsp>
+                        </pic:spPr>
+                      </pic:pic>
                     </a:graphicData>
                   </a:graphic>
-                </wp:inline>
+                </wp:anchor>
               </w:drawing>
             </w:r>
-          </w:p>
-          <w:p>
-            <w:pPr>
-              <w:pStyle w:val="tight"/>
-              <w:spacing w:after="0" w:before="58"/>
+            <w:r>
+              <w:t xml:space="preserve">	</w:t>
+            </w:r>
+            <w:r>
+              <w:rPr>
+                <w:rFonts w:ascii="Poppins" w:cs="Poppins" w:eastAsia="Poppins" w:hAnsi="Poppins"/>
+                <w:b/>
+                <w:bCs/>
+                <w:color w:val="143548"/>
+                <w:sz w:val="15"/>
+                <w:szCs w:val="15"/>
+              </w:rPr>
+              <w:t xml:space="preserve">Capítulo II </w:t>
+            </w:r>
+            <w:r>
+              <w:rPr>
+                <w:rFonts w:ascii="Poppins" w:cs="Poppins" w:eastAsia="Poppins" w:hAnsi="Poppins"/>
+                <w:color w:val="2B2B2B"/>
+                <w:sz w:val="15"/>
+                <w:szCs w:val="15"/>
+              </w:rPr>
+              <w:t xml:space="preserve">Promoción interna vertical del personal funcionario de carrera</w:t>
+            </w:r>
+          </w:p>
+          <w:p>
+            <w:pPr>
+              <w:tabs>
+                <w:tab w:val="left" w:pos="216"/>
+              </w:tabs>
+              <w:spacing w:after="0" w:before="0" w:line="240" w:lineRule="auto"/>
             </w:pPr>
             <w:r>
               <w:drawing>
-                <wp:inline distT="0" distB="0" distL="0" distR="0">
-                  <wp:extent cx="3904548" cy="173698"/>
-                  <wp:effectExtent l="0" t="0" r="0" b="0"/>
-                  <wp:docPr id="5018" name="Forma 5018"/>
-                  <wp:cNvGraphicFramePr/>
+                <wp:anchor distT="0" distB="0" distL="0" distR="0" simplePos="0" allowOverlap="1" behindDoc="1" locked="1" layoutInCell="1" relativeHeight="173693">
+                  <wp:simplePos x="0" y="0"/>
+                  <wp:positionH relativeFrom="column">
+                    <wp:posOffset>0</wp:posOffset>
+                  </wp:positionH>
+                  <wp:positionV relativeFrom="paragraph">
+                    <wp:posOffset>-15421</wp:posOffset>
+                  </wp:positionV>
+                  <wp:extent cx="3904426" cy="173693"/>
+                  <wp:effectExtent t="0" r="0" b="0" l="0"/>
+                  <wp:wrapNone/>
+                  <wp:docPr id="1" name="" descr="" title=""/>
+                  <wp:cNvGraphicFramePr>
+                    <a:graphicFrameLocks xmlns:a="http://schemas.openxmlformats.org/drawingml/2006/main" noChangeAspect="1"/>
+                  </wp:cNvGraphicFramePr>
                   <a:graphic xmlns:a="http://schemas.openxmlformats.org/drawingml/2006/main">
-                    <a:graphicData uri="http://schemas.microsoft.com/office/word/2010/wordprocessingShape">
-                      <wps:wsp>
-                        <wps:cNvSpPr/>
-                        <wps:spPr>
+                    <a:graphicData uri="http://schemas.openxmlformats.org/drawingml/2006/picture">
+                      <pic:pic xmlns:pic="http://schemas.openxmlformats.org/drawingml/2006/picture">
+                        <pic:nvPicPr>
+                          <pic:cNvPr id="0" name="" descr=""/>
+                          <pic:cNvPicPr>
+                            <a:picLocks noChangeAspect="1" noChangeArrowheads="1"/>
+                          </pic:cNvPicPr>
+                        </pic:nvPicPr>
+                        <pic:blipFill>
+                          <a:blip r:embed="rId36" cstate="none"/>
+                          <a:srcRect/>
+                          <a:stretch>
+                            <a:fillRect/>
+                          </a:stretch>
+                        </pic:blipFill>
+                        <pic:spPr bwMode="auto">
                           <a:xfrm>
                             <a:off x="0" y="0"/>
-                            <a:ext cx="3904548" cy="173698"/>
+                            <a:ext cx="3904426" cy="173693"/>
                           </a:xfrm>
-                          <a:prstGeom prst="roundRect">
-                            <a:avLst>
-                              <a:gd name="adj" fmla="val 50000"/>
-                            </a:avLst>
+                          <a:prstGeom prst="rect">
+                            <a:avLst/>
                           </a:prstGeom>
-                          <a:solidFill>
-                            <a:srgbClr val="FFFFFF"/>
-                          </a:solidFill>
-                          <a:ln w="9525">
-                            <a:solidFill>
-                              <a:srgbClr val="CFE3EC"/>
-                            </a:solidFill>
-                          </a:ln>
-                        </wps:spPr>
-                        <wps:txbx>
-                          <w:txbxContent>
-                            <w:p>
-                              <w:pPr>
-                                <w:spacing w:before="0" w:after="0" w:line="240" w:lineRule="auto"/>
-                                <w:jc w:val="center"/>
-                              </w:pPr>
-                              <w:r>
-                                <w:rPr>
-                                  <w:rFonts w:ascii="Poppins" w:hAnsi="Poppins" w:cs="Poppins"/>
-                                  <w:b/>
-                                  <w:bCs/>
-                                  <w:color w:val="143548"/>
-                                  <w:sz w:val="15"/>
-                                  <w:szCs w:val="15"/>
-                                </w:rPr>
-                                <w:t xml:space="preserve">Capítulo III </w:t>
-                              </w:r>
-                              <w:r>
-                                <w:rPr>
-                                  <w:rFonts w:ascii="Poppins" w:hAnsi="Poppins" w:cs="Poppins"/>
-                                  <w:color w:val="2B2B2B"/>
-                                  <w:sz w:val="15"/>
-                                  <w:szCs w:val="15"/>
-                                </w:rPr>
-                                <w:t xml:space="preserve">Promoción interna horizontal del personal funcionario de carrera</w:t>
-                              </w:r>
-                            </w:p>
-                          </w:txbxContent>
-                        </wps:txbx>
-                        <wps:bodyPr rot="0" vert="horz" wrap="square" lIns="54852" tIns="0" rIns="54852" bIns="0" anchor="ctr" anchorCtr="0">
-                          <a:noAutofit/>
-                        </wps:bodyPr>
-                      </wps:wsp>
+                        </pic:spPr>
+                      </pic:pic>
                     </a:graphicData>
                   </a:graphic>
-                </wp:inline>
+                </wp:anchor>
               </w:drawing>
+            </w:r>
+            <w:r>
+              <w:t xml:space="preserve">	</w:t>
+            </w:r>
+            <w:r>
+              <w:rPr>
+                <w:rFonts w:ascii="Poppins" w:cs="Poppins" w:eastAsia="Poppins" w:hAnsi="Poppins"/>
+                <w:b/>
+                <w:bCs/>
+                <w:color w:val="143548"/>
+                <w:sz w:val="15"/>
+                <w:szCs w:val="15"/>
+              </w:rPr>
+              <w:t xml:space="preserve">Capítulo III </w:t>
+            </w:r>
+            <w:r>
+              <w:rPr>
+                <w:rFonts w:ascii="Poppins" w:cs="Poppins" w:eastAsia="Poppins" w:hAnsi="Poppins"/>
+                <w:color w:val="2B2B2B"/>
+                <w:sz w:val="15"/>
+                <w:szCs w:val="15"/>
+              </w:rPr>
+              <w:t xml:space="preserve">Promoción interna horizontal del personal funcionario de carrera</w:t>
             </w:r>
           </w:p>
           <w:p>
@@ -2544,7 +2551,7 @@
                           </pic:cNvPicPr>
                         </pic:nvPicPr>
                         <pic:blipFill>
-                          <a:blip r:embed="rId20" cstate="none"/>
+                          <a:blip r:embed="rId37" cstate="none"/>
                           <a:srcRect/>
                           <a:stretch>
                             <a:fillRect/>
@@ -2618,227 +2625,239 @@
           </w:p>
           <w:p>
             <w:pPr>
-              <w:pStyle w:val="tight"/>
-              <w:spacing w:after="0" w:before="0"/>
+              <w:tabs>
+                <w:tab w:val="left" w:pos="216"/>
+              </w:tabs>
+              <w:spacing w:after="86" w:before="0" w:line="240" w:lineRule="auto"/>
             </w:pPr>
             <w:r>
               <w:drawing>
-                <wp:inline distT="0" distB="0" distL="0" distR="0">
-                  <wp:extent cx="1643732" cy="173698"/>
-                  <wp:effectExtent l="0" t="0" r="0" b="0"/>
-                  <wp:docPr id="5019" name="Forma 5019"/>
-                  <wp:cNvGraphicFramePr/>
+                <wp:anchor distT="0" distB="0" distL="0" distR="0" simplePos="0" allowOverlap="1" behindDoc="1" locked="1" layoutInCell="1" relativeHeight="173693">
+                  <wp:simplePos x="0" y="0"/>
+                  <wp:positionH relativeFrom="column">
+                    <wp:posOffset>0</wp:posOffset>
+                  </wp:positionH>
+                  <wp:positionV relativeFrom="paragraph">
+                    <wp:posOffset>-15421</wp:posOffset>
+                  </wp:positionV>
+                  <wp:extent cx="1643680" cy="173693"/>
+                  <wp:effectExtent t="0" r="0" b="0" l="0"/>
+                  <wp:wrapNone/>
+                  <wp:docPr id="1" name="" descr="" title=""/>
+                  <wp:cNvGraphicFramePr>
+                    <a:graphicFrameLocks xmlns:a="http://schemas.openxmlformats.org/drawingml/2006/main" noChangeAspect="1"/>
+                  </wp:cNvGraphicFramePr>
                   <a:graphic xmlns:a="http://schemas.openxmlformats.org/drawingml/2006/main">
-                    <a:graphicData uri="http://schemas.microsoft.com/office/word/2010/wordprocessingShape">
-                      <wps:wsp>
-                        <wps:cNvSpPr/>
-                        <wps:spPr>
+                    <a:graphicData uri="http://schemas.openxmlformats.org/drawingml/2006/picture">
+                      <pic:pic xmlns:pic="http://schemas.openxmlformats.org/drawingml/2006/picture">
+                        <pic:nvPicPr>
+                          <pic:cNvPr id="0" name="" descr=""/>
+                          <pic:cNvPicPr>
+                            <a:picLocks noChangeAspect="1" noChangeArrowheads="1"/>
+                          </pic:cNvPicPr>
+                        </pic:nvPicPr>
+                        <pic:blipFill>
+                          <a:blip r:embed="rId28" cstate="none"/>
+                          <a:srcRect/>
+                          <a:stretch>
+                            <a:fillRect/>
+                          </a:stretch>
+                        </pic:blipFill>
+                        <pic:spPr bwMode="auto">
                           <a:xfrm>
                             <a:off x="0" y="0"/>
-                            <a:ext cx="1643732" cy="173698"/>
+                            <a:ext cx="1643680" cy="173693"/>
                           </a:xfrm>
-                          <a:prstGeom prst="roundRect">
-                            <a:avLst>
-                              <a:gd name="adj" fmla="val 50000"/>
-                            </a:avLst>
+                          <a:prstGeom prst="rect">
+                            <a:avLst/>
                           </a:prstGeom>
-                          <a:solidFill>
-                            <a:srgbClr val="FFFFFF"/>
-                          </a:solidFill>
-                          <a:ln w="9525">
-                            <a:solidFill>
-                              <a:srgbClr val="CFE3EC"/>
-                            </a:solidFill>
-                          </a:ln>
-                        </wps:spPr>
-                        <wps:txbx>
-                          <w:txbxContent>
-                            <w:p>
-                              <w:pPr>
-                                <w:spacing w:before="0" w:after="0" w:line="240" w:lineRule="auto"/>
-                                <w:jc w:val="center"/>
-                              </w:pPr>
-                              <w:r>
-                                <w:rPr>
-                                  <w:rFonts w:ascii="Poppins" w:hAnsi="Poppins" w:cs="Poppins"/>
-                                  <w:b/>
-                                  <w:bCs/>
-                                  <w:color w:val="143548"/>
-                                  <w:sz w:val="15"/>
-                                  <w:szCs w:val="15"/>
-                                </w:rPr>
-                                <w:t xml:space="preserve">Capítulo I </w:t>
-                              </w:r>
-                              <w:r>
-                                <w:rPr>
-                                  <w:rFonts w:ascii="Poppins" w:hAnsi="Poppins" w:cs="Poppins"/>
-                                  <w:color w:val="2B2B2B"/>
-                                  <w:sz w:val="15"/>
-                                  <w:szCs w:val="15"/>
-                                </w:rPr>
-                                <w:t xml:space="preserve">Normas generales</w:t>
-                              </w:r>
-                            </w:p>
-                          </w:txbxContent>
-                        </wps:txbx>
-                        <wps:bodyPr rot="0" vert="horz" wrap="square" lIns="54852" tIns="0" rIns="54852" bIns="0" anchor="ctr" anchorCtr="0">
-                          <a:noAutofit/>
-                        </wps:bodyPr>
-                      </wps:wsp>
+                        </pic:spPr>
+                      </pic:pic>
                     </a:graphicData>
                   </a:graphic>
-                </wp:inline>
+                </wp:anchor>
               </w:drawing>
             </w:r>
-          </w:p>
-          <w:p>
-            <w:pPr>
-              <w:pStyle w:val="tight"/>
-              <w:spacing w:after="0" w:before="58"/>
+            <w:r>
+              <w:t xml:space="preserve">	</w:t>
+            </w:r>
+            <w:r>
+              <w:rPr>
+                <w:rFonts w:ascii="Poppins" w:cs="Poppins" w:eastAsia="Poppins" w:hAnsi="Poppins"/>
+                <w:b/>
+                <w:bCs/>
+                <w:color w:val="143548"/>
+                <w:sz w:val="15"/>
+                <w:szCs w:val="15"/>
+              </w:rPr>
+              <w:t xml:space="preserve">Capítulo I </w:t>
+            </w:r>
+            <w:r>
+              <w:rPr>
+                <w:rFonts w:ascii="Poppins" w:cs="Poppins" w:eastAsia="Poppins" w:hAnsi="Poppins"/>
+                <w:color w:val="2B2B2B"/>
+                <w:sz w:val="15"/>
+                <w:szCs w:val="15"/>
+              </w:rPr>
+              <w:t xml:space="preserve">Normas generales</w:t>
+            </w:r>
+          </w:p>
+          <w:p>
+            <w:pPr>
+              <w:tabs>
+                <w:tab w:val="left" w:pos="216"/>
+              </w:tabs>
+              <w:spacing w:after="86" w:before="0" w:line="240" w:lineRule="auto"/>
             </w:pPr>
             <w:r>
               <w:drawing>
-                <wp:inline distT="0" distB="0" distL="0" distR="0">
-                  <wp:extent cx="4336051" cy="173698"/>
-                  <wp:effectExtent l="0" t="0" r="0" b="0"/>
-                  <wp:docPr id="5020" name="Forma 5020"/>
-                  <wp:cNvGraphicFramePr/>
+                <wp:anchor distT="0" distB="0" distL="0" distR="0" simplePos="0" allowOverlap="1" behindDoc="1" locked="1" layoutInCell="1" relativeHeight="173693">
+                  <wp:simplePos x="0" y="0"/>
+                  <wp:positionH relativeFrom="column">
+                    <wp:posOffset>0</wp:posOffset>
+                  </wp:positionH>
+                  <wp:positionV relativeFrom="paragraph">
+                    <wp:posOffset>-15421</wp:posOffset>
+                  </wp:positionV>
+                  <wp:extent cx="4335915" cy="173693"/>
+                  <wp:effectExtent t="0" r="0" b="0" l="0"/>
+                  <wp:wrapNone/>
+                  <wp:docPr id="1" name="" descr="" title=""/>
+                  <wp:cNvGraphicFramePr>
+                    <a:graphicFrameLocks xmlns:a="http://schemas.openxmlformats.org/drawingml/2006/main" noChangeAspect="1"/>
+                  </wp:cNvGraphicFramePr>
                   <a:graphic xmlns:a="http://schemas.openxmlformats.org/drawingml/2006/main">
-                    <a:graphicData uri="http://schemas.microsoft.com/office/word/2010/wordprocessingShape">
-                      <wps:wsp>
-                        <wps:cNvSpPr/>
-                        <wps:spPr>
+                    <a:graphicData uri="http://schemas.openxmlformats.org/drawingml/2006/picture">
+                      <pic:pic xmlns:pic="http://schemas.openxmlformats.org/drawingml/2006/picture">
+                        <pic:nvPicPr>
+                          <pic:cNvPr id="0" name="" descr=""/>
+                          <pic:cNvPicPr>
+                            <a:picLocks noChangeAspect="1" noChangeArrowheads="1"/>
+                          </pic:cNvPicPr>
+                        </pic:nvPicPr>
+                        <pic:blipFill>
+                          <a:blip r:embed="rId38" cstate="none"/>
+                          <a:srcRect/>
+                          <a:stretch>
+                            <a:fillRect/>
+                          </a:stretch>
+                        </pic:blipFill>
+                        <pic:spPr bwMode="auto">
                           <a:xfrm>
                             <a:off x="0" y="0"/>
-                            <a:ext cx="4336051" cy="173698"/>
+                            <a:ext cx="4335915" cy="173693"/>
                           </a:xfrm>
-                          <a:prstGeom prst="roundRect">
-                            <a:avLst>
-                              <a:gd name="adj" fmla="val 50000"/>
-                            </a:avLst>
+                          <a:prstGeom prst="rect">
+                            <a:avLst/>
                           </a:prstGeom>
-                          <a:solidFill>
-                            <a:srgbClr val="FFFFFF"/>
-                          </a:solidFill>
-                          <a:ln w="9525">
-                            <a:solidFill>
-                              <a:srgbClr val="CFE3EC"/>
-                            </a:solidFill>
-                          </a:ln>
-                        </wps:spPr>
-                        <wps:txbx>
-                          <w:txbxContent>
-                            <w:p>
-                              <w:pPr>
-                                <w:spacing w:before="0" w:after="0" w:line="240" w:lineRule="auto"/>
-                                <w:jc w:val="center"/>
-                              </w:pPr>
-                              <w:r>
-                                <w:rPr>
-                                  <w:rFonts w:ascii="Poppins" w:hAnsi="Poppins" w:cs="Poppins"/>
-                                  <w:b/>
-                                  <w:bCs/>
-                                  <w:color w:val="143548"/>
-                                  <w:sz w:val="15"/>
-                                  <w:szCs w:val="15"/>
-                                </w:rPr>
-                                <w:t xml:space="preserve">Capítulo II </w:t>
-                              </w:r>
-                              <w:r>
-                                <w:rPr>
-                                  <w:rFonts w:ascii="Poppins" w:hAnsi="Poppins" w:cs="Poppins"/>
-                                  <w:color w:val="2B2B2B"/>
-                                  <w:sz w:val="15"/>
-                                  <w:szCs w:val="15"/>
-                                </w:rPr>
-                                <w:t xml:space="preserve">Procedimientos ordinarios de provisión de personal funcionario de carrera</w:t>
-                              </w:r>
-                            </w:p>
-                          </w:txbxContent>
-                        </wps:txbx>
-                        <wps:bodyPr rot="0" vert="horz" wrap="square" lIns="54852" tIns="0" rIns="54852" bIns="0" anchor="ctr" anchorCtr="0">
-                          <a:noAutofit/>
-                        </wps:bodyPr>
-                      </wps:wsp>
+                        </pic:spPr>
+                      </pic:pic>
                     </a:graphicData>
                   </a:graphic>
-                </wp:inline>
+                </wp:anchor>
               </w:drawing>
             </w:r>
-          </w:p>
-          <w:p>
-            <w:pPr>
-              <w:pStyle w:val="tight"/>
-              <w:spacing w:after="0" w:before="58"/>
+            <w:r>
+              <w:t xml:space="preserve">	</w:t>
+            </w:r>
+            <w:r>
+              <w:rPr>
+                <w:rFonts w:ascii="Poppins" w:cs="Poppins" w:eastAsia="Poppins" w:hAnsi="Poppins"/>
+                <w:b/>
+                <w:bCs/>
+                <w:color w:val="143548"/>
+                <w:sz w:val="15"/>
+                <w:szCs w:val="15"/>
+              </w:rPr>
+              <w:t xml:space="preserve">Capítulo II </w:t>
+            </w:r>
+            <w:r>
+              <w:rPr>
+                <w:rFonts w:ascii="Poppins" w:cs="Poppins" w:eastAsia="Poppins" w:hAnsi="Poppins"/>
+                <w:color w:val="2B2B2B"/>
+                <w:sz w:val="15"/>
+                <w:szCs w:val="15"/>
+              </w:rPr>
+              <w:t xml:space="preserve">Procedimientos ordinarios de provisión de personal funcionario de carrera</w:t>
+            </w:r>
+          </w:p>
+          <w:p>
+            <w:pPr>
+              <w:tabs>
+                <w:tab w:val="left" w:pos="216"/>
+              </w:tabs>
+              <w:spacing w:after="0" w:before="0" w:line="240" w:lineRule="auto"/>
             </w:pPr>
             <w:r>
               <w:drawing>
-                <wp:inline distT="0" distB="0" distL="0" distR="0">
-                  <wp:extent cx="3452019" cy="173698"/>
-                  <wp:effectExtent l="0" t="0" r="0" b="0"/>
-                  <wp:docPr id="5021" name="Forma 5021"/>
-                  <wp:cNvGraphicFramePr/>
+                <wp:anchor distT="0" distB="0" distL="0" distR="0" simplePos="0" allowOverlap="1" behindDoc="1" locked="1" layoutInCell="1" relativeHeight="173693">
+                  <wp:simplePos x="0" y="0"/>
+                  <wp:positionH relativeFrom="column">
+                    <wp:posOffset>0</wp:posOffset>
+                  </wp:positionH>
+                  <wp:positionV relativeFrom="paragraph">
+                    <wp:posOffset>-15421</wp:posOffset>
+                  </wp:positionV>
+                  <wp:extent cx="3451911" cy="173693"/>
+                  <wp:effectExtent t="0" r="0" b="0" l="0"/>
+                  <wp:wrapNone/>
+                  <wp:docPr id="1" name="" descr="" title=""/>
+                  <wp:cNvGraphicFramePr>
+                    <a:graphicFrameLocks xmlns:a="http://schemas.openxmlformats.org/drawingml/2006/main" noChangeAspect="1"/>
+                  </wp:cNvGraphicFramePr>
                   <a:graphic xmlns:a="http://schemas.openxmlformats.org/drawingml/2006/main">
-                    <a:graphicData uri="http://schemas.microsoft.com/office/word/2010/wordprocessingShape">
-                      <wps:wsp>
-                        <wps:cNvSpPr/>
-                        <wps:spPr>
+                    <a:graphicData uri="http://schemas.openxmlformats.org/drawingml/2006/picture">
+                      <pic:pic xmlns:pic="http://schemas.openxmlformats.org/drawingml/2006/picture">
+                        <pic:nvPicPr>
+                          <pic:cNvPr id="0" name="" descr=""/>
+                          <pic:cNvPicPr>
+                            <a:picLocks noChangeAspect="1" noChangeArrowheads="1"/>
+                          </pic:cNvPicPr>
+                        </pic:nvPicPr>
+                        <pic:blipFill>
+                          <a:blip r:embed="rId39" cstate="none"/>
+                          <a:srcRect/>
+                          <a:stretch>
+                            <a:fillRect/>
+                          </a:stretch>
+                        </pic:blipFill>
+                        <pic:spPr bwMode="auto">
                           <a:xfrm>
                             <a:off x="0" y="0"/>
-                            <a:ext cx="3452019" cy="173698"/>
+                            <a:ext cx="3451911" cy="173693"/>
                           </a:xfrm>
-                          <a:prstGeom prst="roundRect">
-                            <a:avLst>
-                              <a:gd name="adj" fmla="val 50000"/>
-                            </a:avLst>
+                          <a:prstGeom prst="rect">
+                            <a:avLst/>
                           </a:prstGeom>
-                          <a:solidFill>
-                            <a:srgbClr val="FFFFFF"/>
-                          </a:solidFill>
-                          <a:ln w="9525">
-                            <a:solidFill>
-                              <a:srgbClr val="CFE3EC"/>
-                            </a:solidFill>
-                          </a:ln>
-                        </wps:spPr>
-                        <wps:txbx>
-                          <w:txbxContent>
-                            <w:p>
-                              <w:pPr>
-                                <w:spacing w:before="0" w:after="0" w:line="240" w:lineRule="auto"/>
-                                <w:jc w:val="center"/>
-                              </w:pPr>
-                              <w:r>
-                                <w:rPr>
-                                  <w:rFonts w:ascii="Poppins" w:hAnsi="Poppins" w:cs="Poppins"/>
-                                  <w:b/>
-                                  <w:bCs/>
-                                  <w:color w:val="143548"/>
-                                  <w:sz w:val="15"/>
-                                  <w:szCs w:val="15"/>
-                                </w:rPr>
-                                <w:t xml:space="preserve">Capítulo III </w:t>
-                              </w:r>
-                              <w:r>
-                                <w:rPr>
-                                  <w:rFonts w:ascii="Poppins" w:hAnsi="Poppins" w:cs="Poppins"/>
-                                  <w:color w:val="2B2B2B"/>
-                                  <w:sz w:val="15"/>
-                                  <w:szCs w:val="15"/>
-                                </w:rPr>
-                                <w:t xml:space="preserve">Procedimientos de provisión de carácter extraordinario</w:t>
-                              </w:r>
-                            </w:p>
-                          </w:txbxContent>
-                        </wps:txbx>
-                        <wps:bodyPr rot="0" vert="horz" wrap="square" lIns="54852" tIns="0" rIns="54852" bIns="0" anchor="ctr" anchorCtr="0">
-                          <a:noAutofit/>
-                        </wps:bodyPr>
-                      </wps:wsp>
+                        </pic:spPr>
+                      </pic:pic>
                     </a:graphicData>
                   </a:graphic>
-                </wp:inline>
+                </wp:anchor>
               </w:drawing>
+            </w:r>
+            <w:r>
+              <w:t xml:space="preserve">	</w:t>
+            </w:r>
+            <w:r>
+              <w:rPr>
+                <w:rFonts w:ascii="Poppins" w:cs="Poppins" w:eastAsia="Poppins" w:hAnsi="Poppins"/>
+                <w:b/>
+                <w:bCs/>
+                <w:color w:val="143548"/>
+                <w:sz w:val="15"/>
+                <w:szCs w:val="15"/>
+              </w:rPr>
+              <w:t xml:space="preserve">Capítulo III </w:t>
+            </w:r>
+            <w:r>
+              <w:rPr>
+                <w:rFonts w:ascii="Poppins" w:cs="Poppins" w:eastAsia="Poppins" w:hAnsi="Poppins"/>
+                <w:color w:val="2B2B2B"/>
+                <w:sz w:val="15"/>
+                <w:szCs w:val="15"/>
+              </w:rPr>
+              <w:t xml:space="preserve">Procedimientos de provisión de carácter extraordinario</w:t>
             </w:r>
           </w:p>
           <w:p>
@@ -2970,7 +2989,7 @@
                           </pic:cNvPicPr>
                         </pic:nvPicPr>
                         <pic:blipFill>
-                          <a:blip r:embed="rId21" cstate="none"/>
+                          <a:blip r:embed="rId40" cstate="none"/>
                           <a:srcRect/>
                           <a:stretch>
                             <a:fillRect/>
@@ -3044,227 +3063,239 @@
           </w:p>
           <w:p>
             <w:pPr>
-              <w:pStyle w:val="tight"/>
-              <w:spacing w:after="0" w:before="0"/>
+              <w:tabs>
+                <w:tab w:val="left" w:pos="216"/>
+              </w:tabs>
+              <w:spacing w:after="86" w:before="0" w:line="240" w:lineRule="auto"/>
             </w:pPr>
             <w:r>
               <w:drawing>
-                <wp:inline distT="0" distB="0" distL="0" distR="0">
-                  <wp:extent cx="4244631" cy="173698"/>
-                  <wp:effectExtent l="0" t="0" r="0" b="0"/>
-                  <wp:docPr id="5022" name="Forma 5022"/>
-                  <wp:cNvGraphicFramePr/>
+                <wp:anchor distT="0" distB="0" distL="0" distR="0" simplePos="0" allowOverlap="1" behindDoc="1" locked="1" layoutInCell="1" relativeHeight="173693">
+                  <wp:simplePos x="0" y="0"/>
+                  <wp:positionH relativeFrom="column">
+                    <wp:posOffset>0</wp:posOffset>
+                  </wp:positionH>
+                  <wp:positionV relativeFrom="paragraph">
+                    <wp:posOffset>-15421</wp:posOffset>
+                  </wp:positionV>
+                  <wp:extent cx="4244498" cy="173693"/>
+                  <wp:effectExtent t="0" r="0" b="0" l="0"/>
+                  <wp:wrapNone/>
+                  <wp:docPr id="1" name="" descr="" title=""/>
+                  <wp:cNvGraphicFramePr>
+                    <a:graphicFrameLocks xmlns:a="http://schemas.openxmlformats.org/drawingml/2006/main" noChangeAspect="1"/>
+                  </wp:cNvGraphicFramePr>
                   <a:graphic xmlns:a="http://schemas.openxmlformats.org/drawingml/2006/main">
-                    <a:graphicData uri="http://schemas.microsoft.com/office/word/2010/wordprocessingShape">
-                      <wps:wsp>
-                        <wps:cNvSpPr/>
-                        <wps:spPr>
+                    <a:graphicData uri="http://schemas.openxmlformats.org/drawingml/2006/picture">
+                      <pic:pic xmlns:pic="http://schemas.openxmlformats.org/drawingml/2006/picture">
+                        <pic:nvPicPr>
+                          <pic:cNvPr id="0" name="" descr=""/>
+                          <pic:cNvPicPr>
+                            <a:picLocks noChangeAspect="1" noChangeArrowheads="1"/>
+                          </pic:cNvPicPr>
+                        </pic:nvPicPr>
+                        <pic:blipFill>
+                          <a:blip r:embed="rId41" cstate="none"/>
+                          <a:srcRect/>
+                          <a:stretch>
+                            <a:fillRect/>
+                          </a:stretch>
+                        </pic:blipFill>
+                        <pic:spPr bwMode="auto">
                           <a:xfrm>
                             <a:off x="0" y="0"/>
-                            <a:ext cx="4244631" cy="173698"/>
+                            <a:ext cx="4244498" cy="173693"/>
                           </a:xfrm>
-                          <a:prstGeom prst="roundRect">
-                            <a:avLst>
-                              <a:gd name="adj" fmla="val 50000"/>
-                            </a:avLst>
+                          <a:prstGeom prst="rect">
+                            <a:avLst/>
                           </a:prstGeom>
-                          <a:solidFill>
-                            <a:srgbClr val="FFFFFF"/>
-                          </a:solidFill>
-                          <a:ln w="9525">
-                            <a:solidFill>
-                              <a:srgbClr val="CFE3EC"/>
-                            </a:solidFill>
-                          </a:ln>
-                        </wps:spPr>
-                        <wps:txbx>
-                          <w:txbxContent>
-                            <w:p>
-                              <w:pPr>
-                                <w:spacing w:before="0" w:after="0" w:line="240" w:lineRule="auto"/>
-                                <w:jc w:val="center"/>
-                              </w:pPr>
-                              <w:r>
-                                <w:rPr>
-                                  <w:rFonts w:ascii="Poppins" w:hAnsi="Poppins" w:cs="Poppins"/>
-                                  <w:b/>
-                                  <w:bCs/>
-                                  <w:color w:val="143548"/>
-                                  <w:sz w:val="15"/>
-                                  <w:szCs w:val="15"/>
-                                </w:rPr>
-                                <w:t xml:space="preserve">Capítulo I </w:t>
-                              </w:r>
-                              <w:r>
-                                <w:rPr>
-                                  <w:rFonts w:ascii="Poppins" w:hAnsi="Poppins" w:cs="Poppins"/>
-                                  <w:color w:val="2B2B2B"/>
-                                  <w:sz w:val="15"/>
-                                  <w:szCs w:val="15"/>
-                                </w:rPr>
-                                <w:t xml:space="preserve">Adquisición y pérdida de la condición de personal funcionario de carrera</w:t>
-                              </w:r>
-                            </w:p>
-                          </w:txbxContent>
-                        </wps:txbx>
-                        <wps:bodyPr rot="0" vert="horz" wrap="square" lIns="54852" tIns="0" rIns="54852" bIns="0" anchor="ctr" anchorCtr="0">
-                          <a:noAutofit/>
-                        </wps:bodyPr>
-                      </wps:wsp>
+                        </pic:spPr>
+                      </pic:pic>
                     </a:graphicData>
                   </a:graphic>
-                </wp:inline>
+                </wp:anchor>
               </w:drawing>
             </w:r>
-          </w:p>
-          <w:p>
-            <w:pPr>
-              <w:pStyle w:val="tight"/>
-              <w:spacing w:after="0" w:before="58"/>
+            <w:r>
+              <w:t xml:space="preserve">	</w:t>
+            </w:r>
+            <w:r>
+              <w:rPr>
+                <w:rFonts w:ascii="Poppins" w:cs="Poppins" w:eastAsia="Poppins" w:hAnsi="Poppins"/>
+                <w:b/>
+                <w:bCs/>
+                <w:color w:val="143548"/>
+                <w:sz w:val="15"/>
+                <w:szCs w:val="15"/>
+              </w:rPr>
+              <w:t xml:space="preserve">Capítulo I </w:t>
+            </w:r>
+            <w:r>
+              <w:rPr>
+                <w:rFonts w:ascii="Poppins" w:cs="Poppins" w:eastAsia="Poppins" w:hAnsi="Poppins"/>
+                <w:color w:val="2B2B2B"/>
+                <w:sz w:val="15"/>
+                <w:szCs w:val="15"/>
+              </w:rPr>
+              <w:t xml:space="preserve">Adquisición y pérdida de la condición de personal funcionario de carrera</w:t>
+            </w:r>
+          </w:p>
+          <w:p>
+            <w:pPr>
+              <w:tabs>
+                <w:tab w:val="left" w:pos="216"/>
+              </w:tabs>
+              <w:spacing w:after="86" w:before="0" w:line="240" w:lineRule="auto"/>
             </w:pPr>
             <w:r>
               <w:drawing>
-                <wp:inline distT="0" distB="0" distL="0" distR="0">
-                  <wp:extent cx="3918261" cy="173698"/>
-                  <wp:effectExtent l="0" t="0" r="0" b="0"/>
-                  <wp:docPr id="5023" name="Forma 5023"/>
-                  <wp:cNvGraphicFramePr/>
+                <wp:anchor distT="0" distB="0" distL="0" distR="0" simplePos="0" allowOverlap="1" behindDoc="1" locked="1" layoutInCell="1" relativeHeight="173693">
+                  <wp:simplePos x="0" y="0"/>
+                  <wp:positionH relativeFrom="column">
+                    <wp:posOffset>0</wp:posOffset>
+                  </wp:positionH>
+                  <wp:positionV relativeFrom="paragraph">
+                    <wp:posOffset>-15421</wp:posOffset>
+                  </wp:positionV>
+                  <wp:extent cx="3918139" cy="173693"/>
+                  <wp:effectExtent t="0" r="0" b="0" l="0"/>
+                  <wp:wrapNone/>
+                  <wp:docPr id="1" name="" descr="" title=""/>
+                  <wp:cNvGraphicFramePr>
+                    <a:graphicFrameLocks xmlns:a="http://schemas.openxmlformats.org/drawingml/2006/main" noChangeAspect="1"/>
+                  </wp:cNvGraphicFramePr>
                   <a:graphic xmlns:a="http://schemas.openxmlformats.org/drawingml/2006/main">
-                    <a:graphicData uri="http://schemas.microsoft.com/office/word/2010/wordprocessingShape">
-                      <wps:wsp>
-                        <wps:cNvSpPr/>
-                        <wps:spPr>
+                    <a:graphicData uri="http://schemas.openxmlformats.org/drawingml/2006/picture">
+                      <pic:pic xmlns:pic="http://schemas.openxmlformats.org/drawingml/2006/picture">
+                        <pic:nvPicPr>
+                          <pic:cNvPr id="0" name="" descr=""/>
+                          <pic:cNvPicPr>
+                            <a:picLocks noChangeAspect="1" noChangeArrowheads="1"/>
+                          </pic:cNvPicPr>
+                        </pic:nvPicPr>
+                        <pic:blipFill>
+                          <a:blip r:embed="rId42" cstate="none"/>
+                          <a:srcRect/>
+                          <a:stretch>
+                            <a:fillRect/>
+                          </a:stretch>
+                        </pic:blipFill>
+                        <pic:spPr bwMode="auto">
                           <a:xfrm>
                             <a:off x="0" y="0"/>
-                            <a:ext cx="3918261" cy="173698"/>
+                            <a:ext cx="3918139" cy="173693"/>
                           </a:xfrm>
-                          <a:prstGeom prst="roundRect">
-                            <a:avLst>
-                              <a:gd name="adj" fmla="val 50000"/>
-                            </a:avLst>
+                          <a:prstGeom prst="rect">
+                            <a:avLst/>
                           </a:prstGeom>
-                          <a:solidFill>
-                            <a:srgbClr val="FFFFFF"/>
-                          </a:solidFill>
-                          <a:ln w="9525">
-                            <a:solidFill>
-                              <a:srgbClr val="CFE3EC"/>
-                            </a:solidFill>
-                          </a:ln>
-                        </wps:spPr>
-                        <wps:txbx>
-                          <w:txbxContent>
-                            <w:p>
-                              <w:pPr>
-                                <w:spacing w:before="0" w:after="0" w:line="240" w:lineRule="auto"/>
-                                <w:jc w:val="center"/>
-                              </w:pPr>
-                              <w:r>
-                                <w:rPr>
-                                  <w:rFonts w:ascii="Poppins" w:hAnsi="Poppins" w:cs="Poppins"/>
-                                  <w:b/>
-                                  <w:bCs/>
-                                  <w:color w:val="143548"/>
-                                  <w:sz w:val="15"/>
-                                  <w:szCs w:val="15"/>
-                                </w:rPr>
-                                <w:t xml:space="preserve">Capítulo II </w:t>
-                              </w:r>
-                              <w:r>
-                                <w:rPr>
-                                  <w:rFonts w:ascii="Poppins" w:hAnsi="Poppins" w:cs="Poppins"/>
-                                  <w:color w:val="2B2B2B"/>
-                                  <w:sz w:val="15"/>
-                                  <w:szCs w:val="15"/>
-                                </w:rPr>
-                                <w:t xml:space="preserve">Rehabilitación de la condición de personal funcionario de carrera</w:t>
-                              </w:r>
-                            </w:p>
-                          </w:txbxContent>
-                        </wps:txbx>
-                        <wps:bodyPr rot="0" vert="horz" wrap="square" lIns="54852" tIns="0" rIns="54852" bIns="0" anchor="ctr" anchorCtr="0">
-                          <a:noAutofit/>
-                        </wps:bodyPr>
-                      </wps:wsp>
+                        </pic:spPr>
+                      </pic:pic>
                     </a:graphicData>
                   </a:graphic>
-                </wp:inline>
+                </wp:anchor>
               </w:drawing>
             </w:r>
-          </w:p>
-          <w:p>
-            <w:pPr>
-              <w:pStyle w:val="tight"/>
-              <w:spacing w:after="0" w:before="58"/>
+            <w:r>
+              <w:t xml:space="preserve">	</w:t>
+            </w:r>
+            <w:r>
+              <w:rPr>
+                <w:rFonts w:ascii="Poppins" w:cs="Poppins" w:eastAsia="Poppins" w:hAnsi="Poppins"/>
+                <w:b/>
+                <w:bCs/>
+                <w:color w:val="143548"/>
+                <w:sz w:val="15"/>
+                <w:szCs w:val="15"/>
+              </w:rPr>
+              <w:t xml:space="preserve">Capítulo II </w:t>
+            </w:r>
+            <w:r>
+              <w:rPr>
+                <w:rFonts w:ascii="Poppins" w:cs="Poppins" w:eastAsia="Poppins" w:hAnsi="Poppins"/>
+                <w:color w:val="2B2B2B"/>
+                <w:sz w:val="15"/>
+                <w:szCs w:val="15"/>
+              </w:rPr>
+              <w:t xml:space="preserve">Rehabilitación de la condición de personal funcionario de carrera</w:t>
+            </w:r>
+          </w:p>
+          <w:p>
+            <w:pPr>
+              <w:tabs>
+                <w:tab w:val="left" w:pos="216"/>
+              </w:tabs>
+              <w:spacing w:after="0" w:before="0" w:line="240" w:lineRule="auto"/>
             </w:pPr>
             <w:r>
               <w:drawing>
-                <wp:inline distT="0" distB="0" distL="0" distR="0">
-                  <wp:extent cx="3735421" cy="173698"/>
-                  <wp:effectExtent l="0" t="0" r="0" b="0"/>
-                  <wp:docPr id="5024" name="Forma 5024"/>
-                  <wp:cNvGraphicFramePr/>
+                <wp:anchor distT="0" distB="0" distL="0" distR="0" simplePos="0" allowOverlap="1" behindDoc="1" locked="1" layoutInCell="1" relativeHeight="173693">
+                  <wp:simplePos x="0" y="0"/>
+                  <wp:positionH relativeFrom="column">
+                    <wp:posOffset>0</wp:posOffset>
+                  </wp:positionH>
+                  <wp:positionV relativeFrom="paragraph">
+                    <wp:posOffset>-15421</wp:posOffset>
+                  </wp:positionV>
+                  <wp:extent cx="3735304" cy="173693"/>
+                  <wp:effectExtent t="0" r="0" b="0" l="0"/>
+                  <wp:wrapNone/>
+                  <wp:docPr id="1" name="" descr="" title=""/>
+                  <wp:cNvGraphicFramePr>
+                    <a:graphicFrameLocks xmlns:a="http://schemas.openxmlformats.org/drawingml/2006/main" noChangeAspect="1"/>
+                  </wp:cNvGraphicFramePr>
                   <a:graphic xmlns:a="http://schemas.openxmlformats.org/drawingml/2006/main">
-                    <a:graphicData uri="http://schemas.microsoft.com/office/word/2010/wordprocessingShape">
-                      <wps:wsp>
-                        <wps:cNvSpPr/>
-                        <wps:spPr>
+                    <a:graphicData uri="http://schemas.openxmlformats.org/drawingml/2006/picture">
+                      <pic:pic xmlns:pic="http://schemas.openxmlformats.org/drawingml/2006/picture">
+                        <pic:nvPicPr>
+                          <pic:cNvPr id="0" name="" descr=""/>
+                          <pic:cNvPicPr>
+                            <a:picLocks noChangeAspect="1" noChangeArrowheads="1"/>
+                          </pic:cNvPicPr>
+                        </pic:nvPicPr>
+                        <pic:blipFill>
+                          <a:blip r:embed="rId43" cstate="none"/>
+                          <a:srcRect/>
+                          <a:stretch>
+                            <a:fillRect/>
+                          </a:stretch>
+                        </pic:blipFill>
+                        <pic:spPr bwMode="auto">
                           <a:xfrm>
                             <a:off x="0" y="0"/>
-                            <a:ext cx="3735421" cy="173698"/>
+                            <a:ext cx="3735304" cy="173693"/>
                           </a:xfrm>
-                          <a:prstGeom prst="roundRect">
-                            <a:avLst>
-                              <a:gd name="adj" fmla="val 50000"/>
-                            </a:avLst>
+                          <a:prstGeom prst="rect">
+                            <a:avLst/>
                           </a:prstGeom>
-                          <a:solidFill>
-                            <a:srgbClr val="FFFFFF"/>
-                          </a:solidFill>
-                          <a:ln w="9525">
-                            <a:solidFill>
-                              <a:srgbClr val="CFE3EC"/>
-                            </a:solidFill>
-                          </a:ln>
-                        </wps:spPr>
-                        <wps:txbx>
-                          <w:txbxContent>
-                            <w:p>
-                              <w:pPr>
-                                <w:spacing w:before="0" w:after="0" w:line="240" w:lineRule="auto"/>
-                                <w:jc w:val="center"/>
-                              </w:pPr>
-                              <w:r>
-                                <w:rPr>
-                                  <w:rFonts w:ascii="Poppins" w:hAnsi="Poppins" w:cs="Poppins"/>
-                                  <w:b/>
-                                  <w:bCs/>
-                                  <w:color w:val="143548"/>
-                                  <w:sz w:val="15"/>
-                                  <w:szCs w:val="15"/>
-                                </w:rPr>
-                                <w:t xml:space="preserve">Capítulo III </w:t>
-                              </w:r>
-                              <w:r>
-                                <w:rPr>
-                                  <w:rFonts w:ascii="Poppins" w:hAnsi="Poppins" w:cs="Poppins"/>
-                                  <w:color w:val="2B2B2B"/>
-                                  <w:sz w:val="15"/>
-                                  <w:szCs w:val="15"/>
-                                </w:rPr>
-                                <w:t xml:space="preserve">Adquisición y pérdida de la condición de personal laboral fijo</w:t>
-                              </w:r>
-                            </w:p>
-                          </w:txbxContent>
-                        </wps:txbx>
-                        <wps:bodyPr rot="0" vert="horz" wrap="square" lIns="54852" tIns="0" rIns="54852" bIns="0" anchor="ctr" anchorCtr="0">
-                          <a:noAutofit/>
-                        </wps:bodyPr>
-                      </wps:wsp>
+                        </pic:spPr>
+                      </pic:pic>
                     </a:graphicData>
                   </a:graphic>
-                </wp:inline>
+                </wp:anchor>
               </w:drawing>
+            </w:r>
+            <w:r>
+              <w:t xml:space="preserve">	</w:t>
+            </w:r>
+            <w:r>
+              <w:rPr>
+                <w:rFonts w:ascii="Poppins" w:cs="Poppins" w:eastAsia="Poppins" w:hAnsi="Poppins"/>
+                <w:b/>
+                <w:bCs/>
+                <w:color w:val="143548"/>
+                <w:sz w:val="15"/>
+                <w:szCs w:val="15"/>
+              </w:rPr>
+              <w:t xml:space="preserve">Capítulo III </w:t>
+            </w:r>
+            <w:r>
+              <w:rPr>
+                <w:rFonts w:ascii="Poppins" w:cs="Poppins" w:eastAsia="Poppins" w:hAnsi="Poppins"/>
+                <w:color w:val="2B2B2B"/>
+                <w:sz w:val="15"/>
+                <w:szCs w:val="15"/>
+              </w:rPr>
+              <w:t xml:space="preserve">Adquisición y pérdida de la condición de personal laboral fijo</w:t>
             </w:r>
           </w:p>
           <w:p>
@@ -3397,7 +3428,7 @@
                     </pic:cNvPicPr>
                   </pic:nvPicPr>
                   <pic:blipFill>
-                    <a:blip r:embed="rId22" cstate="none"/>
+                    <a:blip r:embed="rId44" cstate="none"/>
                     <a:srcRect/>
                     <a:stretch>
                       <a:fillRect/>
@@ -3437,7 +3468,7 @@
                     </pic:cNvPicPr>
                   </pic:nvPicPr>
                   <pic:blipFill>
-                    <a:blip r:embed="rId23" cstate="none"/>
+                    <a:blip r:embed="rId45" cstate="none"/>
                     <a:srcRect/>
                     <a:stretch>
                       <a:fillRect/>
@@ -3530,7 +3561,7 @@
           <wp:inline distT="0" distB="0" distL="0" distR="0">
             <wp:extent cx="6115998" cy="438816"/>
             <wp:effectExtent l="0" t="0" r="0" b="0"/>
-            <wp:docPr id="5025" name="Forma 5025"/>
+            <wp:docPr id="5001" name="Forma 5001"/>
             <wp:cNvGraphicFramePr/>
             <a:graphic xmlns:a="http://schemas.openxmlformats.org/drawingml/2006/main">
               <a:graphicData uri="http://schemas.microsoft.com/office/word/2010/wordprocessingShape">
@@ -3658,7 +3689,7 @@
                           </pic:cNvPicPr>
                         </pic:nvPicPr>
                         <pic:blipFill>
-                          <a:blip r:embed="rId24" cstate="none"/>
+                          <a:blip r:embed="rId46" cstate="none"/>
                           <a:srcRect/>
                           <a:stretch>
                             <a:fillRect/>
@@ -4021,7 +4052,7 @@
                           </pic:cNvPicPr>
                         </pic:nvPicPr>
                         <pic:blipFill>
-                          <a:blip r:embed="rId25" cstate="none"/>
+                          <a:blip r:embed="rId47" cstate="none"/>
                           <a:srcRect/>
                           <a:stretch>
                             <a:fillRect/>
@@ -5212,7 +5243,7 @@
                           </pic:cNvPicPr>
                         </pic:nvPicPr>
                         <pic:blipFill>
-                          <a:blip r:embed="rId26" cstate="none"/>
+                          <a:blip r:embed="rId48" cstate="none"/>
                           <a:srcRect/>
                           <a:stretch>
                             <a:fillRect/>
@@ -6156,7 +6187,7 @@
                           </pic:cNvPicPr>
                         </pic:nvPicPr>
                         <pic:blipFill>
-                          <a:blip r:embed="rId27" cstate="none"/>
+                          <a:blip r:embed="rId49" cstate="none"/>
                           <a:srcRect/>
                           <a:stretch>
                             <a:fillRect/>

</xml_diff>

<commit_message>
Decreto 51/2025 Google Docs v8: spacing calibrated against Docs screenshots
Co-Authored-By: Claude Opus 5.5 <noreply@anthropic.com>
Claude-Session: https://claude.ai/code/session_01T98mbmRs8KdzUGJ1QXPFqC
</commit_message>
<xml_diff>
--- a/virginia-jurado/decreto-51-2025-muestra-google-docs.docx
+++ b/virginia-jurado/decreto-51-2025-muestra-google-docs.docx
@@ -9,7 +9,7 @@
       <w:r>
         <w:drawing>
           <wp:inline distT="0" distB="0" distL="0" distR="0">
-            <wp:extent cx="7560197" cy="3016766"/>
+            <wp:extent cx="7560197" cy="3482993"/>
             <wp:effectExtent t="0" r="0" b="0" l="0"/>
             <wp:docPr id="1" name="" descr="" title=""/>
             <wp:cNvGraphicFramePr>
@@ -34,7 +34,7 @@
                   <pic:spPr bwMode="auto">
                     <a:xfrm>
                       <a:off x="0" y="0"/>
-                      <a:ext cx="7560197" cy="3016766"/>
+                      <a:ext cx="7560197" cy="3482993"/>
                     </a:xfrm>
                     <a:prstGeom prst="rect">
                       <a:avLst/>
@@ -49,7 +49,7 @@
     </w:p>
     <w:p>
       <w:pPr>
-        <w:spacing w:after="0" w:before="0" w:line="432" w:lineRule="exact"/>
+        <w:spacing w:after="0" w:before="0" w:line="288" w:lineRule="exact"/>
       </w:pPr>
       <w:r>
         <w:rPr>
@@ -92,7 +92,7 @@
     </w:p>
     <w:p>
       <w:pPr>
-        <w:spacing w:after="58" w:before="0"/>
+        <w:spacing w:after="0" w:before="0"/>
         <w:jc w:val="center"/>
       </w:pPr>
       <w:r>
@@ -138,7 +138,7 @@
     </w:p>
     <w:p>
       <w:pPr>
-        <w:spacing w:after="288" w:before="0" w:line="240" w:lineRule="auto"/>
+        <w:spacing w:after="533" w:before="0" w:line="240" w:lineRule="auto"/>
         <w:ind w:left="1627" w:right="1627"/>
         <w:jc w:val="center"/>
       </w:pPr>
@@ -154,7 +154,7 @@
     </w:p>
     <w:p>
       <w:pPr>
-        <w:spacing w:after="144" w:before="0" w:line="240" w:lineRule="auto"/>
+        <w:spacing w:after="259" w:before="0" w:line="240" w:lineRule="auto"/>
         <w:jc w:val="center"/>
       </w:pPr>
       <w:r>
@@ -472,7 +472,7 @@
     </w:p>
     <w:p>
       <w:pPr>
-        <w:spacing w:after="0" w:before="317"/>
+        <w:spacing w:after="0" w:before="489"/>
         <w:jc w:val="center"/>
       </w:pPr>
       <w:r>
@@ -522,7 +522,7 @@
           <w:footerReference w:type="default" r:id="rId7"/>
           <w:footerReference w:type="first" r:id="rId8"/>
           <w:pgSz w:w="11906" w:h="16838" w:orient="portrait"/>
-          <w:pgMar w:top="0" w:right="0" w:bottom="4319" w:left="0" w:header="0" w:footer="0" w:gutter="0"/>
+          <w:pgMar w:top="0" w:right="0" w:bottom="4780" w:left="0" w:header="0" w:footer="0" w:gutter="0"/>
           <w:pgNumType/>
           <w:titlePg/>
           <w:docGrid w:linePitch="360"/>
@@ -531,7 +531,7 @@
     </w:p>
     <w:p>
       <w:pPr>
-        <w:spacing w:after="432" w:before="0" w:line="240" w:lineRule="auto"/>
+        <w:spacing w:after="792" w:before="0" w:line="240" w:lineRule="auto"/>
         <w:ind w:left="432" w:right="489"/>
       </w:pPr>
       <w:r>
@@ -662,7 +662,7 @@
     </w:p>
     <w:p>
       <w:pPr>
-        <w:spacing w:after="29" w:before="0" w:line="240" w:lineRule="auto"/>
+        <w:spacing w:after="0" w:before="0" w:line="240" w:lineRule="auto"/>
         <w:ind w:left="950"/>
       </w:pPr>
       <w:r>
@@ -775,7 +775,7 @@
     </w:p>
     <w:p>
       <w:pPr>
-        <w:spacing w:after="72" w:before="0" w:line="240" w:lineRule="auto"/>
+        <w:spacing w:after="130" w:before="0" w:line="240" w:lineRule="auto"/>
         <w:ind w:left="950"/>
       </w:pPr>
       <w:r>
@@ -788,7 +788,7 @@
             <wp:positionV relativeFrom="paragraph">
               <wp:posOffset>0</wp:posOffset>
             </wp:positionV>
-            <wp:extent cx="18283" cy="282315"/>
+            <wp:extent cx="18283" cy="318882"/>
             <wp:effectExtent t="0" r="0" b="0" l="0"/>
             <wp:wrapNone/>
             <wp:docPr id="1" name="" descr="" title=""/>
@@ -814,7 +814,7 @@
                   <pic:spPr bwMode="auto">
                     <a:xfrm>
                       <a:off x="0" y="0"/>
-                      <a:ext cx="18283" cy="282315"/>
+                      <a:ext cx="18283" cy="318882"/>
                     </a:xfrm>
                     <a:prstGeom prst="rect">
                       <a:avLst/>
@@ -840,7 +840,7 @@
     </w:p>
     <w:p>
       <w:pPr>
-        <w:spacing w:after="173" w:before="0" w:line="240" w:lineRule="auto"/>
+        <w:spacing w:after="302" w:before="0" w:line="240" w:lineRule="auto"/>
         <w:ind w:left="1166"/>
       </w:pPr>
       <w:r>
@@ -853,7 +853,7 @@
             <wp:positionV relativeFrom="paragraph">
               <wp:posOffset>0</wp:posOffset>
             </wp:positionV>
-            <wp:extent cx="18283" cy="289153"/>
+            <wp:extent cx="18283" cy="371429"/>
             <wp:effectExtent t="0" r="0" b="0" l="0"/>
             <wp:wrapNone/>
             <wp:docPr id="1" name="" descr="" title=""/>
@@ -879,7 +879,7 @@
                   <pic:spPr bwMode="auto">
                     <a:xfrm>
                       <a:off x="0" y="0"/>
-                      <a:ext cx="18283" cy="289153"/>
+                      <a:ext cx="18283" cy="371429"/>
                     </a:xfrm>
                     <a:prstGeom prst="rect">
                       <a:avLst/>
@@ -894,7 +894,7 @@
     </w:p>
     <w:p>
       <w:pPr>
-        <w:spacing w:after="29" w:before="0" w:line="240" w:lineRule="auto"/>
+        <w:spacing w:after="0" w:before="0" w:line="240" w:lineRule="auto"/>
         <w:ind w:left="950"/>
       </w:pPr>
       <w:r>
@@ -1007,7 +1007,7 @@
     </w:p>
     <w:p>
       <w:pPr>
-        <w:spacing w:after="72" w:before="0" w:line="240" w:lineRule="auto"/>
+        <w:spacing w:after="130" w:before="0" w:line="240" w:lineRule="auto"/>
         <w:ind w:left="950"/>
       </w:pPr>
       <w:r>
@@ -1020,7 +1020,7 @@
             <wp:positionV relativeFrom="paragraph">
               <wp:posOffset>0</wp:posOffset>
             </wp:positionV>
-            <wp:extent cx="18283" cy="282315"/>
+            <wp:extent cx="18283" cy="318882"/>
             <wp:effectExtent t="0" r="0" b="0" l="0"/>
             <wp:wrapNone/>
             <wp:docPr id="1" name="" descr="" title=""/>
@@ -1046,7 +1046,7 @@
                   <pic:spPr bwMode="auto">
                     <a:xfrm>
                       <a:off x="0" y="0"/>
-                      <a:ext cx="18283" cy="282315"/>
+                      <a:ext cx="18283" cy="318882"/>
                     </a:xfrm>
                     <a:prstGeom prst="rect">
                       <a:avLst/>
@@ -1072,7 +1072,7 @@
     </w:p>
     <w:p>
       <w:pPr>
-        <w:spacing w:after="106" w:before="0" w:line="240" w:lineRule="auto"/>
+        <w:spacing w:after="179" w:before="0" w:line="240" w:lineRule="auto"/>
         <w:ind w:left="1166"/>
       </w:pPr>
       <w:r>
@@ -1181,7 +1181,7 @@
             <wp:positionV relativeFrom="paragraph">
               <wp:posOffset>0</wp:posOffset>
             </wp:positionV>
-            <wp:extent cx="18283" cy="246826"/>
+            <wp:extent cx="18283" cy="292810"/>
             <wp:effectExtent t="0" r="0" b="0" l="0"/>
             <wp:wrapNone/>
             <wp:docPr id="1" name="" descr="" title=""/>
@@ -1207,7 +1207,7 @@
                   <pic:spPr bwMode="auto">
                     <a:xfrm>
                       <a:off x="0" y="0"/>
-                      <a:ext cx="18283" cy="246826"/>
+                      <a:ext cx="18283" cy="292810"/>
                     </a:xfrm>
                     <a:prstGeom prst="rect">
                       <a:avLst/>
@@ -1270,7 +1270,7 @@
     </w:p>
     <w:p>
       <w:pPr>
-        <w:spacing w:after="173" w:before="0" w:line="240" w:lineRule="auto"/>
+        <w:spacing w:after="302" w:before="0" w:line="240" w:lineRule="auto"/>
         <w:ind w:left="1166"/>
       </w:pPr>
       <w:r>
@@ -1331,7 +1331,7 @@
             <wp:positionV relativeFrom="paragraph">
               <wp:posOffset>0</wp:posOffset>
             </wp:positionV>
-            <wp:extent cx="18283" cy="289153"/>
+            <wp:extent cx="18283" cy="371429"/>
             <wp:effectExtent t="0" r="0" b="0" l="0"/>
             <wp:wrapNone/>
             <wp:docPr id="1" name="" descr="" title=""/>
@@ -1357,7 +1357,7 @@
                   <pic:spPr bwMode="auto">
                     <a:xfrm>
                       <a:off x="0" y="0"/>
-                      <a:ext cx="18283" cy="289153"/>
+                      <a:ext cx="18283" cy="371429"/>
                     </a:xfrm>
                     <a:prstGeom prst="rect">
                       <a:avLst/>
@@ -1392,7 +1392,7 @@
     </w:p>
     <w:p>
       <w:pPr>
-        <w:spacing w:after="29" w:before="0" w:line="240" w:lineRule="auto"/>
+        <w:spacing w:after="0" w:before="0" w:line="240" w:lineRule="auto"/>
         <w:ind w:left="950"/>
       </w:pPr>
       <w:r>
@@ -1505,7 +1505,7 @@
     </w:p>
     <w:p>
       <w:pPr>
-        <w:spacing w:after="72" w:before="0" w:line="240" w:lineRule="auto"/>
+        <w:spacing w:after="130" w:before="0" w:line="240" w:lineRule="auto"/>
         <w:ind w:left="950"/>
       </w:pPr>
       <w:r>
@@ -1518,7 +1518,7 @@
             <wp:positionV relativeFrom="paragraph">
               <wp:posOffset>0</wp:posOffset>
             </wp:positionV>
-            <wp:extent cx="18283" cy="282315"/>
+            <wp:extent cx="18283" cy="318882"/>
             <wp:effectExtent t="0" r="0" b="0" l="0"/>
             <wp:wrapNone/>
             <wp:docPr id="1" name="" descr="" title=""/>
@@ -1544,7 +1544,7 @@
                   <pic:spPr bwMode="auto">
                     <a:xfrm>
                       <a:off x="0" y="0"/>
-                      <a:ext cx="18283" cy="282315"/>
+                      <a:ext cx="18283" cy="318882"/>
                     </a:xfrm>
                     <a:prstGeom prst="rect">
                       <a:avLst/>
@@ -1570,7 +1570,7 @@
     </w:p>
     <w:p>
       <w:pPr>
-        <w:spacing w:after="106" w:before="0" w:line="240" w:lineRule="auto"/>
+        <w:spacing w:after="179" w:before="0" w:line="240" w:lineRule="auto"/>
         <w:ind w:left="1166"/>
       </w:pPr>
       <w:r>
@@ -1679,7 +1679,7 @@
             <wp:positionV relativeFrom="paragraph">
               <wp:posOffset>0</wp:posOffset>
             </wp:positionV>
-            <wp:extent cx="18283" cy="246826"/>
+            <wp:extent cx="18283" cy="292810"/>
             <wp:effectExtent t="0" r="0" b="0" l="0"/>
             <wp:wrapNone/>
             <wp:docPr id="1" name="" descr="" title=""/>
@@ -1705,7 +1705,7 @@
                   <pic:spPr bwMode="auto">
                     <a:xfrm>
                       <a:off x="0" y="0"/>
-                      <a:ext cx="18283" cy="246826"/>
+                      <a:ext cx="18283" cy="292810"/>
                     </a:xfrm>
                     <a:prstGeom prst="rect">
                       <a:avLst/>
@@ -1768,7 +1768,7 @@
     </w:p>
     <w:p>
       <w:pPr>
-        <w:spacing w:after="106" w:before="0" w:line="240" w:lineRule="auto"/>
+        <w:spacing w:after="179" w:before="0" w:line="240" w:lineRule="auto"/>
         <w:ind w:left="1166"/>
       </w:pPr>
       <w:r>
@@ -1877,7 +1877,7 @@
             <wp:positionV relativeFrom="paragraph">
               <wp:posOffset>0</wp:posOffset>
             </wp:positionV>
-            <wp:extent cx="18283" cy="246826"/>
+            <wp:extent cx="18283" cy="292810"/>
             <wp:effectExtent t="0" r="0" b="0" l="0"/>
             <wp:wrapNone/>
             <wp:docPr id="1" name="" descr="" title=""/>
@@ -1903,7 +1903,7 @@
                   <pic:spPr bwMode="auto">
                     <a:xfrm>
                       <a:off x="0" y="0"/>
-                      <a:ext cx="18283" cy="246826"/>
+                      <a:ext cx="18283" cy="292810"/>
                     </a:xfrm>
                     <a:prstGeom prst="rect">
                       <a:avLst/>
@@ -1966,7 +1966,7 @@
     </w:p>
     <w:p>
       <w:pPr>
-        <w:spacing w:after="106" w:before="0" w:line="240" w:lineRule="auto"/>
+        <w:spacing w:after="179" w:before="0" w:line="240" w:lineRule="auto"/>
         <w:ind w:left="1166"/>
       </w:pPr>
       <w:r>
@@ -2027,7 +2027,7 @@
             <wp:positionV relativeFrom="paragraph">
               <wp:posOffset>0</wp:posOffset>
             </wp:positionV>
-            <wp:extent cx="18283" cy="246826"/>
+            <wp:extent cx="18283" cy="292810"/>
             <wp:effectExtent t="0" r="0" b="0" l="0"/>
             <wp:wrapNone/>
             <wp:docPr id="1" name="" descr="" title=""/>
@@ -2053,7 +2053,7 @@
                   <pic:spPr bwMode="auto">
                     <a:xfrm>
                       <a:off x="0" y="0"/>
-                      <a:ext cx="18283" cy="246826"/>
+                      <a:ext cx="18283" cy="292810"/>
                     </a:xfrm>
                     <a:prstGeom prst="rect">
                       <a:avLst/>
@@ -2088,7 +2088,7 @@
     </w:p>
     <w:p>
       <w:pPr>
-        <w:spacing w:after="173" w:before="0" w:line="240" w:lineRule="auto"/>
+        <w:spacing w:after="302" w:before="0" w:line="240" w:lineRule="auto"/>
         <w:ind w:left="1166"/>
       </w:pPr>
       <w:r>
@@ -2149,7 +2149,7 @@
             <wp:positionV relativeFrom="paragraph">
               <wp:posOffset>0</wp:posOffset>
             </wp:positionV>
-            <wp:extent cx="18283" cy="289153"/>
+            <wp:extent cx="18283" cy="371429"/>
             <wp:effectExtent t="0" r="0" b="0" l="0"/>
             <wp:wrapNone/>
             <wp:docPr id="1" name="" descr="" title=""/>
@@ -2175,7 +2175,7 @@
                   <pic:spPr bwMode="auto">
                     <a:xfrm>
                       <a:off x="0" y="0"/>
-                      <a:ext cx="18283" cy="289153"/>
+                      <a:ext cx="18283" cy="371429"/>
                     </a:xfrm>
                     <a:prstGeom prst="rect">
                       <a:avLst/>
@@ -2210,7 +2210,7 @@
     </w:p>
     <w:p>
       <w:pPr>
-        <w:spacing w:after="29" w:before="0" w:line="240" w:lineRule="auto"/>
+        <w:spacing w:after="0" w:before="0" w:line="240" w:lineRule="auto"/>
         <w:ind w:left="950"/>
       </w:pPr>
       <w:r>
@@ -2323,7 +2323,7 @@
     </w:p>
     <w:p>
       <w:pPr>
-        <w:spacing w:after="72" w:before="0" w:line="240" w:lineRule="auto"/>
+        <w:spacing w:after="130" w:before="0" w:line="240" w:lineRule="auto"/>
         <w:ind w:left="950"/>
       </w:pPr>
       <w:r>
@@ -2336,7 +2336,7 @@
             <wp:positionV relativeFrom="paragraph">
               <wp:posOffset>0</wp:posOffset>
             </wp:positionV>
-            <wp:extent cx="18283" cy="482355"/>
+            <wp:extent cx="18283" cy="518922"/>
             <wp:effectExtent t="0" r="0" b="0" l="0"/>
             <wp:wrapNone/>
             <wp:docPr id="1" name="" descr="" title=""/>
@@ -2362,7 +2362,7 @@
                   <pic:spPr bwMode="auto">
                     <a:xfrm>
                       <a:off x="0" y="0"/>
-                      <a:ext cx="18283" cy="482355"/>
+                      <a:ext cx="18283" cy="518922"/>
                     </a:xfrm>
                     <a:prstGeom prst="rect">
                       <a:avLst/>
@@ -2388,7 +2388,7 @@
     </w:p>
     <w:p>
       <w:pPr>
-        <w:spacing w:after="106" w:before="0" w:line="240" w:lineRule="auto"/>
+        <w:spacing w:after="179" w:before="0" w:line="240" w:lineRule="auto"/>
         <w:ind w:left="1166"/>
       </w:pPr>
       <w:r>
@@ -2449,7 +2449,7 @@
             <wp:positionV relativeFrom="paragraph">
               <wp:posOffset>0</wp:posOffset>
             </wp:positionV>
-            <wp:extent cx="18283" cy="246826"/>
+            <wp:extent cx="18283" cy="292810"/>
             <wp:effectExtent t="0" r="0" b="0" l="0"/>
             <wp:wrapNone/>
             <wp:docPr id="1" name="" descr="" title=""/>
@@ -2475,7 +2475,7 @@
                   <pic:spPr bwMode="auto">
                     <a:xfrm>
                       <a:off x="0" y="0"/>
-                      <a:ext cx="18283" cy="246826"/>
+                      <a:ext cx="18283" cy="292810"/>
                     </a:xfrm>
                     <a:prstGeom prst="rect">
                       <a:avLst/>
@@ -2510,7 +2510,7 @@
     </w:p>
     <w:p>
       <w:pPr>
-        <w:spacing w:after="106" w:before="0" w:line="240" w:lineRule="auto"/>
+        <w:spacing w:after="179" w:before="0" w:line="240" w:lineRule="auto"/>
         <w:ind w:left="1166"/>
       </w:pPr>
       <w:r>
@@ -2571,7 +2571,7 @@
             <wp:positionV relativeFrom="paragraph">
               <wp:posOffset>0</wp:posOffset>
             </wp:positionV>
-            <wp:extent cx="18283" cy="246826"/>
+            <wp:extent cx="18283" cy="292810"/>
             <wp:effectExtent t="0" r="0" b="0" l="0"/>
             <wp:wrapNone/>
             <wp:docPr id="1" name="" descr="" title=""/>
@@ -2597,7 +2597,7 @@
                   <pic:spPr bwMode="auto">
                     <a:xfrm>
                       <a:off x="0" y="0"/>
-                      <a:ext cx="18283" cy="246826"/>
+                      <a:ext cx="18283" cy="292810"/>
                     </a:xfrm>
                     <a:prstGeom prst="rect">
                       <a:avLst/>
@@ -2632,7 +2632,7 @@
     </w:p>
     <w:p>
       <w:pPr>
-        <w:spacing w:after="173" w:before="0" w:line="240" w:lineRule="auto"/>
+        <w:spacing w:after="302" w:before="0" w:line="240" w:lineRule="auto"/>
         <w:ind w:left="1166"/>
       </w:pPr>
       <w:r>
@@ -2693,7 +2693,7 @@
             <wp:positionV relativeFrom="paragraph">
               <wp:posOffset>0</wp:posOffset>
             </wp:positionV>
-            <wp:extent cx="18283" cy="289153"/>
+            <wp:extent cx="18283" cy="371429"/>
             <wp:effectExtent t="0" r="0" b="0" l="0"/>
             <wp:wrapNone/>
             <wp:docPr id="1" name="" descr="" title=""/>
@@ -2719,7 +2719,7 @@
                   <pic:spPr bwMode="auto">
                     <a:xfrm>
                       <a:off x="0" y="0"/>
-                      <a:ext cx="18283" cy="289153"/>
+                      <a:ext cx="18283" cy="371429"/>
                     </a:xfrm>
                     <a:prstGeom prst="rect">
                       <a:avLst/>
@@ -2754,7 +2754,7 @@
     </w:p>
     <w:p>
       <w:pPr>
-        <w:spacing w:after="29" w:before="0" w:line="240" w:lineRule="auto"/>
+        <w:spacing w:after="0" w:before="0" w:line="240" w:lineRule="auto"/>
         <w:ind w:left="950"/>
       </w:pPr>
       <w:r>
@@ -2867,7 +2867,7 @@
     </w:p>
     <w:p>
       <w:pPr>
-        <w:spacing w:after="72" w:before="0" w:line="240" w:lineRule="auto"/>
+        <w:spacing w:after="130" w:before="0" w:line="240" w:lineRule="auto"/>
         <w:ind w:left="950"/>
       </w:pPr>
       <w:r>
@@ -2880,7 +2880,7 @@
             <wp:positionV relativeFrom="paragraph">
               <wp:posOffset>0</wp:posOffset>
             </wp:positionV>
-            <wp:extent cx="18283" cy="482355"/>
+            <wp:extent cx="18283" cy="518922"/>
             <wp:effectExtent t="0" r="0" b="0" l="0"/>
             <wp:wrapNone/>
             <wp:docPr id="1" name="" descr="" title=""/>
@@ -2906,7 +2906,7 @@
                   <pic:spPr bwMode="auto">
                     <a:xfrm>
                       <a:off x="0" y="0"/>
-                      <a:ext cx="18283" cy="482355"/>
+                      <a:ext cx="18283" cy="518922"/>
                     </a:xfrm>
                     <a:prstGeom prst="rect">
                       <a:avLst/>
@@ -2932,7 +2932,7 @@
     </w:p>
     <w:p>
       <w:pPr>
-        <w:spacing w:after="106" w:before="0" w:line="240" w:lineRule="auto"/>
+        <w:spacing w:after="179" w:before="0" w:line="240" w:lineRule="auto"/>
         <w:ind w:left="1166"/>
       </w:pPr>
       <w:r>
@@ -2993,7 +2993,7 @@
             <wp:positionV relativeFrom="paragraph">
               <wp:posOffset>0</wp:posOffset>
             </wp:positionV>
-            <wp:extent cx="18283" cy="246826"/>
+            <wp:extent cx="18283" cy="292810"/>
             <wp:effectExtent t="0" r="0" b="0" l="0"/>
             <wp:wrapNone/>
             <wp:docPr id="1" name="" descr="" title=""/>
@@ -3019,7 +3019,7 @@
                   <pic:spPr bwMode="auto">
                     <a:xfrm>
                       <a:off x="0" y="0"/>
-                      <a:ext cx="18283" cy="246826"/>
+                      <a:ext cx="18283" cy="292810"/>
                     </a:xfrm>
                     <a:prstGeom prst="rect">
                       <a:avLst/>
@@ -3054,7 +3054,7 @@
     </w:p>
     <w:p>
       <w:pPr>
-        <w:spacing w:after="106" w:before="0" w:line="240" w:lineRule="auto"/>
+        <w:spacing w:after="179" w:before="0" w:line="240" w:lineRule="auto"/>
         <w:ind w:left="1166"/>
       </w:pPr>
       <w:r>
@@ -3115,7 +3115,7 @@
             <wp:positionV relativeFrom="paragraph">
               <wp:posOffset>0</wp:posOffset>
             </wp:positionV>
-            <wp:extent cx="18283" cy="246826"/>
+            <wp:extent cx="18283" cy="292810"/>
             <wp:effectExtent t="0" r="0" b="0" l="0"/>
             <wp:wrapNone/>
             <wp:docPr id="1" name="" descr="" title=""/>
@@ -3141,7 +3141,7 @@
                   <pic:spPr bwMode="auto">
                     <a:xfrm>
                       <a:off x="0" y="0"/>
-                      <a:ext cx="18283" cy="246826"/>
+                      <a:ext cx="18283" cy="292810"/>
                     </a:xfrm>
                     <a:prstGeom prst="rect">
                       <a:avLst/>
@@ -3176,7 +3176,7 @@
     </w:p>
     <w:p>
       <w:pPr>
-        <w:spacing w:after="173" w:before="0" w:line="240" w:lineRule="auto"/>
+        <w:spacing w:after="302" w:before="0" w:line="240" w:lineRule="auto"/>
         <w:ind w:left="1166"/>
       </w:pPr>
       <w:r>
@@ -3237,7 +3237,7 @@
             <wp:positionV relativeFrom="paragraph">
               <wp:posOffset>0</wp:posOffset>
             </wp:positionV>
-            <wp:extent cx="18283" cy="289153"/>
+            <wp:extent cx="18283" cy="371429"/>
             <wp:effectExtent t="0" r="0" b="0" l="0"/>
             <wp:wrapNone/>
             <wp:docPr id="1" name="" descr="" title=""/>
@@ -3263,7 +3263,7 @@
                   <pic:spPr bwMode="auto">
                     <a:xfrm>
                       <a:off x="0" y="0"/>
-                      <a:ext cx="18283" cy="289153"/>
+                      <a:ext cx="18283" cy="371429"/>
                     </a:xfrm>
                     <a:prstGeom prst="rect">
                       <a:avLst/>
@@ -3298,7 +3298,7 @@
     </w:p>
     <w:p>
       <w:pPr>
-        <w:spacing w:after="29" w:before="0" w:line="240" w:lineRule="auto"/>
+        <w:spacing w:after="0" w:before="0" w:line="240" w:lineRule="auto"/>
         <w:ind w:left="950"/>
       </w:pPr>
       <w:r>
@@ -3363,7 +3363,7 @@
     </w:p>
     <w:p>
       <w:pPr>
-        <w:spacing w:after="72" w:before="0" w:line="240" w:lineRule="auto"/>
+        <w:spacing w:after="130" w:before="0" w:line="240" w:lineRule="auto"/>
         <w:ind w:left="950"/>
       </w:pPr>
       <w:r>
@@ -3380,7 +3380,7 @@
     </w:p>
     <w:p>
       <w:pPr>
-        <w:spacing w:after="106" w:before="0" w:line="240" w:lineRule="auto"/>
+        <w:spacing w:after="179" w:before="0" w:line="240" w:lineRule="auto"/>
         <w:ind w:left="1166"/>
       </w:pPr>
       <w:r>
@@ -3454,7 +3454,7 @@
     </w:p>
     <w:p>
       <w:pPr>
-        <w:spacing w:after="106" w:before="0" w:line="240" w:lineRule="auto"/>
+        <w:spacing w:after="179" w:before="0" w:line="240" w:lineRule="auto"/>
         <w:ind w:left="1166"/>
       </w:pPr>
       <w:r>
@@ -3528,7 +3528,7 @@
     </w:p>
     <w:p>
       <w:pPr>
-        <w:spacing w:after="230" w:before="0" w:line="240" w:lineRule="auto"/>
+        <w:spacing w:after="302" w:before="0" w:line="240" w:lineRule="auto"/>
         <w:ind w:left="1166"/>
       </w:pPr>
       <w:r>
@@ -7028,7 +7028,7 @@
     <w:r>
       <w:drawing>
         <wp:inline distT="0" distB="0" distL="0" distR="0">
-          <wp:extent cx="7560197" cy="2742514"/>
+          <wp:extent cx="7560197" cy="3035049"/>
           <wp:effectExtent t="0" r="0" b="0" l="0"/>
           <wp:docPr id="1" name="" descr="" title=""/>
           <wp:cNvGraphicFramePr>
@@ -7053,7 +7053,7 @@
                 <pic:spPr bwMode="auto">
                   <a:xfrm>
                     <a:off x="0" y="0"/>
-                    <a:ext cx="7560197" cy="2742514"/>
+                    <a:ext cx="7560197" cy="3035049"/>
                   </a:xfrm>
                   <a:prstGeom prst="rect">
                     <a:avLst/>

</xml_diff>

<commit_message>
Decreto 51/2025 Google Docs: page-3 table aligned to the reference PDF
Multiple line spacing instead of exact (Docs), no vertical padding in the
concept column (it inflated rowspan rows), black lists as in the PDF, and
title bar as background image with editable text.

Co-Authored-By: Claude Opus 5.5 <noreply@anthropic.com>
Claude-Session: https://claude.ai/code/session_01T98mbmRs8KdzUGJ1QXPFqC
</commit_message>
<xml_diff>
--- a/virginia-jurado/decreto-51-2025-muestra-google-docs.docx
+++ b/virginia-jurado/decreto-51-2025-muestra-google-docs.docx
@@ -3757,77 +3757,67 @@
     </w:p>
     <w:p>
       <w:pPr>
-        <w:pStyle w:val="tight"/>
+        <w:spacing w:after="351" w:before="0" w:line="240" w:lineRule="auto"/>
+        <w:jc w:val="center"/>
       </w:pPr>
       <w:r>
         <w:drawing>
-          <wp:inline distT="0" distB="0" distL="0" distR="0">
-            <wp:extent cx="6115998" cy="438816"/>
-            <wp:effectExtent l="0" t="0" r="0" b="0"/>
-            <wp:docPr id="5001" name="Forma 5001"/>
-            <wp:cNvGraphicFramePr/>
+          <wp:anchor distT="0" distB="0" distL="0" distR="0" simplePos="0" allowOverlap="1" behindDoc="1" locked="1" layoutInCell="1" relativeHeight="1">
+            <wp:simplePos x="0" y="0"/>
+            <wp:positionH relativeFrom="page">
+              <wp:posOffset>722218</wp:posOffset>
+            </wp:positionH>
+            <wp:positionV relativeFrom="paragraph">
+              <wp:posOffset>-76518</wp:posOffset>
+            </wp:positionV>
+            <wp:extent cx="6115807" cy="438802"/>
+            <wp:effectExtent t="0" r="0" b="0" l="0"/>
+            <wp:wrapNone/>
+            <wp:docPr id="1" name="" descr="" title=""/>
+            <wp:cNvGraphicFramePr>
+              <a:graphicFrameLocks xmlns:a="http://schemas.openxmlformats.org/drawingml/2006/main" noChangeAspect="1"/>
+            </wp:cNvGraphicFramePr>
             <a:graphic xmlns:a="http://schemas.openxmlformats.org/drawingml/2006/main">
-              <a:graphicData uri="http://schemas.microsoft.com/office/word/2010/wordprocessingShape">
-                <wps:wsp>
-                  <wps:cNvSpPr/>
-                  <wps:spPr>
+              <a:graphicData uri="http://schemas.openxmlformats.org/drawingml/2006/picture">
+                <pic:pic xmlns:pic="http://schemas.openxmlformats.org/drawingml/2006/picture">
+                  <pic:nvPicPr>
+                    <pic:cNvPr id="0" name="" descr=""/>
+                    <pic:cNvPicPr>
+                      <a:picLocks noChangeAspect="1" noChangeArrowheads="1"/>
+                    </pic:cNvPicPr>
+                  </pic:nvPicPr>
+                  <pic:blipFill>
+                    <a:blip r:embed="rId49" cstate="none"/>
+                    <a:srcRect/>
+                    <a:stretch>
+                      <a:fillRect/>
+                    </a:stretch>
+                  </pic:blipFill>
+                  <pic:spPr bwMode="auto">
                     <a:xfrm>
                       <a:off x="0" y="0"/>
-                      <a:ext cx="6115998" cy="438816"/>
+                      <a:ext cx="6115807" cy="438802"/>
                     </a:xfrm>
-                    <a:prstGeom prst="roundRect">
-                      <a:avLst>
-                        <a:gd name="adj" fmla="val 50000"/>
-                      </a:avLst>
+                    <a:prstGeom prst="rect">
+                      <a:avLst/>
                     </a:prstGeom>
-                    <a:solidFill>
-                      <a:srgbClr val="143548"/>
-                    </a:solidFill>
-                    <a:ln>
-                      <a:noFill/>
-                    </a:ln>
-                  </wps:spPr>
-                  <wps:txbx>
-                    <w:txbxContent>
-                      <w:p>
-                        <w:pPr>
-                          <w:spacing w:before="0" w:after="0" w:line="240" w:lineRule="auto"/>
-                          <w:jc w:val="center"/>
-                        </w:pPr>
-                        <w:r>
-                          <w:rPr>
-                            <w:rFonts w:ascii="Poppins" w:hAnsi="Poppins" w:cs="Poppins"/>
-                            <w:b/>
-                            <w:bCs/>
-                            <w:color w:val="FFFFFF"/>
-                            <w:sz w:val="30"/>
-                            <w:szCs w:val="30"/>
-                          </w:rPr>
-                          <w:t xml:space="preserve">Título preliminar: Disposiciones generales</w:t>
-                        </w:r>
-                      </w:p>
-                    </w:txbxContent>
-                  </wps:txbx>
-                  <wps:bodyPr rot="0" vert="horz" wrap="square" lIns="91420" tIns="0" rIns="91420" bIns="0" anchor="ctr" anchorCtr="0">
-                    <a:noAutofit/>
-                  </wps:bodyPr>
-                </wps:wsp>
+                  </pic:spPr>
+                </pic:pic>
               </a:graphicData>
             </a:graphic>
-          </wp:inline>
+          </wp:anchor>
         </w:drawing>
       </w:r>
-    </w:p>
-    <w:p>
-      <w:pPr>
-        <w:spacing w:after="0" w:before="0" w:line="144" w:lineRule="exact"/>
-      </w:pPr>
       <w:r>
         <w:rPr>
-          <w:sz w:val="2"/>
-          <w:szCs w:val="2"/>
+          <w:rFonts w:ascii="Poppins" w:cs="Poppins" w:eastAsia="Poppins" w:hAnsi="Poppins"/>
+          <w:b/>
+          <w:bCs/>
+          <w:color w:val="FFFFFF"/>
+          <w:sz w:val="30"/>
+          <w:szCs w:val="30"/>
         </w:rPr>
-        <w:t xml:space="preserve"/>
+        <w:t xml:space="preserve">Título preliminar: Disposiciones generales</w:t>
       </w:r>
     </w:p>
     <w:tbl>
@@ -3861,9 +3851,9 @@
             </w:tcBorders>
             <w:shd w:fill="D1EDF9" w:color="auto" w:val="clear"/>
             <w:tcMar>
-              <w:top w:type="dxa" w:w="115"/>
+              <w:top w:type="dxa" w:w="0"/>
               <w:left w:type="dxa" w:w="72"/>
-              <w:bottom w:type="dxa" w:w="115"/>
+              <w:bottom w:type="dxa" w:w="0"/>
               <w:right w:type="dxa" w:w="72"/>
             </w:tcMar>
             <w:vAlign w:val="center"/>
@@ -3892,7 +3882,7 @@
                           </pic:cNvPicPr>
                         </pic:nvPicPr>
                         <pic:blipFill>
-                          <a:blip r:embed="rId49" cstate="none"/>
+                          <a:blip r:embed="rId50" cstate="none"/>
                           <a:srcRect/>
                           <a:stretch>
                             <a:fillRect/>
@@ -3916,7 +3906,7 @@
           </w:p>
           <w:p>
             <w:pPr>
-              <w:spacing w:after="0" w:before="0" w:line="216" w:lineRule="exact"/>
+              <w:spacing w:after="0" w:before="0" w:line="216" w:lineRule="auto"/>
               <w:jc w:val="center"/>
             </w:pPr>
             <w:r>
@@ -3963,7 +3953,7 @@
           </w:tcPr>
           <w:p>
             <w:pPr>
-              <w:spacing w:after="0" w:before="0" w:line="207" w:lineRule="exact"/>
+              <w:spacing w:after="0" w:before="0" w:line="221" w:lineRule="auto"/>
               <w:jc w:val="center"/>
             </w:pPr>
             <w:r>
@@ -3990,9 +3980,9 @@
               <w:right w:val="single" w:color="D1EDF9" w:sz="6"/>
             </w:tcBorders>
             <w:tcMar>
-              <w:top w:type="dxa" w:w="29"/>
+              <w:top w:type="dxa" w:w="0"/>
               <w:left w:type="dxa" w:w="115"/>
-              <w:bottom w:type="dxa" w:w="29"/>
+              <w:bottom w:type="dxa" w:w="0"/>
               <w:right w:type="dxa" w:w="86"/>
             </w:tcMar>
           </w:tcPr>
@@ -4036,7 +4026,7 @@
                       <w:ilvl w:val="0"/>
                       <w:numId w:val="2"/>
                     </w:numPr>
-                    <w:spacing w:after="0" w:before="0" w:line="193" w:lineRule="exact"/>
+                    <w:spacing w:after="0" w:before="0" w:line="270" w:lineRule="auto"/>
                   </w:pPr>
                   <w:r>
                     <w:rPr>
@@ -4057,7 +4047,7 @@
                       <w:ilvl w:val="0"/>
                       <w:numId w:val="2"/>
                     </w:numPr>
-                    <w:spacing w:after="0" w:before="0" w:line="193" w:lineRule="exact"/>
+                    <w:spacing w:after="0" w:before="0" w:line="270" w:lineRule="auto"/>
                   </w:pPr>
                   <w:r>
                     <w:rPr>
@@ -4078,7 +4068,7 @@
                       <w:ilvl w:val="0"/>
                       <w:numId w:val="2"/>
                     </w:numPr>
-                    <w:spacing w:after="0" w:before="0" w:line="193" w:lineRule="exact"/>
+                    <w:spacing w:after="0" w:before="0" w:line="270" w:lineRule="auto"/>
                   </w:pPr>
                   <w:r>
                     <w:rPr>
@@ -4116,7 +4106,7 @@
                       <w:ilvl w:val="0"/>
                       <w:numId w:val="2"/>
                     </w:numPr>
-                    <w:spacing w:after="0" w:before="0" w:line="193" w:lineRule="exact"/>
+                    <w:spacing w:after="0" w:before="0" w:line="270" w:lineRule="auto"/>
                   </w:pPr>
                   <w:r>
                     <w:rPr>
@@ -4137,7 +4127,7 @@
                       <w:ilvl w:val="0"/>
                       <w:numId w:val="2"/>
                     </w:numPr>
-                    <w:spacing w:after="0" w:before="0" w:line="193" w:lineRule="exact"/>
+                    <w:spacing w:after="0" w:before="0" w:line="270" w:lineRule="auto"/>
                   </w:pPr>
                   <w:r>
                     <w:rPr>
@@ -4180,7 +4170,7 @@
                       <w:ilvl w:val="0"/>
                       <w:numId w:val="2"/>
                     </w:numPr>
-                    <w:spacing w:after="0" w:before="0" w:line="193" w:lineRule="exact"/>
+                    <w:spacing w:after="0" w:before="0" w:line="270" w:lineRule="auto"/>
                   </w:pPr>
                   <w:r>
                     <w:rPr>
@@ -4224,1200 +4214,9 @@
             </w:tcBorders>
             <w:shd w:fill="D1EDF9" w:color="auto" w:val="clear"/>
             <w:tcMar>
-              <w:top w:type="dxa" w:w="115"/>
+              <w:top w:type="dxa" w:w="0"/>
               <w:left w:type="dxa" w:w="72"/>
-              <w:bottom w:type="dxa" w:w="115"/>
-              <w:right w:type="dxa" w:w="72"/>
-            </w:tcMar>
-            <w:vAlign w:val="center"/>
-          </w:tcPr>
-          <w:p>
-            <w:pPr>
-              <w:spacing w:after="72" w:before="0"/>
-              <w:jc w:val="center"/>
-            </w:pPr>
-            <w:r>
-              <w:drawing>
-                <wp:inline distT="0" distB="0" distL="0" distR="0">
-                  <wp:extent cx="219075" cy="219075"/>
-                  <wp:effectExtent t="0" r="0" b="0" l="0"/>
-                  <wp:docPr id="1" name="" descr="" title=""/>
-                  <wp:cNvGraphicFramePr>
-                    <a:graphicFrameLocks xmlns:a="http://schemas.openxmlformats.org/drawingml/2006/main" noChangeAspect="1"/>
-                  </wp:cNvGraphicFramePr>
-                  <a:graphic xmlns:a="http://schemas.openxmlformats.org/drawingml/2006/main">
-                    <a:graphicData uri="http://schemas.openxmlformats.org/drawingml/2006/picture">
-                      <pic:pic xmlns:pic="http://schemas.openxmlformats.org/drawingml/2006/picture">
-                        <pic:nvPicPr>
-                          <pic:cNvPr id="0" name="" descr=""/>
-                          <pic:cNvPicPr>
-                            <a:picLocks noChangeAspect="1" noChangeArrowheads="1"/>
-                          </pic:cNvPicPr>
-                        </pic:nvPicPr>
-                        <pic:blipFill>
-                          <a:blip r:embed="rId50" cstate="none"/>
-                          <a:srcRect/>
-                          <a:stretch>
-                            <a:fillRect/>
-                          </a:stretch>
-                        </pic:blipFill>
-                        <pic:spPr bwMode="auto">
-                          <a:xfrm>
-                            <a:off x="0" y="0"/>
-                            <a:ext cx="219075" cy="219075"/>
-                          </a:xfrm>
-                          <a:prstGeom prst="rect">
-                            <a:avLst/>
-                          </a:prstGeom>
-                        </pic:spPr>
-                      </pic:pic>
-                    </a:graphicData>
-                  </a:graphic>
-                </wp:inline>
-              </w:drawing>
-            </w:r>
-          </w:p>
-          <w:p>
-            <w:pPr>
-              <w:spacing w:after="0" w:before="0" w:line="216" w:lineRule="exact"/>
-              <w:jc w:val="center"/>
-            </w:pPr>
-            <w:r>
-              <w:rPr>
-                <w:rFonts w:ascii="Lora" w:cs="Lora" w:eastAsia="Lora" w:hAnsi="Lora"/>
-                <w:b/>
-                <w:bCs/>
-                <w:color w:val="143548"/>
-                <w:sz w:val="24"/>
-                <w:szCs w:val="24"/>
-              </w:rPr>
-              <w:t xml:space="preserve">2 </w:t>
-            </w:r>
-            <w:r>
-              <w:rPr>
-                <w:rFonts w:ascii="Poppins" w:cs="Poppins" w:eastAsia="Poppins" w:hAnsi="Poppins"/>
-                <w:b/>
-                <w:bCs/>
-                <w:color w:val="143548"/>
-                <w:sz w:val="16"/>
-                <w:szCs w:val="16"/>
-              </w:rPr>
-              <w:t xml:space="preserve">Ámbito de aplicación</w:t>
-            </w:r>
-          </w:p>
-        </w:tc>
-        <w:tc>
-          <w:tcPr>
-            <w:tcW w:type="dxa" w:w="1612"/>
-            <w:tcBorders>
-              <w:top w:val="single" w:color="D1EDF9" w:sz="6"/>
-              <w:left w:val="single" w:color="D1EDF9" w:sz="6"/>
-              <w:bottom w:val="single" w:color="D1EDF9" w:sz="6"/>
-              <w:right w:val="single" w:color="D1EDF9" w:sz="6"/>
-            </w:tcBorders>
-            <w:shd w:fill="F8F9FA" w:color="auto" w:val="clear"/>
-            <w:tcMar>
-              <w:top w:type="dxa" w:w="58"/>
-              <w:left w:type="dxa" w:w="115"/>
-              <w:bottom w:type="dxa" w:w="43"/>
-              <w:right w:type="dxa" w:w="86"/>
-            </w:tcMar>
-            <w:vAlign w:val="center"/>
-          </w:tcPr>
-          <w:p>
-            <w:pPr>
-              <w:spacing w:after="0" w:before="0" w:line="207" w:lineRule="exact"/>
-              <w:jc w:val="center"/>
-            </w:pPr>
-            <w:r>
-              <w:rPr>
-                <w:rFonts w:ascii="Poppins" w:cs="Poppins" w:eastAsia="Poppins" w:hAnsi="Poppins"/>
-                <w:b/>
-                <w:bCs/>
-                <w:color w:val="1A7BB9"/>
-                <w:sz w:val="15"/>
-                <w:szCs w:val="15"/>
-              </w:rPr>
-              <w:t xml:space="preserve">Personal funcionario</w:t>
-            </w:r>
-          </w:p>
-        </w:tc>
-        <w:tc>
-          <w:tcPr>
-            <w:tcW w:type="dxa" w:w="4333"/>
-            <w:gridSpan w:val="1"/>
-            <w:tcBorders>
-              <w:top w:val="single" w:color="D1EDF9" w:sz="6"/>
-              <w:left w:val="single" w:color="D1EDF9" w:sz="6"/>
-              <w:bottom w:val="single" w:color="D1EDF9" w:sz="6"/>
-              <w:right w:val="single" w:color="D1EDF9" w:sz="6"/>
-            </w:tcBorders>
-            <w:tcMar>
-              <w:top w:type="dxa" w:w="29"/>
-              <w:left w:type="dxa" w:w="115"/>
-              <w:bottom w:type="dxa" w:w="29"/>
-              <w:right w:type="dxa" w:w="86"/>
-            </w:tcMar>
-          </w:tcPr>
-          <w:p>
-            <w:pPr>
-              <w:pStyle w:val="ListParagraph"/>
-              <w:numPr>
-                <w:ilvl w:val="0"/>
-                <w:numId w:val="2"/>
-              </w:numPr>
-              <w:spacing w:after="0" w:before="0" w:line="193" w:lineRule="exact"/>
-            </w:pPr>
-            <w:r>
-              <w:rPr>
-                <w:rFonts w:ascii="Arial" w:cs="Arial" w:eastAsia="Arial" w:hAnsi="Arial"/>
-                <w:b w:val="false"/>
-                <w:bCs w:val="false"/>
-                <w:color w:val="1A7BB9"/>
-                <w:sz w:val="16"/>
-                <w:szCs w:val="16"/>
-              </w:rPr>
-              <w:t xml:space="preserve">En las Consejerías,</w:t>
-            </w:r>
-          </w:p>
-          <w:p>
-            <w:pPr>
-              <w:pStyle w:val="ListParagraph"/>
-              <w:numPr>
-                <w:ilvl w:val="0"/>
-                <w:numId w:val="2"/>
-              </w:numPr>
-              <w:spacing w:after="0" w:before="0" w:line="193" w:lineRule="exact"/>
-            </w:pPr>
-            <w:r>
-              <w:rPr>
-                <w:rFonts w:ascii="Arial" w:cs="Arial" w:eastAsia="Arial" w:hAnsi="Arial"/>
-                <w:b w:val="false"/>
-                <w:bCs w:val="false"/>
-                <w:color w:val="1A7BB9"/>
-                <w:sz w:val="16"/>
-                <w:szCs w:val="16"/>
-              </w:rPr>
-              <w:t xml:space="preserve">Delegaciones del Gobierno,</w:t>
-            </w:r>
-          </w:p>
-          <w:p>
-            <w:pPr>
-              <w:pStyle w:val="ListParagraph"/>
-              <w:numPr>
-                <w:ilvl w:val="0"/>
-                <w:numId w:val="2"/>
-              </w:numPr>
-              <w:spacing w:after="0" w:before="0" w:line="193" w:lineRule="exact"/>
-            </w:pPr>
-            <w:r>
-              <w:rPr>
-                <w:rFonts w:ascii="Arial" w:cs="Arial" w:eastAsia="Arial" w:hAnsi="Arial"/>
-                <w:b w:val="false"/>
-                <w:bCs w:val="false"/>
-                <w:color w:val="1A7BB9"/>
-                <w:sz w:val="16"/>
-                <w:szCs w:val="16"/>
-              </w:rPr>
-              <w:t xml:space="preserve">Delegaciones Territoriales o Provinciales,</w:t>
-            </w:r>
-          </w:p>
-          <w:p>
-            <w:pPr>
-              <w:pStyle w:val="ListParagraph"/>
-              <w:numPr>
-                <w:ilvl w:val="0"/>
-                <w:numId w:val="2"/>
-              </w:numPr>
-              <w:spacing w:after="0" w:before="0" w:line="193" w:lineRule="exact"/>
-            </w:pPr>
-            <w:r>
-              <w:rPr>
-                <w:rFonts w:ascii="Arial" w:cs="Arial" w:eastAsia="Arial" w:hAnsi="Arial"/>
-                <w:b w:val="false"/>
-                <w:bCs w:val="false"/>
-                <w:color w:val="1A7BB9"/>
-                <w:sz w:val="16"/>
-                <w:szCs w:val="16"/>
-              </w:rPr>
-              <w:t xml:space="preserve">otros órganos dependientes o vinculados a la AJA,</w:t>
-            </w:r>
-          </w:p>
-          <w:p>
-            <w:pPr>
-              <w:pStyle w:val="ListParagraph"/>
-              <w:numPr>
-                <w:ilvl w:val="0"/>
-                <w:numId w:val="2"/>
-              </w:numPr>
-              <w:spacing w:after="0" w:before="0" w:line="193" w:lineRule="exact"/>
-            </w:pPr>
-            <w:r>
-              <w:rPr>
-                <w:rFonts w:ascii="Arial" w:cs="Arial" w:eastAsia="Arial" w:hAnsi="Arial"/>
-                <w:b w:val="false"/>
-                <w:bCs w:val="false"/>
-                <w:color w:val="1A7BB9"/>
-                <w:sz w:val="16"/>
-                <w:szCs w:val="16"/>
-              </w:rPr>
-              <w:t xml:space="preserve">y en las AA, ARE o APE</w:t>
-            </w:r>
-          </w:p>
-        </w:tc>
-        <w:tc>
-          <w:tcPr>
-            <w:tcW w:type="dxa" w:w="2146"/>
-            <w:tcBorders>
-              <w:top w:val="single" w:color="D1EDF9" w:sz="6"/>
-              <w:left w:val="single" w:color="D1EDF9" w:sz="6"/>
-              <w:bottom w:val="single" w:color="D1EDF9" w:sz="6"/>
-              <w:right w:val="single" w:color="D1EDF9" w:sz="6"/>
-            </w:tcBorders>
-            <w:shd w:fill="F6FBFE" w:color="auto" w:val="clear"/>
-            <w:tcMar>
-              <w:top w:type="dxa" w:w="58"/>
-              <w:left w:type="dxa" w:w="115"/>
-              <w:bottom w:type="dxa" w:w="43"/>
-              <w:right w:type="dxa" w:w="86"/>
-            </w:tcMar>
-          </w:tcPr>
-          <w:p>
-            <w:pPr>
-              <w:pStyle w:val="ListParagraph"/>
-              <w:numPr>
-                <w:ilvl w:val="0"/>
-                <w:numId w:val="2"/>
-              </w:numPr>
-              <w:spacing w:after="0" w:before="0" w:line="190" w:lineRule="exact"/>
-            </w:pPr>
-            <w:r>
-              <w:rPr>
-                <w:rFonts w:ascii="Arial" w:cs="Arial" w:eastAsia="Arial" w:hAnsi="Arial"/>
-                <w:b w:val="false"/>
-                <w:bCs w:val="false"/>
-                <w:color w:val="222222"/>
-                <w:sz w:val="16"/>
-                <w:szCs w:val="16"/>
-              </w:rPr>
-              <w:t xml:space="preserve">Se regirán por </w:t>
-            </w:r>
-            <w:r>
-              <w:rPr>
-                <w:rFonts w:ascii="Arial" w:cs="Arial" w:eastAsia="Arial" w:hAnsi="Arial"/>
-                <w:b w:val="false"/>
-                <w:bCs w:val="false"/>
-                <w:color w:val="222222"/>
-                <w:sz w:val="16"/>
-                <w:szCs w:val="16"/>
-                <w:u w:val="thick" w:color="9DDFEA"/>
-              </w:rPr>
-              <w:t xml:space="preserve">D 51/25</w:t>
-            </w:r>
-            <w:r>
-              <w:rPr>
-                <w:rFonts w:ascii="Arial" w:cs="Arial" w:eastAsia="Arial" w:hAnsi="Arial"/>
-                <w:b w:val="false"/>
-                <w:bCs w:val="false"/>
-                <w:color w:val="222222"/>
-                <w:sz w:val="16"/>
-                <w:szCs w:val="16"/>
-              </w:rPr>
-              <w:t xml:space="preserve">.</w:t>
-            </w:r>
-          </w:p>
-        </w:tc>
-      </w:tr>
-      <w:tr>
-        <w:tc>
-          <w:tcPr>
-            <w:vMerge w:val="continue"/>
-            <w:tcBorders>
-              <w:top w:val="single" w:color="D1EDF9" w:sz="6"/>
-              <w:left w:val="single" w:color="D1EDF9" w:sz="6"/>
-              <w:bottom w:val="single" w:color="D1EDF9" w:sz="6"/>
-              <w:right w:val="single" w:color="D1EDF9" w:sz="6"/>
-            </w:tcBorders>
-          </w:tcPr>
-          <w:p/>
-        </w:tc>
-        <w:tc>
-          <w:tcPr>
-            <w:tcW w:type="dxa" w:w="1612"/>
-            <w:tcBorders>
-              <w:top w:val="single" w:color="D1EDF9" w:sz="6"/>
-              <w:left w:val="single" w:color="D1EDF9" w:sz="6"/>
-              <w:bottom w:val="single" w:color="D1EDF9" w:sz="6"/>
-              <w:right w:val="single" w:color="D1EDF9" w:sz="6"/>
-            </w:tcBorders>
-            <w:shd w:fill="F8F9FA" w:color="auto" w:val="clear"/>
-            <w:tcMar>
-              <w:top w:type="dxa" w:w="58"/>
-              <w:left w:type="dxa" w:w="115"/>
-              <w:bottom w:type="dxa" w:w="43"/>
-              <w:right w:type="dxa" w:w="86"/>
-            </w:tcMar>
-            <w:vAlign w:val="center"/>
-          </w:tcPr>
-          <w:p>
-            <w:pPr>
-              <w:spacing w:after="0" w:before="0" w:line="207" w:lineRule="exact"/>
-              <w:jc w:val="center"/>
-            </w:pPr>
-            <w:r>
-              <w:rPr>
-                <w:rFonts w:ascii="Poppins" w:cs="Poppins" w:eastAsia="Poppins" w:hAnsi="Poppins"/>
-                <w:b/>
-                <w:bCs/>
-                <w:color w:val="1A7BB9"/>
-                <w:sz w:val="15"/>
-                <w:szCs w:val="15"/>
-              </w:rPr>
-              <w:t xml:space="preserve">Personal funcionario de la DA1ª</w:t>
-            </w:r>
-          </w:p>
-        </w:tc>
-        <w:tc>
-          <w:tcPr>
-            <w:tcW w:type="dxa" w:w="4333"/>
-            <w:gridSpan w:val="1"/>
-            <w:tcBorders>
-              <w:top w:val="single" w:color="D1EDF9" w:sz="6"/>
-              <w:left w:val="single" w:color="D1EDF9" w:sz="6"/>
-              <w:bottom w:val="single" w:color="D1EDF9" w:sz="6"/>
-              <w:right w:val="single" w:color="D1EDF9" w:sz="6"/>
-            </w:tcBorders>
-            <w:tcMar>
-              <w:top w:type="dxa" w:w="29"/>
-              <w:left w:type="dxa" w:w="115"/>
-              <w:bottom w:type="dxa" w:w="29"/>
-              <w:right w:type="dxa" w:w="86"/>
-            </w:tcMar>
-          </w:tcPr>
-          <w:p>
-            <w:pPr>
-              <w:pStyle w:val="ListParagraph"/>
-              <w:numPr>
-                <w:ilvl w:val="0"/>
-                <w:numId w:val="2"/>
-              </w:numPr>
-              <w:spacing w:after="0" w:before="0" w:line="193" w:lineRule="exact"/>
-            </w:pPr>
-            <w:r>
-              <w:rPr>
-                <w:rFonts w:ascii="Arial" w:cs="Arial" w:eastAsia="Arial" w:hAnsi="Arial"/>
-                <w:b w:val="false"/>
-                <w:bCs w:val="false"/>
-                <w:color w:val="1A7BB9"/>
-                <w:sz w:val="16"/>
-                <w:szCs w:val="16"/>
-              </w:rPr>
-              <w:t xml:space="preserve">Cuerpo de Letrados/as.</w:t>
-            </w:r>
-          </w:p>
-          <w:p>
-            <w:pPr>
-              <w:pStyle w:val="ListParagraph"/>
-              <w:numPr>
-                <w:ilvl w:val="0"/>
-                <w:numId w:val="2"/>
-              </w:numPr>
-              <w:spacing w:after="0" w:before="0" w:line="193" w:lineRule="exact"/>
-            </w:pPr>
-            <w:r>
-              <w:rPr>
-                <w:rFonts w:ascii="Arial" w:cs="Arial" w:eastAsia="Arial" w:hAnsi="Arial"/>
-                <w:b w:val="false"/>
-                <w:bCs w:val="false"/>
-                <w:color w:val="1A7BB9"/>
-                <w:sz w:val="16"/>
-                <w:szCs w:val="16"/>
-              </w:rPr>
-              <w:t xml:space="preserve">Cuerpo Superior de Inspección de OTUyV,</w:t>
-            </w:r>
-          </w:p>
-          <w:p>
-            <w:pPr>
-              <w:pStyle w:val="ListParagraph"/>
-              <w:numPr>
-                <w:ilvl w:val="0"/>
-                <w:numId w:val="2"/>
-              </w:numPr>
-              <w:spacing w:after="0" w:before="0" w:line="193" w:lineRule="exact"/>
-            </w:pPr>
-            <w:r>
-              <w:rPr>
-                <w:rFonts w:ascii="Arial" w:cs="Arial" w:eastAsia="Arial" w:hAnsi="Arial"/>
-                <w:b w:val="false"/>
-                <w:bCs w:val="false"/>
-                <w:color w:val="1A7BB9"/>
-                <w:sz w:val="16"/>
-                <w:szCs w:val="16"/>
-              </w:rPr>
-              <w:t xml:space="preserve">Cuerpo de Subinspección de OTUyV.</w:t>
-            </w:r>
-          </w:p>
-          <w:p>
-            <w:pPr>
-              <w:pStyle w:val="ListParagraph"/>
-              <w:numPr>
-                <w:ilvl w:val="0"/>
-                <w:numId w:val="2"/>
-              </w:numPr>
-              <w:spacing w:after="0" w:before="0" w:line="193" w:lineRule="exact"/>
-            </w:pPr>
-            <w:r>
-              <w:rPr>
-                <w:rFonts w:ascii="Arial" w:cs="Arial" w:eastAsia="Arial" w:hAnsi="Arial"/>
-                <w:b w:val="false"/>
-                <w:bCs w:val="false"/>
-                <w:color w:val="1A7BB9"/>
-                <w:sz w:val="16"/>
-                <w:szCs w:val="16"/>
-              </w:rPr>
-              <w:t xml:space="preserve">Cuerpo Superior Facultativo de Instit. Sanitarias</w:t>
-            </w:r>
-          </w:p>
-          <w:p>
-            <w:pPr>
-              <w:pStyle w:val="ListParagraph"/>
-              <w:numPr>
-                <w:ilvl w:val="0"/>
-                <w:numId w:val="2"/>
-              </w:numPr>
-              <w:spacing w:after="0" w:before="0" w:line="193" w:lineRule="exact"/>
-            </w:pPr>
-            <w:r>
-              <w:rPr>
-                <w:rFonts w:ascii="Arial" w:cs="Arial" w:eastAsia="Arial" w:hAnsi="Arial"/>
-                <w:b w:val="false"/>
-                <w:bCs w:val="false"/>
-                <w:color w:val="1A7BB9"/>
-                <w:sz w:val="16"/>
-                <w:szCs w:val="16"/>
-              </w:rPr>
-              <w:t xml:space="preserve">Especialidad Investigación Agraria y Pesquera (…),</w:t>
-            </w:r>
-          </w:p>
-          <w:p>
-            <w:pPr>
-              <w:pStyle w:val="ListParagraph"/>
-              <w:numPr>
-                <w:ilvl w:val="0"/>
-                <w:numId w:val="2"/>
-              </w:numPr>
-              <w:spacing w:after="0" w:before="0" w:line="193" w:lineRule="exact"/>
-            </w:pPr>
-            <w:r>
-              <w:rPr>
-                <w:rFonts w:ascii="Arial" w:cs="Arial" w:eastAsia="Arial" w:hAnsi="Arial"/>
-                <w:b w:val="false"/>
-                <w:bCs w:val="false"/>
-                <w:color w:val="1A7BB9"/>
-                <w:sz w:val="16"/>
-                <w:szCs w:val="16"/>
-              </w:rPr>
-              <w:t xml:space="preserve">Cuerpo Ayudantes Técnicos (Medio Ambiente)</w:t>
-            </w:r>
-          </w:p>
-          <w:p>
-            <w:pPr>
-              <w:pStyle w:val="ListParagraph"/>
-              <w:numPr>
-                <w:ilvl w:val="0"/>
-                <w:numId w:val="2"/>
-              </w:numPr>
-              <w:spacing w:after="0" w:before="0" w:line="193" w:lineRule="exact"/>
-            </w:pPr>
-            <w:r>
-              <w:rPr>
-                <w:rFonts w:ascii="Arial" w:cs="Arial" w:eastAsia="Arial" w:hAnsi="Arial"/>
-                <w:b w:val="false"/>
-                <w:bCs w:val="false"/>
-                <w:color w:val="1A7BB9"/>
-                <w:sz w:val="16"/>
-                <w:szCs w:val="16"/>
-              </w:rPr>
-              <w:t xml:space="preserve">Cuerpo Superior (y Técnico) de Interv. y Auditoría.</w:t>
-            </w:r>
-          </w:p>
-        </w:tc>
-        <w:tc>
-          <w:tcPr>
-            <w:tcW w:type="dxa" w:w="2146"/>
-            <w:tcBorders>
-              <w:top w:val="single" w:color="D1EDF9" w:sz="6"/>
-              <w:left w:val="single" w:color="D1EDF9" w:sz="6"/>
-              <w:bottom w:val="single" w:color="D1EDF9" w:sz="6"/>
-              <w:right w:val="single" w:color="D1EDF9" w:sz="6"/>
-            </w:tcBorders>
-            <w:shd w:fill="F6FBFE" w:color="auto" w:val="clear"/>
-            <w:tcMar>
-              <w:top w:type="dxa" w:w="58"/>
-              <w:left w:type="dxa" w:w="115"/>
-              <w:bottom w:type="dxa" w:w="43"/>
-              <w:right w:type="dxa" w:w="86"/>
-            </w:tcMar>
-          </w:tcPr>
-          <w:p>
-            <w:pPr>
-              <w:pStyle w:val="ListParagraph"/>
-              <w:numPr>
-                <w:ilvl w:val="0"/>
-                <w:numId w:val="2"/>
-              </w:numPr>
-              <w:spacing w:after="0" w:before="0" w:line="190" w:lineRule="exact"/>
-            </w:pPr>
-            <w:r>
-              <w:rPr>
-                <w:rFonts w:ascii="Arial" w:cs="Arial" w:eastAsia="Arial" w:hAnsi="Arial"/>
-                <w:b w:val="false"/>
-                <w:bCs w:val="false"/>
-                <w:color w:val="222222"/>
-                <w:sz w:val="16"/>
-                <w:szCs w:val="16"/>
-              </w:rPr>
-              <w:t xml:space="preserve">Se regirán por su </w:t>
-            </w:r>
-            <w:r>
-              <w:rPr>
-                <w:rFonts w:ascii="Arial" w:cs="Arial" w:eastAsia="Arial" w:hAnsi="Arial"/>
-                <w:b w:val="false"/>
-                <w:bCs w:val="false"/>
-                <w:color w:val="222222"/>
-                <w:sz w:val="16"/>
-                <w:szCs w:val="16"/>
-                <w:u w:val="thick" w:color="9DDFEA"/>
-              </w:rPr>
-              <w:t xml:space="preserve">normativa específica</w:t>
-            </w:r>
-            <w:r>
-              <w:rPr>
-                <w:rFonts w:ascii="Arial" w:cs="Arial" w:eastAsia="Arial" w:hAnsi="Arial"/>
-                <w:b w:val="false"/>
-                <w:bCs w:val="false"/>
-                <w:color w:val="222222"/>
-                <w:sz w:val="16"/>
-                <w:szCs w:val="16"/>
-              </w:rPr>
-              <w:t xml:space="preserve">.</w:t>
-            </w:r>
-          </w:p>
-          <w:p>
-            <w:pPr>
-              <w:pStyle w:val="ListParagraph"/>
-              <w:numPr>
-                <w:ilvl w:val="0"/>
-                <w:numId w:val="2"/>
-              </w:numPr>
-              <w:spacing w:after="0" w:before="72" w:line="190" w:lineRule="exact"/>
-            </w:pPr>
-            <w:r>
-              <w:rPr>
-                <w:rFonts w:ascii="Arial" w:cs="Arial" w:eastAsia="Arial" w:hAnsi="Arial"/>
-                <w:b w:val="false"/>
-                <w:bCs w:val="false"/>
-                <w:color w:val="222222"/>
-                <w:sz w:val="16"/>
-                <w:szCs w:val="16"/>
-              </w:rPr>
-              <w:t xml:space="preserve">En todo no previsto en la misma, se rigen por </w:t>
-            </w:r>
-            <w:r>
-              <w:rPr>
-                <w:rFonts w:ascii="Arial" w:cs="Arial" w:eastAsia="Arial" w:hAnsi="Arial"/>
-                <w:b w:val="false"/>
-                <w:bCs w:val="false"/>
-                <w:color w:val="222222"/>
-                <w:sz w:val="16"/>
-                <w:szCs w:val="16"/>
-                <w:u w:val="thick" w:color="9DDFEA"/>
-              </w:rPr>
-              <w:t xml:space="preserve">LFPA y D 51/25</w:t>
-            </w:r>
-            <w:r>
-              <w:rPr>
-                <w:rFonts w:ascii="Arial" w:cs="Arial" w:eastAsia="Arial" w:hAnsi="Arial"/>
-                <w:b w:val="false"/>
-                <w:bCs w:val="false"/>
-                <w:color w:val="222222"/>
-                <w:sz w:val="16"/>
-                <w:szCs w:val="16"/>
-              </w:rPr>
-              <w:t xml:space="preserve">;</w:t>
-            </w:r>
-          </w:p>
-        </w:tc>
-      </w:tr>
-      <w:tr>
-        <w:tc>
-          <w:tcPr>
-            <w:vMerge w:val="continue"/>
-            <w:tcBorders>
-              <w:top w:val="single" w:color="D1EDF9" w:sz="6"/>
-              <w:left w:val="single" w:color="D1EDF9" w:sz="6"/>
-              <w:bottom w:val="single" w:color="D1EDF9" w:sz="6"/>
-              <w:right w:val="single" w:color="D1EDF9" w:sz="6"/>
-            </w:tcBorders>
-          </w:tcPr>
-          <w:p/>
-        </w:tc>
-        <w:tc>
-          <w:tcPr>
-            <w:tcW w:type="dxa" w:w="1612"/>
-            <w:tcBorders>
-              <w:top w:val="single" w:color="D1EDF9" w:sz="6"/>
-              <w:left w:val="single" w:color="D1EDF9" w:sz="6"/>
-              <w:bottom w:val="single" w:color="D1EDF9" w:sz="6"/>
-              <w:right w:val="single" w:color="D1EDF9" w:sz="6"/>
-            </w:tcBorders>
-            <w:shd w:fill="F8F9FA" w:color="auto" w:val="clear"/>
-            <w:tcMar>
-              <w:top w:type="dxa" w:w="58"/>
-              <w:left w:type="dxa" w:w="115"/>
-              <w:bottom w:type="dxa" w:w="43"/>
-              <w:right w:type="dxa" w:w="86"/>
-            </w:tcMar>
-            <w:vAlign w:val="center"/>
-          </w:tcPr>
-          <w:p>
-            <w:pPr>
-              <w:spacing w:after="0" w:before="0" w:line="207" w:lineRule="exact"/>
-              <w:jc w:val="center"/>
-            </w:pPr>
-            <w:r>
-              <w:rPr>
-                <w:rFonts w:ascii="Poppins" w:cs="Poppins" w:eastAsia="Poppins" w:hAnsi="Poppins"/>
-                <w:b/>
-                <w:bCs/>
-                <w:color w:val="1A7BB9"/>
-                <w:sz w:val="15"/>
-                <w:szCs w:val="15"/>
-              </w:rPr>
-              <w:t xml:space="preserve">Personal laboral</w:t>
-            </w:r>
-          </w:p>
-        </w:tc>
-        <w:tc>
-          <w:tcPr>
-            <w:tcW w:type="dxa" w:w="6479"/>
-            <w:gridSpan w:val="2"/>
-            <w:tcBorders>
-              <w:top w:val="single" w:color="D1EDF9" w:sz="6"/>
-              <w:left w:val="single" w:color="D1EDF9" w:sz="6"/>
-              <w:bottom w:val="single" w:color="D1EDF9" w:sz="6"/>
-              <w:right w:val="single" w:color="D1EDF9" w:sz="6"/>
-            </w:tcBorders>
-            <w:tcMar>
-              <w:top w:type="dxa" w:w="29"/>
-              <w:left w:type="dxa" w:w="115"/>
-              <w:bottom w:type="dxa" w:w="29"/>
-              <w:right w:type="dxa" w:w="86"/>
-            </w:tcMar>
-          </w:tcPr>
-          <w:p>
-            <w:pPr>
-              <w:pStyle w:val="ListParagraph"/>
-              <w:numPr>
-                <w:ilvl w:val="0"/>
-                <w:numId w:val="2"/>
-              </w:numPr>
-              <w:spacing w:after="0" w:before="0" w:line="193" w:lineRule="exact"/>
-            </w:pPr>
-            <w:r>
-              <w:rPr>
-                <w:rFonts w:ascii="Arial" w:cs="Arial" w:eastAsia="Arial" w:hAnsi="Arial"/>
-                <w:b w:val="false"/>
-                <w:bCs w:val="false"/>
-                <w:color w:val="222222"/>
-                <w:sz w:val="16"/>
-                <w:szCs w:val="16"/>
-              </w:rPr>
-              <w:t xml:space="preserve">Legislación laboral</w:t>
-            </w:r>
-          </w:p>
-          <w:p>
-            <w:pPr>
-              <w:pStyle w:val="ListParagraph"/>
-              <w:numPr>
-                <w:ilvl w:val="0"/>
-                <w:numId w:val="2"/>
-              </w:numPr>
-              <w:spacing w:after="0" w:before="0" w:line="193" w:lineRule="exact"/>
-            </w:pPr>
-            <w:r>
-              <w:rPr>
-                <w:rFonts w:ascii="Arial" w:cs="Arial" w:eastAsia="Arial" w:hAnsi="Arial"/>
-                <w:b w:val="false"/>
-                <w:bCs w:val="false"/>
-                <w:color w:val="222222"/>
-                <w:sz w:val="16"/>
-                <w:szCs w:val="16"/>
-              </w:rPr>
-              <w:t xml:space="preserve">EBEP y restantes legislación estatal de carácter básico aplicable</w:t>
-            </w:r>
-          </w:p>
-          <w:p>
-            <w:pPr>
-              <w:pStyle w:val="ListParagraph"/>
-              <w:numPr>
-                <w:ilvl w:val="0"/>
-                <w:numId w:val="2"/>
-              </w:numPr>
-              <w:spacing w:after="0" w:before="0" w:line="193" w:lineRule="exact"/>
-            </w:pPr>
-            <w:r>
-              <w:rPr>
-                <w:rFonts w:ascii="Arial" w:cs="Arial" w:eastAsia="Arial" w:hAnsi="Arial"/>
-                <w:b w:val="false"/>
-                <w:bCs w:val="false"/>
-                <w:color w:val="222222"/>
-                <w:sz w:val="16"/>
-                <w:szCs w:val="16"/>
-              </w:rPr>
-              <w:t xml:space="preserve">Preceptos de la LFPA y D 51/25 que así lo dispongan expresamente</w:t>
-            </w:r>
-          </w:p>
-          <w:p>
-            <w:pPr>
-              <w:pStyle w:val="ListParagraph"/>
-              <w:numPr>
-                <w:ilvl w:val="0"/>
-                <w:numId w:val="2"/>
-              </w:numPr>
-              <w:spacing w:after="0" w:before="0" w:line="193" w:lineRule="exact"/>
-            </w:pPr>
-            <w:r>
-              <w:rPr>
-                <w:rFonts w:ascii="Arial" w:cs="Arial" w:eastAsia="Arial" w:hAnsi="Arial"/>
-                <w:b w:val="false"/>
-                <w:bCs w:val="false"/>
-                <w:color w:val="222222"/>
-                <w:sz w:val="16"/>
-                <w:szCs w:val="16"/>
-              </w:rPr>
-              <w:t xml:space="preserve">Normas convencionales que sean de aplicación</w:t>
-            </w:r>
-          </w:p>
-        </w:tc>
-      </w:tr>
-      <w:tr>
-        <w:tc>
-          <w:tcPr>
-            <w:vMerge w:val="continue"/>
-            <w:tcBorders>
-              <w:top w:val="single" w:color="D1EDF9" w:sz="6"/>
-              <w:left w:val="single" w:color="D1EDF9" w:sz="6"/>
-              <w:bottom w:val="single" w:color="D1EDF9" w:sz="6"/>
-              <w:right w:val="single" w:color="D1EDF9" w:sz="6"/>
-            </w:tcBorders>
-          </w:tcPr>
-          <w:p/>
-        </w:tc>
-        <w:tc>
-          <w:tcPr>
-            <w:tcW w:type="dxa" w:w="1612"/>
-            <w:tcBorders>
-              <w:top w:val="single" w:color="D1EDF9" w:sz="6"/>
-              <w:left w:val="single" w:color="D1EDF9" w:sz="6"/>
-              <w:bottom w:val="single" w:color="D1EDF9" w:sz="6"/>
-              <w:right w:val="single" w:color="D1EDF9" w:sz="6"/>
-            </w:tcBorders>
-            <w:shd w:fill="F8F9FA" w:color="auto" w:val="clear"/>
-            <w:tcMar>
-              <w:top w:type="dxa" w:w="58"/>
-              <w:left w:type="dxa" w:w="115"/>
-              <w:bottom w:type="dxa" w:w="43"/>
-              <w:right w:type="dxa" w:w="86"/>
-            </w:tcMar>
-            <w:vAlign w:val="center"/>
-          </w:tcPr>
-          <w:p>
-            <w:pPr>
-              <w:spacing w:after="0" w:before="0" w:line="207" w:lineRule="exact"/>
-              <w:jc w:val="center"/>
-            </w:pPr>
-            <w:r>
-              <w:rPr>
-                <w:rFonts w:ascii="Poppins" w:cs="Poppins" w:eastAsia="Poppins" w:hAnsi="Poppins"/>
-                <w:b/>
-                <w:bCs/>
-                <w:color w:val="1A7BB9"/>
-                <w:sz w:val="15"/>
-                <w:szCs w:val="15"/>
-              </w:rPr>
-              <w:t xml:space="preserve">Personal del art 3.1 LFPA</w:t>
-            </w:r>
-          </w:p>
-        </w:tc>
-        <w:tc>
-          <w:tcPr>
-            <w:tcW w:type="dxa" w:w="4333"/>
-            <w:gridSpan w:val="1"/>
-            <w:tcBorders>
-              <w:top w:val="single" w:color="D1EDF9" w:sz="6"/>
-              <w:left w:val="single" w:color="D1EDF9" w:sz="6"/>
-              <w:bottom w:val="single" w:color="D1EDF9" w:sz="6"/>
-              <w:right w:val="single" w:color="D1EDF9" w:sz="6"/>
-            </w:tcBorders>
-            <w:tcMar>
-              <w:top w:type="dxa" w:w="29"/>
-              <w:left w:type="dxa" w:w="115"/>
-              <w:bottom w:type="dxa" w:w="29"/>
-              <w:right w:type="dxa" w:w="86"/>
-            </w:tcMar>
-          </w:tcPr>
-          <w:p>
-            <w:pPr>
-              <w:pStyle w:val="ListParagraph"/>
-              <w:numPr>
-                <w:ilvl w:val="0"/>
-                <w:numId w:val="2"/>
-              </w:numPr>
-              <w:spacing w:after="0" w:before="0" w:line="193" w:lineRule="exact"/>
-            </w:pPr>
-            <w:r>
-              <w:rPr>
-                <w:rFonts w:ascii="Arial" w:cs="Arial" w:eastAsia="Arial" w:hAnsi="Arial"/>
-                <w:b w:val="false"/>
-                <w:bCs w:val="false"/>
-                <w:color w:val="1A7BB9"/>
-                <w:sz w:val="16"/>
-                <w:szCs w:val="16"/>
-              </w:rPr>
-              <w:t xml:space="preserve">Servicio Andaluz de Salud.</w:t>
-            </w:r>
-          </w:p>
-          <w:p>
-            <w:pPr>
-              <w:pStyle w:val="ListParagraph"/>
-              <w:numPr>
-                <w:ilvl w:val="0"/>
-                <w:numId w:val="2"/>
-              </w:numPr>
-              <w:spacing w:after="0" w:before="0" w:line="193" w:lineRule="exact"/>
-            </w:pPr>
-            <w:r>
-              <w:rPr>
-                <w:rFonts w:ascii="Arial" w:cs="Arial" w:eastAsia="Arial" w:hAnsi="Arial"/>
-                <w:b w:val="false"/>
-                <w:bCs w:val="false"/>
-                <w:color w:val="1A7BB9"/>
-                <w:sz w:val="16"/>
-                <w:szCs w:val="16"/>
-              </w:rPr>
-              <w:t xml:space="preserve">Admin. de Justicia.</w:t>
-            </w:r>
-          </w:p>
-          <w:p>
-            <w:pPr>
-              <w:pStyle w:val="ListParagraph"/>
-              <w:numPr>
-                <w:ilvl w:val="0"/>
-                <w:numId w:val="2"/>
-              </w:numPr>
-              <w:spacing w:after="0" w:before="0" w:line="193" w:lineRule="exact"/>
-            </w:pPr>
-            <w:r>
-              <w:rPr>
-                <w:rFonts w:ascii="Arial" w:cs="Arial" w:eastAsia="Arial" w:hAnsi="Arial"/>
-                <w:b w:val="false"/>
-                <w:bCs w:val="false"/>
-                <w:color w:val="1A7BB9"/>
-                <w:sz w:val="16"/>
-                <w:szCs w:val="16"/>
-              </w:rPr>
-              <w:t xml:space="preserve">Universidades públicas:</w:t>
-            </w:r>
-          </w:p>
-          <w:p>
-            <w:pPr>
-              <w:pStyle w:val="ListParagraph"/>
-              <w:numPr>
-                <w:ilvl w:val="0"/>
-                <w:numId w:val="2"/>
-              </w:numPr>
-              <w:spacing w:after="0" w:before="0" w:line="193" w:lineRule="exact"/>
-            </w:pPr>
-            <w:r>
-              <w:rPr>
-                <w:rFonts w:ascii="Arial" w:cs="Arial" w:eastAsia="Arial" w:hAnsi="Arial"/>
-                <w:b w:val="false"/>
-                <w:bCs w:val="false"/>
-                <w:color w:val="1A7BB9"/>
-                <w:sz w:val="16"/>
-                <w:szCs w:val="16"/>
-              </w:rPr>
-              <w:t xml:space="preserve">Funcionario docente universitario.</w:t>
-            </w:r>
-          </w:p>
-          <w:p>
-            <w:pPr>
-              <w:pStyle w:val="ListParagraph"/>
-              <w:numPr>
-                <w:ilvl w:val="0"/>
-                <w:numId w:val="2"/>
-              </w:numPr>
-              <w:spacing w:after="0" w:before="0" w:line="193" w:lineRule="exact"/>
-            </w:pPr>
-            <w:r>
-              <w:rPr>
-                <w:rFonts w:ascii="Arial" w:cs="Arial" w:eastAsia="Arial" w:hAnsi="Arial"/>
-                <w:b w:val="false"/>
-                <w:bCs w:val="false"/>
-                <w:color w:val="1A7BB9"/>
-                <w:sz w:val="16"/>
-                <w:szCs w:val="16"/>
-              </w:rPr>
-              <w:t xml:space="preserve">Funcionario y laboral de admin y servicios.</w:t>
-            </w:r>
-          </w:p>
-          <w:p>
-            <w:pPr>
-              <w:pStyle w:val="ListParagraph"/>
-              <w:numPr>
-                <w:ilvl w:val="0"/>
-                <w:numId w:val="2"/>
-              </w:numPr>
-              <w:spacing w:after="0" w:before="0" w:line="193" w:lineRule="exact"/>
-            </w:pPr>
-            <w:r>
-              <w:rPr>
-                <w:rFonts w:ascii="Arial" w:cs="Arial" w:eastAsia="Arial" w:hAnsi="Arial"/>
-                <w:b w:val="false"/>
-                <w:bCs w:val="false"/>
-                <w:color w:val="1A7BB9"/>
-                <w:sz w:val="16"/>
-                <w:szCs w:val="16"/>
-              </w:rPr>
-              <w:t xml:space="preserve">Administraciones locales.</w:t>
-            </w:r>
-          </w:p>
-          <w:p>
-            <w:pPr>
-              <w:pStyle w:val="ListParagraph"/>
-              <w:numPr>
-                <w:ilvl w:val="0"/>
-                <w:numId w:val="2"/>
-              </w:numPr>
-              <w:spacing w:after="0" w:before="0" w:line="193" w:lineRule="exact"/>
-            </w:pPr>
-            <w:r>
-              <w:rPr>
-                <w:rFonts w:ascii="Arial" w:cs="Arial" w:eastAsia="Arial" w:hAnsi="Arial"/>
-                <w:b w:val="false"/>
-                <w:bCs w:val="false"/>
-                <w:color w:val="1A7BB9"/>
-                <w:sz w:val="16"/>
-                <w:szCs w:val="16"/>
-              </w:rPr>
-              <w:t xml:space="preserve">Oficina Andaluza contra el Fraude y la Corrupción,</w:t>
-            </w:r>
-          </w:p>
-          <w:p>
-            <w:pPr>
-              <w:pStyle w:val="ListParagraph"/>
-              <w:numPr>
-                <w:ilvl w:val="0"/>
-                <w:numId w:val="2"/>
-              </w:numPr>
-              <w:spacing w:after="0" w:before="0" w:line="193" w:lineRule="exact"/>
-            </w:pPr>
-            <w:r>
-              <w:rPr>
-                <w:rFonts w:ascii="Arial" w:cs="Arial" w:eastAsia="Arial" w:hAnsi="Arial"/>
-                <w:b w:val="false"/>
-                <w:bCs w:val="false"/>
-                <w:color w:val="1A7BB9"/>
-                <w:sz w:val="16"/>
-                <w:szCs w:val="16"/>
-              </w:rPr>
-              <w:t xml:space="preserve">Consejo Consultivo de Andalucía,</w:t>
-            </w:r>
-          </w:p>
-          <w:p>
-            <w:pPr>
-              <w:pStyle w:val="ListParagraph"/>
-              <w:numPr>
-                <w:ilvl w:val="0"/>
-                <w:numId w:val="2"/>
-              </w:numPr>
-              <w:spacing w:after="0" w:before="0" w:line="193" w:lineRule="exact"/>
-            </w:pPr>
-            <w:r>
-              <w:rPr>
-                <w:rFonts w:ascii="Arial" w:cs="Arial" w:eastAsia="Arial" w:hAnsi="Arial"/>
-                <w:b w:val="false"/>
-                <w:bCs w:val="false"/>
-                <w:color w:val="1A7BB9"/>
-                <w:sz w:val="16"/>
-                <w:szCs w:val="16"/>
-              </w:rPr>
-              <w:t xml:space="preserve">Consejo Audiovisual de Andalucía,</w:t>
-            </w:r>
-          </w:p>
-          <w:p>
-            <w:pPr>
-              <w:pStyle w:val="ListParagraph"/>
-              <w:numPr>
-                <w:ilvl w:val="0"/>
-                <w:numId w:val="2"/>
-              </w:numPr>
-              <w:spacing w:after="0" w:before="0" w:line="193" w:lineRule="exact"/>
-            </w:pPr>
-            <w:r>
-              <w:rPr>
-                <w:rFonts w:ascii="Arial" w:cs="Arial" w:eastAsia="Arial" w:hAnsi="Arial"/>
-                <w:b w:val="false"/>
-                <w:bCs w:val="false"/>
-                <w:color w:val="1A7BB9"/>
-                <w:sz w:val="16"/>
-                <w:szCs w:val="16"/>
-              </w:rPr>
-              <w:t xml:space="preserve">Consejo Económico y Social de Andalucía,</w:t>
-            </w:r>
-          </w:p>
-          <w:p>
-            <w:pPr>
-              <w:pStyle w:val="ListParagraph"/>
-              <w:numPr>
-                <w:ilvl w:val="0"/>
-                <w:numId w:val="2"/>
-              </w:numPr>
-              <w:spacing w:after="0" w:before="0" w:line="193" w:lineRule="exact"/>
-            </w:pPr>
-            <w:r>
-              <w:rPr>
-                <w:rFonts w:ascii="Arial" w:cs="Arial" w:eastAsia="Arial" w:hAnsi="Arial"/>
-                <w:b w:val="false"/>
-                <w:bCs w:val="false"/>
-                <w:color w:val="1A7BB9"/>
-                <w:sz w:val="16"/>
-                <w:szCs w:val="16"/>
-              </w:rPr>
-              <w:t xml:space="preserve">Consejo de Transparencia y Protección de Datos,</w:t>
-            </w:r>
-          </w:p>
-          <w:p>
-            <w:pPr>
-              <w:pStyle w:val="ListParagraph"/>
-              <w:numPr>
-                <w:ilvl w:val="0"/>
-                <w:numId w:val="2"/>
-              </w:numPr>
-              <w:spacing w:after="0" w:before="0" w:line="193" w:lineRule="exact"/>
-            </w:pPr>
-            <w:r>
-              <w:rPr>
-                <w:rFonts w:ascii="Arial" w:cs="Arial" w:eastAsia="Arial" w:hAnsi="Arial"/>
-                <w:b w:val="false"/>
-                <w:bCs w:val="false"/>
-                <w:color w:val="1A7BB9"/>
-                <w:sz w:val="16"/>
-                <w:szCs w:val="16"/>
-              </w:rPr>
-              <w:t xml:space="preserve">Otras entidades públicas con personalidad jurídica.</w:t>
-            </w:r>
-          </w:p>
-          <w:p>
-            <w:pPr>
-              <w:pStyle w:val="ListParagraph"/>
-              <w:numPr>
-                <w:ilvl w:val="0"/>
-                <w:numId w:val="2"/>
-              </w:numPr>
-              <w:spacing w:after="0" w:before="0" w:line="193" w:lineRule="exact"/>
-            </w:pPr>
-            <w:r>
-              <w:rPr>
-                <w:rFonts w:ascii="Arial" w:cs="Arial" w:eastAsia="Arial" w:hAnsi="Arial"/>
-                <w:b w:val="false"/>
-                <w:bCs w:val="false"/>
-                <w:color w:val="1A7BB9"/>
-                <w:sz w:val="16"/>
-                <w:szCs w:val="16"/>
-              </w:rPr>
-              <w:t xml:space="preserve">Personal investigador.</w:t>
-            </w:r>
-          </w:p>
-          <w:p>
-            <w:pPr>
-              <w:pStyle w:val="ListParagraph"/>
-              <w:numPr>
-                <w:ilvl w:val="0"/>
-                <w:numId w:val="2"/>
-              </w:numPr>
-              <w:spacing w:after="0" w:before="0" w:line="193" w:lineRule="exact"/>
-            </w:pPr>
-            <w:r>
-              <w:rPr>
-                <w:rFonts w:ascii="Arial" w:cs="Arial" w:eastAsia="Arial" w:hAnsi="Arial"/>
-                <w:b w:val="false"/>
-                <w:bCs w:val="false"/>
-                <w:color w:val="1A7BB9"/>
-                <w:sz w:val="16"/>
-                <w:szCs w:val="16"/>
-              </w:rPr>
-              <w:t xml:space="preserve">Personal eventual.</w:t>
-            </w:r>
-          </w:p>
-        </w:tc>
-        <w:tc>
-          <w:tcPr>
-            <w:tcW w:type="dxa" w:w="2146"/>
-            <w:tcBorders>
-              <w:top w:val="single" w:color="D1EDF9" w:sz="6"/>
-              <w:left w:val="single" w:color="D1EDF9" w:sz="6"/>
-              <w:bottom w:val="single" w:color="D1EDF9" w:sz="6"/>
-              <w:right w:val="single" w:color="D1EDF9" w:sz="6"/>
-            </w:tcBorders>
-            <w:shd w:fill="F6FBFE" w:color="auto" w:val="clear"/>
-            <w:tcMar>
-              <w:top w:type="dxa" w:w="58"/>
-              <w:left w:type="dxa" w:w="115"/>
-              <w:bottom w:type="dxa" w:w="43"/>
-              <w:right w:type="dxa" w:w="86"/>
-            </w:tcMar>
-          </w:tcPr>
-          <w:p>
-            <w:pPr>
-              <w:pStyle w:val="ListParagraph"/>
-              <w:numPr>
-                <w:ilvl w:val="0"/>
-                <w:numId w:val="2"/>
-              </w:numPr>
-              <w:spacing w:after="0" w:before="0" w:line="190" w:lineRule="exact"/>
-            </w:pPr>
-            <w:r>
-              <w:rPr>
-                <w:rFonts w:ascii="Arial" w:cs="Arial" w:eastAsia="Arial" w:hAnsi="Arial"/>
-                <w:b w:val="false"/>
-                <w:bCs w:val="false"/>
-                <w:color w:val="222222"/>
-                <w:sz w:val="16"/>
-                <w:szCs w:val="16"/>
-              </w:rPr>
-              <w:t xml:space="preserve">En todo lo no previsto en su legislación específica, el D 51/25 tendrá carácter supletorio.</w:t>
-            </w:r>
-          </w:p>
-        </w:tc>
-      </w:tr>
-      <w:tr>
-        <w:tc>
-          <w:tcPr>
-            <w:tcW w:type="dxa" w:w="1555"/>
-            <w:vMerge w:val="restart"/>
-            <w:tcBorders>
-              <w:top w:val="single" w:color="D1EDF9" w:sz="6"/>
-              <w:left w:val="single" w:color="D1EDF9" w:sz="6"/>
-              <w:bottom w:val="single" w:color="D1EDF9" w:sz="6"/>
-              <w:right w:val="single" w:color="D1EDF9" w:sz="6"/>
-            </w:tcBorders>
-            <w:shd w:fill="D1EDF9" w:color="auto" w:val="clear"/>
-            <w:tcMar>
-              <w:top w:type="dxa" w:w="115"/>
-              <w:left w:type="dxa" w:w="72"/>
-              <w:bottom w:type="dxa" w:w="115"/>
+              <w:bottom w:type="dxa" w:w="0"/>
               <w:right w:type="dxa" w:w="72"/>
             </w:tcMar>
             <w:vAlign w:val="center"/>
@@ -5470,7 +4269,7 @@
           </w:p>
           <w:p>
             <w:pPr>
-              <w:spacing w:after="0" w:before="0" w:line="216" w:lineRule="exact"/>
+              <w:spacing w:after="0" w:before="0" w:line="216" w:lineRule="auto"/>
               <w:jc w:val="center"/>
             </w:pPr>
             <w:r>
@@ -5482,7 +4281,7 @@
                 <w:sz w:val="24"/>
                 <w:szCs w:val="24"/>
               </w:rPr>
-              <w:t xml:space="preserve">3 </w:t>
+              <w:t xml:space="preserve">2 </w:t>
             </w:r>
             <w:r>
               <w:rPr>
@@ -5493,26 +4292,7 @@
                 <w:sz w:val="16"/>
                 <w:szCs w:val="16"/>
               </w:rPr>
-              <w:t xml:space="preserve">Principios en el acceso al empleo público y la provisión de puestos</w:t>
-            </w:r>
-          </w:p>
-          <w:p>
-            <w:pPr>
-              <w:spacing w:after="0" w:before="86"/>
-              <w:jc w:val="center"/>
-            </w:pPr>
-            <w:r>
-              <w:rPr>
-                <w:rFonts w:ascii="Arial" w:cs="Arial" w:eastAsia="Arial" w:hAnsi="Arial"/>
-                <w:b/>
-                <w:bCs/>
-                <w:color w:val="143548"/>
-                <w:spacing w:val="24"/>
-                <w:sz w:val="12"/>
-                <w:szCs w:val="12"/>
-                <w:shd w:fill="9DDFEA" w:color="auto" w:val="clear"/>
-              </w:rPr>
-              <w:t xml:space="preserve"> ♥ ¡TEST! </w:t>
+              <w:t xml:space="preserve">Ámbito de aplicación</w:t>
             </w:r>
           </w:p>
         </w:tc>
@@ -5536,26 +4316,26 @@
           </w:tcPr>
           <w:p>
             <w:pPr>
-              <w:spacing w:after="0" w:before="0" w:line="207" w:lineRule="exact"/>
+              <w:spacing w:after="0" w:before="0" w:line="221" w:lineRule="auto"/>
               <w:jc w:val="center"/>
             </w:pPr>
             <w:r>
               <w:rPr>
                 <w:rFonts w:ascii="Poppins" w:cs="Poppins" w:eastAsia="Poppins" w:hAnsi="Poppins"/>
-                <w:b w:val="false"/>
-                <w:bCs w:val="false"/>
-                <w:color w:val="143548"/>
+                <w:b/>
+                <w:bCs/>
+                <w:color w:val="1A7BB9"/>
                 <w:sz w:val="15"/>
                 <w:szCs w:val="15"/>
               </w:rPr>
-              <w:t xml:space="preserve">Acceso F y L</w:t>
+              <w:t xml:space="preserve">Personal funcionario</w:t>
             </w:r>
           </w:p>
         </w:tc>
         <w:tc>
           <w:tcPr>
-            <w:tcW w:type="dxa" w:w="6479"/>
-            <w:gridSpan w:val="2"/>
+            <w:tcW w:type="dxa" w:w="4333"/>
+            <w:gridSpan w:val="1"/>
             <w:tcBorders>
               <w:top w:val="single" w:color="D1EDF9" w:sz="6"/>
               <w:left w:val="single" w:color="D1EDF9" w:sz="6"/>
@@ -5563,9 +4343,9 @@
               <w:right w:val="single" w:color="D1EDF9" w:sz="6"/>
             </w:tcBorders>
             <w:tcMar>
-              <w:top w:type="dxa" w:w="29"/>
+              <w:top w:type="dxa" w:w="0"/>
               <w:left w:type="dxa" w:w="115"/>
-              <w:bottom w:type="dxa" w:w="29"/>
+              <w:bottom w:type="dxa" w:w="0"/>
               <w:right w:type="dxa" w:w="86"/>
             </w:tcMar>
           </w:tcPr>
@@ -5576,7 +4356,7 @@
                 <w:ilvl w:val="0"/>
                 <w:numId w:val="2"/>
               </w:numPr>
-              <w:spacing w:after="0" w:before="0" w:line="193" w:lineRule="exact"/>
+              <w:spacing w:after="0" w:before="0" w:line="270" w:lineRule="auto"/>
             </w:pPr>
             <w:r>
               <w:rPr>
@@ -5587,29 +4367,7 @@
                 <w:sz w:val="16"/>
                 <w:szCs w:val="16"/>
               </w:rPr>
-              <w:t xml:space="preserve">Procesos selectivos con respeto a los ppios CE </w:t>
-            </w:r>
-            <w:r>
-              <w:rPr>
-                <w:rFonts w:ascii="Arial" w:cs="Arial" w:eastAsia="Arial" w:hAnsi="Arial"/>
-                <w:b w:val="false"/>
-                <w:bCs w:val="false"/>
-                <w:color w:val="1F9D63"/>
-                <w:sz w:val="16"/>
-                <w:szCs w:val="16"/>
-              </w:rPr>
-              <w:t xml:space="preserve">igualdad, mérito y capacidad</w:t>
-            </w:r>
-            <w:r>
-              <w:rPr>
-                <w:rFonts w:ascii="Arial" w:cs="Arial" w:eastAsia="Arial" w:hAnsi="Arial"/>
-                <w:b w:val="false"/>
-                <w:bCs w:val="false"/>
-                <w:color w:val="222222"/>
-                <w:sz w:val="16"/>
-                <w:szCs w:val="16"/>
-              </w:rPr>
-              <w:t xml:space="preserve">.</w:t>
+              <w:t xml:space="preserve">En las Consejerías,</w:t>
             </w:r>
           </w:p>
           <w:p>
@@ -5619,18 +4377,18 @@
                 <w:ilvl w:val="0"/>
                 <w:numId w:val="2"/>
               </w:numPr>
-              <w:spacing w:after="0" w:before="0" w:line="193" w:lineRule="exact"/>
-            </w:pPr>
-            <w:r>
-              <w:rPr>
-                <w:rFonts w:ascii="Arial" w:cs="Arial" w:eastAsia="Arial" w:hAnsi="Arial"/>
-                <w:b w:val="false"/>
-                <w:bCs w:val="false"/>
-                <w:color w:val="1F9D63"/>
-                <w:sz w:val="16"/>
-                <w:szCs w:val="16"/>
-              </w:rPr>
-              <w:t xml:space="preserve">Publicidad</w:t>
+              <w:spacing w:after="0" w:before="0" w:line="270" w:lineRule="auto"/>
+            </w:pPr>
+            <w:r>
+              <w:rPr>
+                <w:rFonts w:ascii="Arial" w:cs="Arial" w:eastAsia="Arial" w:hAnsi="Arial"/>
+                <w:b w:val="false"/>
+                <w:bCs w:val="false"/>
+                <w:color w:val="222222"/>
+                <w:sz w:val="16"/>
+                <w:szCs w:val="16"/>
+              </w:rPr>
+              <w:t xml:space="preserve">Delegaciones del Gobierno,</w:t>
             </w:r>
           </w:p>
           <w:p>
@@ -5640,18 +4398,18 @@
                 <w:ilvl w:val="0"/>
                 <w:numId w:val="2"/>
               </w:numPr>
-              <w:spacing w:after="0" w:before="0" w:line="193" w:lineRule="exact"/>
-            </w:pPr>
-            <w:r>
-              <w:rPr>
-                <w:rFonts w:ascii="Arial" w:cs="Arial" w:eastAsia="Arial" w:hAnsi="Arial"/>
-                <w:b w:val="false"/>
-                <w:bCs w:val="false"/>
-                <w:color w:val="1F9D63"/>
-                <w:sz w:val="16"/>
-                <w:szCs w:val="16"/>
-              </w:rPr>
-              <w:t xml:space="preserve">Transparencia</w:t>
+              <w:spacing w:after="0" w:before="0" w:line="270" w:lineRule="auto"/>
+            </w:pPr>
+            <w:r>
+              <w:rPr>
+                <w:rFonts w:ascii="Arial" w:cs="Arial" w:eastAsia="Arial" w:hAnsi="Arial"/>
+                <w:b w:val="false"/>
+                <w:bCs w:val="false"/>
+                <w:color w:val="222222"/>
+                <w:sz w:val="16"/>
+                <w:szCs w:val="16"/>
+              </w:rPr>
+              <w:t xml:space="preserve">Delegaciones Territoriales o Provinciales,</w:t>
             </w:r>
           </w:p>
           <w:p>
@@ -5661,19 +4419,8 @@
                 <w:ilvl w:val="0"/>
                 <w:numId w:val="2"/>
               </w:numPr>
-              <w:spacing w:after="0" w:before="0" w:line="193" w:lineRule="exact"/>
-            </w:pPr>
-            <w:r>
-              <w:rPr>
-                <w:rFonts w:ascii="Arial" w:cs="Arial" w:eastAsia="Arial" w:hAnsi="Arial"/>
-                <w:b w:val="false"/>
-                <w:bCs w:val="false"/>
-                <w:color w:val="1F9D63"/>
-                <w:sz w:val="16"/>
-                <w:szCs w:val="16"/>
-              </w:rPr>
-              <w:t xml:space="preserve">Imparcialidad y profesionalidad</w:t>
-            </w:r>
+              <w:spacing w:after="0" w:before="0" w:line="270" w:lineRule="auto"/>
+            </w:pPr>
             <w:r>
               <w:rPr>
                 <w:rFonts w:ascii="Arial" w:cs="Arial" w:eastAsia="Arial" w:hAnsi="Arial"/>
@@ -5683,7 +4430,7 @@
                 <w:sz w:val="16"/>
                 <w:szCs w:val="16"/>
               </w:rPr>
-              <w:t xml:space="preserve"> de los miembros de los órganos de selección.</w:t>
+              <w:t xml:space="preserve">otros órganos dependientes o vinculados a la AJA,</w:t>
             </w:r>
           </w:p>
           <w:p>
@@ -5693,19 +4440,8 @@
                 <w:ilvl w:val="0"/>
                 <w:numId w:val="2"/>
               </w:numPr>
-              <w:spacing w:after="0" w:before="0" w:line="193" w:lineRule="exact"/>
-            </w:pPr>
-            <w:r>
-              <w:rPr>
-                <w:rFonts w:ascii="Arial" w:cs="Arial" w:eastAsia="Arial" w:hAnsi="Arial"/>
-                <w:b w:val="false"/>
-                <w:bCs w:val="false"/>
-                <w:color w:val="1F9D63"/>
-                <w:sz w:val="16"/>
-                <w:szCs w:val="16"/>
-              </w:rPr>
-              <w:t xml:space="preserve">Independencia y discrecionalidad técnica</w:t>
-            </w:r>
+              <w:spacing w:after="0" w:before="0" w:line="270" w:lineRule="auto"/>
+            </w:pPr>
             <w:r>
               <w:rPr>
                 <w:rFonts w:ascii="Arial" w:cs="Arial" w:eastAsia="Arial" w:hAnsi="Arial"/>
@@ -5715,31 +4451,27 @@
                 <w:sz w:val="16"/>
                 <w:szCs w:val="16"/>
               </w:rPr>
-              <w:t xml:space="preserve"> en la actuación de los órganos de selección, así como </w:t>
-            </w:r>
-            <w:r>
-              <w:rPr>
-                <w:rFonts w:ascii="Arial" w:cs="Arial" w:eastAsia="Arial" w:hAnsi="Arial"/>
-                <w:b w:val="false"/>
-                <w:bCs w:val="false"/>
-                <w:color w:val="1F9D63"/>
-                <w:sz w:val="16"/>
-                <w:szCs w:val="16"/>
-              </w:rPr>
-              <w:t xml:space="preserve">confidencialidad</w:t>
-            </w:r>
-            <w:r>
-              <w:rPr>
-                <w:rFonts w:ascii="Arial" w:cs="Arial" w:eastAsia="Arial" w:hAnsi="Arial"/>
-                <w:b w:val="false"/>
-                <w:bCs w:val="false"/>
-                <w:color w:val="222222"/>
-                <w:sz w:val="16"/>
-                <w:szCs w:val="16"/>
-              </w:rPr>
-              <w:t xml:space="preserve"> en su actuación.</w:t>
-            </w:r>
-          </w:p>
+              <w:t xml:space="preserve">y en las AA, ARE o APE</w:t>
+            </w:r>
+          </w:p>
+        </w:tc>
+        <w:tc>
+          <w:tcPr>
+            <w:tcW w:type="dxa" w:w="2146"/>
+            <w:tcBorders>
+              <w:top w:val="single" w:color="D1EDF9" w:sz="6"/>
+              <w:left w:val="single" w:color="D1EDF9" w:sz="6"/>
+              <w:bottom w:val="single" w:color="D1EDF9" w:sz="6"/>
+              <w:right w:val="single" w:color="D1EDF9" w:sz="6"/>
+            </w:tcBorders>
+            <w:shd w:fill="F6FBFE" w:color="auto" w:val="clear"/>
+            <w:tcMar>
+              <w:top w:type="dxa" w:w="14"/>
+              <w:left w:type="dxa" w:w="115"/>
+              <w:bottom w:type="dxa" w:w="0"/>
+              <w:right w:type="dxa" w:w="86"/>
+            </w:tcMar>
+          </w:tcPr>
           <w:p>
             <w:pPr>
               <w:pStyle w:val="ListParagraph"/>
@@ -5747,19 +4479,8 @@
                 <w:ilvl w:val="0"/>
                 <w:numId w:val="2"/>
               </w:numPr>
-              <w:spacing w:after="0" w:before="0" w:line="193" w:lineRule="exact"/>
-            </w:pPr>
-            <w:r>
-              <w:rPr>
-                <w:rFonts w:ascii="Arial" w:cs="Arial" w:eastAsia="Arial" w:hAnsi="Arial"/>
-                <w:b w:val="false"/>
-                <w:bCs w:val="false"/>
-                <w:color w:val="1F9D63"/>
-                <w:sz w:val="16"/>
-                <w:szCs w:val="16"/>
-              </w:rPr>
-              <w:t xml:space="preserve">Fiabilidad</w:t>
-            </w:r>
+              <w:spacing w:after="0" w:before="0" w:line="266" w:lineRule="auto"/>
+            </w:pPr>
             <w:r>
               <w:rPr>
                 <w:rFonts w:ascii="Arial" w:cs="Arial" w:eastAsia="Arial" w:hAnsi="Arial"/>
@@ -5769,28 +4490,7 @@
                 <w:sz w:val="16"/>
                 <w:szCs w:val="16"/>
               </w:rPr>
-              <w:t xml:space="preserve"> y validez predictiva de los instrumentos y procesos.</w:t>
-            </w:r>
-          </w:p>
-          <w:p>
-            <w:pPr>
-              <w:pStyle w:val="ListParagraph"/>
-              <w:numPr>
-                <w:ilvl w:val="0"/>
-                <w:numId w:val="2"/>
-              </w:numPr>
-              <w:spacing w:after="0" w:before="0" w:line="193" w:lineRule="exact"/>
-            </w:pPr>
-            <w:r>
-              <w:rPr>
-                <w:rFonts w:ascii="Arial" w:cs="Arial" w:eastAsia="Arial" w:hAnsi="Arial"/>
-                <w:b w:val="false"/>
-                <w:bCs w:val="false"/>
-                <w:color w:val="1F9D63"/>
-                <w:sz w:val="16"/>
-                <w:szCs w:val="16"/>
-              </w:rPr>
-              <w:t xml:space="preserve">Adecuación</w:t>
+              <w:t xml:space="preserve">Se regirán por </w:t>
             </w:r>
             <w:r>
               <w:rPr>
@@ -5800,29 +4500,9 @@
                 <w:color w:val="222222"/>
                 <w:sz w:val="16"/>
                 <w:szCs w:val="16"/>
-              </w:rPr>
-              <w:t xml:space="preserve"> entre el contenido de los procesos selectivos y las funciones.</w:t>
-            </w:r>
-          </w:p>
-          <w:p>
-            <w:pPr>
-              <w:pStyle w:val="ListParagraph"/>
-              <w:numPr>
-                <w:ilvl w:val="0"/>
-                <w:numId w:val="2"/>
-              </w:numPr>
-              <w:spacing w:after="0" w:before="0" w:line="193" w:lineRule="exact"/>
-            </w:pPr>
-            <w:r>
-              <w:rPr>
-                <w:rFonts w:ascii="Arial" w:cs="Arial" w:eastAsia="Arial" w:hAnsi="Arial"/>
-                <w:b w:val="false"/>
-                <w:bCs w:val="false"/>
-                <w:color w:val="1F9D63"/>
-                <w:sz w:val="16"/>
-                <w:szCs w:val="16"/>
-              </w:rPr>
-              <w:t xml:space="preserve">Agilidad y eficiencia</w:t>
+                <w:u w:val="thick" w:color="9DDFEA"/>
+              </w:rPr>
+              <w:t xml:space="preserve">D 51/25</w:t>
             </w:r>
             <w:r>
               <w:rPr>
@@ -5833,29 +4513,7 @@
                 <w:sz w:val="16"/>
                 <w:szCs w:val="16"/>
               </w:rPr>
-              <w:t xml:space="preserve">, sin perjuicio de la </w:t>
-            </w:r>
-            <w:r>
-              <w:rPr>
-                <w:rFonts w:ascii="Arial" w:cs="Arial" w:eastAsia="Arial" w:hAnsi="Arial"/>
-                <w:b w:val="false"/>
-                <w:bCs w:val="false"/>
-                <w:color w:val="1F9D63"/>
-                <w:sz w:val="16"/>
-                <w:szCs w:val="16"/>
-              </w:rPr>
-              <w:t xml:space="preserve">objetividad</w:t>
-            </w:r>
-            <w:r>
-              <w:rPr>
-                <w:rFonts w:ascii="Arial" w:cs="Arial" w:eastAsia="Arial" w:hAnsi="Arial"/>
-                <w:b w:val="false"/>
-                <w:bCs w:val="false"/>
-                <w:color w:val="222222"/>
-                <w:sz w:val="16"/>
-                <w:szCs w:val="16"/>
-              </w:rPr>
-              <w:t xml:space="preserve">, en los procesos de selección.</w:t>
+              <w:t xml:space="preserve">.</w:t>
             </w:r>
           </w:p>
         </w:tc>
@@ -5893,26 +4551,26 @@
           </w:tcPr>
           <w:p>
             <w:pPr>
-              <w:spacing w:after="0" w:before="0" w:line="207" w:lineRule="exact"/>
+              <w:spacing w:after="0" w:before="0" w:line="221" w:lineRule="auto"/>
               <w:jc w:val="center"/>
             </w:pPr>
             <w:r>
               <w:rPr>
                 <w:rFonts w:ascii="Poppins" w:cs="Poppins" w:eastAsia="Poppins" w:hAnsi="Poppins"/>
-                <w:b w:val="false"/>
-                <w:bCs w:val="false"/>
-                <w:color w:val="143548"/>
+                <w:b/>
+                <w:bCs/>
+                <w:color w:val="1A7BB9"/>
                 <w:sz w:val="15"/>
                 <w:szCs w:val="15"/>
               </w:rPr>
-              <w:t xml:space="preserve">Provisión FC</w:t>
+              <w:t xml:space="preserve">Personal funcionario de la DA1ª</w:t>
             </w:r>
           </w:p>
         </w:tc>
         <w:tc>
           <w:tcPr>
-            <w:tcW w:type="dxa" w:w="6479"/>
-            <w:gridSpan w:val="2"/>
+            <w:tcW w:type="dxa" w:w="4333"/>
+            <w:gridSpan w:val="1"/>
             <w:tcBorders>
               <w:top w:val="single" w:color="D1EDF9" w:sz="6"/>
               <w:left w:val="single" w:color="D1EDF9" w:sz="6"/>
@@ -5920,9 +4578,9 @@
               <w:right w:val="single" w:color="D1EDF9" w:sz="6"/>
             </w:tcBorders>
             <w:tcMar>
-              <w:top w:type="dxa" w:w="29"/>
+              <w:top w:type="dxa" w:w="0"/>
               <w:left w:type="dxa" w:w="115"/>
-              <w:bottom w:type="dxa" w:w="29"/>
+              <w:bottom w:type="dxa" w:w="0"/>
               <w:right w:type="dxa" w:w="86"/>
             </w:tcMar>
           </w:tcPr>
@@ -5933,7 +4591,7 @@
                 <w:ilvl w:val="0"/>
                 <w:numId w:val="2"/>
               </w:numPr>
-              <w:spacing w:after="0" w:before="0" w:line="193" w:lineRule="exact"/>
+              <w:spacing w:after="0" w:before="0" w:line="270" w:lineRule="auto"/>
             </w:pPr>
             <w:r>
               <w:rPr>
@@ -5944,29 +4602,7 @@
                 <w:sz w:val="16"/>
                 <w:szCs w:val="16"/>
               </w:rPr>
-              <w:t xml:space="preserve">Se llevará a cabo mediante los ppios de </w:t>
-            </w:r>
-            <w:r>
-              <w:rPr>
-                <w:rFonts w:ascii="Arial" w:cs="Arial" w:eastAsia="Arial" w:hAnsi="Arial"/>
-                <w:b w:val="false"/>
-                <w:bCs w:val="false"/>
-                <w:color w:val="1F9D63"/>
-                <w:sz w:val="16"/>
-                <w:szCs w:val="16"/>
-              </w:rPr>
-              <w:t xml:space="preserve">igualdad, mérito, capacidad, publicidad</w:t>
-            </w:r>
-            <w:r>
-              <w:rPr>
-                <w:rFonts w:ascii="Arial" w:cs="Arial" w:eastAsia="Arial" w:hAnsi="Arial"/>
-                <w:b w:val="false"/>
-                <w:bCs w:val="false"/>
-                <w:color w:val="222222"/>
-                <w:sz w:val="16"/>
-                <w:szCs w:val="16"/>
-              </w:rPr>
-              <w:t xml:space="preserve">,</w:t>
+              <w:t xml:space="preserve">Cuerpo de Letrados/as.</w:t>
             </w:r>
           </w:p>
           <w:p>
@@ -5976,7 +4612,7 @@
                 <w:ilvl w:val="0"/>
                 <w:numId w:val="2"/>
               </w:numPr>
-              <w:spacing w:after="0" w:before="0" w:line="193" w:lineRule="exact"/>
+              <w:spacing w:after="0" w:before="0" w:line="270" w:lineRule="auto"/>
             </w:pPr>
             <w:r>
               <w:rPr>
@@ -5987,19 +4623,18 @@
                 <w:sz w:val="16"/>
                 <w:szCs w:val="16"/>
               </w:rPr>
-              <w:t xml:space="preserve">y en su caso, para puestos provistos por libre designación (PLD), </w:t>
-            </w:r>
-            <w:r>
-              <w:rPr>
-                <w:rFonts w:ascii="Arial" w:cs="Arial" w:eastAsia="Arial" w:hAnsi="Arial"/>
-                <w:b w:val="false"/>
-                <w:bCs w:val="false"/>
-                <w:color w:val="1F9D63"/>
-                <w:sz w:val="16"/>
-                <w:szCs w:val="16"/>
-              </w:rPr>
-              <w:t xml:space="preserve">idoneidad</w:t>
-            </w:r>
+              <w:t xml:space="preserve">Cuerpo Superior de Inspección de OTUyV,</w:t>
+            </w:r>
+          </w:p>
+          <w:p>
+            <w:pPr>
+              <w:pStyle w:val="ListParagraph"/>
+              <w:numPr>
+                <w:ilvl w:val="0"/>
+                <w:numId w:val="2"/>
+              </w:numPr>
+              <w:spacing w:after="0" w:before="0" w:line="270" w:lineRule="auto"/>
+            </w:pPr>
             <w:r>
               <w:rPr>
                 <w:rFonts w:ascii="Arial" w:cs="Arial" w:eastAsia="Arial" w:hAnsi="Arial"/>
@@ -6009,7 +4644,197 @@
                 <w:sz w:val="16"/>
                 <w:szCs w:val="16"/>
               </w:rPr>
+              <w:t xml:space="preserve">Cuerpo de Subinspección de OTUyV.</w:t>
+            </w:r>
+          </w:p>
+          <w:p>
+            <w:pPr>
+              <w:pStyle w:val="ListParagraph"/>
+              <w:numPr>
+                <w:ilvl w:val="0"/>
+                <w:numId w:val="2"/>
+              </w:numPr>
+              <w:spacing w:after="0" w:before="0" w:line="270" w:lineRule="auto"/>
+            </w:pPr>
+            <w:r>
+              <w:rPr>
+                <w:rFonts w:ascii="Arial" w:cs="Arial" w:eastAsia="Arial" w:hAnsi="Arial"/>
+                <w:b w:val="false"/>
+                <w:bCs w:val="false"/>
+                <w:color w:val="222222"/>
+                <w:sz w:val="16"/>
+                <w:szCs w:val="16"/>
+              </w:rPr>
+              <w:t xml:space="preserve">Cuerpo Superior Facultativo de Instit. Sanitarias</w:t>
+            </w:r>
+          </w:p>
+          <w:p>
+            <w:pPr>
+              <w:pStyle w:val="ListParagraph"/>
+              <w:numPr>
+                <w:ilvl w:val="0"/>
+                <w:numId w:val="2"/>
+              </w:numPr>
+              <w:spacing w:after="0" w:before="0" w:line="270" w:lineRule="auto"/>
+            </w:pPr>
+            <w:r>
+              <w:rPr>
+                <w:rFonts w:ascii="Arial" w:cs="Arial" w:eastAsia="Arial" w:hAnsi="Arial"/>
+                <w:b w:val="false"/>
+                <w:bCs w:val="false"/>
+                <w:color w:val="222222"/>
+                <w:sz w:val="16"/>
+                <w:szCs w:val="16"/>
+              </w:rPr>
+              <w:t xml:space="preserve">Especialidad Investigación Agraria y Pesquera (…),</w:t>
+            </w:r>
+          </w:p>
+          <w:p>
+            <w:pPr>
+              <w:pStyle w:val="ListParagraph"/>
+              <w:numPr>
+                <w:ilvl w:val="0"/>
+                <w:numId w:val="2"/>
+              </w:numPr>
+              <w:spacing w:after="0" w:before="0" w:line="270" w:lineRule="auto"/>
+            </w:pPr>
+            <w:r>
+              <w:rPr>
+                <w:rFonts w:ascii="Arial" w:cs="Arial" w:eastAsia="Arial" w:hAnsi="Arial"/>
+                <w:b w:val="false"/>
+                <w:bCs w:val="false"/>
+                <w:color w:val="222222"/>
+                <w:sz w:val="16"/>
+                <w:szCs w:val="16"/>
+              </w:rPr>
+              <w:t xml:space="preserve">Cuerpo Ayudantes Técnicos (Medio Ambiente)</w:t>
+            </w:r>
+          </w:p>
+          <w:p>
+            <w:pPr>
+              <w:pStyle w:val="ListParagraph"/>
+              <w:numPr>
+                <w:ilvl w:val="0"/>
+                <w:numId w:val="2"/>
+              </w:numPr>
+              <w:spacing w:after="0" w:before="0" w:line="270" w:lineRule="auto"/>
+            </w:pPr>
+            <w:r>
+              <w:rPr>
+                <w:rFonts w:ascii="Arial" w:cs="Arial" w:eastAsia="Arial" w:hAnsi="Arial"/>
+                <w:b w:val="false"/>
+                <w:bCs w:val="false"/>
+                <w:color w:val="222222"/>
+                <w:sz w:val="16"/>
+                <w:szCs w:val="16"/>
+              </w:rPr>
+              <w:t xml:space="preserve">Cuerpo Superior (y Técnico) de Interv. y Auditoría.</w:t>
+            </w:r>
+          </w:p>
+        </w:tc>
+        <w:tc>
+          <w:tcPr>
+            <w:tcW w:type="dxa" w:w="2146"/>
+            <w:tcBorders>
+              <w:top w:val="single" w:color="D1EDF9" w:sz="6"/>
+              <w:left w:val="single" w:color="D1EDF9" w:sz="6"/>
+              <w:bottom w:val="single" w:color="D1EDF9" w:sz="6"/>
+              <w:right w:val="single" w:color="D1EDF9" w:sz="6"/>
+            </w:tcBorders>
+            <w:shd w:fill="F6FBFE" w:color="auto" w:val="clear"/>
+            <w:tcMar>
+              <w:top w:type="dxa" w:w="14"/>
+              <w:left w:type="dxa" w:w="115"/>
+              <w:bottom w:type="dxa" w:w="0"/>
+              <w:right w:type="dxa" w:w="86"/>
+            </w:tcMar>
+          </w:tcPr>
+          <w:p>
+            <w:pPr>
+              <w:pStyle w:val="ListParagraph"/>
+              <w:numPr>
+                <w:ilvl w:val="0"/>
+                <w:numId w:val="2"/>
+              </w:numPr>
+              <w:spacing w:after="0" w:before="0" w:line="266" w:lineRule="auto"/>
+            </w:pPr>
+            <w:r>
+              <w:rPr>
+                <w:rFonts w:ascii="Arial" w:cs="Arial" w:eastAsia="Arial" w:hAnsi="Arial"/>
+                <w:b w:val="false"/>
+                <w:bCs w:val="false"/>
+                <w:color w:val="222222"/>
+                <w:sz w:val="16"/>
+                <w:szCs w:val="16"/>
+              </w:rPr>
+              <w:t xml:space="preserve">Se regirán por su </w:t>
+            </w:r>
+            <w:r>
+              <w:rPr>
+                <w:rFonts w:ascii="Arial" w:cs="Arial" w:eastAsia="Arial" w:hAnsi="Arial"/>
+                <w:b w:val="false"/>
+                <w:bCs w:val="false"/>
+                <w:color w:val="222222"/>
+                <w:sz w:val="16"/>
+                <w:szCs w:val="16"/>
+                <w:u w:val="thick" w:color="9DDFEA"/>
+              </w:rPr>
+              <w:t xml:space="preserve">normativa específica</w:t>
+            </w:r>
+            <w:r>
+              <w:rPr>
+                <w:rFonts w:ascii="Arial" w:cs="Arial" w:eastAsia="Arial" w:hAnsi="Arial"/>
+                <w:b w:val="false"/>
+                <w:bCs w:val="false"/>
+                <w:color w:val="222222"/>
+                <w:sz w:val="16"/>
+                <w:szCs w:val="16"/>
+              </w:rPr>
               <w:t xml:space="preserve">.</w:t>
+            </w:r>
+          </w:p>
+          <w:p>
+            <w:pPr>
+              <w:pStyle w:val="ListParagraph"/>
+              <w:numPr>
+                <w:ilvl w:val="0"/>
+                <w:numId w:val="2"/>
+              </w:numPr>
+              <w:spacing w:after="0" w:before="72" w:line="266" w:lineRule="auto"/>
+            </w:pPr>
+            <w:r>
+              <w:rPr>
+                <w:rFonts w:ascii="Arial" w:cs="Arial" w:eastAsia="Arial" w:hAnsi="Arial"/>
+                <w:b w:val="false"/>
+                <w:bCs w:val="false"/>
+                <w:color w:val="222222"/>
+                <w:sz w:val="16"/>
+                <w:szCs w:val="16"/>
+              </w:rPr>
+              <w:t xml:space="preserve">En todo no previsto en la misma, se rigen por </w:t>
+            </w:r>
+            <w:r>
+              <w:rPr>
+                <w:rFonts w:ascii="Arial" w:cs="Arial" w:eastAsia="Arial" w:hAnsi="Arial"/>
+                <w:b w:val="false"/>
+                <w:bCs w:val="false"/>
+                <w:color w:val="222222"/>
+                <w:sz w:val="16"/>
+                <w:szCs w:val="16"/>
+                <w:u w:val="thick" w:color="9DDFEA"/>
+              </w:rPr>
+              <w:t xml:space="preserve">LFPA y D 51/25</w:t>
+            </w:r>
+            <w:r>
+              <w:rPr>
+                <w:rFonts w:ascii="Arial" w:cs="Arial" w:eastAsia="Arial" w:hAnsi="Arial"/>
+                <w:b w:val="false"/>
+                <w:bCs w:val="false"/>
+                <w:color w:val="222222"/>
+                <w:sz w:val="16"/>
+                <w:szCs w:val="16"/>
+              </w:rPr>
+              <w:t xml:space="preserve">;</w:t>
             </w:r>
           </w:p>
         </w:tc>
@@ -6047,19 +4872,19 @@
           </w:tcPr>
           <w:p>
             <w:pPr>
-              <w:spacing w:after="0" w:before="0" w:line="207" w:lineRule="exact"/>
+              <w:spacing w:after="0" w:before="0" w:line="221" w:lineRule="auto"/>
               <w:jc w:val="center"/>
             </w:pPr>
             <w:r>
               <w:rPr>
                 <w:rFonts w:ascii="Poppins" w:cs="Poppins" w:eastAsia="Poppins" w:hAnsi="Poppins"/>
-                <w:b w:val="false"/>
-                <w:bCs w:val="false"/>
-                <w:color w:val="143548"/>
+                <w:b/>
+                <w:bCs/>
+                <w:color w:val="1A7BB9"/>
                 <w:sz w:val="15"/>
                 <w:szCs w:val="15"/>
               </w:rPr>
-              <w:t xml:space="preserve">Interinos y Laboral Temporal</w:t>
+              <w:t xml:space="preserve">Personal laboral</w:t>
             </w:r>
           </w:p>
         </w:tc>
@@ -6074,9 +4899,9 @@
               <w:right w:val="single" w:color="D1EDF9" w:sz="6"/>
             </w:tcBorders>
             <w:tcMar>
-              <w:top w:type="dxa" w:w="29"/>
+              <w:top w:type="dxa" w:w="0"/>
               <w:left w:type="dxa" w:w="115"/>
-              <w:bottom w:type="dxa" w:w="29"/>
+              <w:bottom w:type="dxa" w:w="0"/>
               <w:right w:type="dxa" w:w="86"/>
             </w:tcMar>
           </w:tcPr>
@@ -6087,19 +4912,29 @@
                 <w:ilvl w:val="0"/>
                 <w:numId w:val="2"/>
               </w:numPr>
-              <w:spacing w:after="0" w:before="0" w:line="193" w:lineRule="exact"/>
-            </w:pPr>
-            <w:r>
-              <w:rPr>
-                <w:rFonts w:ascii="Arial" w:cs="Arial" w:eastAsia="Arial" w:hAnsi="Arial"/>
-                <w:b/>
-                <w:bCs/>
+              <w:spacing w:after="0" w:before="0" w:line="270" w:lineRule="auto"/>
+            </w:pPr>
+            <w:r>
+              <w:rPr>
+                <w:rFonts w:ascii="Arial" w:cs="Arial" w:eastAsia="Arial" w:hAnsi="Arial"/>
+                <w:b w:val="false"/>
+                <w:bCs w:val="false"/>
                 <w:color w:val="222222"/>
                 <w:sz w:val="16"/>
                 <w:szCs w:val="16"/>
               </w:rPr>
-              <w:t xml:space="preserve">Procedimientos ágiles</w:t>
-            </w:r>
+              <w:t xml:space="preserve">Legislación laboral</w:t>
+            </w:r>
+          </w:p>
+          <w:p>
+            <w:pPr>
+              <w:pStyle w:val="ListParagraph"/>
+              <w:numPr>
+                <w:ilvl w:val="0"/>
+                <w:numId w:val="2"/>
+              </w:numPr>
+              <w:spacing w:after="0" w:before="0" w:line="270" w:lineRule="auto"/>
+            </w:pPr>
             <w:r>
               <w:rPr>
                 <w:rFonts w:ascii="Arial" w:cs="Arial" w:eastAsia="Arial" w:hAnsi="Arial"/>
@@ -6109,19 +4944,18 @@
                 <w:sz w:val="16"/>
                 <w:szCs w:val="16"/>
               </w:rPr>
-              <w:t xml:space="preserve"> que garanticen </w:t>
-            </w:r>
-            <w:r>
-              <w:rPr>
-                <w:rFonts w:ascii="Arial" w:cs="Arial" w:eastAsia="Arial" w:hAnsi="Arial"/>
-                <w:b w:val="false"/>
-                <w:bCs w:val="false"/>
-                <w:color w:val="1F9D63"/>
-                <w:sz w:val="16"/>
-                <w:szCs w:val="16"/>
-              </w:rPr>
-              <w:t xml:space="preserve">igualdad, mérito, capacidad, publicidad y celeridad</w:t>
-            </w:r>
+              <w:t xml:space="preserve">EBEP y restantes legislación estatal de carácter básico aplicable</w:t>
+            </w:r>
+          </w:p>
+          <w:p>
+            <w:pPr>
+              <w:pStyle w:val="ListParagraph"/>
+              <w:numPr>
+                <w:ilvl w:val="0"/>
+                <w:numId w:val="2"/>
+              </w:numPr>
+              <w:spacing w:after="0" w:before="0" w:line="270" w:lineRule="auto"/>
+            </w:pPr>
             <w:r>
               <w:rPr>
                 <w:rFonts w:ascii="Arial" w:cs="Arial" w:eastAsia="Arial" w:hAnsi="Arial"/>
@@ -6131,7 +4965,28 @@
                 <w:sz w:val="16"/>
                 <w:szCs w:val="16"/>
               </w:rPr>
-              <w:t xml:space="preserve">.</w:t>
+              <w:t xml:space="preserve">Preceptos de la LFPA y D 51/25 que así lo dispongan expresamente</w:t>
+            </w:r>
+          </w:p>
+          <w:p>
+            <w:pPr>
+              <w:pStyle w:val="ListParagraph"/>
+              <w:numPr>
+                <w:ilvl w:val="0"/>
+                <w:numId w:val="2"/>
+              </w:numPr>
+              <w:spacing w:after="0" w:before="0" w:line="270" w:lineRule="auto"/>
+            </w:pPr>
+            <w:r>
+              <w:rPr>
+                <w:rFonts w:ascii="Arial" w:cs="Arial" w:eastAsia="Arial" w:hAnsi="Arial"/>
+                <w:b w:val="false"/>
+                <w:bCs w:val="false"/>
+                <w:color w:val="222222"/>
+                <w:sz w:val="16"/>
+                <w:szCs w:val="16"/>
+              </w:rPr>
+              <w:t xml:space="preserve">Normas convencionales que sean de aplicación</w:t>
             </w:r>
           </w:p>
         </w:tc>
@@ -6169,26 +5024,26 @@
           </w:tcPr>
           <w:p>
             <w:pPr>
-              <w:spacing w:after="0" w:before="0" w:line="207" w:lineRule="exact"/>
+              <w:spacing w:after="0" w:before="0" w:line="221" w:lineRule="auto"/>
               <w:jc w:val="center"/>
             </w:pPr>
             <w:r>
               <w:rPr>
                 <w:rFonts w:ascii="Poppins" w:cs="Poppins" w:eastAsia="Poppins" w:hAnsi="Poppins"/>
-                <w:b w:val="false"/>
-                <w:bCs w:val="false"/>
-                <w:color w:val="143548"/>
+                <w:b/>
+                <w:bCs/>
+                <w:color w:val="1A7BB9"/>
                 <w:sz w:val="15"/>
                 <w:szCs w:val="15"/>
               </w:rPr>
-              <w:t xml:space="preserve">Discapacidad</w:t>
+              <w:t xml:space="preserve">Personal del art 3.1 LFPA</w:t>
             </w:r>
           </w:p>
         </w:tc>
         <w:tc>
           <w:tcPr>
-            <w:tcW w:type="dxa" w:w="6479"/>
-            <w:gridSpan w:val="2"/>
+            <w:tcW w:type="dxa" w:w="4333"/>
+            <w:gridSpan w:val="1"/>
             <w:tcBorders>
               <w:top w:val="single" w:color="D1EDF9" w:sz="6"/>
               <w:left w:val="single" w:color="D1EDF9" w:sz="6"/>
@@ -6196,9 +5051,9 @@
               <w:right w:val="single" w:color="D1EDF9" w:sz="6"/>
             </w:tcBorders>
             <w:tcMar>
-              <w:top w:type="dxa" w:w="29"/>
+              <w:top w:type="dxa" w:w="0"/>
               <w:left w:type="dxa" w:w="115"/>
-              <w:bottom w:type="dxa" w:w="29"/>
+              <w:bottom w:type="dxa" w:w="0"/>
               <w:right w:type="dxa" w:w="86"/>
             </w:tcMar>
           </w:tcPr>
@@ -6209,19 +5064,8 @@
                 <w:ilvl w:val="0"/>
                 <w:numId w:val="2"/>
               </w:numPr>
-              <w:spacing w:after="0" w:before="0" w:line="193" w:lineRule="exact"/>
-            </w:pPr>
-            <w:r>
-              <w:rPr>
-                <w:rFonts w:ascii="Arial" w:cs="Arial" w:eastAsia="Arial" w:hAnsi="Arial"/>
-                <w:b w:val="false"/>
-                <w:bCs w:val="false"/>
-                <w:color w:val="1F9D63"/>
-                <w:sz w:val="16"/>
-                <w:szCs w:val="16"/>
-              </w:rPr>
-              <w:t xml:space="preserve">= de oportunidades, no discriminación</w:t>
-            </w:r>
+              <w:spacing w:after="0" w:before="0" w:line="270" w:lineRule="auto"/>
+            </w:pPr>
             <w:r>
               <w:rPr>
                 <w:rFonts w:ascii="Arial" w:cs="Arial" w:eastAsia="Arial" w:hAnsi="Arial"/>
@@ -6231,85 +5075,297 @@
                 <w:sz w:val="16"/>
                 <w:szCs w:val="16"/>
               </w:rPr>
-              <w:t xml:space="preserve"> y </w:t>
-            </w:r>
-            <w:r>
-              <w:rPr>
-                <w:rFonts w:ascii="Arial" w:cs="Arial" w:eastAsia="Arial" w:hAnsi="Arial"/>
-                <w:b w:val="false"/>
-                <w:bCs w:val="false"/>
-                <w:color w:val="1F9D63"/>
-                <w:sz w:val="16"/>
-                <w:szCs w:val="16"/>
-              </w:rPr>
-              <w:t xml:space="preserve">accesibilidad universal.</w:t>
+              <w:t xml:space="preserve">Servicio Andaluz de Salud.</w:t>
+            </w:r>
+          </w:p>
+          <w:p>
+            <w:pPr>
+              <w:pStyle w:val="ListParagraph"/>
+              <w:numPr>
+                <w:ilvl w:val="0"/>
+                <w:numId w:val="2"/>
+              </w:numPr>
+              <w:spacing w:after="0" w:before="0" w:line="270" w:lineRule="auto"/>
+            </w:pPr>
+            <w:r>
+              <w:rPr>
+                <w:rFonts w:ascii="Arial" w:cs="Arial" w:eastAsia="Arial" w:hAnsi="Arial"/>
+                <w:b w:val="false"/>
+                <w:bCs w:val="false"/>
+                <w:color w:val="222222"/>
+                <w:sz w:val="16"/>
+                <w:szCs w:val="16"/>
+              </w:rPr>
+              <w:t xml:space="preserve">Admin. de Justicia.</w:t>
+            </w:r>
+          </w:p>
+          <w:p>
+            <w:pPr>
+              <w:pStyle w:val="ListParagraph"/>
+              <w:numPr>
+                <w:ilvl w:val="0"/>
+                <w:numId w:val="2"/>
+              </w:numPr>
+              <w:spacing w:after="0" w:before="0" w:line="270" w:lineRule="auto"/>
+            </w:pPr>
+            <w:r>
+              <w:rPr>
+                <w:rFonts w:ascii="Arial" w:cs="Arial" w:eastAsia="Arial" w:hAnsi="Arial"/>
+                <w:b w:val="false"/>
+                <w:bCs w:val="false"/>
+                <w:color w:val="222222"/>
+                <w:sz w:val="16"/>
+                <w:szCs w:val="16"/>
+              </w:rPr>
+              <w:t xml:space="preserve">Universidades públicas:</w:t>
+            </w:r>
+          </w:p>
+          <w:p>
+            <w:pPr>
+              <w:pStyle w:val="ListParagraph"/>
+              <w:numPr>
+                <w:ilvl w:val="0"/>
+                <w:numId w:val="2"/>
+              </w:numPr>
+              <w:spacing w:after="0" w:before="0" w:line="270" w:lineRule="auto"/>
+            </w:pPr>
+            <w:r>
+              <w:rPr>
+                <w:rFonts w:ascii="Arial" w:cs="Arial" w:eastAsia="Arial" w:hAnsi="Arial"/>
+                <w:b w:val="false"/>
+                <w:bCs w:val="false"/>
+                <w:color w:val="222222"/>
+                <w:sz w:val="16"/>
+                <w:szCs w:val="16"/>
+              </w:rPr>
+              <w:t xml:space="preserve">Funcionario docente universitario.</w:t>
+            </w:r>
+          </w:p>
+          <w:p>
+            <w:pPr>
+              <w:pStyle w:val="ListParagraph"/>
+              <w:numPr>
+                <w:ilvl w:val="0"/>
+                <w:numId w:val="2"/>
+              </w:numPr>
+              <w:spacing w:after="0" w:before="0" w:line="270" w:lineRule="auto"/>
+            </w:pPr>
+            <w:r>
+              <w:rPr>
+                <w:rFonts w:ascii="Arial" w:cs="Arial" w:eastAsia="Arial" w:hAnsi="Arial"/>
+                <w:b w:val="false"/>
+                <w:bCs w:val="false"/>
+                <w:color w:val="222222"/>
+                <w:sz w:val="16"/>
+                <w:szCs w:val="16"/>
+              </w:rPr>
+              <w:t xml:space="preserve">Funcionario y laboral de admin y servicios.</w:t>
+            </w:r>
+          </w:p>
+          <w:p>
+            <w:pPr>
+              <w:pStyle w:val="ListParagraph"/>
+              <w:numPr>
+                <w:ilvl w:val="0"/>
+                <w:numId w:val="2"/>
+              </w:numPr>
+              <w:spacing w:after="0" w:before="0" w:line="270" w:lineRule="auto"/>
+            </w:pPr>
+            <w:r>
+              <w:rPr>
+                <w:rFonts w:ascii="Arial" w:cs="Arial" w:eastAsia="Arial" w:hAnsi="Arial"/>
+                <w:b w:val="false"/>
+                <w:bCs w:val="false"/>
+                <w:color w:val="222222"/>
+                <w:sz w:val="16"/>
+                <w:szCs w:val="16"/>
+              </w:rPr>
+              <w:t xml:space="preserve">Administraciones locales.</w:t>
+            </w:r>
+          </w:p>
+          <w:p>
+            <w:pPr>
+              <w:pStyle w:val="ListParagraph"/>
+              <w:numPr>
+                <w:ilvl w:val="0"/>
+                <w:numId w:val="2"/>
+              </w:numPr>
+              <w:spacing w:after="0" w:before="0" w:line="270" w:lineRule="auto"/>
+            </w:pPr>
+            <w:r>
+              <w:rPr>
+                <w:rFonts w:ascii="Arial" w:cs="Arial" w:eastAsia="Arial" w:hAnsi="Arial"/>
+                <w:b w:val="false"/>
+                <w:bCs w:val="false"/>
+                <w:color w:val="222222"/>
+                <w:sz w:val="16"/>
+                <w:szCs w:val="16"/>
+              </w:rPr>
+              <w:t xml:space="preserve">Oficina Andaluza contra el Fraude y la Corrupción,</w:t>
+            </w:r>
+          </w:p>
+          <w:p>
+            <w:pPr>
+              <w:pStyle w:val="ListParagraph"/>
+              <w:numPr>
+                <w:ilvl w:val="0"/>
+                <w:numId w:val="2"/>
+              </w:numPr>
+              <w:spacing w:after="0" w:before="0" w:line="270" w:lineRule="auto"/>
+            </w:pPr>
+            <w:r>
+              <w:rPr>
+                <w:rFonts w:ascii="Arial" w:cs="Arial" w:eastAsia="Arial" w:hAnsi="Arial"/>
+                <w:b w:val="false"/>
+                <w:bCs w:val="false"/>
+                <w:color w:val="222222"/>
+                <w:sz w:val="16"/>
+                <w:szCs w:val="16"/>
+              </w:rPr>
+              <w:t xml:space="preserve">Consejo Consultivo de Andalucía,</w:t>
+            </w:r>
+          </w:p>
+          <w:p>
+            <w:pPr>
+              <w:pStyle w:val="ListParagraph"/>
+              <w:numPr>
+                <w:ilvl w:val="0"/>
+                <w:numId w:val="2"/>
+              </w:numPr>
+              <w:spacing w:after="0" w:before="0" w:line="270" w:lineRule="auto"/>
+            </w:pPr>
+            <w:r>
+              <w:rPr>
+                <w:rFonts w:ascii="Arial" w:cs="Arial" w:eastAsia="Arial" w:hAnsi="Arial"/>
+                <w:b w:val="false"/>
+                <w:bCs w:val="false"/>
+                <w:color w:val="222222"/>
+                <w:sz w:val="16"/>
+                <w:szCs w:val="16"/>
+              </w:rPr>
+              <w:t xml:space="preserve">Consejo Audiovisual de Andalucía,</w:t>
+            </w:r>
+          </w:p>
+          <w:p>
+            <w:pPr>
+              <w:pStyle w:val="ListParagraph"/>
+              <w:numPr>
+                <w:ilvl w:val="0"/>
+                <w:numId w:val="2"/>
+              </w:numPr>
+              <w:spacing w:after="0" w:before="0" w:line="270" w:lineRule="auto"/>
+            </w:pPr>
+            <w:r>
+              <w:rPr>
+                <w:rFonts w:ascii="Arial" w:cs="Arial" w:eastAsia="Arial" w:hAnsi="Arial"/>
+                <w:b w:val="false"/>
+                <w:bCs w:val="false"/>
+                <w:color w:val="222222"/>
+                <w:sz w:val="16"/>
+                <w:szCs w:val="16"/>
+              </w:rPr>
+              <w:t xml:space="preserve">Consejo Económico y Social de Andalucía,</w:t>
+            </w:r>
+          </w:p>
+          <w:p>
+            <w:pPr>
+              <w:pStyle w:val="ListParagraph"/>
+              <w:numPr>
+                <w:ilvl w:val="0"/>
+                <w:numId w:val="2"/>
+              </w:numPr>
+              <w:spacing w:after="0" w:before="0" w:line="270" w:lineRule="auto"/>
+            </w:pPr>
+            <w:r>
+              <w:rPr>
+                <w:rFonts w:ascii="Arial" w:cs="Arial" w:eastAsia="Arial" w:hAnsi="Arial"/>
+                <w:b w:val="false"/>
+                <w:bCs w:val="false"/>
+                <w:color w:val="222222"/>
+                <w:sz w:val="16"/>
+                <w:szCs w:val="16"/>
+              </w:rPr>
+              <w:t xml:space="preserve">Consejo de Transparencia y Protección de Datos,</w:t>
+            </w:r>
+          </w:p>
+          <w:p>
+            <w:pPr>
+              <w:pStyle w:val="ListParagraph"/>
+              <w:numPr>
+                <w:ilvl w:val="0"/>
+                <w:numId w:val="2"/>
+              </w:numPr>
+              <w:spacing w:after="0" w:before="0" w:line="270" w:lineRule="auto"/>
+            </w:pPr>
+            <w:r>
+              <w:rPr>
+                <w:rFonts w:ascii="Arial" w:cs="Arial" w:eastAsia="Arial" w:hAnsi="Arial"/>
+                <w:b w:val="false"/>
+                <w:bCs w:val="false"/>
+                <w:color w:val="222222"/>
+                <w:sz w:val="16"/>
+                <w:szCs w:val="16"/>
+              </w:rPr>
+              <w:t xml:space="preserve">Otras entidades públicas con personalidad jurídica.</w:t>
+            </w:r>
+          </w:p>
+          <w:p>
+            <w:pPr>
+              <w:pStyle w:val="ListParagraph"/>
+              <w:numPr>
+                <w:ilvl w:val="0"/>
+                <w:numId w:val="2"/>
+              </w:numPr>
+              <w:spacing w:after="0" w:before="0" w:line="270" w:lineRule="auto"/>
+            </w:pPr>
+            <w:r>
+              <w:rPr>
+                <w:rFonts w:ascii="Arial" w:cs="Arial" w:eastAsia="Arial" w:hAnsi="Arial"/>
+                <w:b w:val="false"/>
+                <w:bCs w:val="false"/>
+                <w:color w:val="222222"/>
+                <w:sz w:val="16"/>
+                <w:szCs w:val="16"/>
+              </w:rPr>
+              <w:t xml:space="preserve">Personal investigador.</w:t>
+            </w:r>
+          </w:p>
+          <w:p>
+            <w:pPr>
+              <w:pStyle w:val="ListParagraph"/>
+              <w:numPr>
+                <w:ilvl w:val="0"/>
+                <w:numId w:val="2"/>
+              </w:numPr>
+              <w:spacing w:after="0" w:before="0" w:line="270" w:lineRule="auto"/>
+            </w:pPr>
+            <w:r>
+              <w:rPr>
+                <w:rFonts w:ascii="Arial" w:cs="Arial" w:eastAsia="Arial" w:hAnsi="Arial"/>
+                <w:b w:val="false"/>
+                <w:bCs w:val="false"/>
+                <w:color w:val="222222"/>
+                <w:sz w:val="16"/>
+                <w:szCs w:val="16"/>
+              </w:rPr>
+              <w:t xml:space="preserve">Personal eventual.</w:t>
             </w:r>
           </w:p>
         </w:tc>
-      </w:tr>
-      <w:tr>
         <w:tc>
           <w:tcPr>
-            <w:vMerge w:val="continue"/>
+            <w:tcW w:type="dxa" w:w="2146"/>
             <w:tcBorders>
               <w:top w:val="single" w:color="D1EDF9" w:sz="6"/>
               <w:left w:val="single" w:color="D1EDF9" w:sz="6"/>
               <w:bottom w:val="single" w:color="D1EDF9" w:sz="6"/>
               <w:right w:val="single" w:color="D1EDF9" w:sz="6"/>
             </w:tcBorders>
-          </w:tcPr>
-          <w:p/>
-        </w:tc>
-        <w:tc>
-          <w:tcPr>
-            <w:tcW w:type="dxa" w:w="1612"/>
-            <w:tcBorders>
-              <w:top w:val="single" w:color="D1EDF9" w:sz="6"/>
-              <w:left w:val="single" w:color="D1EDF9" w:sz="6"/>
-              <w:bottom w:val="single" w:color="D1EDF9" w:sz="6"/>
-              <w:right w:val="single" w:color="D1EDF9" w:sz="6"/>
-            </w:tcBorders>
-            <w:shd w:fill="F8F9FA" w:color="auto" w:val="clear"/>
+            <w:shd w:fill="F6FBFE" w:color="auto" w:val="clear"/>
             <w:tcMar>
-              <w:top w:type="dxa" w:w="58"/>
+              <w:top w:type="dxa" w:w="14"/>
               <w:left w:type="dxa" w:w="115"/>
-              <w:bottom w:type="dxa" w:w="43"/>
-              <w:right w:type="dxa" w:w="86"/>
-            </w:tcMar>
-            <w:vAlign w:val="center"/>
-          </w:tcPr>
-          <w:p>
-            <w:pPr>
-              <w:spacing w:after="0" w:before="0" w:line="207" w:lineRule="exact"/>
-              <w:jc w:val="center"/>
-            </w:pPr>
-            <w:r>
-              <w:rPr>
-                <w:rFonts w:ascii="Poppins" w:cs="Poppins" w:eastAsia="Poppins" w:hAnsi="Poppins"/>
-                <w:b w:val="false"/>
-                <w:bCs w:val="false"/>
-                <w:color w:val="143548"/>
-                <w:sz w:val="15"/>
-                <w:szCs w:val="15"/>
-              </w:rPr>
-              <w:t xml:space="preserve">Igualdad M y H</w:t>
-            </w:r>
-          </w:p>
-        </w:tc>
-        <w:tc>
-          <w:tcPr>
-            <w:tcW w:type="dxa" w:w="6479"/>
-            <w:gridSpan w:val="2"/>
-            <w:tcBorders>
-              <w:top w:val="single" w:color="D1EDF9" w:sz="6"/>
-              <w:left w:val="single" w:color="D1EDF9" w:sz="6"/>
-              <w:bottom w:val="single" w:color="D1EDF9" w:sz="6"/>
-              <w:right w:val="single" w:color="D1EDF9" w:sz="6"/>
-            </w:tcBorders>
-            <w:tcMar>
-              <w:top w:type="dxa" w:w="29"/>
-              <w:left w:type="dxa" w:w="115"/>
-              <w:bottom w:type="dxa" w:w="29"/>
+              <w:bottom w:type="dxa" w:w="0"/>
               <w:right w:type="dxa" w:w="86"/>
             </w:tcMar>
           </w:tcPr>
@@ -6320,7 +5376,7 @@
                 <w:ilvl w:val="0"/>
                 <w:numId w:val="2"/>
               </w:numPr>
-              <w:spacing w:after="0" w:before="0" w:line="193" w:lineRule="exact"/>
+              <w:spacing w:after="0" w:before="0" w:line="266" w:lineRule="auto"/>
             </w:pPr>
             <w:r>
               <w:rPr>
@@ -6331,18 +5387,7 @@
                 <w:sz w:val="16"/>
                 <w:szCs w:val="16"/>
               </w:rPr>
-              <w:t xml:space="preserve">Medidas específicas para alcanzar </w:t>
-            </w:r>
-            <w:r>
-              <w:rPr>
-                <w:rFonts w:ascii="Arial" w:cs="Arial" w:eastAsia="Arial" w:hAnsi="Arial"/>
-                <w:b w:val="false"/>
-                <w:bCs w:val="false"/>
-                <w:color w:val="1F9D63"/>
-                <w:sz w:val="16"/>
-                <w:szCs w:val="16"/>
-              </w:rPr>
-              <w:t xml:space="preserve">la = de oportunidades entre M y H.</w:t>
+              <w:t xml:space="preserve">En todo lo no previsto en su legislación específica, el D 51/25 tendrá carácter supletorio.</w:t>
             </w:r>
           </w:p>
         </w:tc>
@@ -6351,6 +5396,7 @@
         <w:tc>
           <w:tcPr>
             <w:tcW w:type="dxa" w:w="1555"/>
+            <w:vMerge w:val="restart"/>
             <w:tcBorders>
               <w:top w:val="single" w:color="D1EDF9" w:sz="6"/>
               <w:left w:val="single" w:color="D1EDF9" w:sz="6"/>
@@ -6359,9 +5405,9 @@
             </w:tcBorders>
             <w:shd w:fill="D1EDF9" w:color="auto" w:val="clear"/>
             <w:tcMar>
-              <w:top w:type="dxa" w:w="115"/>
+              <w:top w:type="dxa" w:w="0"/>
               <w:left w:type="dxa" w:w="72"/>
-              <w:bottom w:type="dxa" w:w="115"/>
+              <w:bottom w:type="dxa" w:w="0"/>
               <w:right w:type="dxa" w:w="72"/>
             </w:tcMar>
             <w:vAlign w:val="center"/>
@@ -6414,7 +5460,7 @@
           </w:p>
           <w:p>
             <w:pPr>
-              <w:spacing w:after="0" w:before="0" w:line="216" w:lineRule="exact"/>
+              <w:spacing w:after="0" w:before="0" w:line="216" w:lineRule="auto"/>
               <w:jc w:val="center"/>
             </w:pPr>
             <w:r>
@@ -6426,7 +5472,7 @@
                 <w:sz w:val="24"/>
                 <w:szCs w:val="24"/>
               </w:rPr>
-              <w:t xml:space="preserve">4 </w:t>
+              <w:t xml:space="preserve">3 </w:t>
             </w:r>
             <w:r>
               <w:rPr>
@@ -6437,7 +5483,26 @@
                 <w:sz w:val="16"/>
                 <w:szCs w:val="16"/>
               </w:rPr>
-              <w:t xml:space="preserve">Fundamentos y criterios de actuación en los planes de ordenación de RRHH</w:t>
+              <w:t xml:space="preserve">Principios en el acceso al empleo público y la provisión de puestos</w:t>
+            </w:r>
+          </w:p>
+          <w:p>
+            <w:pPr>
+              <w:spacing w:after="0" w:before="86"/>
+              <w:jc w:val="center"/>
+            </w:pPr>
+            <w:r>
+              <w:rPr>
+                <w:rFonts w:ascii="Arial" w:cs="Arial" w:eastAsia="Arial" w:hAnsi="Arial"/>
+                <w:b/>
+                <w:bCs/>
+                <w:color w:val="143548"/>
+                <w:spacing w:val="24"/>
+                <w:sz w:val="12"/>
+                <w:szCs w:val="12"/>
+                <w:shd w:fill="9DDFEA" w:color="auto" w:val="clear"/>
+              </w:rPr>
+              <w:t xml:space="preserve"> ♥ ¡TEST! </w:t>
             </w:r>
           </w:p>
         </w:tc>
@@ -6461,7 +5526,7 @@
           </w:tcPr>
           <w:p>
             <w:pPr>
-              <w:spacing w:after="0" w:before="0" w:line="207" w:lineRule="exact"/>
+              <w:spacing w:after="0" w:before="0" w:line="221" w:lineRule="auto"/>
               <w:jc w:val="center"/>
             </w:pPr>
             <w:r>
@@ -6473,51 +5538,7 @@
                 <w:sz w:val="15"/>
                 <w:szCs w:val="15"/>
               </w:rPr>
-              <w:t xml:space="preserve">Los planes de ordenación de RRHH deben basarse en los siguientes </w:t>
-            </w:r>
-            <w:r>
-              <w:rPr>
-                <w:rFonts w:ascii="Poppins" w:cs="Poppins" w:eastAsia="Poppins" w:hAnsi="Poppins"/>
-                <w:b/>
-                <w:bCs/>
-                <w:color w:val="143548"/>
-                <w:sz w:val="15"/>
-                <w:szCs w:val="15"/>
-              </w:rPr>
-              <w:t xml:space="preserve">fundamentos</w:t>
-            </w:r>
-            <w:r>
-              <w:rPr>
-                <w:rFonts w:ascii="Poppins" w:cs="Poppins" w:eastAsia="Poppins" w:hAnsi="Poppins"/>
-                <w:b w:val="false"/>
-                <w:bCs w:val="false"/>
-                <w:color w:val="143548"/>
-                <w:sz w:val="15"/>
-                <w:szCs w:val="15"/>
-              </w:rPr>
-              <w:t xml:space="preserve"> y </w:t>
-            </w:r>
-            <w:r>
-              <w:rPr>
-                <w:rFonts w:ascii="Poppins" w:cs="Poppins" w:eastAsia="Poppins" w:hAnsi="Poppins"/>
-                <w:b/>
-                <w:bCs/>
-                <w:color w:val="143548"/>
-                <w:sz w:val="15"/>
-                <w:szCs w:val="15"/>
-              </w:rPr>
-              <w:t xml:space="preserve">criterios de actuación</w:t>
-            </w:r>
-            <w:r>
-              <w:rPr>
-                <w:rFonts w:ascii="Poppins" w:cs="Poppins" w:eastAsia="Poppins" w:hAnsi="Poppins"/>
-                <w:b w:val="false"/>
-                <w:bCs w:val="false"/>
-                <w:color w:val="143548"/>
-                <w:sz w:val="15"/>
-                <w:szCs w:val="15"/>
-              </w:rPr>
-              <w:t xml:space="preserve">:</w:t>
+              <w:t xml:space="preserve">Acceso F y L</w:t>
             </w:r>
           </w:p>
         </w:tc>
@@ -6532,9 +5553,9 @@
               <w:right w:val="single" w:color="D1EDF9" w:sz="6"/>
             </w:tcBorders>
             <w:tcMar>
-              <w:top w:type="dxa" w:w="29"/>
+              <w:top w:type="dxa" w:w="0"/>
               <w:left w:type="dxa" w:w="115"/>
-              <w:bottom w:type="dxa" w:w="29"/>
+              <w:bottom w:type="dxa" w:w="0"/>
               <w:right w:type="dxa" w:w="86"/>
             </w:tcMar>
           </w:tcPr>
@@ -6545,8 +5566,19 @@
                 <w:ilvl w:val="0"/>
                 <w:numId w:val="2"/>
               </w:numPr>
-              <w:spacing w:after="0" w:before="0" w:line="193" w:lineRule="exact"/>
-            </w:pPr>
+              <w:spacing w:after="0" w:before="0" w:line="270" w:lineRule="auto"/>
+            </w:pPr>
+            <w:r>
+              <w:rPr>
+                <w:rFonts w:ascii="Arial" w:cs="Arial" w:eastAsia="Arial" w:hAnsi="Arial"/>
+                <w:b w:val="false"/>
+                <w:bCs w:val="false"/>
+                <w:color w:val="222222"/>
+                <w:sz w:val="16"/>
+                <w:szCs w:val="16"/>
+              </w:rPr>
+              <w:t xml:space="preserve">Procesos selectivos con respeto a los ppios CE </w:t>
+            </w:r>
             <w:r>
               <w:rPr>
                 <w:rFonts w:ascii="Arial" w:cs="Arial" w:eastAsia="Arial" w:hAnsi="Arial"/>
@@ -6556,7 +5588,7 @@
                 <w:sz w:val="16"/>
                 <w:szCs w:val="16"/>
               </w:rPr>
-              <w:t xml:space="preserve">Transparencia y participación</w:t>
+              <w:t xml:space="preserve">igualdad, mérito y capacidad</w:t>
             </w:r>
             <w:r>
               <w:rPr>
@@ -6577,7 +5609,7 @@
                 <w:ilvl w:val="0"/>
                 <w:numId w:val="2"/>
               </w:numPr>
-              <w:spacing w:after="0" w:before="0" w:line="193" w:lineRule="exact"/>
+              <w:spacing w:after="0" w:before="0" w:line="270" w:lineRule="auto"/>
             </w:pPr>
             <w:r>
               <w:rPr>
@@ -6588,18 +5620,7 @@
                 <w:sz w:val="16"/>
                 <w:szCs w:val="16"/>
               </w:rPr>
-              <w:t xml:space="preserve">Negociación colectiva</w:t>
-            </w:r>
-            <w:r>
-              <w:rPr>
-                <w:rFonts w:ascii="Arial" w:cs="Arial" w:eastAsia="Arial" w:hAnsi="Arial"/>
-                <w:b w:val="false"/>
-                <w:bCs w:val="false"/>
-                <w:color w:val="222222"/>
-                <w:sz w:val="16"/>
-                <w:szCs w:val="16"/>
-              </w:rPr>
-              <w:t xml:space="preserve">.</w:t>
+              <w:t xml:space="preserve">Publicidad</w:t>
             </w:r>
           </w:p>
           <w:p>
@@ -6609,7 +5630,7 @@
                 <w:ilvl w:val="0"/>
                 <w:numId w:val="2"/>
               </w:numPr>
-              <w:spacing w:after="0" w:before="0" w:line="193" w:lineRule="exact"/>
+              <w:spacing w:after="0" w:before="0" w:line="270" w:lineRule="auto"/>
             </w:pPr>
             <w:r>
               <w:rPr>
@@ -6620,18 +5641,7 @@
                 <w:sz w:val="16"/>
                 <w:szCs w:val="16"/>
               </w:rPr>
-              <w:t xml:space="preserve">Eficacia</w:t>
-            </w:r>
-            <w:r>
-              <w:rPr>
-                <w:rFonts w:ascii="Arial" w:cs="Arial" w:eastAsia="Arial" w:hAnsi="Arial"/>
-                <w:b w:val="false"/>
-                <w:bCs w:val="false"/>
-                <w:color w:val="222222"/>
-                <w:sz w:val="16"/>
-                <w:szCs w:val="16"/>
-              </w:rPr>
-              <w:t xml:space="preserve"> en la prestación de los servicios públicos</w:t>
+              <w:t xml:space="preserve">Transparencia</w:t>
             </w:r>
           </w:p>
           <w:p>
@@ -6641,7 +5651,7 @@
                 <w:ilvl w:val="0"/>
                 <w:numId w:val="2"/>
               </w:numPr>
-              <w:spacing w:after="0" w:before="0" w:line="193" w:lineRule="exact"/>
+              <w:spacing w:after="0" w:before="0" w:line="270" w:lineRule="auto"/>
             </w:pPr>
             <w:r>
               <w:rPr>
@@ -6652,7 +5662,7 @@
                 <w:sz w:val="16"/>
                 <w:szCs w:val="16"/>
               </w:rPr>
-              <w:t xml:space="preserve">Eficiencia</w:t>
+              <w:t xml:space="preserve">Imparcialidad y profesionalidad</w:t>
             </w:r>
             <w:r>
               <w:rPr>
@@ -6663,7 +5673,7 @@
                 <w:sz w:val="16"/>
                 <w:szCs w:val="16"/>
               </w:rPr>
-              <w:t xml:space="preserve"> en el empleo de los recursos económicos disponibles.</w:t>
+              <w:t xml:space="preserve"> de los miembros de los órganos de selección.</w:t>
             </w:r>
           </w:p>
           <w:p>
@@ -6673,7 +5683,7 @@
                 <w:ilvl w:val="0"/>
                 <w:numId w:val="2"/>
               </w:numPr>
-              <w:spacing w:after="0" w:before="0" w:line="193" w:lineRule="exact"/>
+              <w:spacing w:after="0" w:before="0" w:line="270" w:lineRule="auto"/>
             </w:pPr>
             <w:r>
               <w:rPr>
@@ -6684,7 +5694,7 @@
                 <w:sz w:val="16"/>
                 <w:szCs w:val="16"/>
               </w:rPr>
-              <w:t xml:space="preserve">Buena administración</w:t>
+              <w:t xml:space="preserve">Independencia y discrecionalidad técnica</w:t>
             </w:r>
             <w:r>
               <w:rPr>
@@ -6695,7 +5705,29 @@
                 <w:sz w:val="16"/>
                 <w:szCs w:val="16"/>
               </w:rPr>
-              <w:t xml:space="preserve"> y calidad e innovación de los servicios públicos.</w:t>
+              <w:t xml:space="preserve"> en la actuación de los órganos de selección, así como </w:t>
+            </w:r>
+            <w:r>
+              <w:rPr>
+                <w:rFonts w:ascii="Arial" w:cs="Arial" w:eastAsia="Arial" w:hAnsi="Arial"/>
+                <w:b w:val="false"/>
+                <w:bCs w:val="false"/>
+                <w:color w:val="1F9D63"/>
+                <w:sz w:val="16"/>
+                <w:szCs w:val="16"/>
+              </w:rPr>
+              <w:t xml:space="preserve">confidencialidad</w:t>
+            </w:r>
+            <w:r>
+              <w:rPr>
+                <w:rFonts w:ascii="Arial" w:cs="Arial" w:eastAsia="Arial" w:hAnsi="Arial"/>
+                <w:b w:val="false"/>
+                <w:bCs w:val="false"/>
+                <w:color w:val="222222"/>
+                <w:sz w:val="16"/>
+                <w:szCs w:val="16"/>
+              </w:rPr>
+              <w:t xml:space="preserve"> en su actuación.</w:t>
             </w:r>
           </w:p>
           <w:p>
@@ -6705,7 +5737,7 @@
                 <w:ilvl w:val="0"/>
                 <w:numId w:val="2"/>
               </w:numPr>
-              <w:spacing w:after="0" w:before="0" w:line="193" w:lineRule="exact"/>
+              <w:spacing w:after="0" w:before="0" w:line="270" w:lineRule="auto"/>
             </w:pPr>
             <w:r>
               <w:rPr>
@@ -6716,7 +5748,7 @@
                 <w:sz w:val="16"/>
                 <w:szCs w:val="16"/>
               </w:rPr>
-              <w:t xml:space="preserve">Racionalidad organizativa</w:t>
+              <w:t xml:space="preserve">Fiabilidad</w:t>
             </w:r>
             <w:r>
               <w:rPr>
@@ -6727,7 +5759,7 @@
                 <w:sz w:val="16"/>
                 <w:szCs w:val="16"/>
               </w:rPr>
-              <w:t xml:space="preserve">, simplific. de procedimientos y mejora regulatoria.</w:t>
+              <w:t xml:space="preserve"> y validez predictiva de los instrumentos y procesos.</w:t>
             </w:r>
           </w:p>
           <w:p>
@@ -6737,7 +5769,7 @@
                 <w:ilvl w:val="0"/>
                 <w:numId w:val="2"/>
               </w:numPr>
-              <w:spacing w:after="0" w:before="0" w:line="193" w:lineRule="exact"/>
+              <w:spacing w:after="0" w:before="0" w:line="270" w:lineRule="auto"/>
             </w:pPr>
             <w:r>
               <w:rPr>
@@ -6748,7 +5780,7 @@
                 <w:sz w:val="16"/>
                 <w:szCs w:val="16"/>
               </w:rPr>
-              <w:t xml:space="preserve">Compromiso</w:t>
+              <w:t xml:space="preserve">Adecuación</w:t>
             </w:r>
             <w:r>
               <w:rPr>
@@ -6759,7 +5791,7 @@
                 <w:sz w:val="16"/>
                 <w:szCs w:val="16"/>
               </w:rPr>
-              <w:t xml:space="preserve"> con el personal y el empleo público.</w:t>
+              <w:t xml:space="preserve"> entre el contenido de los procesos selectivos y las funciones.</w:t>
             </w:r>
           </w:p>
           <w:p>
@@ -6769,7 +5801,7 @@
                 <w:ilvl w:val="0"/>
                 <w:numId w:val="2"/>
               </w:numPr>
-              <w:spacing w:after="0" w:before="0" w:line="193" w:lineRule="exact"/>
+              <w:spacing w:after="0" w:before="0" w:line="270" w:lineRule="auto"/>
             </w:pPr>
             <w:r>
               <w:rPr>
@@ -6780,7 +5812,7 @@
                 <w:sz w:val="16"/>
                 <w:szCs w:val="16"/>
               </w:rPr>
-              <w:t xml:space="preserve">Igualdad</w:t>
+              <w:t xml:space="preserve">Agilidad y eficiencia</w:t>
             </w:r>
             <w:r>
               <w:rPr>
@@ -6791,9 +5823,99 @@
                 <w:sz w:val="16"/>
                 <w:szCs w:val="16"/>
               </w:rPr>
-              <w:t xml:space="preserve"> de oportunidades, no discriminación y accesibilidad universal.</w:t>
-            </w:r>
-          </w:p>
+              <w:t xml:space="preserve">, sin perjuicio de la </w:t>
+            </w:r>
+            <w:r>
+              <w:rPr>
+                <w:rFonts w:ascii="Arial" w:cs="Arial" w:eastAsia="Arial" w:hAnsi="Arial"/>
+                <w:b w:val="false"/>
+                <w:bCs w:val="false"/>
+                <w:color w:val="1F9D63"/>
+                <w:sz w:val="16"/>
+                <w:szCs w:val="16"/>
+              </w:rPr>
+              <w:t xml:space="preserve">objetividad</w:t>
+            </w:r>
+            <w:r>
+              <w:rPr>
+                <w:rFonts w:ascii="Arial" w:cs="Arial" w:eastAsia="Arial" w:hAnsi="Arial"/>
+                <w:b w:val="false"/>
+                <w:bCs w:val="false"/>
+                <w:color w:val="222222"/>
+                <w:sz w:val="16"/>
+                <w:szCs w:val="16"/>
+              </w:rPr>
+              <w:t xml:space="preserve">, en los procesos de selección.</w:t>
+            </w:r>
+          </w:p>
+        </w:tc>
+      </w:tr>
+      <w:tr>
+        <w:tc>
+          <w:tcPr>
+            <w:vMerge w:val="continue"/>
+            <w:tcBorders>
+              <w:top w:val="single" w:color="D1EDF9" w:sz="6"/>
+              <w:left w:val="single" w:color="D1EDF9" w:sz="6"/>
+              <w:bottom w:val="single" w:color="D1EDF9" w:sz="6"/>
+              <w:right w:val="single" w:color="D1EDF9" w:sz="6"/>
+            </w:tcBorders>
+          </w:tcPr>
+          <w:p/>
+        </w:tc>
+        <w:tc>
+          <w:tcPr>
+            <w:tcW w:type="dxa" w:w="1612"/>
+            <w:tcBorders>
+              <w:top w:val="single" w:color="D1EDF9" w:sz="6"/>
+              <w:left w:val="single" w:color="D1EDF9" w:sz="6"/>
+              <w:bottom w:val="single" w:color="D1EDF9" w:sz="6"/>
+              <w:right w:val="single" w:color="D1EDF9" w:sz="6"/>
+            </w:tcBorders>
+            <w:shd w:fill="F8F9FA" w:color="auto" w:val="clear"/>
+            <w:tcMar>
+              <w:top w:type="dxa" w:w="58"/>
+              <w:left w:type="dxa" w:w="115"/>
+              <w:bottom w:type="dxa" w:w="43"/>
+              <w:right w:type="dxa" w:w="86"/>
+            </w:tcMar>
+            <w:vAlign w:val="center"/>
+          </w:tcPr>
+          <w:p>
+            <w:pPr>
+              <w:spacing w:after="0" w:before="0" w:line="221" w:lineRule="auto"/>
+              <w:jc w:val="center"/>
+            </w:pPr>
+            <w:r>
+              <w:rPr>
+                <w:rFonts w:ascii="Poppins" w:cs="Poppins" w:eastAsia="Poppins" w:hAnsi="Poppins"/>
+                <w:b w:val="false"/>
+                <w:bCs w:val="false"/>
+                <w:color w:val="143548"/>
+                <w:sz w:val="15"/>
+                <w:szCs w:val="15"/>
+              </w:rPr>
+              <w:t xml:space="preserve">Provisión FC</w:t>
+            </w:r>
+          </w:p>
+        </w:tc>
+        <w:tc>
+          <w:tcPr>
+            <w:tcW w:type="dxa" w:w="6479"/>
+            <w:gridSpan w:val="2"/>
+            <w:tcBorders>
+              <w:top w:val="single" w:color="D1EDF9" w:sz="6"/>
+              <w:left w:val="single" w:color="D1EDF9" w:sz="6"/>
+              <w:bottom w:val="single" w:color="D1EDF9" w:sz="6"/>
+              <w:right w:val="single" w:color="D1EDF9" w:sz="6"/>
+            </w:tcBorders>
+            <w:tcMar>
+              <w:top w:type="dxa" w:w="0"/>
+              <w:left w:type="dxa" w:w="115"/>
+              <w:bottom w:type="dxa" w:w="0"/>
+              <w:right w:type="dxa" w:w="86"/>
+            </w:tcMar>
+          </w:tcPr>
           <w:p>
             <w:pPr>
               <w:pStyle w:val="ListParagraph"/>
@@ -6801,7 +5923,7 @@
                 <w:ilvl w:val="0"/>
                 <w:numId w:val="2"/>
               </w:numPr>
-              <w:spacing w:after="0" w:before="0" w:line="193" w:lineRule="exact"/>
+              <w:spacing w:after="0" w:before="0" w:line="270" w:lineRule="auto"/>
             </w:pPr>
             <w:r>
               <w:rPr>
@@ -6812,7 +5934,7 @@
                 <w:sz w:val="16"/>
                 <w:szCs w:val="16"/>
               </w:rPr>
-              <w:t xml:space="preserve">Incorporación de la </w:t>
+              <w:t xml:space="preserve">Se llevará a cabo mediante los ppios de </w:t>
             </w:r>
             <w:r>
               <w:rPr>
@@ -6823,7 +5945,7 @@
                 <w:sz w:val="16"/>
                 <w:szCs w:val="16"/>
               </w:rPr>
-              <w:t xml:space="preserve">perspectiva de género</w:t>
+              <w:t xml:space="preserve">igualdad, mérito, capacidad, publicidad</w:t>
             </w:r>
             <w:r>
               <w:rPr>
@@ -6834,7 +5956,7 @@
                 <w:sz w:val="16"/>
                 <w:szCs w:val="16"/>
               </w:rPr>
-              <w:t xml:space="preserve"> en todas las fases de la planificación.</w:t>
+              <w:t xml:space="preserve">,</w:t>
             </w:r>
           </w:p>
           <w:p>
@@ -6844,8 +5966,19 @@
                 <w:ilvl w:val="0"/>
                 <w:numId w:val="2"/>
               </w:numPr>
-              <w:spacing w:after="0" w:before="0" w:line="193" w:lineRule="exact"/>
-            </w:pPr>
+              <w:spacing w:after="0" w:before="0" w:line="270" w:lineRule="auto"/>
+            </w:pPr>
+            <w:r>
+              <w:rPr>
+                <w:rFonts w:ascii="Arial" w:cs="Arial" w:eastAsia="Arial" w:hAnsi="Arial"/>
+                <w:b w:val="false"/>
+                <w:bCs w:val="false"/>
+                <w:color w:val="222222"/>
+                <w:sz w:val="16"/>
+                <w:szCs w:val="16"/>
+              </w:rPr>
+              <w:t xml:space="preserve">y en su caso, para puestos provistos por libre designación (PLD), </w:t>
+            </w:r>
             <w:r>
               <w:rPr>
                 <w:rFonts w:ascii="Arial" w:cs="Arial" w:eastAsia="Arial" w:hAnsi="Arial"/>
@@ -6855,7 +5988,7 @@
                 <w:sz w:val="16"/>
                 <w:szCs w:val="16"/>
               </w:rPr>
-              <w:t xml:space="preserve">Formación</w:t>
+              <w:t xml:space="preserve">idoneidad</w:t>
             </w:r>
             <w:r>
               <w:rPr>
@@ -6866,9 +5999,77 @@
                 <w:sz w:val="16"/>
                 <w:szCs w:val="16"/>
               </w:rPr>
-              <w:t xml:space="preserve"> y cualificación profesional permanente.</w:t>
-            </w:r>
-          </w:p>
+              <w:t xml:space="preserve">.</w:t>
+            </w:r>
+          </w:p>
+        </w:tc>
+      </w:tr>
+      <w:tr>
+        <w:tc>
+          <w:tcPr>
+            <w:vMerge w:val="continue"/>
+            <w:tcBorders>
+              <w:top w:val="single" w:color="D1EDF9" w:sz="6"/>
+              <w:left w:val="single" w:color="D1EDF9" w:sz="6"/>
+              <w:bottom w:val="single" w:color="D1EDF9" w:sz="6"/>
+              <w:right w:val="single" w:color="D1EDF9" w:sz="6"/>
+            </w:tcBorders>
+          </w:tcPr>
+          <w:p/>
+        </w:tc>
+        <w:tc>
+          <w:tcPr>
+            <w:tcW w:type="dxa" w:w="1612"/>
+            <w:tcBorders>
+              <w:top w:val="single" w:color="D1EDF9" w:sz="6"/>
+              <w:left w:val="single" w:color="D1EDF9" w:sz="6"/>
+              <w:bottom w:val="single" w:color="D1EDF9" w:sz="6"/>
+              <w:right w:val="single" w:color="D1EDF9" w:sz="6"/>
+            </w:tcBorders>
+            <w:shd w:fill="F8F9FA" w:color="auto" w:val="clear"/>
+            <w:tcMar>
+              <w:top w:type="dxa" w:w="58"/>
+              <w:left w:type="dxa" w:w="115"/>
+              <w:bottom w:type="dxa" w:w="43"/>
+              <w:right w:type="dxa" w:w="86"/>
+            </w:tcMar>
+            <w:vAlign w:val="center"/>
+          </w:tcPr>
+          <w:p>
+            <w:pPr>
+              <w:spacing w:after="0" w:before="0" w:line="221" w:lineRule="auto"/>
+              <w:jc w:val="center"/>
+            </w:pPr>
+            <w:r>
+              <w:rPr>
+                <w:rFonts w:ascii="Poppins" w:cs="Poppins" w:eastAsia="Poppins" w:hAnsi="Poppins"/>
+                <w:b w:val="false"/>
+                <w:bCs w:val="false"/>
+                <w:color w:val="143548"/>
+                <w:sz w:val="15"/>
+                <w:szCs w:val="15"/>
+              </w:rPr>
+              <w:t xml:space="preserve">Interinos y Laboral Temporal</w:t>
+            </w:r>
+          </w:p>
+        </w:tc>
+        <w:tc>
+          <w:tcPr>
+            <w:tcW w:type="dxa" w:w="6479"/>
+            <w:gridSpan w:val="2"/>
+            <w:tcBorders>
+              <w:top w:val="single" w:color="D1EDF9" w:sz="6"/>
+              <w:left w:val="single" w:color="D1EDF9" w:sz="6"/>
+              <w:bottom w:val="single" w:color="D1EDF9" w:sz="6"/>
+              <w:right w:val="single" w:color="D1EDF9" w:sz="6"/>
+            </w:tcBorders>
+            <w:tcMar>
+              <w:top w:type="dxa" w:w="0"/>
+              <w:left w:type="dxa" w:w="115"/>
+              <w:bottom w:type="dxa" w:w="0"/>
+              <w:right w:type="dxa" w:w="86"/>
+            </w:tcMar>
+          </w:tcPr>
           <w:p>
             <w:pPr>
               <w:pStyle w:val="ListParagraph"/>
@@ -6876,18 +6077,29 @@
                 <w:ilvl w:val="0"/>
                 <w:numId w:val="2"/>
               </w:numPr>
-              <w:spacing w:after="0" w:before="0" w:line="193" w:lineRule="exact"/>
-            </w:pPr>
-            <w:r>
-              <w:rPr>
-                <w:rFonts w:ascii="Arial" w:cs="Arial" w:eastAsia="Arial" w:hAnsi="Arial"/>
-                <w:b w:val="false"/>
-                <w:bCs w:val="false"/>
+              <w:spacing w:after="0" w:before="0" w:line="270" w:lineRule="auto"/>
+            </w:pPr>
+            <w:r>
+              <w:rPr>
+                <w:rFonts w:ascii="Arial" w:cs="Arial" w:eastAsia="Arial" w:hAnsi="Arial"/>
+                <w:b/>
+                <w:bCs/>
                 <w:color w:val="222222"/>
                 <w:sz w:val="16"/>
                 <w:szCs w:val="16"/>
               </w:rPr>
-              <w:t xml:space="preserve">Fomento de la </w:t>
+              <w:t xml:space="preserve">Procedimientos ágiles</w:t>
+            </w:r>
+            <w:r>
+              <w:rPr>
+                <w:rFonts w:ascii="Arial" w:cs="Arial" w:eastAsia="Arial" w:hAnsi="Arial"/>
+                <w:b w:val="false"/>
+                <w:bCs w:val="false"/>
+                <w:color w:val="222222"/>
+                <w:sz w:val="16"/>
+                <w:szCs w:val="16"/>
+              </w:rPr>
+              <w:t xml:space="preserve"> que garanticen </w:t>
             </w:r>
             <w:r>
               <w:rPr>
@@ -6898,7 +6110,7 @@
                 <w:sz w:val="16"/>
                 <w:szCs w:val="16"/>
               </w:rPr>
-              <w:t xml:space="preserve">conciliación</w:t>
+              <w:t xml:space="preserve">igualdad, mérito, capacidad, publicidad y celeridad</w:t>
             </w:r>
             <w:r>
               <w:rPr>
@@ -6909,9 +6121,77 @@
                 <w:sz w:val="16"/>
                 <w:szCs w:val="16"/>
               </w:rPr>
-              <w:t xml:space="preserve"> de la vida profesional con la personal y familiar.</w:t>
-            </w:r>
-          </w:p>
+              <w:t xml:space="preserve">.</w:t>
+            </w:r>
+          </w:p>
+        </w:tc>
+      </w:tr>
+      <w:tr>
+        <w:tc>
+          <w:tcPr>
+            <w:vMerge w:val="continue"/>
+            <w:tcBorders>
+              <w:top w:val="single" w:color="D1EDF9" w:sz="6"/>
+              <w:left w:val="single" w:color="D1EDF9" w:sz="6"/>
+              <w:bottom w:val="single" w:color="D1EDF9" w:sz="6"/>
+              <w:right w:val="single" w:color="D1EDF9" w:sz="6"/>
+            </w:tcBorders>
+          </w:tcPr>
+          <w:p/>
+        </w:tc>
+        <w:tc>
+          <w:tcPr>
+            <w:tcW w:type="dxa" w:w="1612"/>
+            <w:tcBorders>
+              <w:top w:val="single" w:color="D1EDF9" w:sz="6"/>
+              <w:left w:val="single" w:color="D1EDF9" w:sz="6"/>
+              <w:bottom w:val="single" w:color="D1EDF9" w:sz="6"/>
+              <w:right w:val="single" w:color="D1EDF9" w:sz="6"/>
+            </w:tcBorders>
+            <w:shd w:fill="F8F9FA" w:color="auto" w:val="clear"/>
+            <w:tcMar>
+              <w:top w:type="dxa" w:w="58"/>
+              <w:left w:type="dxa" w:w="115"/>
+              <w:bottom w:type="dxa" w:w="43"/>
+              <w:right w:type="dxa" w:w="86"/>
+            </w:tcMar>
+            <w:vAlign w:val="center"/>
+          </w:tcPr>
+          <w:p>
+            <w:pPr>
+              <w:spacing w:after="0" w:before="0" w:line="221" w:lineRule="auto"/>
+              <w:jc w:val="center"/>
+            </w:pPr>
+            <w:r>
+              <w:rPr>
+                <w:rFonts w:ascii="Poppins" w:cs="Poppins" w:eastAsia="Poppins" w:hAnsi="Poppins"/>
+                <w:b w:val="false"/>
+                <w:bCs w:val="false"/>
+                <w:color w:val="143548"/>
+                <w:sz w:val="15"/>
+                <w:szCs w:val="15"/>
+              </w:rPr>
+              <w:t xml:space="preserve">Discapacidad</w:t>
+            </w:r>
+          </w:p>
+        </w:tc>
+        <w:tc>
+          <w:tcPr>
+            <w:tcW w:type="dxa" w:w="6479"/>
+            <w:gridSpan w:val="2"/>
+            <w:tcBorders>
+              <w:top w:val="single" w:color="D1EDF9" w:sz="6"/>
+              <w:left w:val="single" w:color="D1EDF9" w:sz="6"/>
+              <w:bottom w:val="single" w:color="D1EDF9" w:sz="6"/>
+              <w:right w:val="single" w:color="D1EDF9" w:sz="6"/>
+            </w:tcBorders>
+            <w:tcMar>
+              <w:top w:type="dxa" w:w="0"/>
+              <w:left w:type="dxa" w:w="115"/>
+              <w:bottom w:type="dxa" w:w="0"/>
+              <w:right w:type="dxa" w:w="86"/>
+            </w:tcMar>
+          </w:tcPr>
           <w:p>
             <w:pPr>
               <w:pStyle w:val="ListParagraph"/>
@@ -6919,7 +6199,717 @@
                 <w:ilvl w:val="0"/>
                 <w:numId w:val="2"/>
               </w:numPr>
-              <w:spacing w:after="0" w:before="0" w:line="193" w:lineRule="exact"/>
+              <w:spacing w:after="0" w:before="0" w:line="270" w:lineRule="auto"/>
+            </w:pPr>
+            <w:r>
+              <w:rPr>
+                <w:rFonts w:ascii="Arial" w:cs="Arial" w:eastAsia="Arial" w:hAnsi="Arial"/>
+                <w:b w:val="false"/>
+                <w:bCs w:val="false"/>
+                <w:color w:val="1F9D63"/>
+                <w:sz w:val="16"/>
+                <w:szCs w:val="16"/>
+              </w:rPr>
+              <w:t xml:space="preserve">= de oportunidades, no discriminación</w:t>
+            </w:r>
+            <w:r>
+              <w:rPr>
+                <w:rFonts w:ascii="Arial" w:cs="Arial" w:eastAsia="Arial" w:hAnsi="Arial"/>
+                <w:b w:val="false"/>
+                <w:bCs w:val="false"/>
+                <w:color w:val="222222"/>
+                <w:sz w:val="16"/>
+                <w:szCs w:val="16"/>
+              </w:rPr>
+              <w:t xml:space="preserve"> y </w:t>
+            </w:r>
+            <w:r>
+              <w:rPr>
+                <w:rFonts w:ascii="Arial" w:cs="Arial" w:eastAsia="Arial" w:hAnsi="Arial"/>
+                <w:b w:val="false"/>
+                <w:bCs w:val="false"/>
+                <w:color w:val="1F9D63"/>
+                <w:sz w:val="16"/>
+                <w:szCs w:val="16"/>
+              </w:rPr>
+              <w:t xml:space="preserve">accesibilidad universal.</w:t>
+            </w:r>
+          </w:p>
+        </w:tc>
+      </w:tr>
+      <w:tr>
+        <w:tc>
+          <w:tcPr>
+            <w:vMerge w:val="continue"/>
+            <w:tcBorders>
+              <w:top w:val="single" w:color="D1EDF9" w:sz="6"/>
+              <w:left w:val="single" w:color="D1EDF9" w:sz="6"/>
+              <w:bottom w:val="single" w:color="D1EDF9" w:sz="6"/>
+              <w:right w:val="single" w:color="D1EDF9" w:sz="6"/>
+            </w:tcBorders>
+          </w:tcPr>
+          <w:p/>
+        </w:tc>
+        <w:tc>
+          <w:tcPr>
+            <w:tcW w:type="dxa" w:w="1612"/>
+            <w:tcBorders>
+              <w:top w:val="single" w:color="D1EDF9" w:sz="6"/>
+              <w:left w:val="single" w:color="D1EDF9" w:sz="6"/>
+              <w:bottom w:val="single" w:color="D1EDF9" w:sz="6"/>
+              <w:right w:val="single" w:color="D1EDF9" w:sz="6"/>
+            </w:tcBorders>
+            <w:shd w:fill="F8F9FA" w:color="auto" w:val="clear"/>
+            <w:tcMar>
+              <w:top w:type="dxa" w:w="58"/>
+              <w:left w:type="dxa" w:w="115"/>
+              <w:bottom w:type="dxa" w:w="43"/>
+              <w:right w:type="dxa" w:w="86"/>
+            </w:tcMar>
+            <w:vAlign w:val="center"/>
+          </w:tcPr>
+          <w:p>
+            <w:pPr>
+              <w:spacing w:after="0" w:before="0" w:line="221" w:lineRule="auto"/>
+              <w:jc w:val="center"/>
+            </w:pPr>
+            <w:r>
+              <w:rPr>
+                <w:rFonts w:ascii="Poppins" w:cs="Poppins" w:eastAsia="Poppins" w:hAnsi="Poppins"/>
+                <w:b w:val="false"/>
+                <w:bCs w:val="false"/>
+                <w:color w:val="143548"/>
+                <w:sz w:val="15"/>
+                <w:szCs w:val="15"/>
+              </w:rPr>
+              <w:t xml:space="preserve">Igualdad M y H</w:t>
+            </w:r>
+          </w:p>
+        </w:tc>
+        <w:tc>
+          <w:tcPr>
+            <w:tcW w:type="dxa" w:w="6479"/>
+            <w:gridSpan w:val="2"/>
+            <w:tcBorders>
+              <w:top w:val="single" w:color="D1EDF9" w:sz="6"/>
+              <w:left w:val="single" w:color="D1EDF9" w:sz="6"/>
+              <w:bottom w:val="single" w:color="D1EDF9" w:sz="6"/>
+              <w:right w:val="single" w:color="D1EDF9" w:sz="6"/>
+            </w:tcBorders>
+            <w:tcMar>
+              <w:top w:type="dxa" w:w="0"/>
+              <w:left w:type="dxa" w:w="115"/>
+              <w:bottom w:type="dxa" w:w="0"/>
+              <w:right w:type="dxa" w:w="86"/>
+            </w:tcMar>
+          </w:tcPr>
+          <w:p>
+            <w:pPr>
+              <w:pStyle w:val="ListParagraph"/>
+              <w:numPr>
+                <w:ilvl w:val="0"/>
+                <w:numId w:val="2"/>
+              </w:numPr>
+              <w:spacing w:after="0" w:before="0" w:line="270" w:lineRule="auto"/>
+            </w:pPr>
+            <w:r>
+              <w:rPr>
+                <w:rFonts w:ascii="Arial" w:cs="Arial" w:eastAsia="Arial" w:hAnsi="Arial"/>
+                <w:b w:val="false"/>
+                <w:bCs w:val="false"/>
+                <w:color w:val="222222"/>
+                <w:sz w:val="16"/>
+                <w:szCs w:val="16"/>
+              </w:rPr>
+              <w:t xml:space="preserve">Medidas específicas para alcanzar </w:t>
+            </w:r>
+            <w:r>
+              <w:rPr>
+                <w:rFonts w:ascii="Arial" w:cs="Arial" w:eastAsia="Arial" w:hAnsi="Arial"/>
+                <w:b w:val="false"/>
+                <w:bCs w:val="false"/>
+                <w:color w:val="1F9D63"/>
+                <w:sz w:val="16"/>
+                <w:szCs w:val="16"/>
+              </w:rPr>
+              <w:t xml:space="preserve">la = de oportunidades entre M y H.</w:t>
+            </w:r>
+          </w:p>
+        </w:tc>
+      </w:tr>
+      <w:tr>
+        <w:tc>
+          <w:tcPr>
+            <w:tcW w:type="dxa" w:w="1555"/>
+            <w:tcBorders>
+              <w:top w:val="single" w:color="D1EDF9" w:sz="6"/>
+              <w:left w:val="single" w:color="D1EDF9" w:sz="6"/>
+              <w:bottom w:val="single" w:color="D1EDF9" w:sz="6"/>
+              <w:right w:val="single" w:color="D1EDF9" w:sz="6"/>
+            </w:tcBorders>
+            <w:shd w:fill="D1EDF9" w:color="auto" w:val="clear"/>
+            <w:tcMar>
+              <w:top w:type="dxa" w:w="0"/>
+              <w:left w:type="dxa" w:w="72"/>
+              <w:bottom w:type="dxa" w:w="0"/>
+              <w:right w:type="dxa" w:w="72"/>
+            </w:tcMar>
+            <w:vAlign w:val="center"/>
+          </w:tcPr>
+          <w:p>
+            <w:pPr>
+              <w:spacing w:after="72" w:before="0"/>
+              <w:jc w:val="center"/>
+            </w:pPr>
+            <w:r>
+              <w:drawing>
+                <wp:inline distT="0" distB="0" distL="0" distR="0">
+                  <wp:extent cx="219075" cy="219075"/>
+                  <wp:effectExtent t="0" r="0" b="0" l="0"/>
+                  <wp:docPr id="1" name="" descr="" title=""/>
+                  <wp:cNvGraphicFramePr>
+                    <a:graphicFrameLocks xmlns:a="http://schemas.openxmlformats.org/drawingml/2006/main" noChangeAspect="1"/>
+                  </wp:cNvGraphicFramePr>
+                  <a:graphic xmlns:a="http://schemas.openxmlformats.org/drawingml/2006/main">
+                    <a:graphicData uri="http://schemas.openxmlformats.org/drawingml/2006/picture">
+                      <pic:pic xmlns:pic="http://schemas.openxmlformats.org/drawingml/2006/picture">
+                        <pic:nvPicPr>
+                          <pic:cNvPr id="0" name="" descr=""/>
+                          <pic:cNvPicPr>
+                            <a:picLocks noChangeAspect="1" noChangeArrowheads="1"/>
+                          </pic:cNvPicPr>
+                        </pic:nvPicPr>
+                        <pic:blipFill>
+                          <a:blip r:embed="rId53" cstate="none"/>
+                          <a:srcRect/>
+                          <a:stretch>
+                            <a:fillRect/>
+                          </a:stretch>
+                        </pic:blipFill>
+                        <pic:spPr bwMode="auto">
+                          <a:xfrm>
+                            <a:off x="0" y="0"/>
+                            <a:ext cx="219075" cy="219075"/>
+                          </a:xfrm>
+                          <a:prstGeom prst="rect">
+                            <a:avLst/>
+                          </a:prstGeom>
+                        </pic:spPr>
+                      </pic:pic>
+                    </a:graphicData>
+                  </a:graphic>
+                </wp:inline>
+              </w:drawing>
+            </w:r>
+          </w:p>
+          <w:p>
+            <w:pPr>
+              <w:spacing w:after="0" w:before="0" w:line="216" w:lineRule="auto"/>
+              <w:jc w:val="center"/>
+            </w:pPr>
+            <w:r>
+              <w:rPr>
+                <w:rFonts w:ascii="Lora" w:cs="Lora" w:eastAsia="Lora" w:hAnsi="Lora"/>
+                <w:b/>
+                <w:bCs/>
+                <w:color w:val="143548"/>
+                <w:sz w:val="24"/>
+                <w:szCs w:val="24"/>
+              </w:rPr>
+              <w:t xml:space="preserve">4 </w:t>
+            </w:r>
+            <w:r>
+              <w:rPr>
+                <w:rFonts w:ascii="Poppins" w:cs="Poppins" w:eastAsia="Poppins" w:hAnsi="Poppins"/>
+                <w:b/>
+                <w:bCs/>
+                <w:color w:val="143548"/>
+                <w:sz w:val="16"/>
+                <w:szCs w:val="16"/>
+              </w:rPr>
+              <w:t xml:space="preserve">Fundamentos y criterios de actuación en los planes de ordenación de RRHH</w:t>
+            </w:r>
+          </w:p>
+        </w:tc>
+        <w:tc>
+          <w:tcPr>
+            <w:tcW w:type="dxa" w:w="1612"/>
+            <w:tcBorders>
+              <w:top w:val="single" w:color="D1EDF9" w:sz="6"/>
+              <w:left w:val="single" w:color="D1EDF9" w:sz="6"/>
+              <w:bottom w:val="single" w:color="D1EDF9" w:sz="6"/>
+              <w:right w:val="single" w:color="D1EDF9" w:sz="6"/>
+            </w:tcBorders>
+            <w:shd w:fill="F8F9FA" w:color="auto" w:val="clear"/>
+            <w:tcMar>
+              <w:top w:type="dxa" w:w="58"/>
+              <w:left w:type="dxa" w:w="115"/>
+              <w:bottom w:type="dxa" w:w="43"/>
+              <w:right w:type="dxa" w:w="86"/>
+            </w:tcMar>
+            <w:vAlign w:val="center"/>
+          </w:tcPr>
+          <w:p>
+            <w:pPr>
+              <w:spacing w:after="0" w:before="0" w:line="221" w:lineRule="auto"/>
+              <w:jc w:val="center"/>
+            </w:pPr>
+            <w:r>
+              <w:rPr>
+                <w:rFonts w:ascii="Poppins" w:cs="Poppins" w:eastAsia="Poppins" w:hAnsi="Poppins"/>
+                <w:b w:val="false"/>
+                <w:bCs w:val="false"/>
+                <w:color w:val="143548"/>
+                <w:sz w:val="15"/>
+                <w:szCs w:val="15"/>
+              </w:rPr>
+              <w:t xml:space="preserve">Los planes de ordenación de RRHH deben basarse en los siguientes </w:t>
+            </w:r>
+            <w:r>
+              <w:rPr>
+                <w:rFonts w:ascii="Poppins" w:cs="Poppins" w:eastAsia="Poppins" w:hAnsi="Poppins"/>
+                <w:b/>
+                <w:bCs/>
+                <w:color w:val="143548"/>
+                <w:sz w:val="15"/>
+                <w:szCs w:val="15"/>
+              </w:rPr>
+              <w:t xml:space="preserve">fundamentos</w:t>
+            </w:r>
+            <w:r>
+              <w:rPr>
+                <w:rFonts w:ascii="Poppins" w:cs="Poppins" w:eastAsia="Poppins" w:hAnsi="Poppins"/>
+                <w:b w:val="false"/>
+                <w:bCs w:val="false"/>
+                <w:color w:val="143548"/>
+                <w:sz w:val="15"/>
+                <w:szCs w:val="15"/>
+              </w:rPr>
+              <w:t xml:space="preserve"> y </w:t>
+            </w:r>
+            <w:r>
+              <w:rPr>
+                <w:rFonts w:ascii="Poppins" w:cs="Poppins" w:eastAsia="Poppins" w:hAnsi="Poppins"/>
+                <w:b/>
+                <w:bCs/>
+                <w:color w:val="143548"/>
+                <w:sz w:val="15"/>
+                <w:szCs w:val="15"/>
+              </w:rPr>
+              <w:t xml:space="preserve">criterios de actuación</w:t>
+            </w:r>
+            <w:r>
+              <w:rPr>
+                <w:rFonts w:ascii="Poppins" w:cs="Poppins" w:eastAsia="Poppins" w:hAnsi="Poppins"/>
+                <w:b w:val="false"/>
+                <w:bCs w:val="false"/>
+                <w:color w:val="143548"/>
+                <w:sz w:val="15"/>
+                <w:szCs w:val="15"/>
+              </w:rPr>
+              <w:t xml:space="preserve">:</w:t>
+            </w:r>
+          </w:p>
+        </w:tc>
+        <w:tc>
+          <w:tcPr>
+            <w:tcW w:type="dxa" w:w="6479"/>
+            <w:gridSpan w:val="2"/>
+            <w:tcBorders>
+              <w:top w:val="single" w:color="D1EDF9" w:sz="6"/>
+              <w:left w:val="single" w:color="D1EDF9" w:sz="6"/>
+              <w:bottom w:val="single" w:color="D1EDF9" w:sz="6"/>
+              <w:right w:val="single" w:color="D1EDF9" w:sz="6"/>
+            </w:tcBorders>
+            <w:tcMar>
+              <w:top w:type="dxa" w:w="0"/>
+              <w:left w:type="dxa" w:w="115"/>
+              <w:bottom w:type="dxa" w:w="0"/>
+              <w:right w:type="dxa" w:w="86"/>
+            </w:tcMar>
+          </w:tcPr>
+          <w:p>
+            <w:pPr>
+              <w:pStyle w:val="ListParagraph"/>
+              <w:numPr>
+                <w:ilvl w:val="0"/>
+                <w:numId w:val="2"/>
+              </w:numPr>
+              <w:spacing w:after="0" w:before="0" w:line="270" w:lineRule="auto"/>
+            </w:pPr>
+            <w:r>
+              <w:rPr>
+                <w:rFonts w:ascii="Arial" w:cs="Arial" w:eastAsia="Arial" w:hAnsi="Arial"/>
+                <w:b w:val="false"/>
+                <w:bCs w:val="false"/>
+                <w:color w:val="1F9D63"/>
+                <w:sz w:val="16"/>
+                <w:szCs w:val="16"/>
+              </w:rPr>
+              <w:t xml:space="preserve">Transparencia y participación</w:t>
+            </w:r>
+            <w:r>
+              <w:rPr>
+                <w:rFonts w:ascii="Arial" w:cs="Arial" w:eastAsia="Arial" w:hAnsi="Arial"/>
+                <w:b w:val="false"/>
+                <w:bCs w:val="false"/>
+                <w:color w:val="222222"/>
+                <w:sz w:val="16"/>
+                <w:szCs w:val="16"/>
+              </w:rPr>
+              <w:t xml:space="preserve">.</w:t>
+            </w:r>
+          </w:p>
+          <w:p>
+            <w:pPr>
+              <w:pStyle w:val="ListParagraph"/>
+              <w:numPr>
+                <w:ilvl w:val="0"/>
+                <w:numId w:val="2"/>
+              </w:numPr>
+              <w:spacing w:after="0" w:before="0" w:line="270" w:lineRule="auto"/>
+            </w:pPr>
+            <w:r>
+              <w:rPr>
+                <w:rFonts w:ascii="Arial" w:cs="Arial" w:eastAsia="Arial" w:hAnsi="Arial"/>
+                <w:b w:val="false"/>
+                <w:bCs w:val="false"/>
+                <w:color w:val="1F9D63"/>
+                <w:sz w:val="16"/>
+                <w:szCs w:val="16"/>
+              </w:rPr>
+              <w:t xml:space="preserve">Negociación colectiva</w:t>
+            </w:r>
+            <w:r>
+              <w:rPr>
+                <w:rFonts w:ascii="Arial" w:cs="Arial" w:eastAsia="Arial" w:hAnsi="Arial"/>
+                <w:b w:val="false"/>
+                <w:bCs w:val="false"/>
+                <w:color w:val="222222"/>
+                <w:sz w:val="16"/>
+                <w:szCs w:val="16"/>
+              </w:rPr>
+              <w:t xml:space="preserve">.</w:t>
+            </w:r>
+          </w:p>
+          <w:p>
+            <w:pPr>
+              <w:pStyle w:val="ListParagraph"/>
+              <w:numPr>
+                <w:ilvl w:val="0"/>
+                <w:numId w:val="2"/>
+              </w:numPr>
+              <w:spacing w:after="0" w:before="0" w:line="270" w:lineRule="auto"/>
+            </w:pPr>
+            <w:r>
+              <w:rPr>
+                <w:rFonts w:ascii="Arial" w:cs="Arial" w:eastAsia="Arial" w:hAnsi="Arial"/>
+                <w:b w:val="false"/>
+                <w:bCs w:val="false"/>
+                <w:color w:val="1F9D63"/>
+                <w:sz w:val="16"/>
+                <w:szCs w:val="16"/>
+              </w:rPr>
+              <w:t xml:space="preserve">Eficacia</w:t>
+            </w:r>
+            <w:r>
+              <w:rPr>
+                <w:rFonts w:ascii="Arial" w:cs="Arial" w:eastAsia="Arial" w:hAnsi="Arial"/>
+                <w:b w:val="false"/>
+                <w:bCs w:val="false"/>
+                <w:color w:val="222222"/>
+                <w:sz w:val="16"/>
+                <w:szCs w:val="16"/>
+              </w:rPr>
+              <w:t xml:space="preserve"> en la prestación de los servicios públicos</w:t>
+            </w:r>
+          </w:p>
+          <w:p>
+            <w:pPr>
+              <w:pStyle w:val="ListParagraph"/>
+              <w:numPr>
+                <w:ilvl w:val="0"/>
+                <w:numId w:val="2"/>
+              </w:numPr>
+              <w:spacing w:after="0" w:before="0" w:line="270" w:lineRule="auto"/>
+            </w:pPr>
+            <w:r>
+              <w:rPr>
+                <w:rFonts w:ascii="Arial" w:cs="Arial" w:eastAsia="Arial" w:hAnsi="Arial"/>
+                <w:b w:val="false"/>
+                <w:bCs w:val="false"/>
+                <w:color w:val="1F9D63"/>
+                <w:sz w:val="16"/>
+                <w:szCs w:val="16"/>
+              </w:rPr>
+              <w:t xml:space="preserve">Eficiencia</w:t>
+            </w:r>
+            <w:r>
+              <w:rPr>
+                <w:rFonts w:ascii="Arial" w:cs="Arial" w:eastAsia="Arial" w:hAnsi="Arial"/>
+                <w:b w:val="false"/>
+                <w:bCs w:val="false"/>
+                <w:color w:val="222222"/>
+                <w:sz w:val="16"/>
+                <w:szCs w:val="16"/>
+              </w:rPr>
+              <w:t xml:space="preserve"> en el empleo de los recursos económicos disponibles.</w:t>
+            </w:r>
+          </w:p>
+          <w:p>
+            <w:pPr>
+              <w:pStyle w:val="ListParagraph"/>
+              <w:numPr>
+                <w:ilvl w:val="0"/>
+                <w:numId w:val="2"/>
+              </w:numPr>
+              <w:spacing w:after="0" w:before="0" w:line="270" w:lineRule="auto"/>
+            </w:pPr>
+            <w:r>
+              <w:rPr>
+                <w:rFonts w:ascii="Arial" w:cs="Arial" w:eastAsia="Arial" w:hAnsi="Arial"/>
+                <w:b w:val="false"/>
+                <w:bCs w:val="false"/>
+                <w:color w:val="1F9D63"/>
+                <w:sz w:val="16"/>
+                <w:szCs w:val="16"/>
+              </w:rPr>
+              <w:t xml:space="preserve">Buena administración</w:t>
+            </w:r>
+            <w:r>
+              <w:rPr>
+                <w:rFonts w:ascii="Arial" w:cs="Arial" w:eastAsia="Arial" w:hAnsi="Arial"/>
+                <w:b w:val="false"/>
+                <w:bCs w:val="false"/>
+                <w:color w:val="222222"/>
+                <w:sz w:val="16"/>
+                <w:szCs w:val="16"/>
+              </w:rPr>
+              <w:t xml:space="preserve"> y calidad e innovación de los servicios públicos.</w:t>
+            </w:r>
+          </w:p>
+          <w:p>
+            <w:pPr>
+              <w:pStyle w:val="ListParagraph"/>
+              <w:numPr>
+                <w:ilvl w:val="0"/>
+                <w:numId w:val="2"/>
+              </w:numPr>
+              <w:spacing w:after="0" w:before="0" w:line="270" w:lineRule="auto"/>
+            </w:pPr>
+            <w:r>
+              <w:rPr>
+                <w:rFonts w:ascii="Arial" w:cs="Arial" w:eastAsia="Arial" w:hAnsi="Arial"/>
+                <w:b w:val="false"/>
+                <w:bCs w:val="false"/>
+                <w:color w:val="1F9D63"/>
+                <w:sz w:val="16"/>
+                <w:szCs w:val="16"/>
+              </w:rPr>
+              <w:t xml:space="preserve">Racionalidad organizativa</w:t>
+            </w:r>
+            <w:r>
+              <w:rPr>
+                <w:rFonts w:ascii="Arial" w:cs="Arial" w:eastAsia="Arial" w:hAnsi="Arial"/>
+                <w:b w:val="false"/>
+                <w:bCs w:val="false"/>
+                <w:color w:val="222222"/>
+                <w:sz w:val="16"/>
+                <w:szCs w:val="16"/>
+              </w:rPr>
+              <w:t xml:space="preserve">, simplific. de procedimientos y mejora regulatoria.</w:t>
+            </w:r>
+          </w:p>
+          <w:p>
+            <w:pPr>
+              <w:pStyle w:val="ListParagraph"/>
+              <w:numPr>
+                <w:ilvl w:val="0"/>
+                <w:numId w:val="2"/>
+              </w:numPr>
+              <w:spacing w:after="0" w:before="0" w:line="270" w:lineRule="auto"/>
+            </w:pPr>
+            <w:r>
+              <w:rPr>
+                <w:rFonts w:ascii="Arial" w:cs="Arial" w:eastAsia="Arial" w:hAnsi="Arial"/>
+                <w:b w:val="false"/>
+                <w:bCs w:val="false"/>
+                <w:color w:val="1F9D63"/>
+                <w:sz w:val="16"/>
+                <w:szCs w:val="16"/>
+              </w:rPr>
+              <w:t xml:space="preserve">Compromiso</w:t>
+            </w:r>
+            <w:r>
+              <w:rPr>
+                <w:rFonts w:ascii="Arial" w:cs="Arial" w:eastAsia="Arial" w:hAnsi="Arial"/>
+                <w:b w:val="false"/>
+                <w:bCs w:val="false"/>
+                <w:color w:val="222222"/>
+                <w:sz w:val="16"/>
+                <w:szCs w:val="16"/>
+              </w:rPr>
+              <w:t xml:space="preserve"> con el personal y el empleo público.</w:t>
+            </w:r>
+          </w:p>
+          <w:p>
+            <w:pPr>
+              <w:pStyle w:val="ListParagraph"/>
+              <w:numPr>
+                <w:ilvl w:val="0"/>
+                <w:numId w:val="2"/>
+              </w:numPr>
+              <w:spacing w:after="0" w:before="0" w:line="270" w:lineRule="auto"/>
+            </w:pPr>
+            <w:r>
+              <w:rPr>
+                <w:rFonts w:ascii="Arial" w:cs="Arial" w:eastAsia="Arial" w:hAnsi="Arial"/>
+                <w:b w:val="false"/>
+                <w:bCs w:val="false"/>
+                <w:color w:val="1F9D63"/>
+                <w:sz w:val="16"/>
+                <w:szCs w:val="16"/>
+              </w:rPr>
+              <w:t xml:space="preserve">Igualdad</w:t>
+            </w:r>
+            <w:r>
+              <w:rPr>
+                <w:rFonts w:ascii="Arial" w:cs="Arial" w:eastAsia="Arial" w:hAnsi="Arial"/>
+                <w:b w:val="false"/>
+                <w:bCs w:val="false"/>
+                <w:color w:val="222222"/>
+                <w:sz w:val="16"/>
+                <w:szCs w:val="16"/>
+              </w:rPr>
+              <w:t xml:space="preserve"> de oportunidades, no discriminación y accesibilidad universal.</w:t>
+            </w:r>
+          </w:p>
+          <w:p>
+            <w:pPr>
+              <w:pStyle w:val="ListParagraph"/>
+              <w:numPr>
+                <w:ilvl w:val="0"/>
+                <w:numId w:val="2"/>
+              </w:numPr>
+              <w:spacing w:after="0" w:before="0" w:line="270" w:lineRule="auto"/>
+            </w:pPr>
+            <w:r>
+              <w:rPr>
+                <w:rFonts w:ascii="Arial" w:cs="Arial" w:eastAsia="Arial" w:hAnsi="Arial"/>
+                <w:b w:val="false"/>
+                <w:bCs w:val="false"/>
+                <w:color w:val="222222"/>
+                <w:sz w:val="16"/>
+                <w:szCs w:val="16"/>
+              </w:rPr>
+              <w:t xml:space="preserve">Incorporación de la </w:t>
+            </w:r>
+            <w:r>
+              <w:rPr>
+                <w:rFonts w:ascii="Arial" w:cs="Arial" w:eastAsia="Arial" w:hAnsi="Arial"/>
+                <w:b w:val="false"/>
+                <w:bCs w:val="false"/>
+                <w:color w:val="1F9D63"/>
+                <w:sz w:val="16"/>
+                <w:szCs w:val="16"/>
+              </w:rPr>
+              <w:t xml:space="preserve">perspectiva de género</w:t>
+            </w:r>
+            <w:r>
+              <w:rPr>
+                <w:rFonts w:ascii="Arial" w:cs="Arial" w:eastAsia="Arial" w:hAnsi="Arial"/>
+                <w:b w:val="false"/>
+                <w:bCs w:val="false"/>
+                <w:color w:val="222222"/>
+                <w:sz w:val="16"/>
+                <w:szCs w:val="16"/>
+              </w:rPr>
+              <w:t xml:space="preserve"> en todas las fases de la planificación.</w:t>
+            </w:r>
+          </w:p>
+          <w:p>
+            <w:pPr>
+              <w:pStyle w:val="ListParagraph"/>
+              <w:numPr>
+                <w:ilvl w:val="0"/>
+                <w:numId w:val="2"/>
+              </w:numPr>
+              <w:spacing w:after="0" w:before="0" w:line="270" w:lineRule="auto"/>
+            </w:pPr>
+            <w:r>
+              <w:rPr>
+                <w:rFonts w:ascii="Arial" w:cs="Arial" w:eastAsia="Arial" w:hAnsi="Arial"/>
+                <w:b w:val="false"/>
+                <w:bCs w:val="false"/>
+                <w:color w:val="1F9D63"/>
+                <w:sz w:val="16"/>
+                <w:szCs w:val="16"/>
+              </w:rPr>
+              <w:t xml:space="preserve">Formación</w:t>
+            </w:r>
+            <w:r>
+              <w:rPr>
+                <w:rFonts w:ascii="Arial" w:cs="Arial" w:eastAsia="Arial" w:hAnsi="Arial"/>
+                <w:b w:val="false"/>
+                <w:bCs w:val="false"/>
+                <w:color w:val="222222"/>
+                <w:sz w:val="16"/>
+                <w:szCs w:val="16"/>
+              </w:rPr>
+              <w:t xml:space="preserve"> y cualificación profesional permanente.</w:t>
+            </w:r>
+          </w:p>
+          <w:p>
+            <w:pPr>
+              <w:pStyle w:val="ListParagraph"/>
+              <w:numPr>
+                <w:ilvl w:val="0"/>
+                <w:numId w:val="2"/>
+              </w:numPr>
+              <w:spacing w:after="0" w:before="0" w:line="270" w:lineRule="auto"/>
+            </w:pPr>
+            <w:r>
+              <w:rPr>
+                <w:rFonts w:ascii="Arial" w:cs="Arial" w:eastAsia="Arial" w:hAnsi="Arial"/>
+                <w:b w:val="false"/>
+                <w:bCs w:val="false"/>
+                <w:color w:val="222222"/>
+                <w:sz w:val="16"/>
+                <w:szCs w:val="16"/>
+              </w:rPr>
+              <w:t xml:space="preserve">Fomento de la </w:t>
+            </w:r>
+            <w:r>
+              <w:rPr>
+                <w:rFonts w:ascii="Arial" w:cs="Arial" w:eastAsia="Arial" w:hAnsi="Arial"/>
+                <w:b w:val="false"/>
+                <w:bCs w:val="false"/>
+                <w:color w:val="1F9D63"/>
+                <w:sz w:val="16"/>
+                <w:szCs w:val="16"/>
+              </w:rPr>
+              <w:t xml:space="preserve">conciliación</w:t>
+            </w:r>
+            <w:r>
+              <w:rPr>
+                <w:rFonts w:ascii="Arial" w:cs="Arial" w:eastAsia="Arial" w:hAnsi="Arial"/>
+                <w:b w:val="false"/>
+                <w:bCs w:val="false"/>
+                <w:color w:val="222222"/>
+                <w:sz w:val="16"/>
+                <w:szCs w:val="16"/>
+              </w:rPr>
+              <w:t xml:space="preserve"> de la vida profesional con la personal y familiar.</w:t>
+            </w:r>
+          </w:p>
+          <w:p>
+            <w:pPr>
+              <w:pStyle w:val="ListParagraph"/>
+              <w:numPr>
+                <w:ilvl w:val="0"/>
+                <w:numId w:val="2"/>
+              </w:numPr>
+              <w:spacing w:after="0" w:before="0" w:line="270" w:lineRule="auto"/>
             </w:pPr>
             <w:r>
               <w:rPr>
@@ -6964,7 +6954,7 @@
       <w:footerReference w:type="default" r:id="rId12"/>
       <w:type w:val="nextPage"/>
       <w:pgSz w:w="11906" w:h="16838" w:orient="portrait"/>
-      <w:pgMar w:top="576" w:right="1137" w:bottom="806" w:left="1137" w:header="0" w:footer="165" w:gutter="0"/>
+      <w:pgMar w:top="941" w:right="1137" w:bottom="806" w:left="1137" w:header="0" w:footer="165" w:gutter="0"/>
       <w:pgNumType/>
       <w:docGrid w:linePitch="360"/>
     </w:sectPr>

</xml_diff>

<commit_message>
Decreto 51/2025 Google Docs: row 1 lists in split cells instead of a nested table
Google Docs inserts an empty paragraph before nested tables, which pushed
the first row's bullets down.

Co-Authored-By: Claude Opus 5.5 <noreply@anthropic.com>
Claude-Session: https://claude.ai/code/session_01T98mbmRs8KdzUGJ1QXPFqC
</commit_message>
<xml_diff>
--- a/virginia-jurado/decreto-51-2025-muestra-google-docs.docx
+++ b/virginia-jurado/decreto-51-2025-muestra-google-docs.docx
@@ -3836,8 +3836,9 @@
       <w:tblGrid>
         <w:gridCol w:w="1555"/>
         <w:gridCol w:w="1612"/>
-        <w:gridCol w:w="4333"/>
-        <w:gridCol w:w="2146"/>
+        <w:gridCol w:w="3110"/>
+        <w:gridCol w:w="1224"/>
+        <w:gridCol w:w="2145"/>
       </w:tblGrid>
       <w:tr>
         <w:tc>
@@ -3971,232 +3972,185 @@
         </w:tc>
         <w:tc>
           <w:tcPr>
-            <w:tcW w:type="dxa" w:w="6479"/>
+            <w:tcW w:type="dxa" w:w="3110"/>
+            <w:gridSpan w:val="1"/>
+            <w:tcBorders>
+              <w:top w:val="single" w:color="D1EDF9" w:sz="6"/>
+              <w:left w:val="single" w:color="D1EDF9" w:sz="6"/>
+              <w:bottom w:val="single" w:color="D1EDF9" w:sz="6"/>
+              <w:right w:val="none" w:color="FFFFFF" w:sz="0"/>
+            </w:tcBorders>
+            <w:tcMar>
+              <w:top w:type="dxa" w:w="0"/>
+              <w:left w:type="dxa" w:w="115"/>
+              <w:bottom w:type="dxa" w:w="0"/>
+              <w:right w:type="dxa" w:w="58"/>
+            </w:tcMar>
+          </w:tcPr>
+          <w:p>
+            <w:pPr>
+              <w:pStyle w:val="ListParagraph"/>
+              <w:numPr>
+                <w:ilvl w:val="0"/>
+                <w:numId w:val="2"/>
+              </w:numPr>
+              <w:spacing w:after="0" w:before="0" w:line="270" w:lineRule="auto"/>
+            </w:pPr>
+            <w:r>
+              <w:rPr>
+                <w:rFonts w:ascii="Arial" w:cs="Arial" w:eastAsia="Arial" w:hAnsi="Arial"/>
+                <w:b w:val="false"/>
+                <w:bCs w:val="false"/>
+                <w:color w:val="222222"/>
+                <w:sz w:val="16"/>
+                <w:szCs w:val="16"/>
+              </w:rPr>
+              <w:t xml:space="preserve">Planificación y ordenación del empleo público</w:t>
+            </w:r>
+          </w:p>
+          <w:p>
+            <w:pPr>
+              <w:pStyle w:val="ListParagraph"/>
+              <w:numPr>
+                <w:ilvl w:val="0"/>
+                <w:numId w:val="2"/>
+              </w:numPr>
+              <w:spacing w:after="0" w:before="0" w:line="270" w:lineRule="auto"/>
+            </w:pPr>
+            <w:r>
+              <w:rPr>
+                <w:rFonts w:ascii="Arial" w:cs="Arial" w:eastAsia="Arial" w:hAnsi="Arial"/>
+                <w:b w:val="false"/>
+                <w:bCs w:val="false"/>
+                <w:color w:val="222222"/>
+                <w:sz w:val="16"/>
+                <w:szCs w:val="16"/>
+              </w:rPr>
+              <w:t xml:space="preserve">Acceso al empleo público</w:t>
+            </w:r>
+          </w:p>
+          <w:p>
+            <w:pPr>
+              <w:pStyle w:val="ListParagraph"/>
+              <w:numPr>
+                <w:ilvl w:val="0"/>
+                <w:numId w:val="2"/>
+              </w:numPr>
+              <w:spacing w:after="0" w:before="0" w:line="270" w:lineRule="auto"/>
+            </w:pPr>
+            <w:r>
+              <w:rPr>
+                <w:rFonts w:ascii="Arial" w:cs="Arial" w:eastAsia="Arial" w:hAnsi="Arial"/>
+                <w:b w:val="false"/>
+                <w:bCs w:val="false"/>
+                <w:color w:val="222222"/>
+                <w:sz w:val="16"/>
+                <w:szCs w:val="16"/>
+              </w:rPr>
+              <w:t xml:space="preserve">Promoción interna</w:t>
+            </w:r>
+          </w:p>
+        </w:tc>
+        <w:tc>
+          <w:tcPr>
+            <w:tcW w:type="dxa" w:w="3369"/>
             <w:gridSpan w:val="2"/>
             <w:tcBorders>
               <w:top w:val="single" w:color="D1EDF9" w:sz="6"/>
-              <w:left w:val="single" w:color="D1EDF9" w:sz="6"/>
+              <w:left w:val="none" w:color="FFFFFF" w:sz="0"/>
               <w:bottom w:val="single" w:color="D1EDF9" w:sz="6"/>
               <w:right w:val="single" w:color="D1EDF9" w:sz="6"/>
             </w:tcBorders>
             <w:tcMar>
               <w:top w:type="dxa" w:w="0"/>
-              <w:left w:type="dxa" w:w="115"/>
+              <w:left w:type="dxa" w:w="58"/>
               <w:bottom w:type="dxa" w:w="0"/>
               <w:right w:type="dxa" w:w="86"/>
             </w:tcMar>
           </w:tcPr>
-          <w:tbl>
-            <w:tblPr>
-              <w:tblW w:type="dxa" w:w="6277"/>
-              <w:tblBorders>
-                <w:top w:val="none" w:color="FFFFFF" w:sz="0"/>
-                <w:left w:val="none" w:color="FFFFFF" w:sz="0"/>
-                <w:bottom w:val="none" w:color="FFFFFF" w:sz="0"/>
-                <w:right w:val="none" w:color="FFFFFF" w:sz="0"/>
-                <w:insideH w:val="none" w:color="FFFFFF" w:sz="0"/>
-                <w:insideV w:val="none" w:color="FFFFFF" w:sz="0"/>
-              </w:tblBorders>
-            </w:tblPr>
-            <w:tblGrid>
-              <w:gridCol w:w="3139"/>
-              <w:gridCol w:w="3139"/>
-            </w:tblGrid>
-            <w:tr>
-              <w:tc>
-                <w:tcPr>
-                  <w:tcW w:type="dxa" w:w="3139"/>
-                  <w:tcBorders>
-                    <w:top w:val="none" w:color="FFFFFF" w:sz="0"/>
-                    <w:left w:val="none" w:color="FFFFFF" w:sz="0"/>
-                    <w:bottom w:val="none" w:color="FFFFFF" w:sz="0"/>
-                    <w:right w:val="none" w:color="FFFFFF" w:sz="0"/>
-                  </w:tcBorders>
-                  <w:tcMar>
-                    <w:top w:type="dxa" w:w="0"/>
-                    <w:left w:type="dxa" w:w="0"/>
-                    <w:bottom w:type="dxa" w:w="0"/>
-                    <w:right w:type="dxa" w:w="101"/>
-                  </w:tcMar>
-                </w:tcPr>
-                <w:p>
-                  <w:pPr>
-                    <w:pStyle w:val="ListParagraph"/>
-                    <w:numPr>
-                      <w:ilvl w:val="0"/>
-                      <w:numId w:val="2"/>
-                    </w:numPr>
-                    <w:spacing w:after="0" w:before="0" w:line="270" w:lineRule="auto"/>
-                  </w:pPr>
-                  <w:r>
-                    <w:rPr>
-                      <w:rFonts w:ascii="Arial" w:cs="Arial" w:eastAsia="Arial" w:hAnsi="Arial"/>
-                      <w:b w:val="false"/>
-                      <w:bCs w:val="false"/>
-                      <w:color w:val="222222"/>
-                      <w:sz w:val="16"/>
-                      <w:szCs w:val="16"/>
-                    </w:rPr>
-                    <w:t xml:space="preserve">Planificación y ordenación del empleo público</w:t>
-                  </w:r>
-                </w:p>
-                <w:p>
-                  <w:pPr>
-                    <w:pStyle w:val="ListParagraph"/>
-                    <w:numPr>
-                      <w:ilvl w:val="0"/>
-                      <w:numId w:val="2"/>
-                    </w:numPr>
-                    <w:spacing w:after="0" w:before="0" w:line="270" w:lineRule="auto"/>
-                  </w:pPr>
-                  <w:r>
-                    <w:rPr>
-                      <w:rFonts w:ascii="Arial" w:cs="Arial" w:eastAsia="Arial" w:hAnsi="Arial"/>
-                      <w:b w:val="false"/>
-                      <w:bCs w:val="false"/>
-                      <w:color w:val="222222"/>
-                      <w:sz w:val="16"/>
-                      <w:szCs w:val="16"/>
-                    </w:rPr>
-                    <w:t xml:space="preserve">Acceso al empleo público</w:t>
-                  </w:r>
-                </w:p>
-                <w:p>
-                  <w:pPr>
-                    <w:pStyle w:val="ListParagraph"/>
-                    <w:numPr>
-                      <w:ilvl w:val="0"/>
-                      <w:numId w:val="2"/>
-                    </w:numPr>
-                    <w:spacing w:after="0" w:before="0" w:line="270" w:lineRule="auto"/>
-                  </w:pPr>
-                  <w:r>
-                    <w:rPr>
-                      <w:rFonts w:ascii="Arial" w:cs="Arial" w:eastAsia="Arial" w:hAnsi="Arial"/>
-                      <w:b w:val="false"/>
-                      <w:bCs w:val="false"/>
-                      <w:color w:val="222222"/>
-                      <w:sz w:val="16"/>
-                      <w:szCs w:val="16"/>
-                    </w:rPr>
-                    <w:t xml:space="preserve">Promoción interna</w:t>
-                  </w:r>
-                </w:p>
-              </w:tc>
-              <w:tc>
-                <w:tcPr>
-                  <w:tcW w:type="dxa" w:w="3139"/>
-                  <w:tcBorders>
-                    <w:top w:val="none" w:color="FFFFFF" w:sz="0"/>
-                    <w:left w:val="none" w:color="FFFFFF" w:sz="0"/>
-                    <w:bottom w:val="none" w:color="FFFFFF" w:sz="0"/>
-                    <w:right w:val="none" w:color="FFFFFF" w:sz="0"/>
-                  </w:tcBorders>
-                  <w:tcMar>
-                    <w:top w:type="dxa" w:w="0"/>
-                    <w:left w:type="dxa" w:w="0"/>
-                    <w:bottom w:type="dxa" w:w="0"/>
-                    <w:right w:type="dxa" w:w="101"/>
-                  </w:tcMar>
-                </w:tcPr>
-                <w:p>
-                  <w:pPr>
-                    <w:pStyle w:val="ListParagraph"/>
-                    <w:numPr>
-                      <w:ilvl w:val="0"/>
-                      <w:numId w:val="2"/>
-                    </w:numPr>
-                    <w:spacing w:after="0" w:before="0" w:line="270" w:lineRule="auto"/>
-                  </w:pPr>
-                  <w:r>
-                    <w:rPr>
-                      <w:rFonts w:ascii="Arial" w:cs="Arial" w:eastAsia="Arial" w:hAnsi="Arial"/>
-                      <w:b w:val="false"/>
-                      <w:bCs w:val="false"/>
-                      <w:color w:val="222222"/>
-                      <w:sz w:val="16"/>
-                      <w:szCs w:val="16"/>
-                    </w:rPr>
-                    <w:t xml:space="preserve">Provisión de puestos de trabajo</w:t>
-                  </w:r>
-                </w:p>
-                <w:p>
-                  <w:pPr>
-                    <w:pStyle w:val="ListParagraph"/>
-                    <w:numPr>
-                      <w:ilvl w:val="0"/>
-                      <w:numId w:val="2"/>
-                    </w:numPr>
-                    <w:spacing w:after="0" w:before="0" w:line="270" w:lineRule="auto"/>
-                  </w:pPr>
-                  <w:r>
-                    <w:rPr>
-                      <w:rFonts w:ascii="Arial" w:cs="Arial" w:eastAsia="Arial" w:hAnsi="Arial"/>
-                      <w:b w:val="false"/>
-                      <w:bCs w:val="false"/>
-                      <w:color w:val="222222"/>
-                      <w:sz w:val="16"/>
-                      <w:szCs w:val="16"/>
-                    </w:rPr>
-                    <w:t xml:space="preserve">Adquisición y </w:t>
-                  </w:r>
-                  <w:r>
-                    <w:rPr>
-                      <w:rFonts w:ascii="Arial" w:cs="Arial" w:eastAsia="Arial" w:hAnsi="Arial"/>
-                      <w:b w:val="false"/>
-                      <w:bCs w:val="false"/>
-                      <w:color w:val="1A7BB9"/>
-                      <w:sz w:val="16"/>
-                      <w:szCs w:val="16"/>
-                    </w:rPr>
-                    <w:t xml:space="preserve">pérdida</w:t>
-                  </w:r>
-                  <w:r>
-                    <w:rPr>
-                      <w:rFonts w:ascii="Arial" w:cs="Arial" w:eastAsia="Arial" w:hAnsi="Arial"/>
-                      <w:b w:val="false"/>
-                      <w:bCs w:val="false"/>
-                      <w:color w:val="222222"/>
-                      <w:sz w:val="16"/>
-                      <w:szCs w:val="16"/>
-                    </w:rPr>
-                    <w:t xml:space="preserve"> de la relación de servicio</w:t>
-                  </w:r>
-                </w:p>
-                <w:p>
-                  <w:pPr>
-                    <w:pStyle w:val="ListParagraph"/>
-                    <w:numPr>
-                      <w:ilvl w:val="0"/>
-                      <w:numId w:val="2"/>
-                    </w:numPr>
-                    <w:spacing w:after="0" w:before="0" w:line="270" w:lineRule="auto"/>
-                  </w:pPr>
-                  <w:r>
-                    <w:rPr>
-                      <w:rFonts w:ascii="Arial" w:cs="Arial" w:eastAsia="Arial" w:hAnsi="Arial"/>
-                      <w:b w:val="false"/>
-                      <w:bCs w:val="false"/>
-                      <w:color w:val="222222"/>
-                      <w:sz w:val="16"/>
-                      <w:szCs w:val="16"/>
-                    </w:rPr>
-                    <w:t xml:space="preserve">Movilidad del personal funcionario de la AJA</w:t>
-                  </w:r>
-                </w:p>
-              </w:tc>
-            </w:tr>
-          </w:tbl>
-          <w:p>
-            <w:pPr>
-              <w:spacing w:after="0" w:before="0" w:line="20" w:lineRule="exact"/>
-            </w:pPr>
-            <w:r>
-              <w:rPr>
-                <w:sz w:val="2"/>
-                <w:szCs w:val="2"/>
-              </w:rPr>
-              <w:t xml:space="preserve"/>
+          <w:p>
+            <w:pPr>
+              <w:pStyle w:val="ListParagraph"/>
+              <w:numPr>
+                <w:ilvl w:val="0"/>
+                <w:numId w:val="2"/>
+              </w:numPr>
+              <w:spacing w:after="0" w:before="0" w:line="270" w:lineRule="auto"/>
+            </w:pPr>
+            <w:r>
+              <w:rPr>
+                <w:rFonts w:ascii="Arial" w:cs="Arial" w:eastAsia="Arial" w:hAnsi="Arial"/>
+                <w:b w:val="false"/>
+                <w:bCs w:val="false"/>
+                <w:color w:val="222222"/>
+                <w:sz w:val="16"/>
+                <w:szCs w:val="16"/>
+              </w:rPr>
+              <w:t xml:space="preserve">Provisión de puestos de trabajo</w:t>
+            </w:r>
+          </w:p>
+          <w:p>
+            <w:pPr>
+              <w:pStyle w:val="ListParagraph"/>
+              <w:numPr>
+                <w:ilvl w:val="0"/>
+                <w:numId w:val="2"/>
+              </w:numPr>
+              <w:spacing w:after="0" w:before="0" w:line="270" w:lineRule="auto"/>
+            </w:pPr>
+            <w:r>
+              <w:rPr>
+                <w:rFonts w:ascii="Arial" w:cs="Arial" w:eastAsia="Arial" w:hAnsi="Arial"/>
+                <w:b w:val="false"/>
+                <w:bCs w:val="false"/>
+                <w:color w:val="222222"/>
+                <w:sz w:val="16"/>
+                <w:szCs w:val="16"/>
+              </w:rPr>
+              <w:t xml:space="preserve">Adquisición y </w:t>
+            </w:r>
+            <w:r>
+              <w:rPr>
+                <w:rFonts w:ascii="Arial" w:cs="Arial" w:eastAsia="Arial" w:hAnsi="Arial"/>
+                <w:b w:val="false"/>
+                <w:bCs w:val="false"/>
+                <w:color w:val="1A7BB9"/>
+                <w:sz w:val="16"/>
+                <w:szCs w:val="16"/>
+              </w:rPr>
+              <w:t xml:space="preserve">pérdida</w:t>
+            </w:r>
+            <w:r>
+              <w:rPr>
+                <w:rFonts w:ascii="Arial" w:cs="Arial" w:eastAsia="Arial" w:hAnsi="Arial"/>
+                <w:b w:val="false"/>
+                <w:bCs w:val="false"/>
+                <w:color w:val="222222"/>
+                <w:sz w:val="16"/>
+                <w:szCs w:val="16"/>
+              </w:rPr>
+              <w:t xml:space="preserve"> de la relación de servicio</w:t>
+            </w:r>
+          </w:p>
+          <w:p>
+            <w:pPr>
+              <w:pStyle w:val="ListParagraph"/>
+              <w:numPr>
+                <w:ilvl w:val="0"/>
+                <w:numId w:val="2"/>
+              </w:numPr>
+              <w:spacing w:after="0" w:before="0" w:line="270" w:lineRule="auto"/>
+            </w:pPr>
+            <w:r>
+              <w:rPr>
+                <w:rFonts w:ascii="Arial" w:cs="Arial" w:eastAsia="Arial" w:hAnsi="Arial"/>
+                <w:b w:val="false"/>
+                <w:bCs w:val="false"/>
+                <w:color w:val="222222"/>
+                <w:sz w:val="16"/>
+                <w:szCs w:val="16"/>
+              </w:rPr>
+              <w:t xml:space="preserve">Movilidad del personal funcionario de la AJA</w:t>
             </w:r>
           </w:p>
         </w:tc>
@@ -4334,8 +4288,8 @@
         </w:tc>
         <w:tc>
           <w:tcPr>
-            <w:tcW w:type="dxa" w:w="4333"/>
-            <w:gridSpan w:val="1"/>
+            <w:tcW w:type="dxa" w:w="4334"/>
+            <w:gridSpan w:val="2"/>
             <w:tcBorders>
               <w:top w:val="single" w:color="D1EDF9" w:sz="6"/>
               <w:left w:val="single" w:color="D1EDF9" w:sz="6"/>
@@ -4457,7 +4411,7 @@
         </w:tc>
         <w:tc>
           <w:tcPr>
-            <w:tcW w:type="dxa" w:w="2146"/>
+            <w:tcW w:type="dxa" w:w="2145"/>
             <w:tcBorders>
               <w:top w:val="single" w:color="D1EDF9" w:sz="6"/>
               <w:left w:val="single" w:color="D1EDF9" w:sz="6"/>
@@ -4569,8 +4523,8 @@
         </w:tc>
         <w:tc>
           <w:tcPr>
-            <w:tcW w:type="dxa" w:w="4333"/>
-            <w:gridSpan w:val="1"/>
+            <w:tcW w:type="dxa" w:w="4334"/>
+            <w:gridSpan w:val="2"/>
             <w:tcBorders>
               <w:top w:val="single" w:color="D1EDF9" w:sz="6"/>
               <w:left w:val="single" w:color="D1EDF9" w:sz="6"/>
@@ -4734,7 +4688,7 @@
         </w:tc>
         <w:tc>
           <w:tcPr>
-            <w:tcW w:type="dxa" w:w="2146"/>
+            <w:tcW w:type="dxa" w:w="2145"/>
             <w:tcBorders>
               <w:top w:val="single" w:color="D1EDF9" w:sz="6"/>
               <w:left w:val="single" w:color="D1EDF9" w:sz="6"/>
@@ -4891,7 +4845,7 @@
         <w:tc>
           <w:tcPr>
             <w:tcW w:type="dxa" w:w="6479"/>
-            <w:gridSpan w:val="2"/>
+            <w:gridSpan w:val="3"/>
             <w:tcBorders>
               <w:top w:val="single" w:color="D1EDF9" w:sz="6"/>
               <w:left w:val="single" w:color="D1EDF9" w:sz="6"/>
@@ -5042,8 +4996,8 @@
         </w:tc>
         <w:tc>
           <w:tcPr>
-            <w:tcW w:type="dxa" w:w="4333"/>
-            <w:gridSpan w:val="1"/>
+            <w:tcW w:type="dxa" w:w="4334"/>
+            <w:gridSpan w:val="2"/>
             <w:tcBorders>
               <w:top w:val="single" w:color="D1EDF9" w:sz="6"/>
               <w:left w:val="single" w:color="D1EDF9" w:sz="6"/>
@@ -5354,7 +5308,7 @@
         </w:tc>
         <w:tc>
           <w:tcPr>
-            <w:tcW w:type="dxa" w:w="2146"/>
+            <w:tcW w:type="dxa" w:w="2145"/>
             <w:tcBorders>
               <w:top w:val="single" w:color="D1EDF9" w:sz="6"/>
               <w:left w:val="single" w:color="D1EDF9" w:sz="6"/>
@@ -5545,7 +5499,7 @@
         <w:tc>
           <w:tcPr>
             <w:tcW w:type="dxa" w:w="6479"/>
-            <w:gridSpan w:val="2"/>
+            <w:gridSpan w:val="3"/>
             <w:tcBorders>
               <w:top w:val="single" w:color="D1EDF9" w:sz="6"/>
               <w:left w:val="single" w:color="D1EDF9" w:sz="6"/>
@@ -5902,7 +5856,7 @@
         <w:tc>
           <w:tcPr>
             <w:tcW w:type="dxa" w:w="6479"/>
-            <w:gridSpan w:val="2"/>
+            <w:gridSpan w:val="3"/>
             <w:tcBorders>
               <w:top w:val="single" w:color="D1EDF9" w:sz="6"/>
               <w:left w:val="single" w:color="D1EDF9" w:sz="6"/>
@@ -6056,7 +6010,7 @@
         <w:tc>
           <w:tcPr>
             <w:tcW w:type="dxa" w:w="6479"/>
-            <w:gridSpan w:val="2"/>
+            <w:gridSpan w:val="3"/>
             <w:tcBorders>
               <w:top w:val="single" w:color="D1EDF9" w:sz="6"/>
               <w:left w:val="single" w:color="D1EDF9" w:sz="6"/>
@@ -6178,7 +6132,7 @@
         <w:tc>
           <w:tcPr>
             <w:tcW w:type="dxa" w:w="6479"/>
-            <w:gridSpan w:val="2"/>
+            <w:gridSpan w:val="3"/>
             <w:tcBorders>
               <w:top w:val="single" w:color="D1EDF9" w:sz="6"/>
               <w:left w:val="single" w:color="D1EDF9" w:sz="6"/>
@@ -6289,7 +6243,7 @@
         <w:tc>
           <w:tcPr>
             <w:tcW w:type="dxa" w:w="6479"/>
-            <w:gridSpan w:val="2"/>
+            <w:gridSpan w:val="3"/>
             <w:tcBorders>
               <w:top w:val="single" w:color="D1EDF9" w:sz="6"/>
               <w:left w:val="single" w:color="D1EDF9" w:sz="6"/>
@@ -6514,7 +6468,7 @@
         <w:tc>
           <w:tcPr>
             <w:tcW w:type="dxa" w:w="6479"/>
-            <w:gridSpan w:val="2"/>
+            <w:gridSpan w:val="3"/>
             <w:tcBorders>
               <w:top w:val="single" w:color="D1EDF9" w:sz="6"/>
               <w:left w:val="single" w:color="D1EDF9" w:sz="6"/>

</xml_diff>